<commit_message>
pdf added of migration
</commit_message>
<xml_diff>
--- a/migration/Migration is one of the major component of population change which is basically cause by socio (1).docx
+++ b/migration/Migration is one of the major component of population change which is basically cause by socio (1).docx
@@ -1,6 +1,6 @@
 
 <file path=word/document.xml><?xml version="1.0" encoding="utf-8"?>
-<w:document xmlns:wpc="http://schemas.microsoft.com/office/word/2010/wordprocessingCanvas" xmlns:mc="http://schemas.openxmlformats.org/markup-compatibility/2006" xmlns:o="urn:schemas-microsoft-com:office:office" xmlns:r="http://schemas.openxmlformats.org/officeDocument/2006/relationships" xmlns:m="http://schemas.openxmlformats.org/officeDocument/2006/math" xmlns:v="urn:schemas-microsoft-com:vml" xmlns:wp14="http://schemas.microsoft.com/office/word/2010/wordprocessingDrawing" xmlns:wp="http://schemas.openxmlformats.org/drawingml/2006/wordprocessingDrawing" xmlns:w10="urn:schemas-microsoft-com:office:word" xmlns:w="http://schemas.openxmlformats.org/wordprocessingml/2006/main" xmlns:w14="http://schemas.microsoft.com/office/word/2010/wordml" xmlns:w15="http://schemas.microsoft.com/office/word/2012/wordml" xmlns:wpg="http://schemas.microsoft.com/office/word/2010/wordprocessingGroup" xmlns:wpi="http://schemas.microsoft.com/office/word/2010/wordprocessingInk" xmlns:wne="http://schemas.microsoft.com/office/word/2006/wordml" xmlns:wps="http://schemas.microsoft.com/office/word/2010/wordprocessingShape" mc:Ignorable="w14 w15 wp14">
+<w:document xmlns:wpc="http://schemas.microsoft.com/office/word/2010/wordprocessingCanvas" xmlns:cx="http://schemas.microsoft.com/office/drawing/2014/chartex" xmlns:mc="http://schemas.openxmlformats.org/markup-compatibility/2006" xmlns:o="urn:schemas-microsoft-com:office:office" xmlns:r="http://schemas.openxmlformats.org/officeDocument/2006/relationships" xmlns:m="http://schemas.openxmlformats.org/officeDocument/2006/math" xmlns:v="urn:schemas-microsoft-com:vml" xmlns:wp14="http://schemas.microsoft.com/office/word/2010/wordprocessingDrawing" xmlns:wp="http://schemas.openxmlformats.org/drawingml/2006/wordprocessingDrawing" xmlns:w10="urn:schemas-microsoft-com:office:word" xmlns:w="http://schemas.openxmlformats.org/wordprocessingml/2006/main" xmlns:w14="http://schemas.microsoft.com/office/word/2010/wordml" xmlns:w15="http://schemas.microsoft.com/office/word/2012/wordml" xmlns:w16se="http://schemas.microsoft.com/office/word/2015/wordml/symex" xmlns:wpg="http://schemas.microsoft.com/office/word/2010/wordprocessingGroup" xmlns:wpi="http://schemas.microsoft.com/office/word/2010/wordprocessingInk" xmlns:wne="http://schemas.microsoft.com/office/word/2006/wordml" xmlns:wps="http://schemas.microsoft.com/office/word/2010/wordprocessingShape" mc:Ignorable="w14 w15 w16se wp14">
   <w:body>
     <w:p>
       <w:pPr>
@@ -910,7 +910,7 @@
           <w:rFonts w:ascii="Times New Roman" w:eastAsia="Times New Roman" w:hAnsi="Times New Roman" w:cs="Times New Roman"/>
           <w:shd w:val="clear" w:color="auto" w:fill="FFFFFF"/>
         </w:rPr>
-        <w:t>April</w:t>
+        <w:t>December</w:t>
       </w:r>
       <w:r>
         <w:rPr>
@@ -922,16 +922,7 @@
     </w:p>
     <w:sdt>
       <w:sdtPr>
-        <w:rPr>
-          <w:rFonts w:asciiTheme="minorHAnsi" w:eastAsiaTheme="minorEastAsia" w:hAnsiTheme="minorHAnsi" w:cstheme="minorBidi"/>
-          <w:color w:val="auto"/>
-          <w:kern w:val="2"/>
-          <w:sz w:val="24"/>
-          <w:szCs w:val="24"/>
-          <w:lang w:eastAsia="ko-KR"/>
-          <w14:ligatures w14:val="standardContextual"/>
-        </w:rPr>
-        <w:id w:val="419917677"/>
+        <w:id w:val="-1461724575"/>
         <w:docPartObj>
           <w:docPartGallery w:val="Table of Contents"/>
           <w:docPartUnique/>
@@ -945,57 +936,26 @@
         </w:rPr>
       </w:sdtEndPr>
       <w:sdtContent>
+        <w:p/>
         <w:p>
-          <w:pPr>
-            <w:pStyle w:val="TOCHeading"/>
-            <w:rPr>
-              <w:rFonts w:ascii="Times New Roman" w:hAnsi="Times New Roman" w:cs="Times New Roman"/>
-              <w:b/>
-              <w:bCs/>
-              <w:color w:val="auto"/>
-            </w:rPr>
-          </w:pPr>
           <w:r>
-            <w:rPr>
-              <w:rFonts w:ascii="Times New Roman" w:hAnsi="Times New Roman" w:cs="Times New Roman"/>
-              <w:b/>
-              <w:bCs/>
-              <w:color w:val="auto"/>
-            </w:rPr>
-            <w:t xml:space="preserve">Table of </w:t>
+            <w:br w:type="page"/>
           </w:r>
           <w:r>
-            <w:rPr>
-              <w:rFonts w:ascii="Times New Roman" w:hAnsi="Times New Roman" w:cs="Times New Roman"/>
-              <w:b/>
-              <w:bCs/>
-              <w:color w:val="auto"/>
-            </w:rPr>
+            <w:lastRenderedPageBreak/>
             <w:t>Contents</w:t>
           </w:r>
-        </w:p>
-        <w:p>
-          <w:pPr>
-            <w:rPr>
-              <w:lang w:eastAsia="en-US"/>
-            </w:rPr>
-          </w:pPr>
-        </w:p>
-        <w:p>
-          <w:pPr>
-            <w:rPr>
-              <w:lang w:eastAsia="en-US"/>
-            </w:rPr>
-          </w:pPr>
+          <w:bookmarkStart w:id="0" w:name="_GoBack"/>
+          <w:bookmarkEnd w:id="0"/>
         </w:p>
         <w:p>
           <w:pPr>
             <w:pStyle w:val="TOC1"/>
             <w:tabs>
-              <w:tab w:val="right" w:pos="10070"/>
+              <w:tab w:val="right" w:leader="dot" w:pos="10070"/>
             </w:tabs>
             <w:rPr>
-              <w:rFonts w:cs="Kokila"/>
+              <w:rFonts w:cs="Mangal"/>
               <w:noProof/>
               <w:kern w:val="0"/>
               <w:sz w:val="22"/>
@@ -1013,7 +973,7 @@
           <w:r>
             <w:fldChar w:fldCharType="separate"/>
           </w:r>
-          <w:hyperlink w:anchor="_Toc196406223" w:history="1">
+          <w:hyperlink w:anchor="_Toc215954703" w:history="1">
             <w:r>
               <w:rPr>
                 <w:rStyle w:val="Hyperlink"/>
@@ -1043,7 +1003,7 @@
                 <w:noProof/>
                 <w:webHidden/>
               </w:rPr>
-              <w:instrText xml:space="preserve"> PAGEREF _Toc196406223 \h </w:instrText>
+              <w:instrText xml:space="preserve"> PAGEREF _Toc215954703 \h </w:instrText>
             </w:r>
             <w:r>
               <w:rPr>
@@ -1078,10 +1038,10 @@
           <w:pPr>
             <w:pStyle w:val="TOC1"/>
             <w:tabs>
-              <w:tab w:val="right" w:pos="10070"/>
+              <w:tab w:val="right" w:leader="dot" w:pos="10070"/>
             </w:tabs>
             <w:rPr>
-              <w:rFonts w:cs="Kokila"/>
+              <w:rFonts w:cs="Mangal"/>
               <w:noProof/>
               <w:kern w:val="0"/>
               <w:sz w:val="22"/>
@@ -1090,7 +1050,7 @@
               <w14:ligatures w14:val="none"/>
             </w:rPr>
           </w:pPr>
-          <w:hyperlink w:anchor="_Toc196406224" w:history="1">
+          <w:hyperlink w:anchor="_Toc215954704" w:history="1">
             <w:r>
               <w:rPr>
                 <w:rStyle w:val="Hyperlink"/>
@@ -1120,7 +1080,7 @@
                 <w:noProof/>
                 <w:webHidden/>
               </w:rPr>
-              <w:instrText xml:space="preserve"> PAGEREF _Toc196406224 \h </w:instrText>
+              <w:instrText xml:space="preserve"> PAGEREF _Toc215954704 \h </w:instrText>
             </w:r>
             <w:r>
               <w:rPr>
@@ -1155,10 +1115,10 @@
           <w:pPr>
             <w:pStyle w:val="TOC2"/>
             <w:tabs>
-              <w:tab w:val="right" w:pos="10070"/>
+              <w:tab w:val="right" w:leader="dot" w:pos="10070"/>
             </w:tabs>
             <w:rPr>
-              <w:rFonts w:cs="Kokila"/>
+              <w:rFonts w:cs="Mangal"/>
               <w:noProof/>
               <w:kern w:val="0"/>
               <w:sz w:val="22"/>
@@ -1167,7 +1127,7 @@
               <w14:ligatures w14:val="none"/>
             </w:rPr>
           </w:pPr>
-          <w:hyperlink w:anchor="_Toc196406225" w:history="1">
+          <w:hyperlink w:anchor="_Toc215954705" w:history="1">
             <w:r>
               <w:rPr>
                 <w:rStyle w:val="Hyperlink"/>
@@ -1197,7 +1157,7 @@
                 <w:noProof/>
                 <w:webHidden/>
               </w:rPr>
-              <w:instrText xml:space="preserve"> PAGEREF _Toc196406225 \h </w:instrText>
+              <w:instrText xml:space="preserve"> PAGEREF _Toc215954705 \h </w:instrText>
             </w:r>
             <w:r>
               <w:rPr>
@@ -1232,10 +1192,10 @@
           <w:pPr>
             <w:pStyle w:val="TOC2"/>
             <w:tabs>
-              <w:tab w:val="right" w:pos="10070"/>
+              <w:tab w:val="right" w:leader="dot" w:pos="10070"/>
             </w:tabs>
             <w:rPr>
-              <w:rFonts w:cs="Kokila"/>
+              <w:rFonts w:cs="Mangal"/>
               <w:noProof/>
               <w:kern w:val="0"/>
               <w:sz w:val="22"/>
@@ -1244,7 +1204,7 @@
               <w14:ligatures w14:val="none"/>
             </w:rPr>
           </w:pPr>
-          <w:hyperlink w:anchor="_Toc196406226" w:history="1">
+          <w:hyperlink w:anchor="_Toc215954706" w:history="1">
             <w:r>
               <w:rPr>
                 <w:rStyle w:val="Hyperlink"/>
@@ -1274,7 +1234,7 @@
                 <w:noProof/>
                 <w:webHidden/>
               </w:rPr>
-              <w:instrText xml:space="preserve"> PAGEREF _Toc196406226 \h </w:instrText>
+              <w:instrText xml:space="preserve"> PAGEREF _Toc215954706 \h </w:instrText>
             </w:r>
             <w:r>
               <w:rPr>
@@ -1309,10 +1269,10 @@
           <w:pPr>
             <w:pStyle w:val="TOC2"/>
             <w:tabs>
-              <w:tab w:val="right" w:pos="10070"/>
+              <w:tab w:val="right" w:leader="dot" w:pos="10070"/>
             </w:tabs>
             <w:rPr>
-              <w:rFonts w:cs="Kokila"/>
+              <w:rFonts w:cs="Mangal"/>
               <w:noProof/>
               <w:kern w:val="0"/>
               <w:sz w:val="22"/>
@@ -1321,7 +1281,7 @@
               <w14:ligatures w14:val="none"/>
             </w:rPr>
           </w:pPr>
-          <w:hyperlink w:anchor="_Toc196406227" w:history="1">
+          <w:hyperlink w:anchor="_Toc215954707" w:history="1">
             <w:r>
               <w:rPr>
                 <w:rStyle w:val="Hyperlink"/>
@@ -1351,7 +1311,7 @@
                 <w:noProof/>
                 <w:webHidden/>
               </w:rPr>
-              <w:instrText xml:space="preserve"> PAGEREF _Toc196406227 \h </w:instrText>
+              <w:instrText xml:space="preserve"> PAGEREF _Toc215954707 \h </w:instrText>
             </w:r>
             <w:r>
               <w:rPr>
@@ -1384,12 +1344,12 @@
         </w:p>
         <w:p>
           <w:pPr>
-            <w:pStyle w:val="TOC3"/>
+            <w:pStyle w:val="TOC2"/>
             <w:tabs>
-              <w:tab w:val="right" w:pos="10070"/>
+              <w:tab w:val="right" w:leader="dot" w:pos="10070"/>
             </w:tabs>
             <w:rPr>
-              <w:rFonts w:cs="Kokila"/>
+              <w:rFonts w:cs="Mangal"/>
               <w:noProof/>
               <w:kern w:val="0"/>
               <w:sz w:val="22"/>
@@ -1398,7 +1358,7 @@
               <w14:ligatures w14:val="none"/>
             </w:rPr>
           </w:pPr>
-          <w:hyperlink w:anchor="_Toc196406228" w:history="1">
+          <w:hyperlink w:anchor="_Toc215954708" w:history="1">
             <w:r>
               <w:rPr>
                 <w:rStyle w:val="Hyperlink"/>
@@ -1407,7 +1367,7 @@
                 <w:bCs/>
                 <w:noProof/>
               </w:rPr>
-              <w:t>1.3.1 General Objective</w:t>
+              <w:t>1.4 Rationale of the study</w:t>
             </w:r>
             <w:r>
               <w:rPr>
@@ -1428,7 +1388,13 @@
                 <w:noProof/>
                 <w:webHidden/>
               </w:rPr>
-              <w:instrText xml:space="preserve"> PAGEREF _Toc196406228 \h </w:instrText>
+              <w:instrText xml:space="preserve"> PAGEREF _Toc215954708 \h </w:instrText>
+            </w:r>
+            <w:r>
+              <w:rPr>
+                <w:noProof/>
+                <w:webHidden/>
+              </w:rPr>
             </w:r>
             <w:r>
               <w:rPr>
@@ -1439,12 +1405,10 @@
             </w:r>
             <w:r>
               <w:rPr>
-                <w:b/>
-                <w:bCs/>
-                <w:noProof/>
-                <w:webHidden/>
-              </w:rPr>
-              <w:t>Error! Bookmark not defined.</w:t>
+                <w:noProof/>
+                <w:webHidden/>
+              </w:rPr>
+              <w:t>4</w:t>
             </w:r>
             <w:r>
               <w:rPr>
@@ -1457,12 +1421,12 @@
         </w:p>
         <w:p>
           <w:pPr>
-            <w:pStyle w:val="TOC3"/>
+            <w:pStyle w:val="TOC1"/>
             <w:tabs>
-              <w:tab w:val="right" w:pos="10070"/>
+              <w:tab w:val="right" w:leader="dot" w:pos="10070"/>
             </w:tabs>
             <w:rPr>
-              <w:rFonts w:cs="Kokila"/>
+              <w:rFonts w:cs="Mangal"/>
               <w:noProof/>
               <w:kern w:val="0"/>
               <w:sz w:val="22"/>
@@ -1471,7 +1435,7 @@
               <w14:ligatures w14:val="none"/>
             </w:rPr>
           </w:pPr>
-          <w:hyperlink w:anchor="_Toc196406229" w:history="1">
+          <w:hyperlink w:anchor="_Toc215954709" w:history="1">
             <w:r>
               <w:rPr>
                 <w:rStyle w:val="Hyperlink"/>
@@ -1480,7 +1444,7 @@
                 <w:bCs/>
                 <w:noProof/>
               </w:rPr>
-              <w:t>1.3.2 Specific Objectives</w:t>
+              <w:t>Chapter 2</w:t>
             </w:r>
             <w:r>
               <w:rPr>
@@ -1501,7 +1465,13 @@
                 <w:noProof/>
                 <w:webHidden/>
               </w:rPr>
-              <w:instrText xml:space="preserve"> PAGEREF _Toc196406229 \h </w:instrText>
+              <w:instrText xml:space="preserve"> PAGEREF _Toc215954709 \h </w:instrText>
+            </w:r>
+            <w:r>
+              <w:rPr>
+                <w:noProof/>
+                <w:webHidden/>
+              </w:rPr>
             </w:r>
             <w:r>
               <w:rPr>
@@ -1512,12 +1482,10 @@
             </w:r>
             <w:r>
               <w:rPr>
-                <w:b/>
-                <w:bCs/>
-                <w:noProof/>
-                <w:webHidden/>
-              </w:rPr>
-              <w:t>Error! Bookmark not defined.</w:t>
+                <w:noProof/>
+                <w:webHidden/>
+              </w:rPr>
+              <w:t>5</w:t>
             </w:r>
             <w:r>
               <w:rPr>
@@ -1530,12 +1498,12 @@
         </w:p>
         <w:p>
           <w:pPr>
-            <w:pStyle w:val="TOC2"/>
+            <w:pStyle w:val="TOC1"/>
             <w:tabs>
-              <w:tab w:val="right" w:pos="10070"/>
+              <w:tab w:val="right" w:leader="dot" w:pos="10070"/>
             </w:tabs>
             <w:rPr>
-              <w:rFonts w:cs="Kokila"/>
+              <w:rFonts w:cs="Mangal"/>
               <w:noProof/>
               <w:kern w:val="0"/>
               <w:sz w:val="22"/>
@@ -1544,7 +1512,7 @@
               <w14:ligatures w14:val="none"/>
             </w:rPr>
           </w:pPr>
-          <w:hyperlink w:anchor="_Toc196406230" w:history="1">
+          <w:hyperlink w:anchor="_Toc215954710" w:history="1">
             <w:r>
               <w:rPr>
                 <w:rStyle w:val="Hyperlink"/>
@@ -1553,7 +1521,7 @@
                 <w:bCs/>
                 <w:noProof/>
               </w:rPr>
-              <w:t>1.4 Rationale of the study</w:t>
+              <w:t>Literature Review</w:t>
             </w:r>
             <w:r>
               <w:rPr>
@@ -1574,7 +1542,7 @@
                 <w:noProof/>
                 <w:webHidden/>
               </w:rPr>
-              <w:instrText xml:space="preserve"> PAGEREF _Toc196406230 \h </w:instrText>
+              <w:instrText xml:space="preserve"> PAGEREF _Toc215954710 \h </w:instrText>
             </w:r>
             <w:r>
               <w:rPr>
@@ -1594,7 +1562,7 @@
                 <w:noProof/>
                 <w:webHidden/>
               </w:rPr>
-              <w:t>4</w:t>
+              <w:t>5</w:t>
             </w:r>
             <w:r>
               <w:rPr>
@@ -1609,10 +1577,10 @@
           <w:pPr>
             <w:pStyle w:val="TOC1"/>
             <w:tabs>
-              <w:tab w:val="right" w:pos="10070"/>
+              <w:tab w:val="right" w:leader="dot" w:pos="10070"/>
             </w:tabs>
             <w:rPr>
-              <w:rFonts w:cs="Kokila"/>
+              <w:rFonts w:cs="Mangal"/>
               <w:noProof/>
               <w:kern w:val="0"/>
               <w:sz w:val="22"/>
@@ -1621,16 +1589,15 @@
               <w14:ligatures w14:val="none"/>
             </w:rPr>
           </w:pPr>
-          <w:hyperlink w:anchor="_Toc196406231" w:history="1">
+          <w:hyperlink w:anchor="_Toc215954711" w:history="1">
             <w:r>
               <w:rPr>
                 <w:rStyle w:val="Hyperlink"/>
                 <w:rFonts w:ascii="Times New Roman" w:hAnsi="Times New Roman" w:cs="Times New Roman"/>
                 <w:b/>
-                <w:bCs/>
-                <w:noProof/>
-              </w:rPr>
-              <w:t>Chapter 2</w:t>
+                <w:noProof/>
+              </w:rPr>
+              <w:t>Chapter 3</w:t>
             </w:r>
             <w:r>
               <w:rPr>
@@ -1651,7 +1618,7 @@
                 <w:noProof/>
                 <w:webHidden/>
               </w:rPr>
-              <w:instrText xml:space="preserve"> PAGEREF _Toc196406231 \h </w:instrText>
+              <w:instrText xml:space="preserve"> PAGEREF _Toc215954711 \h </w:instrText>
             </w:r>
             <w:r>
               <w:rPr>
@@ -1671,7 +1638,7 @@
                 <w:noProof/>
                 <w:webHidden/>
               </w:rPr>
-              <w:t>5</w:t>
+              <w:t>8</w:t>
             </w:r>
             <w:r>
               <w:rPr>
@@ -1686,10 +1653,10 @@
           <w:pPr>
             <w:pStyle w:val="TOC1"/>
             <w:tabs>
-              <w:tab w:val="right" w:pos="10070"/>
+              <w:tab w:val="right" w:leader="dot" w:pos="10070"/>
             </w:tabs>
             <w:rPr>
-              <w:rFonts w:cs="Kokila"/>
+              <w:rFonts w:cs="Mangal"/>
               <w:noProof/>
               <w:kern w:val="0"/>
               <w:sz w:val="22"/>
@@ -1698,16 +1665,15 @@
               <w14:ligatures w14:val="none"/>
             </w:rPr>
           </w:pPr>
-          <w:hyperlink w:anchor="_Toc196406232" w:history="1">
+          <w:hyperlink w:anchor="_Toc215954712" w:history="1">
             <w:r>
               <w:rPr>
                 <w:rStyle w:val="Hyperlink"/>
                 <w:rFonts w:ascii="Times New Roman" w:hAnsi="Times New Roman" w:cs="Times New Roman"/>
                 <w:b/>
-                <w:bCs/>
-                <w:noProof/>
-              </w:rPr>
-              <w:t>Literature Review</w:t>
+                <w:noProof/>
+              </w:rPr>
+              <w:t>Research methodology</w:t>
             </w:r>
             <w:r>
               <w:rPr>
@@ -1728,7 +1694,7 @@
                 <w:noProof/>
                 <w:webHidden/>
               </w:rPr>
-              <w:instrText xml:space="preserve"> PAGEREF _Toc196406232 \h </w:instrText>
+              <w:instrText xml:space="preserve"> PAGEREF _Toc215954712 \h </w:instrText>
             </w:r>
             <w:r>
               <w:rPr>
@@ -1748,7 +1714,7 @@
                 <w:noProof/>
                 <w:webHidden/>
               </w:rPr>
-              <w:t>5</w:t>
+              <w:t>8</w:t>
             </w:r>
             <w:r>
               <w:rPr>
@@ -1761,12 +1727,12 @@
         </w:p>
         <w:p>
           <w:pPr>
-            <w:pStyle w:val="TOC1"/>
+            <w:pStyle w:val="TOC2"/>
             <w:tabs>
-              <w:tab w:val="right" w:pos="10070"/>
+              <w:tab w:val="right" w:leader="dot" w:pos="10070"/>
             </w:tabs>
             <w:rPr>
-              <w:rFonts w:cs="Kokila"/>
+              <w:rFonts w:cs="Mangal"/>
               <w:noProof/>
               <w:kern w:val="0"/>
               <w:sz w:val="22"/>
@@ -1775,15 +1741,16 @@
               <w14:ligatures w14:val="none"/>
             </w:rPr>
           </w:pPr>
-          <w:hyperlink w:anchor="_Toc196406233" w:history="1">
+          <w:hyperlink w:anchor="_Toc215954713" w:history="1">
             <w:r>
               <w:rPr>
                 <w:rStyle w:val="Hyperlink"/>
                 <w:rFonts w:ascii="Times New Roman" w:hAnsi="Times New Roman" w:cs="Times New Roman"/>
                 <w:b/>
-                <w:noProof/>
-              </w:rPr>
-              <w:t>Chapter 3</w:t>
+                <w:bCs/>
+                <w:noProof/>
+              </w:rPr>
+              <w:t>3.1 Study Area</w:t>
             </w:r>
             <w:r>
               <w:rPr>
@@ -1804,7 +1771,7 @@
                 <w:noProof/>
                 <w:webHidden/>
               </w:rPr>
-              <w:instrText xml:space="preserve"> PAGEREF _Toc196406233 \h </w:instrText>
+              <w:instrText xml:space="preserve"> PAGEREF _Toc215954713 \h </w:instrText>
             </w:r>
             <w:r>
               <w:rPr>
@@ -1837,12 +1804,12 @@
         </w:p>
         <w:p>
           <w:pPr>
-            <w:pStyle w:val="TOC1"/>
+            <w:pStyle w:val="TOC2"/>
             <w:tabs>
-              <w:tab w:val="right" w:pos="10070"/>
+              <w:tab w:val="right" w:leader="dot" w:pos="10070"/>
             </w:tabs>
             <w:rPr>
-              <w:rFonts w:cs="Kokila"/>
+              <w:rFonts w:cs="Mangal"/>
               <w:noProof/>
               <w:kern w:val="0"/>
               <w:sz w:val="22"/>
@@ -1851,15 +1818,16 @@
               <w14:ligatures w14:val="none"/>
             </w:rPr>
           </w:pPr>
-          <w:hyperlink w:anchor="_Toc196406234" w:history="1">
+          <w:hyperlink w:anchor="_Toc215954714" w:history="1">
             <w:r>
               <w:rPr>
                 <w:rStyle w:val="Hyperlink"/>
                 <w:rFonts w:ascii="Times New Roman" w:hAnsi="Times New Roman" w:cs="Times New Roman"/>
                 <w:b/>
-                <w:noProof/>
-              </w:rPr>
-              <w:t>Research methodology</w:t>
+                <w:bCs/>
+                <w:noProof/>
+              </w:rPr>
+              <w:t>3.2 Research Design</w:t>
             </w:r>
             <w:r>
               <w:rPr>
@@ -1880,7 +1848,7 @@
                 <w:noProof/>
                 <w:webHidden/>
               </w:rPr>
-              <w:instrText xml:space="preserve"> PAGEREF _Toc196406234 \h </w:instrText>
+              <w:instrText xml:space="preserve"> PAGEREF _Toc215954714 \h </w:instrText>
             </w:r>
             <w:r>
               <w:rPr>
@@ -1915,10 +1883,10 @@
           <w:pPr>
             <w:pStyle w:val="TOC2"/>
             <w:tabs>
-              <w:tab w:val="right" w:pos="10070"/>
+              <w:tab w:val="right" w:leader="dot" w:pos="10070"/>
             </w:tabs>
             <w:rPr>
-              <w:rFonts w:cs="Kokila"/>
+              <w:rFonts w:cs="Mangal"/>
               <w:noProof/>
               <w:kern w:val="0"/>
               <w:sz w:val="22"/>
@@ -1927,7 +1895,7 @@
               <w14:ligatures w14:val="none"/>
             </w:rPr>
           </w:pPr>
-          <w:hyperlink w:anchor="_Toc196406235" w:history="1">
+          <w:hyperlink w:anchor="_Toc215954715" w:history="1">
             <w:r>
               <w:rPr>
                 <w:rStyle w:val="Hyperlink"/>
@@ -1936,7 +1904,7 @@
                 <w:bCs/>
                 <w:noProof/>
               </w:rPr>
-              <w:t>3.1 Study Area</w:t>
+              <w:t>3.3 Nature and source of data</w:t>
             </w:r>
             <w:r>
               <w:rPr>
@@ -1957,7 +1925,7 @@
                 <w:noProof/>
                 <w:webHidden/>
               </w:rPr>
-              <w:instrText xml:space="preserve"> PAGEREF _Toc196406235 \h </w:instrText>
+              <w:instrText xml:space="preserve"> PAGEREF _Toc215954715 \h </w:instrText>
             </w:r>
             <w:r>
               <w:rPr>
@@ -1992,10 +1960,10 @@
           <w:pPr>
             <w:pStyle w:val="TOC2"/>
             <w:tabs>
-              <w:tab w:val="right" w:pos="10070"/>
+              <w:tab w:val="right" w:leader="dot" w:pos="10070"/>
             </w:tabs>
             <w:rPr>
-              <w:rFonts w:cs="Kokila"/>
+              <w:rFonts w:cs="Mangal"/>
               <w:noProof/>
               <w:kern w:val="0"/>
               <w:sz w:val="22"/>
@@ -2004,7 +1972,7 @@
               <w14:ligatures w14:val="none"/>
             </w:rPr>
           </w:pPr>
-          <w:hyperlink w:anchor="_Toc196406236" w:history="1">
+          <w:hyperlink w:anchor="_Toc215954716" w:history="1">
             <w:r>
               <w:rPr>
                 <w:rStyle w:val="Hyperlink"/>
@@ -2013,7 +1981,7 @@
                 <w:bCs/>
                 <w:noProof/>
               </w:rPr>
-              <w:t>3.2 Research Design</w:t>
+              <w:t>3.4 The sampling Procedure</w:t>
             </w:r>
             <w:r>
               <w:rPr>
@@ -2034,7 +2002,7 @@
                 <w:noProof/>
                 <w:webHidden/>
               </w:rPr>
-              <w:instrText xml:space="preserve"> PAGEREF _Toc196406236 \h </w:instrText>
+              <w:instrText xml:space="preserve"> PAGEREF _Toc215954716 \h </w:instrText>
             </w:r>
             <w:r>
               <w:rPr>
@@ -2069,10 +2037,10 @@
           <w:pPr>
             <w:pStyle w:val="TOC2"/>
             <w:tabs>
-              <w:tab w:val="right" w:pos="10070"/>
+              <w:tab w:val="right" w:leader="dot" w:pos="10070"/>
             </w:tabs>
             <w:rPr>
-              <w:rFonts w:cs="Kokila"/>
+              <w:rFonts w:cs="Mangal"/>
               <w:noProof/>
               <w:kern w:val="0"/>
               <w:sz w:val="22"/>
@@ -2081,7 +2049,7 @@
               <w14:ligatures w14:val="none"/>
             </w:rPr>
           </w:pPr>
-          <w:hyperlink w:anchor="_Toc196406237" w:history="1">
+          <w:hyperlink w:anchor="_Toc215954717" w:history="1">
             <w:r>
               <w:rPr>
                 <w:rStyle w:val="Hyperlink"/>
@@ -2090,7 +2058,7 @@
                 <w:bCs/>
                 <w:noProof/>
               </w:rPr>
-              <w:t>3.3 Nature and source of data</w:t>
+              <w:t>3.5 Method of Data Collection</w:t>
             </w:r>
             <w:r>
               <w:rPr>
@@ -2111,7 +2079,7 @@
                 <w:noProof/>
                 <w:webHidden/>
               </w:rPr>
-              <w:instrText xml:space="preserve"> PAGEREF _Toc196406237 \h </w:instrText>
+              <w:instrText xml:space="preserve"> PAGEREF _Toc215954717 \h </w:instrText>
             </w:r>
             <w:r>
               <w:rPr>
@@ -2144,12 +2112,12 @@
         </w:p>
         <w:p>
           <w:pPr>
-            <w:pStyle w:val="TOC2"/>
+            <w:pStyle w:val="TOC3"/>
             <w:tabs>
-              <w:tab w:val="right" w:pos="10070"/>
+              <w:tab w:val="right" w:leader="dot" w:pos="10070"/>
             </w:tabs>
             <w:rPr>
-              <w:rFonts w:cs="Kokila"/>
+              <w:rFonts w:cs="Mangal"/>
               <w:noProof/>
               <w:kern w:val="0"/>
               <w:sz w:val="22"/>
@@ -2158,7 +2126,7 @@
               <w14:ligatures w14:val="none"/>
             </w:rPr>
           </w:pPr>
-          <w:hyperlink w:anchor="_Toc196406238" w:history="1">
+          <w:hyperlink w:anchor="_Toc215954718" w:history="1">
             <w:r>
               <w:rPr>
                 <w:rStyle w:val="Hyperlink"/>
@@ -2167,7 +2135,7 @@
                 <w:bCs/>
                 <w:noProof/>
               </w:rPr>
-              <w:t>3.4 The sampling Procedure</w:t>
+              <w:t>3.5.1 Observation</w:t>
             </w:r>
             <w:r>
               <w:rPr>
@@ -2188,7 +2156,7 @@
                 <w:noProof/>
                 <w:webHidden/>
               </w:rPr>
-              <w:instrText xml:space="preserve"> PAGEREF _Toc196406238 \h </w:instrText>
+              <w:instrText xml:space="preserve"> PAGEREF _Toc215954718 \h </w:instrText>
             </w:r>
             <w:r>
               <w:rPr>
@@ -2208,7 +2176,7 @@
                 <w:noProof/>
                 <w:webHidden/>
               </w:rPr>
-              <w:t>8</w:t>
+              <w:t>9</w:t>
             </w:r>
             <w:r>
               <w:rPr>
@@ -2221,12 +2189,12 @@
         </w:p>
         <w:p>
           <w:pPr>
-            <w:pStyle w:val="TOC2"/>
+            <w:pStyle w:val="TOC3"/>
             <w:tabs>
-              <w:tab w:val="right" w:pos="10070"/>
+              <w:tab w:val="right" w:leader="dot" w:pos="10070"/>
             </w:tabs>
             <w:rPr>
-              <w:rFonts w:cs="Kokila"/>
+              <w:rFonts w:cs="Mangal"/>
               <w:noProof/>
               <w:kern w:val="0"/>
               <w:sz w:val="22"/>
@@ -2235,7 +2203,7 @@
               <w14:ligatures w14:val="none"/>
             </w:rPr>
           </w:pPr>
-          <w:hyperlink w:anchor="_Toc196406239" w:history="1">
+          <w:hyperlink w:anchor="_Toc215954719" w:history="1">
             <w:r>
               <w:rPr>
                 <w:rStyle w:val="Hyperlink"/>
@@ -2244,7 +2212,7 @@
                 <w:bCs/>
                 <w:noProof/>
               </w:rPr>
-              <w:t>3.5 Method of Data Collection</w:t>
+              <w:t>3.5.2 Interview</w:t>
             </w:r>
             <w:r>
               <w:rPr>
@@ -2265,7 +2233,7 @@
                 <w:noProof/>
                 <w:webHidden/>
               </w:rPr>
-              <w:instrText xml:space="preserve"> PAGEREF _Toc196406239 \h </w:instrText>
+              <w:instrText xml:space="preserve"> PAGEREF _Toc215954719 \h </w:instrText>
             </w:r>
             <w:r>
               <w:rPr>
@@ -2285,7 +2253,7 @@
                 <w:noProof/>
                 <w:webHidden/>
               </w:rPr>
-              <w:t>8</w:t>
+              <w:t>9</w:t>
             </w:r>
             <w:r>
               <w:rPr>
@@ -2298,12 +2266,12 @@
         </w:p>
         <w:p>
           <w:pPr>
-            <w:pStyle w:val="TOC3"/>
+            <w:pStyle w:val="TOC2"/>
             <w:tabs>
-              <w:tab w:val="right" w:pos="10070"/>
+              <w:tab w:val="right" w:leader="dot" w:pos="10070"/>
             </w:tabs>
             <w:rPr>
-              <w:rFonts w:cs="Kokila"/>
+              <w:rFonts w:cs="Mangal"/>
               <w:noProof/>
               <w:kern w:val="0"/>
               <w:sz w:val="22"/>
@@ -2312,7 +2280,7 @@
               <w14:ligatures w14:val="none"/>
             </w:rPr>
           </w:pPr>
-          <w:hyperlink w:anchor="_Toc196406240" w:history="1">
+          <w:hyperlink w:anchor="_Toc215954720" w:history="1">
             <w:r>
               <w:rPr>
                 <w:rStyle w:val="Hyperlink"/>
@@ -2321,7 +2289,7 @@
                 <w:bCs/>
                 <w:noProof/>
               </w:rPr>
-              <w:t>3.5.1 Observation</w:t>
+              <w:t>3.6 Data Analysis and Presentation</w:t>
             </w:r>
             <w:r>
               <w:rPr>
@@ -2342,7 +2310,7 @@
                 <w:noProof/>
                 <w:webHidden/>
               </w:rPr>
-              <w:instrText xml:space="preserve"> PAGEREF _Toc196406240 \h </w:instrText>
+              <w:instrText xml:space="preserve"> PAGEREF _Toc215954720 \h </w:instrText>
             </w:r>
             <w:r>
               <w:rPr>
@@ -2375,12 +2343,12 @@
         </w:p>
         <w:p>
           <w:pPr>
-            <w:pStyle w:val="TOC3"/>
+            <w:pStyle w:val="TOC2"/>
             <w:tabs>
-              <w:tab w:val="right" w:pos="10070"/>
+              <w:tab w:val="right" w:leader="dot" w:pos="10070"/>
             </w:tabs>
             <w:rPr>
-              <w:rFonts w:cs="Kokila"/>
+              <w:rFonts w:cs="Mangal"/>
               <w:noProof/>
               <w:kern w:val="0"/>
               <w:sz w:val="22"/>
@@ -2389,7 +2357,7 @@
               <w14:ligatures w14:val="none"/>
             </w:rPr>
           </w:pPr>
-          <w:hyperlink w:anchor="_Toc196406241" w:history="1">
+          <w:hyperlink w:anchor="_Toc215954721" w:history="1">
             <w:r>
               <w:rPr>
                 <w:rStyle w:val="Hyperlink"/>
@@ -2398,7 +2366,7 @@
                 <w:bCs/>
                 <w:noProof/>
               </w:rPr>
-              <w:t>3.5.2 Interview</w:t>
+              <w:t>3.7 Limitation of the study</w:t>
             </w:r>
             <w:r>
               <w:rPr>
@@ -2419,7 +2387,7 @@
                 <w:noProof/>
                 <w:webHidden/>
               </w:rPr>
-              <w:instrText xml:space="preserve"> PAGEREF _Toc196406241 \h </w:instrText>
+              <w:instrText xml:space="preserve"> PAGEREF _Toc215954721 \h </w:instrText>
             </w:r>
             <w:r>
               <w:rPr>
@@ -2454,10 +2422,10 @@
           <w:pPr>
             <w:pStyle w:val="TOC2"/>
             <w:tabs>
-              <w:tab w:val="right" w:pos="10070"/>
+              <w:tab w:val="right" w:leader="dot" w:pos="10070"/>
             </w:tabs>
             <w:rPr>
-              <w:rFonts w:cs="Kokila"/>
+              <w:rFonts w:cs="Mangal"/>
               <w:noProof/>
               <w:kern w:val="0"/>
               <w:sz w:val="22"/>
@@ -2466,7 +2434,7 @@
               <w14:ligatures w14:val="none"/>
             </w:rPr>
           </w:pPr>
-          <w:hyperlink w:anchor="_Toc196406242" w:history="1">
+          <w:hyperlink w:anchor="_Toc215954722" w:history="1">
             <w:r>
               <w:rPr>
                 <w:rStyle w:val="Hyperlink"/>
@@ -2475,7 +2443,7 @@
                 <w:bCs/>
                 <w:noProof/>
               </w:rPr>
-              <w:t>3.6 Data Analysis and Presentation</w:t>
+              <w:t>3.8 Ethical Consideration</w:t>
             </w:r>
             <w:r>
               <w:rPr>
@@ -2496,7 +2464,7 @@
                 <w:noProof/>
                 <w:webHidden/>
               </w:rPr>
-              <w:instrText xml:space="preserve"> PAGEREF _Toc196406242 \h </w:instrText>
+              <w:instrText xml:space="preserve"> PAGEREF _Toc215954722 \h </w:instrText>
             </w:r>
             <w:r>
               <w:rPr>
@@ -2529,12 +2497,12 @@
         </w:p>
         <w:p>
           <w:pPr>
-            <w:pStyle w:val="TOC2"/>
+            <w:pStyle w:val="TOC1"/>
             <w:tabs>
-              <w:tab w:val="right" w:pos="10070"/>
+              <w:tab w:val="right" w:leader="dot" w:pos="10070"/>
             </w:tabs>
             <w:rPr>
-              <w:rFonts w:cs="Kokila"/>
+              <w:rFonts w:cs="Mangal"/>
               <w:noProof/>
               <w:kern w:val="0"/>
               <w:sz w:val="22"/>
@@ -2543,16 +2511,15 @@
               <w14:ligatures w14:val="none"/>
             </w:rPr>
           </w:pPr>
-          <w:hyperlink w:anchor="_Toc196406243" w:history="1">
+          <w:hyperlink w:anchor="_Toc215954723" w:history="1">
             <w:r>
               <w:rPr>
                 <w:rStyle w:val="Hyperlink"/>
                 <w:rFonts w:ascii="Times New Roman" w:hAnsi="Times New Roman" w:cs="Times New Roman"/>
                 <w:b/>
-                <w:bCs/>
-                <w:noProof/>
-              </w:rPr>
-              <w:t>3.7 Limitation of the study</w:t>
+                <w:noProof/>
+              </w:rPr>
+              <w:t>Acronym</w:t>
             </w:r>
             <w:r>
               <w:rPr>
@@ -2573,7 +2540,7 @@
                 <w:noProof/>
                 <w:webHidden/>
               </w:rPr>
-              <w:instrText xml:space="preserve"> PAGEREF _Toc196406243 \h </w:instrText>
+              <w:instrText xml:space="preserve"> PAGEREF _Toc215954723 \h </w:instrText>
             </w:r>
             <w:r>
               <w:rPr>
@@ -2593,7 +2560,7 @@
                 <w:noProof/>
                 <w:webHidden/>
               </w:rPr>
-              <w:t>9</w:t>
+              <w:t>10</w:t>
             </w:r>
             <w:r>
               <w:rPr>
@@ -2606,12 +2573,12 @@
         </w:p>
         <w:p>
           <w:pPr>
-            <w:pStyle w:val="TOC2"/>
+            <w:pStyle w:val="TOC1"/>
             <w:tabs>
-              <w:tab w:val="right" w:pos="10070"/>
+              <w:tab w:val="right" w:leader="dot" w:pos="10070"/>
             </w:tabs>
             <w:rPr>
-              <w:rFonts w:cs="Kokila"/>
+              <w:rFonts w:cs="Mangal"/>
               <w:noProof/>
               <w:kern w:val="0"/>
               <w:sz w:val="22"/>
@@ -2620,16 +2587,15 @@
               <w14:ligatures w14:val="none"/>
             </w:rPr>
           </w:pPr>
-          <w:hyperlink w:anchor="_Toc196406244" w:history="1">
+          <w:hyperlink w:anchor="_Toc215954724" w:history="1">
             <w:r>
               <w:rPr>
                 <w:rStyle w:val="Hyperlink"/>
                 <w:rFonts w:ascii="Times New Roman" w:hAnsi="Times New Roman" w:cs="Times New Roman"/>
                 <w:b/>
-                <w:bCs/>
-                <w:noProof/>
-              </w:rPr>
-              <w:t>3.8 Ethical Consideration</w:t>
+                <w:noProof/>
+              </w:rPr>
+              <w:t>References</w:t>
             </w:r>
             <w:r>
               <w:rPr>
@@ -2650,7 +2616,7 @@
                 <w:noProof/>
                 <w:webHidden/>
               </w:rPr>
-              <w:instrText xml:space="preserve"> PAGEREF _Toc196406244 \h </w:instrText>
+              <w:instrText xml:space="preserve"> PAGEREF _Toc215954724 \h </w:instrText>
             </w:r>
             <w:r>
               <w:rPr>
@@ -2670,7 +2636,7 @@
                 <w:noProof/>
                 <w:webHidden/>
               </w:rPr>
-              <w:t>9</w:t>
+              <w:t>11</w:t>
             </w:r>
             <w:r>
               <w:rPr>
@@ -2682,174 +2648,12 @@
           </w:hyperlink>
         </w:p>
         <w:p>
-          <w:pPr>
-            <w:pStyle w:val="TOC1"/>
-            <w:tabs>
-              <w:tab w:val="right" w:pos="10070"/>
-            </w:tabs>
-            <w:rPr>
-              <w:rFonts w:cs="Kokila"/>
-              <w:noProof/>
-              <w:kern w:val="0"/>
-              <w:sz w:val="22"/>
-              <w:szCs w:val="20"/>
-              <w:lang w:eastAsia="en-US" w:bidi="ne-NP"/>
-              <w14:ligatures w14:val="none"/>
-            </w:rPr>
-          </w:pPr>
-          <w:hyperlink w:anchor="_Toc196406245" w:history="1">
-            <w:r>
-              <w:rPr>
-                <w:rStyle w:val="Hyperlink"/>
-                <w:rFonts w:ascii="Times New Roman" w:hAnsi="Times New Roman" w:cs="Times New Roman"/>
-                <w:b/>
-                <w:noProof/>
-              </w:rPr>
-              <w:t>Acronym</w:t>
-            </w:r>
-            <w:r>
-              <w:rPr>
-                <w:noProof/>
-                <w:webHidden/>
-              </w:rPr>
-              <w:tab/>
-            </w:r>
-            <w:r>
-              <w:rPr>
-                <w:noProof/>
-                <w:webHidden/>
-              </w:rPr>
-              <w:fldChar w:fldCharType="begin"/>
-            </w:r>
-            <w:r>
-              <w:rPr>
-                <w:noProof/>
-                <w:webHidden/>
-              </w:rPr>
-              <w:instrText xml:space="preserve"> PAGEREF _Toc196406245 \h </w:instrText>
-            </w:r>
-            <w:r>
-              <w:rPr>
-                <w:noProof/>
-                <w:webHidden/>
-              </w:rPr>
-            </w:r>
-            <w:r>
-              <w:rPr>
-                <w:noProof/>
-                <w:webHidden/>
-              </w:rPr>
-              <w:fldChar w:fldCharType="separate"/>
-            </w:r>
-            <w:r>
-              <w:rPr>
-                <w:noProof/>
-                <w:webHidden/>
-              </w:rPr>
-              <w:t>10</w:t>
-            </w:r>
-            <w:r>
-              <w:rPr>
-                <w:noProof/>
-                <w:webHidden/>
-              </w:rPr>
-              <w:fldChar w:fldCharType="end"/>
-            </w:r>
-          </w:hyperlink>
-        </w:p>
-        <w:p>
-          <w:pPr>
-            <w:pStyle w:val="TOC1"/>
-            <w:tabs>
-              <w:tab w:val="right" w:pos="10070"/>
-            </w:tabs>
-            <w:rPr>
-              <w:rFonts w:cs="Kokila"/>
-              <w:noProof/>
-              <w:kern w:val="0"/>
-              <w:sz w:val="22"/>
-              <w:szCs w:val="20"/>
-              <w:lang w:eastAsia="en-US" w:bidi="ne-NP"/>
-              <w14:ligatures w14:val="none"/>
-            </w:rPr>
-          </w:pPr>
-          <w:hyperlink w:anchor="_Toc196406246" w:history="1">
-            <w:r>
-              <w:rPr>
-                <w:rStyle w:val="Hyperlink"/>
-                <w:rFonts w:ascii="Times New Roman" w:hAnsi="Times New Roman" w:cs="Times New Roman"/>
-                <w:b/>
-                <w:noProof/>
-              </w:rPr>
-              <w:t>References</w:t>
-            </w:r>
-            <w:r>
-              <w:rPr>
-                <w:noProof/>
-                <w:webHidden/>
-              </w:rPr>
-              <w:tab/>
-            </w:r>
-            <w:r>
-              <w:rPr>
-                <w:noProof/>
-                <w:webHidden/>
-              </w:rPr>
-              <w:fldChar w:fldCharType="begin"/>
-            </w:r>
-            <w:r>
-              <w:rPr>
-                <w:noProof/>
-                <w:webHidden/>
-              </w:rPr>
-              <w:instrText xml:space="preserve"> PAGEREF _Toc196406246 \h </w:instrText>
-            </w:r>
-            <w:r>
-              <w:rPr>
-                <w:noProof/>
-                <w:webHidden/>
-              </w:rPr>
-            </w:r>
-            <w:r>
-              <w:rPr>
-                <w:noProof/>
-                <w:webHidden/>
-              </w:rPr>
-              <w:fldChar w:fldCharType="separate"/>
-            </w:r>
-            <w:r>
-              <w:rPr>
-                <w:noProof/>
-                <w:webHidden/>
-              </w:rPr>
-              <w:t>11</w:t>
-            </w:r>
-            <w:r>
-              <w:rPr>
-                <w:noProof/>
-                <w:webHidden/>
-              </w:rPr>
-              <w:fldChar w:fldCharType="end"/>
-            </w:r>
-          </w:hyperlink>
-        </w:p>
-        <w:p>
-          <w:pPr>
+          <w:r>
             <w:rPr>
               <w:b/>
               <w:bCs/>
               <w:noProof/>
             </w:rPr>
-            <w:sectPr>
-              <w:headerReference w:type="default" r:id="rId8"/>
-              <w:pgSz w:w="12240" w:h="15840"/>
-              <w:pgMar w:top="720" w:right="720" w:bottom="720" w:left="1440" w:header="720" w:footer="720" w:gutter="0"/>
-              <w:pgNumType w:start="1"/>
-              <w:cols w:space="720"/>
-              <w:docGrid w:linePitch="360"/>
-            </w:sectPr>
-          </w:pPr>
-          <w:r>
             <w:fldChar w:fldCharType="end"/>
           </w:r>
         </w:p>
@@ -2857,6 +2661,38 @@
     </w:sdt>
     <w:p>
       <w:pPr>
+        <w:rPr>
+          <w:rFonts w:asciiTheme="majorHAnsi" w:eastAsiaTheme="majorEastAsia" w:hAnsiTheme="majorHAnsi" w:cstheme="majorBidi"/>
+          <w:color w:val="0F4761" w:themeColor="accent1" w:themeShade="BF"/>
+          <w:kern w:val="0"/>
+          <w:sz w:val="32"/>
+          <w:szCs w:val="32"/>
+          <w:lang w:eastAsia="en-US"/>
+          <w14:ligatures w14:val="none"/>
+        </w:rPr>
+      </w:pPr>
+    </w:p>
+    <w:p>
+      <w:pPr>
+        <w:rPr>
+          <w:rStyle w:val="Strong"/>
+          <w:rFonts w:ascii="Times New Roman" w:hAnsi="Times New Roman" w:cs="Times New Roman"/>
+          <w:sz w:val="32"/>
+          <w:szCs w:val="32"/>
+        </w:rPr>
+      </w:pPr>
+      <w:r>
+        <w:rPr>
+          <w:rStyle w:val="Strong"/>
+          <w:rFonts w:ascii="Times New Roman" w:hAnsi="Times New Roman" w:cs="Times New Roman"/>
+          <w:sz w:val="32"/>
+          <w:szCs w:val="32"/>
+        </w:rPr>
+        <w:br w:type="page"/>
+      </w:r>
+    </w:p>
+    <w:p>
+      <w:pPr>
         <w:pStyle w:val="Heading1"/>
         <w:spacing w:before="0" w:after="0" w:line="360" w:lineRule="auto"/>
         <w:rPr>
@@ -2866,9 +2702,19 @@
           <w:sz w:val="32"/>
           <w:szCs w:val="32"/>
         </w:rPr>
-      </w:pPr>
-      <w:bookmarkStart w:id="0" w:name="_Toc196406223"/>
-      <w:r>
+        <w:sectPr>
+          <w:pgSz w:w="12240" w:h="15840"/>
+          <w:pgMar w:top="720" w:right="720" w:bottom="720" w:left="1440" w:header="720" w:footer="720" w:gutter="0"/>
+          <w:pgNumType w:start="1"/>
+          <w:cols w:space="720"/>
+          <w:docGrid w:linePitch="360"/>
+        </w:sectPr>
+      </w:pPr>
+    </w:p>
+    <w:p>
+      <w:pPr>
+        <w:pStyle w:val="Heading1"/>
+        <w:spacing w:before="0" w:after="0" w:line="360" w:lineRule="auto"/>
         <w:rPr>
           <w:rStyle w:val="Strong"/>
           <w:rFonts w:ascii="Times New Roman" w:hAnsi="Times New Roman" w:cs="Times New Roman"/>
@@ -2876,10 +2722,8 @@
           <w:sz w:val="32"/>
           <w:szCs w:val="32"/>
         </w:rPr>
-        <w:lastRenderedPageBreak/>
-        <w:t>Chapter 1</w:t>
-      </w:r>
-      <w:bookmarkEnd w:id="0"/>
+      </w:pPr>
+      <w:bookmarkStart w:id="1" w:name="_Toc215954703"/>
       <w:r>
         <w:rPr>
           <w:rStyle w:val="Strong"/>
@@ -2888,6 +2732,18 @@
           <w:sz w:val="32"/>
           <w:szCs w:val="32"/>
         </w:rPr>
+        <w:lastRenderedPageBreak/>
+        <w:t>Chapter 1</w:t>
+      </w:r>
+      <w:bookmarkEnd w:id="1"/>
+      <w:r>
+        <w:rPr>
+          <w:rStyle w:val="Strong"/>
+          <w:rFonts w:ascii="Times New Roman" w:hAnsi="Times New Roman" w:cs="Times New Roman"/>
+          <w:color w:val="auto"/>
+          <w:sz w:val="32"/>
+          <w:szCs w:val="32"/>
+        </w:rPr>
         <w:t xml:space="preserve"> </w:t>
       </w:r>
     </w:p>
@@ -2903,7 +2759,7 @@
           <w:szCs w:val="28"/>
         </w:rPr>
       </w:pPr>
-      <w:bookmarkStart w:id="1" w:name="_Toc196406224"/>
+      <w:bookmarkStart w:id="2" w:name="_Toc215954704"/>
       <w:r>
         <w:rPr>
           <w:rStyle w:val="Strong"/>
@@ -2914,7 +2770,7 @@
         </w:rPr>
         <w:t>Introduction</w:t>
       </w:r>
-      <w:bookmarkEnd w:id="1"/>
+      <w:bookmarkEnd w:id="2"/>
     </w:p>
     <w:p>
       <w:pPr>
@@ -2932,7 +2788,7 @@
           <w:szCs w:val="24"/>
         </w:rPr>
       </w:pPr>
-      <w:bookmarkStart w:id="2" w:name="_Toc196406225"/>
+      <w:bookmarkStart w:id="3" w:name="_Toc215954705"/>
       <w:r>
         <w:rPr>
           <w:rFonts w:ascii="Times New Roman" w:hAnsi="Times New Roman" w:cs="Times New Roman"/>
@@ -2977,7 +2833,7 @@
         </w:rPr>
         <w:t>Background</w:t>
       </w:r>
-      <w:bookmarkEnd w:id="2"/>
+      <w:bookmarkEnd w:id="3"/>
       <w:r>
         <w:rPr>
           <w:rFonts w:ascii="Times New Roman" w:hAnsi="Times New Roman" w:cs="Times New Roman"/>
@@ -2989,8 +2845,6 @@
         </w:rPr>
         <w:tab/>
       </w:r>
-      <w:bookmarkStart w:id="3" w:name="_GoBack"/>
-      <w:bookmarkEnd w:id="3"/>
     </w:p>
     <w:p>
       <w:pPr>
@@ -3151,25 +3005,7 @@
           <w:sz w:val="22"/>
           <w:szCs w:val="22"/>
         </w:rPr>
-        <w:t xml:space="preserve"> The United Nations Multilingual Dictionary also defined migration as- „a form of geographic mobility or spatial mobility between one geographical unit and another, generally involving change in residence from the place of origin or place of departure to the place of destination or place of arrival‟ (UN</w:t>
-      </w:r>
-      <w:proofErr w:type="gramStart"/>
-      <w:r>
-        <w:rPr>
-          <w:rFonts w:ascii="Times New Roman" w:hAnsi="Times New Roman" w:cs="Times New Roman"/>
-          <w:sz w:val="22"/>
-          <w:szCs w:val="22"/>
-        </w:rPr>
-        <w:t>,1973:173</w:t>
-      </w:r>
-      <w:proofErr w:type="gramEnd"/>
-      <w:r>
-        <w:rPr>
-          <w:rFonts w:ascii="Times New Roman" w:hAnsi="Times New Roman" w:cs="Times New Roman"/>
-          <w:sz w:val="22"/>
-          <w:szCs w:val="22"/>
-        </w:rPr>
-        <w:t>)</w:t>
+        <w:t xml:space="preserve"> The United Nations Multilingual Dictionary also defined migration as- „a form of geographic mobility or spatial mobility between one geographical unit and another, generally involving change in residence from the place of origin or place of departure to the place of destination or place of arrival‟ (UN,1973:173)</w:t>
       </w:r>
     </w:p>
     <w:p>
@@ -3252,23 +3088,7 @@
           <w:sz w:val="22"/>
           <w:szCs w:val="22"/>
         </w:rPr>
-        <w:t xml:space="preserve"> and political circumstances at the national and international level. In all cases, migration is a sign of wide disparities in economic and social conditions between origin and destination both caused by better and cheaper transports and communication facilities. Another common feature is unpredictable and volatile movement as the result of specific short term or long term crises. Most of these crises produce in the first place local rather than international movements through migrants may cross boarders in search of their security (UNFPA, 1993</w:t>
-      </w:r>
-      <w:proofErr w:type="gramStart"/>
-      <w:r>
-        <w:rPr>
-          <w:sz w:val="22"/>
-          <w:szCs w:val="22"/>
-        </w:rPr>
-        <w:t>,15</w:t>
-      </w:r>
-      <w:proofErr w:type="gramEnd"/>
-      <w:r>
-        <w:rPr>
-          <w:sz w:val="22"/>
-          <w:szCs w:val="22"/>
-        </w:rPr>
-        <w:t xml:space="preserve">). </w:t>
+        <w:t xml:space="preserve"> and political circumstances at the national and international level. In all cases, migration is a sign of wide disparities in economic and social conditions between origin and destination both caused by better and cheaper transports and communication facilities. Another common feature is unpredictable and volatile movement as the result of specific short term or long term crises. Most of these crises produce in the first place local rather than international movements through migrants may cross boarders in search of their security (UNFPA, 1993,15). </w:t>
       </w:r>
     </w:p>
     <w:p>
@@ -3582,23 +3402,7 @@
           <w:sz w:val="22"/>
           <w:szCs w:val="22"/>
         </w:rPr>
-        <w:t xml:space="preserve"> 2015 and </w:t>
-      </w:r>
-      <w:proofErr w:type="gramStart"/>
-      <w:r>
-        <w:rPr>
-          <w:sz w:val="22"/>
-          <w:szCs w:val="22"/>
-        </w:rPr>
-        <w:t>may</w:t>
-      </w:r>
-      <w:proofErr w:type="gramEnd"/>
-      <w:r>
-        <w:rPr>
-          <w:sz w:val="22"/>
-          <w:szCs w:val="22"/>
-        </w:rPr>
-        <w:t xml:space="preserve"> 12</w:t>
+        <w:t xml:space="preserve"> 2015 and may 12</w:t>
       </w:r>
       <w:r>
         <w:rPr>
@@ -3716,7 +3520,7 @@
           <w:szCs w:val="24"/>
         </w:rPr>
       </w:pPr>
-      <w:bookmarkStart w:id="4" w:name="_Toc196406226"/>
+      <w:bookmarkStart w:id="4" w:name="_Toc215954706"/>
       <w:r>
         <w:rPr>
           <w:rFonts w:ascii="Times New Roman" w:hAnsi="Times New Roman" w:cs="Times New Roman"/>
@@ -4058,7 +3862,7 @@
           <w:szCs w:val="24"/>
         </w:rPr>
       </w:pPr>
-      <w:bookmarkStart w:id="5" w:name="_Toc196406227"/>
+      <w:bookmarkStart w:id="5" w:name="_Toc215954707"/>
       <w:r>
         <w:rPr>
           <w:rFonts w:ascii="Times New Roman" w:hAnsi="Times New Roman" w:cs="Times New Roman"/>
@@ -4303,7 +4107,6 @@
         </w:rPr>
         <w:t xml:space="preserve"> </w:t>
       </w:r>
-      <w:bookmarkStart w:id="6" w:name="_Toc196406230"/>
     </w:p>
     <w:p>
       <w:pPr>
@@ -4321,30 +4124,53 @@
         </w:rPr>
         <w:br w:type="page"/>
       </w:r>
-      <w:r>
+    </w:p>
+    <w:p>
+      <w:pPr>
+        <w:pStyle w:val="Heading2"/>
         <w:rPr>
           <w:rFonts w:ascii="Times New Roman" w:hAnsi="Times New Roman" w:cs="Times New Roman"/>
           <w:b/>
           <w:bCs/>
+          <w:color w:val="auto"/>
+          <w:sz w:val="24"/>
+          <w:szCs w:val="24"/>
+        </w:rPr>
+      </w:pPr>
+      <w:bookmarkStart w:id="6" w:name="_Toc215954708"/>
+      <w:r>
+        <w:rPr>
+          <w:rFonts w:ascii="Times New Roman" w:hAnsi="Times New Roman" w:cs="Times New Roman"/>
+          <w:b/>
+          <w:bCs/>
+          <w:color w:val="auto"/>
+          <w:sz w:val="24"/>
+          <w:szCs w:val="24"/>
         </w:rPr>
         <w:lastRenderedPageBreak/>
-        <w:t>1.4</w:t>
+        <w:t>1.</w:t>
       </w:r>
       <w:r>
         <w:rPr>
           <w:rFonts w:ascii="Times New Roman" w:hAnsi="Times New Roman" w:cs="Times New Roman"/>
           <w:b/>
           <w:bCs/>
-        </w:rPr>
-        <w:t xml:space="preserve"> </w:t>
+          <w:color w:val="auto"/>
+          <w:sz w:val="24"/>
+          <w:szCs w:val="24"/>
+        </w:rPr>
+        <w:t>4</w:t>
       </w:r>
       <w:r>
         <w:rPr>
           <w:rFonts w:ascii="Times New Roman" w:hAnsi="Times New Roman" w:cs="Times New Roman"/>
           <w:b/>
           <w:bCs/>
-        </w:rPr>
-        <w:t>Rationale of the study</w:t>
+          <w:color w:val="auto"/>
+          <w:sz w:val="24"/>
+          <w:szCs w:val="24"/>
+        </w:rPr>
+        <w:t xml:space="preserve"> Rationale of the study</w:t>
       </w:r>
       <w:bookmarkEnd w:id="6"/>
     </w:p>
@@ -4483,29 +4309,7 @@
           <w:sz w:val="22"/>
           <w:szCs w:val="22"/>
         </w:rPr>
-        <w:t xml:space="preserve">The planners and policy </w:t>
-      </w:r>
-      <w:proofErr w:type="gramStart"/>
-      <w:r>
-        <w:rPr>
-          <w:rFonts w:ascii="Times New Roman" w:hAnsi="Times New Roman" w:cs="Times New Roman"/>
-          <w:color w:val="000000"/>
-          <w:kern w:val="0"/>
-          <w:sz w:val="22"/>
-          <w:szCs w:val="22"/>
-        </w:rPr>
-        <w:t>makers</w:t>
-      </w:r>
-      <w:proofErr w:type="gramEnd"/>
-      <w:r>
-        <w:rPr>
-          <w:rFonts w:ascii="Times New Roman" w:hAnsi="Times New Roman" w:cs="Times New Roman"/>
-          <w:color w:val="000000"/>
-          <w:kern w:val="0"/>
-          <w:sz w:val="22"/>
-          <w:szCs w:val="22"/>
-        </w:rPr>
-        <w:t xml:space="preserve"> advocate and professionals need to concentrate and characterize their energy or power in order to address the </w:t>
+        <w:t xml:space="preserve">The planners and policy makers advocate and professionals need to concentrate and characterize their energy or power in order to address the </w:t>
       </w:r>
       <w:r>
         <w:rPr>
@@ -4863,7 +4667,7 @@
           <w:szCs w:val="32"/>
         </w:rPr>
       </w:pPr>
-      <w:bookmarkStart w:id="7" w:name="_Toc196406231"/>
+      <w:bookmarkStart w:id="7" w:name="_Toc215954709"/>
       <w:r>
         <w:rPr>
           <w:rStyle w:val="Strong"/>
@@ -4899,7 +4703,7 @@
           <w:szCs w:val="28"/>
         </w:rPr>
       </w:pPr>
-      <w:bookmarkStart w:id="8" w:name="_Toc196406232"/>
+      <w:bookmarkStart w:id="8" w:name="_Toc215954710"/>
       <w:r>
         <w:rPr>
           <w:rStyle w:val="Strong"/>
@@ -5201,23 +5005,7 @@
           <w:sz w:val="22"/>
           <w:szCs w:val="22"/>
         </w:rPr>
-        <w:t xml:space="preserve">‟ view regarding to irritation. Gravity Model m=a* u/v, where is the number of migrants in a given stream. </w:t>
-      </w:r>
-      <w:proofErr w:type="gramStart"/>
-      <w:r>
-        <w:rPr>
-          <w:sz w:val="22"/>
-          <w:szCs w:val="22"/>
-        </w:rPr>
-        <w:t>u</w:t>
-      </w:r>
-      <w:proofErr w:type="gramEnd"/>
-      <w:r>
-        <w:rPr>
-          <w:sz w:val="22"/>
-          <w:szCs w:val="22"/>
-        </w:rPr>
-        <w:t xml:space="preserve"> and v independent variables</w:t>
+        <w:t>‟ view regarding to irritation. Gravity Model m=a* u/v, where is the number of migrants in a given stream. u and v independent variables</w:t>
       </w:r>
       <w:r>
         <w:rPr>
@@ -5614,25 +5402,7 @@
           <w:sz w:val="22"/>
           <w:szCs w:val="22"/>
         </w:rPr>
-        <w:t xml:space="preserve"> patterns and implications of rural to urban migration with general system theory (KC</w:t>
-      </w:r>
-      <w:proofErr w:type="gramStart"/>
-      <w:r>
-        <w:rPr>
-          <w:rFonts w:ascii="Times New Roman" w:hAnsi="Times New Roman" w:cs="Times New Roman"/>
-          <w:sz w:val="22"/>
-          <w:szCs w:val="22"/>
-        </w:rPr>
-        <w:t>,1993:3</w:t>
-      </w:r>
-      <w:proofErr w:type="gramEnd"/>
-      <w:r>
-        <w:rPr>
-          <w:rFonts w:ascii="Times New Roman" w:hAnsi="Times New Roman" w:cs="Times New Roman"/>
-          <w:sz w:val="22"/>
-          <w:szCs w:val="22"/>
-        </w:rPr>
-        <w:t>) the ground migration to be systematic, influenced by an environment and control mechanism may change the whole system.</w:t>
+        <w:t xml:space="preserve"> patterns and implications of rural to urban migration with general system theory (KC,1993:3) the ground migration to be systematic, influenced by an environment and control mechanism may change the whole system.</w:t>
       </w:r>
     </w:p>
     <w:p>
@@ -5798,7 +5568,7 @@
         </w:rPr>
         <w:br w:type="page"/>
       </w:r>
-      <w:bookmarkStart w:id="9" w:name="_Toc196406233"/>
+      <w:bookmarkStart w:id="9" w:name="_Toc215954711"/>
       <w:r>
         <w:rPr>
           <w:rStyle w:val="Strong"/>
@@ -5826,7 +5596,7 @@
           <w:szCs w:val="28"/>
         </w:rPr>
       </w:pPr>
-      <w:bookmarkStart w:id="10" w:name="_Toc196406234"/>
+      <w:bookmarkStart w:id="10" w:name="_Toc215954712"/>
       <w:r>
         <w:rPr>
           <w:rStyle w:val="Strong"/>
@@ -5853,7 +5623,7 @@
           <w:szCs w:val="24"/>
         </w:rPr>
       </w:pPr>
-      <w:bookmarkStart w:id="11" w:name="_Toc196406235"/>
+      <w:bookmarkStart w:id="11" w:name="_Toc215954713"/>
       <w:r>
         <w:rPr>
           <w:rFonts w:ascii="Times New Roman" w:hAnsi="Times New Roman" w:cs="Times New Roman"/>
@@ -6237,7 +6007,7 @@
           <w:szCs w:val="24"/>
         </w:rPr>
       </w:pPr>
-      <w:bookmarkStart w:id="12" w:name="_Toc196406236"/>
+      <w:bookmarkStart w:id="12" w:name="_Toc215954714"/>
       <w:r>
         <w:rPr>
           <w:rFonts w:ascii="Times New Roman" w:hAnsi="Times New Roman" w:cs="Times New Roman"/>
@@ -6366,7 +6136,7 @@
           <w:b/>
         </w:rPr>
       </w:pPr>
-      <w:bookmarkStart w:id="13" w:name="_Toc196406237"/>
+      <w:bookmarkStart w:id="13" w:name="_Toc215954715"/>
       <w:r>
         <w:rPr>
           <w:rFonts w:ascii="Times New Roman" w:hAnsi="Times New Roman" w:cs="Times New Roman"/>
@@ -6468,7 +6238,7 @@
         </w:rPr>
         <w:t xml:space="preserve"> </w:t>
       </w:r>
-      <w:bookmarkStart w:id="14" w:name="_Toc196406238"/>
+      <w:bookmarkStart w:id="14" w:name="_Toc215954716"/>
       <w:r>
         <w:rPr>
           <w:rFonts w:ascii="Times New Roman" w:hAnsi="Times New Roman" w:cs="Times New Roman"/>
@@ -6787,7 +6557,7 @@
           <w:szCs w:val="24"/>
         </w:rPr>
       </w:pPr>
-      <w:bookmarkStart w:id="15" w:name="_Toc196406239"/>
+      <w:bookmarkStart w:id="15" w:name="_Toc215954717"/>
       <w:r>
         <w:rPr>
           <w:rFonts w:ascii="Times New Roman" w:hAnsi="Times New Roman" w:cs="Times New Roman"/>
@@ -6865,7 +6635,7 @@
           <w:szCs w:val="24"/>
         </w:rPr>
       </w:pPr>
-      <w:bookmarkStart w:id="16" w:name="_Toc196406240"/>
+      <w:bookmarkStart w:id="16" w:name="_Toc215954718"/>
       <w:r>
         <w:rPr>
           <w:rFonts w:ascii="Times New Roman" w:hAnsi="Times New Roman" w:cs="Times New Roman"/>
@@ -6985,7 +6755,7 @@
           <w:szCs w:val="24"/>
         </w:rPr>
       </w:pPr>
-      <w:bookmarkStart w:id="17" w:name="_Toc196406241"/>
+      <w:bookmarkStart w:id="17" w:name="_Toc215954719"/>
       <w:r>
         <w:rPr>
           <w:rFonts w:ascii="Times New Roman" w:hAnsi="Times New Roman" w:cs="Times New Roman"/>
@@ -7156,7 +6926,7 @@
           <w:szCs w:val="24"/>
         </w:rPr>
       </w:pPr>
-      <w:bookmarkStart w:id="18" w:name="_Toc196406242"/>
+      <w:bookmarkStart w:id="18" w:name="_Toc215954720"/>
       <w:r>
         <w:rPr>
           <w:rFonts w:ascii="Times New Roman" w:hAnsi="Times New Roman" w:cs="Times New Roman"/>
@@ -7215,7 +6985,7 @@
           <w:szCs w:val="24"/>
         </w:rPr>
       </w:pPr>
-      <w:bookmarkStart w:id="19" w:name="_Toc196406243"/>
+      <w:bookmarkStart w:id="19" w:name="_Toc215954721"/>
       <w:r>
         <w:rPr>
           <w:rFonts w:ascii="Times New Roman" w:hAnsi="Times New Roman" w:cs="Times New Roman"/>
@@ -7592,7 +7362,7 @@
           <w:szCs w:val="24"/>
         </w:rPr>
       </w:pPr>
-      <w:bookmarkStart w:id="20" w:name="_Toc196406244"/>
+      <w:bookmarkStart w:id="20" w:name="_Toc215954722"/>
       <w:r>
         <w:rPr>
           <w:rFonts w:ascii="Times New Roman" w:hAnsi="Times New Roman" w:cs="Times New Roman"/>
@@ -7777,7 +7547,7 @@
           <w:szCs w:val="32"/>
         </w:rPr>
       </w:pPr>
-      <w:bookmarkStart w:id="21" w:name="_Toc196406245"/>
+      <w:bookmarkStart w:id="21" w:name="_Toc215954723"/>
       <w:r>
         <w:rPr>
           <w:rStyle w:val="Strong"/>
@@ -7806,8 +7576,17 @@
           <w:rFonts w:ascii="Times New Roman" w:hAnsi="Times New Roman" w:cs="Times New Roman"/>
           <w:bCs/>
         </w:rPr>
-        <w:t>C.B.S</w:t>
-      </w:r>
+        <w:t>C.</w:t>
+      </w:r>
+      <w:proofErr w:type="gramStart"/>
+      <w:r>
+        <w:rPr>
+          <w:rFonts w:ascii="Times New Roman" w:hAnsi="Times New Roman" w:cs="Times New Roman"/>
+          <w:bCs/>
+        </w:rPr>
+        <w:t>B.S</w:t>
+      </w:r>
+      <w:proofErr w:type="gramEnd"/>
       <w:r>
         <w:rPr>
           <w:rFonts w:ascii="Times New Roman" w:hAnsi="Times New Roman" w:cs="Times New Roman"/>
@@ -7844,17 +7623,8 @@
           <w:rFonts w:ascii="Times New Roman" w:hAnsi="Times New Roman" w:cs="Times New Roman"/>
           <w:bCs/>
         </w:rPr>
-        <w:t xml:space="preserve"> </w:t>
-      </w:r>
-      <w:proofErr w:type="gramStart"/>
-      <w:r>
-        <w:rPr>
-          <w:rFonts w:ascii="Times New Roman" w:hAnsi="Times New Roman" w:cs="Times New Roman"/>
-          <w:bCs/>
-        </w:rPr>
-        <w:t>of  Statistics</w:t>
-      </w:r>
-      <w:proofErr w:type="gramEnd"/>
+        <w:t xml:space="preserve"> of  Statistics</w:t>
+      </w:r>
     </w:p>
     <w:p>
       <w:pPr>
@@ -8632,7 +8402,7 @@
           <w:szCs w:val="32"/>
         </w:rPr>
       </w:pPr>
-      <w:bookmarkStart w:id="22" w:name="_Toc196406246"/>
+      <w:bookmarkStart w:id="22" w:name="_Toc215954724"/>
       <w:r>
         <w:rPr>
           <w:rStyle w:val="Strong"/>
@@ -9100,7 +8870,8 @@
       </w:pPr>
     </w:p>
     <w:sectPr>
-      <w:headerReference w:type="default" r:id="rId9"/>
+      <w:headerReference w:type="default" r:id="rId8"/>
+      <w:footerReference w:type="default" r:id="rId9"/>
       <w:pgSz w:w="12240" w:h="15840"/>
       <w:pgMar w:top="720" w:right="720" w:bottom="720" w:left="1440" w:header="720" w:footer="720" w:gutter="0"/>
       <w:pgNumType w:start="1"/>
@@ -9112,7 +8883,7 @@
 </file>
 
 <file path=word/endnotes.xml><?xml version="1.0" encoding="utf-8"?>
-<w:endnotes xmlns:wpc="http://schemas.microsoft.com/office/word/2010/wordprocessingCanvas" xmlns:mc="http://schemas.openxmlformats.org/markup-compatibility/2006" xmlns:o="urn:schemas-microsoft-com:office:office" xmlns:r="http://schemas.openxmlformats.org/officeDocument/2006/relationships" xmlns:m="http://schemas.openxmlformats.org/officeDocument/2006/math" xmlns:v="urn:schemas-microsoft-com:vml" xmlns:wp14="http://schemas.microsoft.com/office/word/2010/wordprocessingDrawing" xmlns:wp="http://schemas.openxmlformats.org/drawingml/2006/wordprocessingDrawing" xmlns:w10="urn:schemas-microsoft-com:office:word" xmlns:w="http://schemas.openxmlformats.org/wordprocessingml/2006/main" xmlns:w14="http://schemas.microsoft.com/office/word/2010/wordml" xmlns:w15="http://schemas.microsoft.com/office/word/2012/wordml" xmlns:wpg="http://schemas.microsoft.com/office/word/2010/wordprocessingGroup" xmlns:wpi="http://schemas.microsoft.com/office/word/2010/wordprocessingInk" xmlns:wne="http://schemas.microsoft.com/office/word/2006/wordml" xmlns:wps="http://schemas.microsoft.com/office/word/2010/wordprocessingShape" mc:Ignorable="w14 w15 wp14">
+<w:endnotes xmlns:wpc="http://schemas.microsoft.com/office/word/2010/wordprocessingCanvas" xmlns:cx="http://schemas.microsoft.com/office/drawing/2014/chartex" xmlns:mc="http://schemas.openxmlformats.org/markup-compatibility/2006" xmlns:o="urn:schemas-microsoft-com:office:office" xmlns:r="http://schemas.openxmlformats.org/officeDocument/2006/relationships" xmlns:m="http://schemas.openxmlformats.org/officeDocument/2006/math" xmlns:v="urn:schemas-microsoft-com:vml" xmlns:wp14="http://schemas.microsoft.com/office/word/2010/wordprocessingDrawing" xmlns:wp="http://schemas.openxmlformats.org/drawingml/2006/wordprocessingDrawing" xmlns:w10="urn:schemas-microsoft-com:office:word" xmlns:w="http://schemas.openxmlformats.org/wordprocessingml/2006/main" xmlns:w14="http://schemas.microsoft.com/office/word/2010/wordml" xmlns:w15="http://schemas.microsoft.com/office/word/2012/wordml" xmlns:w16se="http://schemas.microsoft.com/office/word/2015/wordml/symex" xmlns:wpg="http://schemas.microsoft.com/office/word/2010/wordprocessingGroup" xmlns:wpi="http://schemas.microsoft.com/office/word/2010/wordprocessingInk" xmlns:wne="http://schemas.microsoft.com/office/word/2006/wordml" xmlns:wps="http://schemas.microsoft.com/office/word/2010/wordprocessingShape" mc:Ignorable="w14 w15 w16se wp14">
   <w:endnote w:type="separator" w:id="-1">
     <w:p>
       <w:pPr>
@@ -9136,8 +8907,18 @@
 </w:endnotes>
 </file>
 
+<file path=word/footer1.xml><?xml version="1.0" encoding="utf-8"?>
+<w:ftr xmlns:wpc="http://schemas.microsoft.com/office/word/2010/wordprocessingCanvas" xmlns:cx="http://schemas.microsoft.com/office/drawing/2014/chartex" xmlns:mc="http://schemas.openxmlformats.org/markup-compatibility/2006" xmlns:o="urn:schemas-microsoft-com:office:office" xmlns:r="http://schemas.openxmlformats.org/officeDocument/2006/relationships" xmlns:m="http://schemas.openxmlformats.org/officeDocument/2006/math" xmlns:v="urn:schemas-microsoft-com:vml" xmlns:wp14="http://schemas.microsoft.com/office/word/2010/wordprocessingDrawing" xmlns:wp="http://schemas.openxmlformats.org/drawingml/2006/wordprocessingDrawing" xmlns:w10="urn:schemas-microsoft-com:office:word" xmlns:w="http://schemas.openxmlformats.org/wordprocessingml/2006/main" xmlns:w14="http://schemas.microsoft.com/office/word/2010/wordml" xmlns:w15="http://schemas.microsoft.com/office/word/2012/wordml" xmlns:w16se="http://schemas.microsoft.com/office/word/2015/wordml/symex" xmlns:wpg="http://schemas.microsoft.com/office/word/2010/wordprocessingGroup" xmlns:wpi="http://schemas.microsoft.com/office/word/2010/wordprocessingInk" xmlns:wne="http://schemas.microsoft.com/office/word/2006/wordml" xmlns:wps="http://schemas.microsoft.com/office/word/2010/wordprocessingShape" mc:Ignorable="w14 w15 w16se wp14">
+  <w:p>
+    <w:pPr>
+      <w:pStyle w:val="Footer"/>
+    </w:pPr>
+  </w:p>
+</w:ftr>
+</file>
+
 <file path=word/footnotes.xml><?xml version="1.0" encoding="utf-8"?>
-<w:footnotes xmlns:wpc="http://schemas.microsoft.com/office/word/2010/wordprocessingCanvas" xmlns:mc="http://schemas.openxmlformats.org/markup-compatibility/2006" xmlns:o="urn:schemas-microsoft-com:office:office" xmlns:r="http://schemas.openxmlformats.org/officeDocument/2006/relationships" xmlns:m="http://schemas.openxmlformats.org/officeDocument/2006/math" xmlns:v="urn:schemas-microsoft-com:vml" xmlns:wp14="http://schemas.microsoft.com/office/word/2010/wordprocessingDrawing" xmlns:wp="http://schemas.openxmlformats.org/drawingml/2006/wordprocessingDrawing" xmlns:w10="urn:schemas-microsoft-com:office:word" xmlns:w="http://schemas.openxmlformats.org/wordprocessingml/2006/main" xmlns:w14="http://schemas.microsoft.com/office/word/2010/wordml" xmlns:w15="http://schemas.microsoft.com/office/word/2012/wordml" xmlns:wpg="http://schemas.microsoft.com/office/word/2010/wordprocessingGroup" xmlns:wpi="http://schemas.microsoft.com/office/word/2010/wordprocessingInk" xmlns:wne="http://schemas.microsoft.com/office/word/2006/wordml" xmlns:wps="http://schemas.microsoft.com/office/word/2010/wordprocessingShape" mc:Ignorable="w14 w15 wp14">
+<w:footnotes xmlns:wpc="http://schemas.microsoft.com/office/word/2010/wordprocessingCanvas" xmlns:cx="http://schemas.microsoft.com/office/drawing/2014/chartex" xmlns:mc="http://schemas.openxmlformats.org/markup-compatibility/2006" xmlns:o="urn:schemas-microsoft-com:office:office" xmlns:r="http://schemas.openxmlformats.org/officeDocument/2006/relationships" xmlns:m="http://schemas.openxmlformats.org/officeDocument/2006/math" xmlns:v="urn:schemas-microsoft-com:vml" xmlns:wp14="http://schemas.microsoft.com/office/word/2010/wordprocessingDrawing" xmlns:wp="http://schemas.openxmlformats.org/drawingml/2006/wordprocessingDrawing" xmlns:w10="urn:schemas-microsoft-com:office:word" xmlns:w="http://schemas.openxmlformats.org/wordprocessingml/2006/main" xmlns:w14="http://schemas.microsoft.com/office/word/2010/wordml" xmlns:w15="http://schemas.microsoft.com/office/word/2012/wordml" xmlns:w16se="http://schemas.microsoft.com/office/word/2015/wordml/symex" xmlns:wpg="http://schemas.microsoft.com/office/word/2010/wordprocessingGroup" xmlns:wpi="http://schemas.microsoft.com/office/word/2010/wordprocessingInk" xmlns:wne="http://schemas.microsoft.com/office/word/2006/wordml" xmlns:wps="http://schemas.microsoft.com/office/word/2010/wordprocessingShape" mc:Ignorable="w14 w15 w16se wp14">
   <w:footnote w:type="separator" w:id="-1">
     <w:p>
       <w:pPr>
@@ -9162,26 +8943,10 @@
 </file>
 
 <file path=word/header1.xml><?xml version="1.0" encoding="utf-8"?>
-<w:hdr xmlns:wpc="http://schemas.microsoft.com/office/word/2010/wordprocessingCanvas" xmlns:mc="http://schemas.openxmlformats.org/markup-compatibility/2006" xmlns:o="urn:schemas-microsoft-com:office:office" xmlns:r="http://schemas.openxmlformats.org/officeDocument/2006/relationships" xmlns:m="http://schemas.openxmlformats.org/officeDocument/2006/math" xmlns:v="urn:schemas-microsoft-com:vml" xmlns:wp14="http://schemas.microsoft.com/office/word/2010/wordprocessingDrawing" xmlns:wp="http://schemas.openxmlformats.org/drawingml/2006/wordprocessingDrawing" xmlns:w10="urn:schemas-microsoft-com:office:word" xmlns:w="http://schemas.openxmlformats.org/wordprocessingml/2006/main" xmlns:w14="http://schemas.microsoft.com/office/word/2010/wordml" xmlns:w15="http://schemas.microsoft.com/office/word/2012/wordml" xmlns:wpg="http://schemas.microsoft.com/office/word/2010/wordprocessingGroup" xmlns:wpi="http://schemas.microsoft.com/office/word/2010/wordprocessingInk" xmlns:wne="http://schemas.microsoft.com/office/word/2006/wordml" xmlns:wps="http://schemas.microsoft.com/office/word/2010/wordprocessingShape" mc:Ignorable="w14 w15 wp14">
-  <w:p>
-    <w:pPr>
-      <w:pStyle w:val="Header"/>
-      <w:jc w:val="right"/>
-    </w:pPr>
-  </w:p>
-  <w:p>
-    <w:pPr>
-      <w:pStyle w:val="Header"/>
-    </w:pPr>
-  </w:p>
-</w:hdr>
-</file>
-
-<file path=word/header2.xml><?xml version="1.0" encoding="utf-8"?>
-<w:hdr xmlns:wpc="http://schemas.microsoft.com/office/word/2010/wordprocessingCanvas" xmlns:mc="http://schemas.openxmlformats.org/markup-compatibility/2006" xmlns:o="urn:schemas-microsoft-com:office:office" xmlns:r="http://schemas.openxmlformats.org/officeDocument/2006/relationships" xmlns:m="http://schemas.openxmlformats.org/officeDocument/2006/math" xmlns:v="urn:schemas-microsoft-com:vml" xmlns:wp14="http://schemas.microsoft.com/office/word/2010/wordprocessingDrawing" xmlns:wp="http://schemas.openxmlformats.org/drawingml/2006/wordprocessingDrawing" xmlns:w10="urn:schemas-microsoft-com:office:word" xmlns:w="http://schemas.openxmlformats.org/wordprocessingml/2006/main" xmlns:w14="http://schemas.microsoft.com/office/word/2010/wordml" xmlns:w15="http://schemas.microsoft.com/office/word/2012/wordml" xmlns:wpg="http://schemas.microsoft.com/office/word/2010/wordprocessingGroup" xmlns:wpi="http://schemas.microsoft.com/office/word/2010/wordprocessingInk" xmlns:wne="http://schemas.microsoft.com/office/word/2006/wordml" xmlns:wps="http://schemas.microsoft.com/office/word/2010/wordprocessingShape" mc:Ignorable="w14 w15 wp14">
+<w:hdr xmlns:wpc="http://schemas.microsoft.com/office/word/2010/wordprocessingCanvas" xmlns:cx="http://schemas.microsoft.com/office/drawing/2014/chartex" xmlns:mc="http://schemas.openxmlformats.org/markup-compatibility/2006" xmlns:o="urn:schemas-microsoft-com:office:office" xmlns:r="http://schemas.openxmlformats.org/officeDocument/2006/relationships" xmlns:m="http://schemas.openxmlformats.org/officeDocument/2006/math" xmlns:v="urn:schemas-microsoft-com:vml" xmlns:wp14="http://schemas.microsoft.com/office/word/2010/wordprocessingDrawing" xmlns:wp="http://schemas.openxmlformats.org/drawingml/2006/wordprocessingDrawing" xmlns:w10="urn:schemas-microsoft-com:office:word" xmlns:w="http://schemas.openxmlformats.org/wordprocessingml/2006/main" xmlns:w14="http://schemas.microsoft.com/office/word/2010/wordml" xmlns:w15="http://schemas.microsoft.com/office/word/2012/wordml" xmlns:w16se="http://schemas.microsoft.com/office/word/2015/wordml/symex" xmlns:wpg="http://schemas.microsoft.com/office/word/2010/wordprocessingGroup" xmlns:wpi="http://schemas.microsoft.com/office/word/2010/wordprocessingInk" xmlns:wne="http://schemas.microsoft.com/office/word/2006/wordml" xmlns:wps="http://schemas.microsoft.com/office/word/2010/wordprocessingShape" mc:Ignorable="w14 w15 w16se wp14">
   <w:sdt>
     <w:sdtPr>
-      <w:id w:val="1334344805"/>
+      <w:id w:val="101004192"/>
       <w:docPartObj>
         <w:docPartGallery w:val="Page Numbers (Top of Page)"/>
         <w:docPartUnique/>
@@ -9211,7 +8976,7 @@
           <w:rPr>
             <w:noProof/>
           </w:rPr>
-          <w:t>2</w:t>
+          <w:t>1</w:t>
         </w:r>
         <w:r>
           <w:rPr>
@@ -9231,8 +8996,8 @@
 </file>
 
 <file path=word/numbering.xml><?xml version="1.0" encoding="utf-8"?>
-<w:numbering xmlns:wpc="http://schemas.microsoft.com/office/word/2010/wordprocessingCanvas" xmlns:mc="http://schemas.openxmlformats.org/markup-compatibility/2006" xmlns:o="urn:schemas-microsoft-com:office:office" xmlns:r="http://schemas.openxmlformats.org/officeDocument/2006/relationships" xmlns:m="http://schemas.openxmlformats.org/officeDocument/2006/math" xmlns:v="urn:schemas-microsoft-com:vml" xmlns:wp14="http://schemas.microsoft.com/office/word/2010/wordprocessingDrawing" xmlns:wp="http://schemas.openxmlformats.org/drawingml/2006/wordprocessingDrawing" xmlns:w10="urn:schemas-microsoft-com:office:word" xmlns:w="http://schemas.openxmlformats.org/wordprocessingml/2006/main" xmlns:w14="http://schemas.microsoft.com/office/word/2010/wordml" xmlns:w15="http://schemas.microsoft.com/office/word/2012/wordml" xmlns:wpg="http://schemas.microsoft.com/office/word/2010/wordprocessingGroup" xmlns:wpi="http://schemas.microsoft.com/office/word/2010/wordprocessingInk" xmlns:wne="http://schemas.microsoft.com/office/word/2006/wordml" xmlns:wps="http://schemas.microsoft.com/office/word/2010/wordprocessingShape" mc:Ignorable="w14 w15 wp14">
-  <w:abstractNum w:abstractNumId="0">
+<w:numbering xmlns:wpc="http://schemas.microsoft.com/office/word/2010/wordprocessingCanvas" xmlns:cx="http://schemas.microsoft.com/office/drawing/2014/chartex" xmlns:mc="http://schemas.openxmlformats.org/markup-compatibility/2006" xmlns:o="urn:schemas-microsoft-com:office:office" xmlns:r="http://schemas.openxmlformats.org/officeDocument/2006/relationships" xmlns:m="http://schemas.openxmlformats.org/officeDocument/2006/math" xmlns:v="urn:schemas-microsoft-com:vml" xmlns:wp14="http://schemas.microsoft.com/office/word/2010/wordprocessingDrawing" xmlns:wp="http://schemas.openxmlformats.org/drawingml/2006/wordprocessingDrawing" xmlns:w10="urn:schemas-microsoft-com:office:word" xmlns:w="http://schemas.openxmlformats.org/wordprocessingml/2006/main" xmlns:w14="http://schemas.microsoft.com/office/word/2010/wordml" xmlns:w15="http://schemas.microsoft.com/office/word/2012/wordml" xmlns:w16se="http://schemas.microsoft.com/office/word/2015/wordml/symex" xmlns:wpg="http://schemas.microsoft.com/office/word/2010/wordprocessingGroup" xmlns:wpi="http://schemas.microsoft.com/office/word/2010/wordprocessingInk" xmlns:wne="http://schemas.microsoft.com/office/word/2006/wordml" xmlns:wps="http://schemas.microsoft.com/office/word/2010/wordprocessingShape" mc:Ignorable="w14 w15 w16se wp14">
+  <w:abstractNum w:abstractNumId="0" w15:restartNumberingAfterBreak="0">
     <w:nsid w:val="07C42043"/>
     <w:multiLevelType w:val="hybridMultilevel"/>
     <w:tmpl w:val="CBCE29BE"/>
@@ -9345,7 +9110,7 @@
       </w:rPr>
     </w:lvl>
   </w:abstractNum>
-  <w:abstractNum w:abstractNumId="1">
+  <w:abstractNum w:abstractNumId="1" w15:restartNumberingAfterBreak="0">
     <w:nsid w:val="09F77FF3"/>
     <w:multiLevelType w:val="multilevel"/>
     <w:tmpl w:val="AA724C18"/>
@@ -9431,7 +9196,7 @@
       </w:pPr>
     </w:lvl>
   </w:abstractNum>
-  <w:abstractNum w:abstractNumId="2">
+  <w:abstractNum w:abstractNumId="2" w15:restartNumberingAfterBreak="0">
     <w:nsid w:val="0A7C6CF6"/>
     <w:multiLevelType w:val="hybridMultilevel"/>
     <w:tmpl w:val="FB163A54"/>
@@ -9543,7 +9308,7 @@
       </w:rPr>
     </w:lvl>
   </w:abstractNum>
-  <w:abstractNum w:abstractNumId="3">
+  <w:abstractNum w:abstractNumId="3" w15:restartNumberingAfterBreak="0">
     <w:nsid w:val="1B4A09B0"/>
     <w:multiLevelType w:val="hybridMultilevel"/>
     <w:tmpl w:val="BD7A9A8E"/>
@@ -9632,7 +9397,7 @@
       </w:pPr>
     </w:lvl>
   </w:abstractNum>
-  <w:abstractNum w:abstractNumId="4">
+  <w:abstractNum w:abstractNumId="4" w15:restartNumberingAfterBreak="0">
     <w:nsid w:val="22793970"/>
     <w:multiLevelType w:val="hybridMultilevel"/>
     <w:tmpl w:val="62BEA5B4"/>
@@ -9745,7 +9510,7 @@
       </w:rPr>
     </w:lvl>
   </w:abstractNum>
-  <w:abstractNum w:abstractNumId="5">
+  <w:abstractNum w:abstractNumId="5" w15:restartNumberingAfterBreak="0">
     <w:nsid w:val="23570B90"/>
     <w:multiLevelType w:val="multilevel"/>
     <w:tmpl w:val="977264AE"/>
@@ -9831,7 +9596,7 @@
       </w:pPr>
     </w:lvl>
   </w:abstractNum>
-  <w:abstractNum w:abstractNumId="6">
+  <w:abstractNum w:abstractNumId="6" w15:restartNumberingAfterBreak="0">
     <w:nsid w:val="55085868"/>
     <w:multiLevelType w:val="hybridMultilevel"/>
     <w:tmpl w:val="D9343C62"/>
@@ -9920,7 +9685,7 @@
       </w:pPr>
     </w:lvl>
   </w:abstractNum>
-  <w:abstractNum w:abstractNumId="7">
+  <w:abstractNum w:abstractNumId="7" w15:restartNumberingAfterBreak="0">
     <w:nsid w:val="6EB2648F"/>
     <w:multiLevelType w:val="hybridMultilevel"/>
     <w:tmpl w:val="F5229D62"/>
@@ -10115,7 +9880,7 @@
 </file>
 
 <file path=word/styles.xml><?xml version="1.0" encoding="utf-8"?>
-<w:styles xmlns:mc="http://schemas.openxmlformats.org/markup-compatibility/2006" xmlns:r="http://schemas.openxmlformats.org/officeDocument/2006/relationships" xmlns:w="http://schemas.openxmlformats.org/wordprocessingml/2006/main" xmlns:w14="http://schemas.microsoft.com/office/word/2010/wordml" xmlns:w15="http://schemas.microsoft.com/office/word/2012/wordml" mc:Ignorable="w14 w15">
+<w:styles xmlns:mc="http://schemas.openxmlformats.org/markup-compatibility/2006" xmlns:r="http://schemas.openxmlformats.org/officeDocument/2006/relationships" xmlns:w="http://schemas.openxmlformats.org/wordprocessingml/2006/main" xmlns:w14="http://schemas.microsoft.com/office/word/2010/wordml" xmlns:w15="http://schemas.microsoft.com/office/word/2012/wordml" xmlns:w16se="http://schemas.microsoft.com/office/word/2015/wordml/symex" mc:Ignorable="w14 w15 w16se">
   <w:docDefaults>
     <w:rPrDefault>
       <w:rPr>
@@ -11068,7 +10833,6 @@
       <w14:ligatures w14:val="none"/>
     </w:rPr>
     <w:tblPr>
-      <w:tblInd w:w="0" w:type="dxa"/>
       <w:tblBorders>
         <w:top w:val="single" w:sz="4" w:space="0" w:color="000000" w:themeColor="text1"/>
         <w:left w:val="single" w:sz="4" w:space="0" w:color="000000" w:themeColor="text1"/>
@@ -11077,12 +10841,6 @@
         <w:insideH w:val="single" w:sz="4" w:space="0" w:color="000000" w:themeColor="text1"/>
         <w:insideV w:val="single" w:sz="4" w:space="0" w:color="000000" w:themeColor="text1"/>
       </w:tblBorders>
-      <w:tblCellMar>
-        <w:top w:w="0" w:type="dxa"/>
-        <w:left w:w="108" w:type="dxa"/>
-        <w:bottom w:w="0" w:type="dxa"/>
-        <w:right w:w="108" w:type="dxa"/>
-      </w:tblCellMar>
     </w:tblPr>
   </w:style>
   <w:style w:type="paragraph" w:customStyle="1" w:styleId="Pa9">
@@ -11601,7 +11359,7 @@
 </file>
 
 <file path=customXml/itemProps1.xml><?xml version="1.0" encoding="utf-8"?>
-<ds:datastoreItem xmlns:ds="http://schemas.openxmlformats.org/officeDocument/2006/customXml" ds:itemID="{0D8FDB82-5A2C-4E9A-8CDA-5E459930EAE0}">
+<ds:datastoreItem xmlns:ds="http://schemas.openxmlformats.org/officeDocument/2006/customXml" ds:itemID="{878782BE-0784-4965-8C81-40B33B035E47}">
   <ds:schemaRefs>
     <ds:schemaRef ds:uri="http://schemas.openxmlformats.org/officeDocument/2006/bibliography"/>
   </ds:schemaRefs>

</xml_diff>

<commit_message>
migration, included rationale of selection of study area, and updated significance of study into applied and theoretical significance, and updated numbering
</commit_message>
<xml_diff>
--- a/migration/Migration is one of the major component of population change which is basically cause by socio (1).docx
+++ b/migration/Migration is one of the major component of population change which is basically cause by socio (1).docx
@@ -3654,25 +3654,44 @@
     <w:p>
       <w:pPr>
         <w:pStyle w:val="BodyText"/>
-        <w:rPr>
-          <w:rFonts w:eastAsia="Times New Roman"/>
-          <w:lang w:eastAsia="en-US"/>
+      </w:pPr>
+      <w:bookmarkStart w:id="6" w:name="_Toc216936133"/>
+      <w:r>
+        <w:t xml:space="preserve">This research is highly significant as it provides a comprehensive investigation into the </w:t>
+      </w:r>
+      <w:r>
+        <w:t>causes, consequences, and socio-economic and demographic characteristics</w:t>
+      </w:r>
+      <w:r>
+        <w:t xml:space="preserve"> of migrants in Shankharapur Municipality Ward 9. Understanding these specific factors is critical for explaining the broader patterns and impacts of immigration within the context of </w:t>
+      </w:r>
+      <w:r>
+        <w:t>rapid urban transformation</w:t>
+      </w:r>
+      <w:r>
+        <w:t>.</w:t>
+      </w:r>
+    </w:p>
+    <w:p>
+      <w:pPr>
+        <w:spacing w:after="0" w:line="240" w:lineRule="auto"/>
+        <w:rPr>
+          <w:rFonts w:ascii="Times New Roman" w:eastAsia="Times New Roman" w:hAnsi="Times New Roman" w:cs="Times New Roman"/>
+          <w:kern w:val="0"/>
+          <w:lang w:eastAsia="en-US" w:bidi="ne-NP"/>
           <w14:ligatures w14:val="none"/>
         </w:rPr>
       </w:pPr>
       <w:r>
-        <w:t>This study is related to the investigating the causes and consequences as well as socio economic and demographic characteristics o</w:t>
-      </w:r>
-      <w:r>
-        <w:t>f migrants in the study area.</w:t>
-      </w:r>
-      <w:r>
-        <w:rPr>
-          <w:rFonts w:eastAsia="Times New Roman"/>
-          <w:lang w:eastAsia="en-US"/>
+        <w:rPr>
+          <w:rFonts w:ascii="Times New Roman" w:eastAsia="Times New Roman" w:hAnsi="Times New Roman" w:cs="Times New Roman"/>
+          <w:b/>
+          <w:bCs/>
+          <w:kern w:val="0"/>
+          <w:lang w:eastAsia="en-US" w:bidi="ne-NP"/>
           <w14:ligatures w14:val="none"/>
         </w:rPr>
-        <w:t xml:space="preserve"> </w:t>
+        <w:t>Theoretical Significance</w:t>
       </w:r>
     </w:p>
     <w:p>
@@ -3680,13 +3699,29 @@
         <w:pStyle w:val="BodyText"/>
       </w:pPr>
       <w:r>
-        <w:t xml:space="preserve">This study investigates the causes and consequences, as well as the socioeconomic and demographic characteristics of migrants in the study area. Understanding these factors is essential for explaining the patterns and impacts of </w:t>
-      </w:r>
-      <w:r>
-        <w:t>immigration</w:t>
-      </w:r>
-      <w:r>
-        <w:t xml:space="preserve"> in the context of rapid urban change.</w:t>
+        <w:t>On a theoretical level, this research adds to the academic body of knowledge by scrutinising the demographic trends and underlying drivers that fuel human movement in contemporary Nepal. While the sources suggest that identifying the causes of migration is often straightforward, this study seeks to perform the more complex task of evaluating the quality of the consequences through detailed, "sensible and eventful research". By exploring these patterns within the specific framework of rapid urban transformation, the study establishes a foundational reference for academics and provides a scholarly basis for future investigations into the relationship between migration and rural development.</w:t>
+      </w:r>
+    </w:p>
+    <w:p>
+      <w:pPr>
+        <w:spacing w:after="0" w:line="240" w:lineRule="auto"/>
+        <w:rPr>
+          <w:rFonts w:ascii="Times New Roman" w:eastAsia="Times New Roman" w:hAnsi="Times New Roman" w:cs="Times New Roman"/>
+          <w:kern w:val="0"/>
+          <w:lang w:eastAsia="en-US" w:bidi="ne-NP"/>
+          <w14:ligatures w14:val="none"/>
+        </w:rPr>
+      </w:pPr>
+      <w:r>
+        <w:rPr>
+          <w:rFonts w:ascii="Times New Roman" w:eastAsia="Times New Roman" w:hAnsi="Times New Roman" w:cs="Times New Roman"/>
+          <w:b/>
+          <w:bCs/>
+          <w:kern w:val="0"/>
+          <w:lang w:eastAsia="en-US" w:bidi="ne-NP"/>
+          <w14:ligatures w14:val="none"/>
+        </w:rPr>
+        <w:t>Applied Significance</w:t>
       </w:r>
     </w:p>
     <w:p>
@@ -3694,64 +3729,23 @@
         <w:pStyle w:val="BodyText"/>
       </w:pPr>
       <w:r>
-        <w:t xml:space="preserve">The study has significance at both theoretical and applied levels. At the theoretical level, it contributes to existing literature by examining the demographic trends and underlying drivers of </w:t>
-      </w:r>
-      <w:r>
-        <w:t>immigration</w:t>
-      </w:r>
-      <w:r>
-        <w:t xml:space="preserve">. At the applied level, the findings provide practical insights for planners, policymakers, and development professionals to better address the causes and consequences of </w:t>
-      </w:r>
-      <w:r>
-        <w:t>immigration</w:t>
-      </w:r>
-      <w:r>
-        <w:t xml:space="preserve"> and to promote improved living conditions.</w:t>
+        <w:t xml:space="preserve">At the applied level, the findings offer functional insights for planners, policymakers, and development practitioners to better navigate the complexities of population shifts. By pinpointing the specific causes and consequences of immigration in Ward 9, the research facilitates the design of targeted interventions aimed at enhancing the living conditions of the local population. Furthermore, the study identifies localised dynamics that can be used to strengthen public participation and promote sustainable urban growth within the municipality. Ultimately, these practical outcomes are intended to help local authorities </w:t>
+      </w:r>
+      <w:r>
+        <w:lastRenderedPageBreak/>
+        <w:t>manage the continuous daily influx of migrants and the resulting pressure on social services and community security</w:t>
       </w:r>
     </w:p>
     <w:p>
       <w:pPr>
         <w:pStyle w:val="BodyText"/>
       </w:pPr>
-      <w:r>
-        <w:t xml:space="preserve">By identifying the major causes and consequences of </w:t>
-      </w:r>
-      <w:r>
-        <w:t>immigration</w:t>
-      </w:r>
-      <w:r>
-        <w:t>, the study supports the development of appropriate planning and policy responses. The findings are expected to assist planners and development practitioners in designing targeted interventions that respond to the challenges and opportunities created by population movement.</w:t>
-      </w:r>
-    </w:p>
-    <w:p>
-      <w:pPr>
-        <w:pStyle w:val="BodyText"/>
-      </w:pPr>
-      <w:r>
-        <w:t xml:space="preserve">Furthermore, the study highlights the specific dynamics of </w:t>
-      </w:r>
-      <w:r>
-        <w:t>immigration</w:t>
-      </w:r>
-      <w:r>
-        <w:t xml:space="preserve"> within the study area. In light of the findings, new perspectives may be identified to enhance public participation and accelerate sustainable urban development.</w:t>
-      </w:r>
-    </w:p>
-    <w:p>
-      <w:pPr>
-        <w:pStyle w:val="BodyText"/>
-      </w:pPr>
-      <w:r>
-        <w:t>Finally, this study provides a useful reference for academics and researchers and may serve as a foundation for further research on migration and urban development.</w:t>
-      </w:r>
     </w:p>
     <w:p>
       <w:pPr>
         <w:pStyle w:val="Heading2"/>
       </w:pPr>
-      <w:bookmarkStart w:id="6" w:name="_Toc216936133"/>
-      <w:r>
-        <w:lastRenderedPageBreak/>
+      <w:r>
         <w:t>1.5 Limitations of the study</w:t>
       </w:r>
       <w:bookmarkEnd w:id="6"/>
@@ -3798,7 +3792,11 @@
         <w:pStyle w:val="BodyText"/>
       </w:pPr>
       <w:r>
-        <w:t xml:space="preserve">The proposed study will be organized into five chapters. Chapter One will provide an introduction to the study, including the background, problem statement, objectives, rationale, significance, and limitations. Chapter Two will review the relevant literature on migration, with emphasis on its causes, consequences, and the demographic characteristics of migrants. Chapter Three will describe the research methodology, covering the study area, data sources, sampling techniques, and methods of data collection. Chapter Four will focus on the analysis and interpretation of the collected data. Finally, Chapter Five will present the summary of findings, conclusions, and practical recommendations based on the </w:t>
+        <w:t xml:space="preserve">The proposed study will be organized into five chapters. Chapter One will provide an introduction to the study, including the background, problem statement, objectives, rationale, significance, and limitations. Chapter Two will review the relevant literature on migration, with emphasis on its causes, consequences, and the demographic characteristics of migrants. Chapter Three will describe the research methodology, covering the study area, data sources, sampling techniques, and methods of data collection. Chapter Four will focus </w:t>
+      </w:r>
+      <w:r>
+        <w:lastRenderedPageBreak/>
+        <w:t xml:space="preserve">on the analysis and interpretation of the collected data. Finally, Chapter Five will present the summary of findings, conclusions, and practical recommendations based on the </w:t>
       </w:r>
       <w:r>
         <w:t xml:space="preserve">study. </w:t>
@@ -3857,7 +3855,8 @@
     </w:p>
     <w:p>
       <w:pPr>
-        <w:pStyle w:val="Heading1"/>
+        <w:pStyle w:val="Heading2"/>
+        <w:jc w:val="center"/>
         <w:rPr>
           <w:rStyle w:val="Strong"/>
           <w:b/>
@@ -4290,7 +4289,12 @@
       <w:bookmarkStart w:id="14" w:name="_Toc216936141"/>
       <w:r>
         <w:lastRenderedPageBreak/>
-        <w:t>2.5 Conceptual Framework</w:t>
+        <w:t>2.5 Conceptual F</w:t>
+      </w:r>
+      <w:bookmarkStart w:id="15" w:name="_GoBack"/>
+      <w:bookmarkEnd w:id="15"/>
+      <w:r>
+        <w:t>ramework</w:t>
       </w:r>
       <w:bookmarkEnd w:id="14"/>
     </w:p>
@@ -6206,14 +6210,27 @@
       <w:r>
         <w:t xml:space="preserve">Figure </w:t>
       </w:r>
-      <w:fldSimple w:instr=" SEQ Figure \* ARABIC ">
-        <w:r>
-          <w:rPr>
-            <w:noProof/>
-          </w:rPr>
-          <w:t>1</w:t>
-        </w:r>
-      </w:fldSimple>
+      <w:r>
+        <w:fldChar w:fldCharType="begin"/>
+      </w:r>
+      <w:r>
+        <w:instrText xml:space="preserve"> SEQ Figure \* ARABIC </w:instrText>
+      </w:r>
+      <w:r>
+        <w:fldChar w:fldCharType="separate"/>
+      </w:r>
+      <w:r>
+        <w:rPr>
+          <w:noProof/>
+        </w:rPr>
+        <w:t>1</w:t>
+      </w:r>
+      <w:r>
+        <w:rPr>
+          <w:noProof/>
+        </w:rPr>
+        <w:fldChar w:fldCharType="end"/>
+      </w:r>
       <w:r>
         <w:t xml:space="preserve"> Conceptual Framework of Migration Study</w:t>
       </w:r>
@@ -6318,7 +6335,7 @@
         </w:rPr>
         <w:br w:type="page"/>
       </w:r>
-      <w:bookmarkStart w:id="15" w:name="_Toc216936142"/>
+      <w:bookmarkStart w:id="16" w:name="_Toc216936142"/>
       <w:r>
         <w:rPr>
           <w:rStyle w:val="Strong"/>
@@ -6336,7 +6353,7 @@
         </w:rPr>
         <w:t>Three</w:t>
       </w:r>
-      <w:bookmarkEnd w:id="15"/>
+      <w:bookmarkEnd w:id="16"/>
     </w:p>
     <w:p>
       <w:pPr>
@@ -6349,7 +6366,7 @@
           <w:szCs w:val="38"/>
         </w:rPr>
       </w:pPr>
-      <w:bookmarkStart w:id="16" w:name="_Toc216936143"/>
+      <w:bookmarkStart w:id="17" w:name="_Toc216936143"/>
       <w:r>
         <w:rPr>
           <w:rStyle w:val="Strong"/>
@@ -6360,7 +6377,7 @@
         </w:rPr>
         <w:t>Research methodology</w:t>
       </w:r>
-      <w:bookmarkEnd w:id="16"/>
+      <w:bookmarkEnd w:id="17"/>
     </w:p>
     <w:p>
       <w:pPr>
@@ -6370,74 +6387,95 @@
         <w:t xml:space="preserve">3.1 </w:t>
       </w:r>
       <w:r>
-        <w:t>Rationale of Selection and Study Area</w:t>
-      </w:r>
-    </w:p>
-    <w:p>
-      <w:r>
-        <w:t>T</w:t>
-      </w:r>
-      <w:r>
-        <w:t>he study is focused on Ward No. 9 of Shankharapur Municipality, located in Sankhu, which sits in the northern part of the Kathmandu district.</w:t>
-      </w:r>
-    </w:p>
-    <w:p>
-      <w:r>
-        <w:t>• Geographic and Administrative Context: Shankharapur is a developing municipality within the capital city's periphery. It is situated in the Hill ecological zone and the Central development region of Nepal.</w:t>
-      </w:r>
-    </w:p>
-    <w:p>
-      <w:r>
-        <w:t>• Household Statistics: According to the 2024 municipality profile, there are a total of 843 households across the nine wards of Shankharapur. Specifically, Ward 9 contains 87 households, all of which have been selected as the focus for this research.</w:t>
-      </w:r>
-    </w:p>
-    <w:p>
-      <w:r>
-        <w:t>• Current Status: The area is currently experiencing a continuous, daily flow of in-migration, making it a dynamic environment for studying demographic shifts.</w:t>
-      </w:r>
-    </w:p>
-    <w:p>
-      <w:r>
-        <w:t>2</w:t>
-      </w:r>
-      <w:bookmarkStart w:id="17" w:name="_GoBack"/>
-      <w:bookmarkEnd w:id="17"/>
-      <w:r>
-        <w:t>. Rationale of Selection</w:t>
-      </w:r>
-    </w:p>
-    <w:p>
-      <w:r>
-        <w:t>The selection of Shankharapur Ward 9 as the study area is justified by several strategic and academic reasons found in the sources:</w:t>
-      </w:r>
-    </w:p>
-    <w:p>
-      <w:r>
-        <w:t>• High Migration Intensity: The ward is a primary destination for migrants seeking proximity to the capital, and it faces immediate positive and negative consequences of this movement that require sensible research to identify.</w:t>
-      </w:r>
-    </w:p>
-    <w:p>
-      <w:r>
-        <w:t>• Addressing the Research Gap: While many migration studies in Nepal are conducted at a macro or city-wide level, there is a lack of localized research focused specifically on individual wards like Ward 9. This study fills that gap by providing context-specific insights.</w:t>
-      </w:r>
-    </w:p>
-    <w:p>
-      <w:r>
-        <w:t>• Post-Earthquake Relevance: There is a need for recent data that reflects migration patterns following the massive destruction of the 2015 earthquake, which significantly altered human settlements in the region.</w:t>
-      </w:r>
-    </w:p>
-    <w:p>
-      <w:r>
-        <w:t>• Practical Utility for Planning: The findings will provide practical insights for local planners and policymakers to design targeted interventions, improve living conditions, and manage the pressure on social services and security in the ward.</w:t>
-      </w:r>
-    </w:p>
-    <w:p>
-      <w:r>
-        <w:t xml:space="preserve">• Feasibility and Research Design: Ward 9 was selected using a random sampling method from the district level. It was ultimately chosen for the study </w:t>
-      </w:r>
+        <w:t xml:space="preserve">Rationale </w:t>
+      </w:r>
+      <w:r>
+        <w:softHyphen/>
+      </w:r>
+      <w:r>
+        <w:softHyphen/>
+      </w:r>
+      <w:r>
+        <w:softHyphen/>
+      </w:r>
+      <w:r>
+        <w:t xml:space="preserve">of Selection </w:t>
+      </w:r>
+      <w:r>
+        <w:t xml:space="preserve">of </w:t>
+      </w:r>
+      <w:r>
+        <w:t>Study Area</w:t>
+      </w:r>
+    </w:p>
+    <w:p>
+      <w:pPr>
+        <w:pStyle w:val="BodyText"/>
+      </w:pPr>
+      <w:r>
+        <w:t>The choice of Shankharapur Municipality Ward 9 (Sankhu) as the focal point for this research is based on the following strategic justifications:</w:t>
+      </w:r>
+    </w:p>
+    <w:p>
+      <w:pPr>
+        <w:pStyle w:val="BodyText"/>
+        <w:rPr>
+          <w:lang w:eastAsia="en-US"/>
+        </w:rPr>
+      </w:pPr>
+      <w:r>
+        <w:t>Shankharapur is a rapidly developing municipality on the periphery of Kathmandu that is currently experiencing a continuous, daily influx of in-migrants. This constant population movement creates an immediate and high-priority need to investigate the resulting socio-economic and demographic consequences, whether positive or negative.</w:t>
+      </w:r>
+    </w:p>
+    <w:p>
+      <w:pPr>
+        <w:pStyle w:val="BodyText"/>
+        <w:rPr>
+          <w:lang w:eastAsia="en-US"/>
+        </w:rPr>
+      </w:pPr>
+      <w:r>
+        <w:t>The selection of Ward 9 is highly practical for a Master’s level study. With a total of 87 households, the ward provides a sample size that is manageable within the researcher's specific constraints of time, financial resources, and expert manpower, ensuring the study can be implemented with the required depth.</w:t>
+      </w:r>
+    </w:p>
+    <w:p>
+      <w:pPr>
+        <w:pStyle w:val="BodyText"/>
+        <w:rPr>
+          <w:lang w:eastAsia="en-US"/>
+        </w:rPr>
+      </w:pPr>
+      <w:r>
+        <w:t>To ensure the study remains objective and free from researcher bias, the area was chosen through a random sampling method from the Kathmandu district level. Subsequently, a purposive sampling method will be applied to draw relevant data from the migrant population within those households.</w:t>
+      </w:r>
+    </w:p>
+    <w:p>
+      <w:pPr>
+        <w:pStyle w:val="BodyText"/>
+        <w:rPr>
+          <w:lang w:eastAsia="en-US"/>
+        </w:rPr>
+      </w:pPr>
+      <w:r>
+        <w:t>Existing literature on migration in Nepal is largely dominated by macro-level or city-wide analyses. There is a significant lack of context-specific research that integrates demographic, socio-economic, and policy perspectives at a localised ward level, particularly in areas like Ward 9 that have seen shifts following the 2015 earthquake.</w:t>
+      </w:r>
+    </w:p>
+    <w:p>
+      <w:pPr>
+        <w:pStyle w:val="BodyText"/>
+        <w:rPr>
+          <w:lang w:eastAsia="en-US"/>
+        </w:rPr>
+      </w:pPr>
+      <w:r>
+        <w:t>This specific ward serves as an ideal "laboratory" to identify localised dynamics that can help planners and development practitioners design targeted interventions. The findings will identify new perspectives to enhance public participation and accelerate sustainable urban development within the municipality.</w:t>
+      </w:r>
+    </w:p>
+    <w:p/>
+    <w:p>
       <w:r>
         <w:lastRenderedPageBreak/>
-        <w:t>because its size (87 households) is manageable within the researcher's constraints of time, financial resources, and expert manpower.</w:t>
+        <w:softHyphen/>
       </w:r>
     </w:p>
     <w:p/>
@@ -6447,7 +6485,7 @@
       </w:pPr>
       <w:bookmarkStart w:id="18" w:name="_Toc216936144"/>
       <w:r>
-        <w:t>3.1</w:t>
+        <w:t>3.2</w:t>
       </w:r>
       <w:r>
         <w:t xml:space="preserve"> Research Design</w:t>
@@ -6477,6 +6515,9 @@
         <w:t>inmigration within the inmigrant</w:t>
       </w:r>
       <w:r>
+        <w:t>s</w:t>
+      </w:r>
+      <w:r>
         <w:t xml:space="preserve">. </w:t>
       </w:r>
     </w:p>
@@ -6486,7 +6527,7 @@
       </w:pPr>
       <w:bookmarkStart w:id="19" w:name="_Toc216936145"/>
       <w:r>
-        <w:t>3.2</w:t>
+        <w:t>3.3</w:t>
       </w:r>
       <w:r>
         <w:t xml:space="preserve"> </w:t>
@@ -6525,7 +6566,7 @@
       </w:r>
       <w:bookmarkStart w:id="20" w:name="_Toc216936146"/>
       <w:r>
-        <w:t>3.3</w:t>
+        <w:t>3.4</w:t>
       </w:r>
       <w:r>
         <w:t xml:space="preserve"> </w:t>
@@ -6636,7 +6677,7 @@
       </w:pPr>
       <w:bookmarkStart w:id="21" w:name="_Toc216936147"/>
       <w:r>
-        <w:t>3.4</w:t>
+        <w:t>3.5</w:t>
       </w:r>
       <w:r>
         <w:t xml:space="preserve"> </w:t>
@@ -6667,7 +6708,7 @@
       <w:bookmarkStart w:id="22" w:name="_Toc216936148"/>
       <w:r>
         <w:lastRenderedPageBreak/>
-        <w:t>3.4</w:t>
+        <w:t>3.5</w:t>
       </w:r>
       <w:r>
         <w:t xml:space="preserve">.1 </w:t>
@@ -6700,7 +6741,7 @@
       </w:pPr>
       <w:bookmarkStart w:id="23" w:name="_Toc216936149"/>
       <w:r>
-        <w:t>3.4</w:t>
+        <w:t>3.5</w:t>
       </w:r>
       <w:r>
         <w:t>.2 In</w:t>
@@ -6766,7 +6807,7 @@
       </w:pPr>
       <w:bookmarkStart w:id="24" w:name="_Toc216936150"/>
       <w:r>
-        <w:t>3.5</w:t>
+        <w:t>3.6</w:t>
       </w:r>
       <w:r>
         <w:t xml:space="preserve"> </w:t>
@@ -6790,7 +6831,7 @@
       </w:pPr>
       <w:bookmarkStart w:id="25" w:name="_Toc216936151"/>
       <w:r>
-        <w:t>3.6</w:t>
+        <w:t>3.7</w:t>
       </w:r>
       <w:r>
         <w:t xml:space="preserve"> </w:t>
@@ -7408,7 +7449,7 @@
           <w:rPr>
             <w:noProof/>
           </w:rPr>
-          <w:t>14</w:t>
+          <w:t>13</w:t>
         </w:r>
         <w:r>
           <w:rPr>
@@ -9648,7 +9689,6 @@
   <w:style w:type="character" w:default="1" w:styleId="DefaultParagraphFont">
     <w:name w:val="Default Paragraph Font"/>
     <w:uiPriority w:val="1"/>
-    <w:semiHidden/>
     <w:unhideWhenUsed/>
   </w:style>
   <w:style w:type="table" w:default="1" w:styleId="TableNormal">
@@ -10275,6 +10315,11 @@
       <w:i/>
       <w:iCs/>
     </w:rPr>
+  </w:style>
+  <w:style w:type="character" w:customStyle="1" w:styleId="ng-star-inserted">
+    <w:name w:val="ng-star-inserted"/>
+    <w:basedOn w:val="DefaultParagraphFont"/>
+    <w:rsid w:val="000F353B"/>
   </w:style>
 </w:styles>
 </file>
@@ -10974,7 +11019,7 @@
 </file>
 
 <file path=customXml/itemProps1.xml><?xml version="1.0" encoding="utf-8"?>
-<ds:datastoreItem xmlns:ds="http://schemas.openxmlformats.org/officeDocument/2006/customXml" ds:itemID="{25B2E9FE-1673-430B-A067-EDD5EF75A409}">
+<ds:datastoreItem xmlns:ds="http://schemas.openxmlformats.org/officeDocument/2006/customXml" ds:itemID="{297AA401-84EF-4C3C-8DAD-61DB877FFB6F}">
   <ds:schemaRefs>
     <ds:schemaRef ds:uri="http://schemas.openxmlformats.org/officeDocument/2006/bibliography"/>
   </ds:schemaRefs>

</xml_diff>

<commit_message>
devisthan sinchai and gh continue
</commit_message>
<xml_diff>
--- a/migration/Migration is one of the major component of population change which is basically cause by socio (1).docx
+++ b/migration/Migration is one of the major component of population change which is basically cause by socio (1).docx
@@ -10,8 +10,8 @@
           <w:rFonts w:ascii="Times New Roman" w:eastAsia="Times New Roman" w:hAnsi="Times New Roman" w:cs="Times New Roman"/>
           <w:b/>
           <w:bCs/>
-          <w:sz w:val="32"/>
-          <w:szCs w:val="32"/>
+          <w:sz w:val="28"/>
+          <w:szCs w:val="28"/>
           <w:shd w:val="clear" w:color="auto" w:fill="FFFFFF"/>
         </w:rPr>
       </w:pPr>
@@ -20,70 +20,56 @@
           <w:rFonts w:ascii="Times New Roman" w:eastAsia="Times New Roman" w:hAnsi="Times New Roman" w:cs="Times New Roman"/>
           <w:b/>
           <w:bCs/>
-          <w:sz w:val="32"/>
-          <w:szCs w:val="32"/>
+          <w:sz w:val="28"/>
+          <w:szCs w:val="28"/>
           <w:shd w:val="clear" w:color="auto" w:fill="FFFFFF"/>
         </w:rPr>
-        <w:t>STATUS OF IMMIGRATION</w:t>
-      </w:r>
-    </w:p>
-    <w:p>
-      <w:pPr>
-        <w:spacing w:after="0" w:line="360" w:lineRule="auto"/>
-        <w:jc w:val="center"/>
+        <w:t xml:space="preserve">CAUSES AND CONSEQUENCES OF </w:t>
+      </w:r>
+      <w:r>
         <w:rPr>
           <w:rFonts w:ascii="Times New Roman" w:eastAsia="Times New Roman" w:hAnsi="Times New Roman" w:cs="Times New Roman"/>
+          <w:b/>
+          <w:bCs/>
+          <w:sz w:val="28"/>
+          <w:szCs w:val="28"/>
           <w:shd w:val="clear" w:color="auto" w:fill="FFFFFF"/>
         </w:rPr>
-      </w:pPr>
-      <w:proofErr w:type="gramStart"/>
+        <w:t>IM</w:t>
+      </w:r>
       <w:r>
         <w:rPr>
           <w:rFonts w:ascii="Times New Roman" w:eastAsia="Times New Roman" w:hAnsi="Times New Roman" w:cs="Times New Roman"/>
+          <w:b/>
+          <w:bCs/>
+          <w:sz w:val="28"/>
+          <w:szCs w:val="28"/>
           <w:shd w:val="clear" w:color="auto" w:fill="FFFFFF"/>
         </w:rPr>
-        <w:t>( A</w:t>
-      </w:r>
-      <w:proofErr w:type="gramEnd"/>
+        <w:t>MIGRATION IN SHANKHARAPUR</w:t>
+      </w:r>
       <w:r>
         <w:rPr>
           <w:rFonts w:ascii="Times New Roman" w:eastAsia="Times New Roman" w:hAnsi="Times New Roman" w:cs="Times New Roman"/>
+          <w:b/>
+          <w:bCs/>
+          <w:sz w:val="28"/>
+          <w:szCs w:val="28"/>
           <w:shd w:val="clear" w:color="auto" w:fill="FFFFFF"/>
         </w:rPr>
-        <w:t xml:space="preserve"> CASE STUDY OF SHANKH</w:t>
+        <w:t xml:space="preserve"> WARD 9 OF KATHMANDU, </w:t>
       </w:r>
       <w:r>
         <w:rPr>
           <w:rFonts w:ascii="Times New Roman" w:eastAsia="Times New Roman" w:hAnsi="Times New Roman" w:cs="Times New Roman"/>
+          <w:b/>
+          <w:bCs/>
+          <w:sz w:val="28"/>
+          <w:szCs w:val="28"/>
           <w:shd w:val="clear" w:color="auto" w:fill="FFFFFF"/>
         </w:rPr>
-        <w:softHyphen/>
-      </w:r>
-      <w:r>
-        <w:rPr>
-          <w:rFonts w:ascii="Times New Roman" w:eastAsia="Times New Roman" w:hAnsi="Times New Roman" w:cs="Times New Roman"/>
-          <w:shd w:val="clear" w:color="auto" w:fill="FFFFFF"/>
-        </w:rPr>
-        <w:softHyphen/>
-      </w:r>
-      <w:r>
-        <w:rPr>
-          <w:rFonts w:ascii="Times New Roman" w:eastAsia="Times New Roman" w:hAnsi="Times New Roman" w:cs="Times New Roman"/>
-          <w:shd w:val="clear" w:color="auto" w:fill="FFFFFF"/>
-        </w:rPr>
-        <w:t>ARAPUR MUNICIPALITY WARD 9, SANKHU )</w:t>
-      </w:r>
-    </w:p>
-    <w:p>
-      <w:pPr>
-        <w:spacing w:after="0" w:line="360" w:lineRule="auto"/>
-        <w:rPr>
-          <w:rFonts w:ascii="Times New Roman" w:eastAsia="Times New Roman" w:hAnsi="Times New Roman" w:cs="Times New Roman"/>
-          <w:sz w:val="32"/>
-          <w:szCs w:val="32"/>
-          <w:shd w:val="clear" w:color="auto" w:fill="FFFFFF"/>
-        </w:rPr>
-      </w:pPr>
+        <w:t>NEPAL</w:t>
+      </w:r>
     </w:p>
     <w:p>
       <w:pPr>
@@ -1020,7 +1006,7 @@
           <w:r>
             <w:fldChar w:fldCharType="separate"/>
           </w:r>
-          <w:hyperlink w:anchor="_Toc217624801" w:history="1">
+          <w:hyperlink w:anchor="_Toc220841251" w:history="1">
             <w:r>
               <w:rPr>
                 <w:rStyle w:val="Hyperlink"/>
@@ -1047,7 +1033,7 @@
                 <w:noProof/>
                 <w:webHidden/>
               </w:rPr>
-              <w:instrText xml:space="preserve"> PAGEREF _Toc217624801 \h </w:instrText>
+              <w:instrText xml:space="preserve"> PAGEREF _Toc220841251 \h </w:instrText>
             </w:r>
             <w:r>
               <w:rPr>
@@ -1094,7 +1080,7 @@
               <w14:ligatures w14:val="none"/>
             </w:rPr>
           </w:pPr>
-          <w:hyperlink w:anchor="_Toc217624802" w:history="1">
+          <w:hyperlink w:anchor="_Toc220841252" w:history="1">
             <w:r>
               <w:rPr>
                 <w:rStyle w:val="Hyperlink"/>
@@ -1121,7 +1107,7 @@
                 <w:noProof/>
                 <w:webHidden/>
               </w:rPr>
-              <w:instrText xml:space="preserve"> PAGEREF _Toc217624802 \h </w:instrText>
+              <w:instrText xml:space="preserve"> PAGEREF _Toc220841252 \h </w:instrText>
             </w:r>
             <w:r>
               <w:rPr>
@@ -1168,7 +1154,7 @@
               <w14:ligatures w14:val="none"/>
             </w:rPr>
           </w:pPr>
-          <w:hyperlink w:anchor="_Toc217624803" w:history="1">
+          <w:hyperlink w:anchor="_Toc220841253" w:history="1">
             <w:r>
               <w:rPr>
                 <w:rStyle w:val="Hyperlink"/>
@@ -1195,7 +1181,7 @@
                 <w:noProof/>
                 <w:webHidden/>
               </w:rPr>
-              <w:instrText xml:space="preserve"> PAGEREF _Toc217624803 \h </w:instrText>
+              <w:instrText xml:space="preserve"> PAGEREF _Toc220841253 \h </w:instrText>
             </w:r>
             <w:r>
               <w:rPr>
@@ -1242,7 +1228,7 @@
               <w14:ligatures w14:val="none"/>
             </w:rPr>
           </w:pPr>
-          <w:hyperlink w:anchor="_Toc217624804" w:history="1">
+          <w:hyperlink w:anchor="_Toc220841254" w:history="1">
             <w:r>
               <w:rPr>
                 <w:rStyle w:val="Hyperlink"/>
@@ -1269,7 +1255,7 @@
                 <w:noProof/>
                 <w:webHidden/>
               </w:rPr>
-              <w:instrText xml:space="preserve"> PAGEREF _Toc217624804 \h </w:instrText>
+              <w:instrText xml:space="preserve"> PAGEREF _Toc220841254 \h </w:instrText>
             </w:r>
             <w:r>
               <w:rPr>
@@ -1316,7 +1302,7 @@
               <w14:ligatures w14:val="none"/>
             </w:rPr>
           </w:pPr>
-          <w:hyperlink w:anchor="_Toc217624805" w:history="1">
+          <w:hyperlink w:anchor="_Toc220841255" w:history="1">
             <w:r>
               <w:rPr>
                 <w:rStyle w:val="Hyperlink"/>
@@ -1343,7 +1329,7 @@
                 <w:noProof/>
                 <w:webHidden/>
               </w:rPr>
-              <w:instrText xml:space="preserve"> PAGEREF _Toc217624805 \h </w:instrText>
+              <w:instrText xml:space="preserve"> PAGEREF _Toc220841255 \h </w:instrText>
             </w:r>
             <w:r>
               <w:rPr>
@@ -1390,7 +1376,7 @@
               <w14:ligatures w14:val="none"/>
             </w:rPr>
           </w:pPr>
-          <w:hyperlink w:anchor="_Toc217624806" w:history="1">
+          <w:hyperlink w:anchor="_Toc220841256" w:history="1">
             <w:r>
               <w:rPr>
                 <w:rStyle w:val="Hyperlink"/>
@@ -1417,7 +1403,7 @@
                 <w:noProof/>
                 <w:webHidden/>
               </w:rPr>
-              <w:instrText xml:space="preserve"> PAGEREF _Toc217624806 \h </w:instrText>
+              <w:instrText xml:space="preserve"> PAGEREF _Toc220841256 \h </w:instrText>
             </w:r>
             <w:r>
               <w:rPr>
@@ -1464,13 +1450,13 @@
               <w14:ligatures w14:val="none"/>
             </w:rPr>
           </w:pPr>
-          <w:hyperlink w:anchor="_Toc217624807" w:history="1">
+          <w:hyperlink w:anchor="_Toc220841257" w:history="1">
             <w:r>
               <w:rPr>
                 <w:rStyle w:val="Hyperlink"/>
                 <w:noProof/>
               </w:rPr>
-              <w:t>1.5 Limitations of the study</w:t>
+              <w:t>1.5 Rationale of Selection of Study Area</w:t>
             </w:r>
             <w:r>
               <w:rPr>
@@ -1491,7 +1477,7 @@
                 <w:noProof/>
                 <w:webHidden/>
               </w:rPr>
-              <w:instrText xml:space="preserve"> PAGEREF _Toc217624807 \h </w:instrText>
+              <w:instrText xml:space="preserve"> PAGEREF _Toc220841257 \h </w:instrText>
             </w:r>
             <w:r>
               <w:rPr>
@@ -1538,13 +1524,13 @@
               <w14:ligatures w14:val="none"/>
             </w:rPr>
           </w:pPr>
-          <w:hyperlink w:anchor="_Toc217624808" w:history="1">
+          <w:hyperlink w:anchor="_Toc220841258" w:history="1">
             <w:r>
               <w:rPr>
                 <w:rStyle w:val="Hyperlink"/>
                 <w:noProof/>
               </w:rPr>
-              <w:t>1.6 Organization of the Study</w:t>
+              <w:t>1.6 Limitations of the study</w:t>
             </w:r>
             <w:r>
               <w:rPr>
@@ -1565,7 +1551,7 @@
                 <w:noProof/>
                 <w:webHidden/>
               </w:rPr>
-              <w:instrText xml:space="preserve"> PAGEREF _Toc217624808 \h </w:instrText>
+              <w:instrText xml:space="preserve"> PAGEREF _Toc220841258 \h </w:instrText>
             </w:r>
             <w:r>
               <w:rPr>
@@ -1585,7 +1571,81 @@
                 <w:noProof/>
                 <w:webHidden/>
               </w:rPr>
-              <w:t>6</w:t>
+              <w:t>7</w:t>
+            </w:r>
+            <w:r>
+              <w:rPr>
+                <w:noProof/>
+                <w:webHidden/>
+              </w:rPr>
+              <w:fldChar w:fldCharType="end"/>
+            </w:r>
+          </w:hyperlink>
+        </w:p>
+        <w:p>
+          <w:pPr>
+            <w:pStyle w:val="TOC2"/>
+            <w:tabs>
+              <w:tab w:val="right" w:pos="8630"/>
+            </w:tabs>
+            <w:rPr>
+              <w:rFonts w:cs="Mangal"/>
+              <w:noProof/>
+              <w:kern w:val="0"/>
+              <w:sz w:val="22"/>
+              <w:szCs w:val="20"/>
+              <w:lang w:eastAsia="en-US" w:bidi="ne-NP"/>
+              <w14:ligatures w14:val="none"/>
+            </w:rPr>
+          </w:pPr>
+          <w:hyperlink w:anchor="_Toc220841259" w:history="1">
+            <w:r>
+              <w:rPr>
+                <w:rStyle w:val="Hyperlink"/>
+                <w:noProof/>
+              </w:rPr>
+              <w:t>1.7 Organization of the Study</w:t>
+            </w:r>
+            <w:r>
+              <w:rPr>
+                <w:noProof/>
+                <w:webHidden/>
+              </w:rPr>
+              <w:tab/>
+            </w:r>
+            <w:r>
+              <w:rPr>
+                <w:noProof/>
+                <w:webHidden/>
+              </w:rPr>
+              <w:fldChar w:fldCharType="begin"/>
+            </w:r>
+            <w:r>
+              <w:rPr>
+                <w:noProof/>
+                <w:webHidden/>
+              </w:rPr>
+              <w:instrText xml:space="preserve"> PAGEREF _Toc220841259 \h </w:instrText>
+            </w:r>
+            <w:r>
+              <w:rPr>
+                <w:noProof/>
+                <w:webHidden/>
+              </w:rPr>
+            </w:r>
+            <w:r>
+              <w:rPr>
+                <w:noProof/>
+                <w:webHidden/>
+              </w:rPr>
+              <w:fldChar w:fldCharType="separate"/>
+            </w:r>
+            <w:r>
+              <w:rPr>
+                <w:noProof/>
+                <w:webHidden/>
+              </w:rPr>
+              <w:t>7</w:t>
             </w:r>
             <w:r>
               <w:rPr>
@@ -1612,7 +1672,7 @@
               <w14:ligatures w14:val="none"/>
             </w:rPr>
           </w:pPr>
-          <w:hyperlink w:anchor="_Toc217624809" w:history="1">
+          <w:hyperlink w:anchor="_Toc220841260" w:history="1">
             <w:r>
               <w:rPr>
                 <w:rStyle w:val="Hyperlink"/>
@@ -1639,7 +1699,7 @@
                 <w:noProof/>
                 <w:webHidden/>
               </w:rPr>
-              <w:instrText xml:space="preserve"> PAGEREF _Toc217624809 \h </w:instrText>
+              <w:instrText xml:space="preserve"> PAGEREF _Toc220841260 \h </w:instrText>
             </w:r>
             <w:r>
               <w:rPr>
@@ -1659,7 +1719,7 @@
                 <w:noProof/>
                 <w:webHidden/>
               </w:rPr>
-              <w:t>7</w:t>
+              <w:t>8</w:t>
             </w:r>
             <w:r>
               <w:rPr>
@@ -1686,7 +1746,7 @@
               <w14:ligatures w14:val="none"/>
             </w:rPr>
           </w:pPr>
-          <w:hyperlink w:anchor="_Toc217624810" w:history="1">
+          <w:hyperlink w:anchor="_Toc220841261" w:history="1">
             <w:r>
               <w:rPr>
                 <w:rStyle w:val="Hyperlink"/>
@@ -1713,7 +1773,7 @@
                 <w:noProof/>
                 <w:webHidden/>
               </w:rPr>
-              <w:instrText xml:space="preserve"> PAGEREF _Toc217624810 \h </w:instrText>
+              <w:instrText xml:space="preserve"> PAGEREF _Toc220841261 \h </w:instrText>
             </w:r>
             <w:r>
               <w:rPr>
@@ -1733,7 +1793,7 @@
                 <w:noProof/>
                 <w:webHidden/>
               </w:rPr>
-              <w:t>7</w:t>
+              <w:t>8</w:t>
             </w:r>
             <w:r>
               <w:rPr>
@@ -1760,7 +1820,7 @@
               <w14:ligatures w14:val="none"/>
             </w:rPr>
           </w:pPr>
-          <w:hyperlink w:anchor="_Toc217624811" w:history="1">
+          <w:hyperlink w:anchor="_Toc220841262" w:history="1">
             <w:r>
               <w:rPr>
                 <w:rStyle w:val="Hyperlink"/>
@@ -1787,7 +1847,7 @@
                 <w:noProof/>
                 <w:webHidden/>
               </w:rPr>
-              <w:instrText xml:space="preserve"> PAGEREF _Toc217624811 \h </w:instrText>
+              <w:instrText xml:space="preserve"> PAGEREF _Toc220841262 \h </w:instrText>
             </w:r>
             <w:r>
               <w:rPr>
@@ -1807,7 +1867,7 @@
                 <w:noProof/>
                 <w:webHidden/>
               </w:rPr>
-              <w:t>10</w:t>
+              <w:t>11</w:t>
             </w:r>
             <w:r>
               <w:rPr>
@@ -1834,7 +1894,7 @@
               <w14:ligatures w14:val="none"/>
             </w:rPr>
           </w:pPr>
-          <w:hyperlink w:anchor="_Toc217624812" w:history="1">
+          <w:hyperlink w:anchor="_Toc220841263" w:history="1">
             <w:r>
               <w:rPr>
                 <w:rStyle w:val="Hyperlink"/>
@@ -1861,7 +1921,7 @@
                 <w:noProof/>
                 <w:webHidden/>
               </w:rPr>
-              <w:instrText xml:space="preserve"> PAGEREF _Toc217624812 \h </w:instrText>
+              <w:instrText xml:space="preserve"> PAGEREF _Toc220841263 \h </w:instrText>
             </w:r>
             <w:r>
               <w:rPr>
@@ -1881,7 +1941,7 @@
                 <w:noProof/>
                 <w:webHidden/>
               </w:rPr>
-              <w:t>10</w:t>
+              <w:t>11</w:t>
             </w:r>
             <w:r>
               <w:rPr>
@@ -1908,7 +1968,7 @@
               <w14:ligatures w14:val="none"/>
             </w:rPr>
           </w:pPr>
-          <w:hyperlink w:anchor="_Toc217624813" w:history="1">
+          <w:hyperlink w:anchor="_Toc220841264" w:history="1">
             <w:r>
               <w:rPr>
                 <w:rStyle w:val="Hyperlink"/>
@@ -1935,7 +1995,7 @@
                 <w:noProof/>
                 <w:webHidden/>
               </w:rPr>
-              <w:instrText xml:space="preserve"> PAGEREF _Toc217624813 \h </w:instrText>
+              <w:instrText xml:space="preserve"> PAGEREF _Toc220841264 \h </w:instrText>
             </w:r>
             <w:r>
               <w:rPr>
@@ -1955,7 +2015,7 @@
                 <w:noProof/>
                 <w:webHidden/>
               </w:rPr>
-              <w:t>11</w:t>
+              <w:t>12</w:t>
             </w:r>
             <w:r>
               <w:rPr>
@@ -1982,7 +2042,7 @@
               <w14:ligatures w14:val="none"/>
             </w:rPr>
           </w:pPr>
-          <w:hyperlink w:anchor="_Toc217624814" w:history="1">
+          <w:hyperlink w:anchor="_Toc220841265" w:history="1">
             <w:r>
               <w:rPr>
                 <w:rStyle w:val="Hyperlink"/>
@@ -2009,7 +2069,7 @@
                 <w:noProof/>
                 <w:webHidden/>
               </w:rPr>
-              <w:instrText xml:space="preserve"> PAGEREF _Toc217624814 \h </w:instrText>
+              <w:instrText xml:space="preserve"> PAGEREF _Toc220841265 \h </w:instrText>
             </w:r>
             <w:r>
               <w:rPr>
@@ -2029,7 +2089,7 @@
                 <w:noProof/>
                 <w:webHidden/>
               </w:rPr>
-              <w:t>11</w:t>
+              <w:t>12</w:t>
             </w:r>
             <w:r>
               <w:rPr>
@@ -2056,7 +2116,7 @@
               <w14:ligatures w14:val="none"/>
             </w:rPr>
           </w:pPr>
-          <w:hyperlink w:anchor="_Toc217624815" w:history="1">
+          <w:hyperlink w:anchor="_Toc220841266" w:history="1">
             <w:r>
               <w:rPr>
                 <w:rStyle w:val="Hyperlink"/>
@@ -2083,7 +2143,7 @@
                 <w:noProof/>
                 <w:webHidden/>
               </w:rPr>
-              <w:instrText xml:space="preserve"> PAGEREF _Toc217624815 \h </w:instrText>
+              <w:instrText xml:space="preserve"> PAGEREF _Toc220841266 \h </w:instrText>
             </w:r>
             <w:r>
               <w:rPr>
@@ -2103,7 +2163,7 @@
                 <w:noProof/>
                 <w:webHidden/>
               </w:rPr>
-              <w:t>12</w:t>
+              <w:t>13</w:t>
             </w:r>
             <w:r>
               <w:rPr>
@@ -2130,7 +2190,7 @@
               <w14:ligatures w14:val="none"/>
             </w:rPr>
           </w:pPr>
-          <w:hyperlink w:anchor="_Toc217624816" w:history="1">
+          <w:hyperlink w:anchor="_Toc220841267" w:history="1">
             <w:r>
               <w:rPr>
                 <w:rStyle w:val="Hyperlink"/>
@@ -2157,7 +2217,7 @@
                 <w:noProof/>
                 <w:webHidden/>
               </w:rPr>
-              <w:instrText xml:space="preserve"> PAGEREF _Toc217624816 \h </w:instrText>
+              <w:instrText xml:space="preserve"> PAGEREF _Toc220841267 \h </w:instrText>
             </w:r>
             <w:r>
               <w:rPr>
@@ -2177,7 +2237,7 @@
                 <w:noProof/>
                 <w:webHidden/>
               </w:rPr>
-              <w:t>13</w:t>
+              <w:t>14</w:t>
             </w:r>
             <w:r>
               <w:rPr>
@@ -2204,7 +2264,7 @@
               <w14:ligatures w14:val="none"/>
             </w:rPr>
           </w:pPr>
-          <w:hyperlink w:anchor="_Toc217624817" w:history="1">
+          <w:hyperlink w:anchor="_Toc220841268" w:history="1">
             <w:r>
               <w:rPr>
                 <w:rStyle w:val="Hyperlink"/>
@@ -2231,7 +2291,7 @@
                 <w:noProof/>
                 <w:webHidden/>
               </w:rPr>
-              <w:instrText xml:space="preserve"> PAGEREF _Toc217624817 \h </w:instrText>
+              <w:instrText xml:space="preserve"> PAGEREF _Toc220841268 \h </w:instrText>
             </w:r>
             <w:r>
               <w:rPr>
@@ -2251,7 +2311,7 @@
                 <w:noProof/>
                 <w:webHidden/>
               </w:rPr>
-              <w:t>13</w:t>
+              <w:t>14</w:t>
             </w:r>
             <w:r>
               <w:rPr>
@@ -2278,13 +2338,13 @@
               <w14:ligatures w14:val="none"/>
             </w:rPr>
           </w:pPr>
-          <w:hyperlink w:anchor="_Toc217624818" w:history="1">
+          <w:hyperlink w:anchor="_Toc220841269" w:history="1">
             <w:r>
               <w:rPr>
                 <w:rStyle w:val="Hyperlink"/>
                 <w:noProof/>
               </w:rPr>
-              <w:t>3.1 Rationale of Selection of Study Area</w:t>
+              <w:t>3.1 Research Design</w:t>
             </w:r>
             <w:r>
               <w:rPr>
@@ -2305,7 +2365,7 @@
                 <w:noProof/>
                 <w:webHidden/>
               </w:rPr>
-              <w:instrText xml:space="preserve"> PAGEREF _Toc217624818 \h </w:instrText>
+              <w:instrText xml:space="preserve"> PAGEREF _Toc220841269 \h </w:instrText>
             </w:r>
             <w:r>
               <w:rPr>
@@ -2325,7 +2385,7 @@
                 <w:noProof/>
                 <w:webHidden/>
               </w:rPr>
-              <w:t>13</w:t>
+              <w:t>14</w:t>
             </w:r>
             <w:r>
               <w:rPr>
@@ -2352,13 +2412,13 @@
               <w14:ligatures w14:val="none"/>
             </w:rPr>
           </w:pPr>
-          <w:hyperlink w:anchor="_Toc217624819" w:history="1">
+          <w:hyperlink w:anchor="_Toc220841270" w:history="1">
             <w:r>
               <w:rPr>
                 <w:rStyle w:val="Hyperlink"/>
                 <w:noProof/>
               </w:rPr>
-              <w:t>3.2 Research Design</w:t>
+              <w:t>3.2 Nature and source of data</w:t>
             </w:r>
             <w:r>
               <w:rPr>
@@ -2379,7 +2439,7 @@
                 <w:noProof/>
                 <w:webHidden/>
               </w:rPr>
-              <w:instrText xml:space="preserve"> PAGEREF _Toc217624819 \h </w:instrText>
+              <w:instrText xml:space="preserve"> PAGEREF _Toc220841270 \h </w:instrText>
             </w:r>
             <w:r>
               <w:rPr>
@@ -2426,13 +2486,13 @@
               <w14:ligatures w14:val="none"/>
             </w:rPr>
           </w:pPr>
-          <w:hyperlink w:anchor="_Toc217624820" w:history="1">
+          <w:hyperlink w:anchor="_Toc220841271" w:history="1">
             <w:r>
               <w:rPr>
                 <w:rStyle w:val="Hyperlink"/>
                 <w:noProof/>
               </w:rPr>
-              <w:t>3.3 Nature and source of data</w:t>
+              <w:t>3.3 Population and Sampling</w:t>
             </w:r>
             <w:r>
               <w:rPr>
@@ -2453,7 +2513,7 @@
                 <w:noProof/>
                 <w:webHidden/>
               </w:rPr>
-              <w:instrText xml:space="preserve"> PAGEREF _Toc217624820 \h </w:instrText>
+              <w:instrText xml:space="preserve"> PAGEREF _Toc220841271 \h </w:instrText>
             </w:r>
             <w:r>
               <w:rPr>
@@ -2500,13 +2560,13 @@
               <w14:ligatures w14:val="none"/>
             </w:rPr>
           </w:pPr>
-          <w:hyperlink w:anchor="_Toc217624821" w:history="1">
+          <w:hyperlink w:anchor="_Toc220841272" w:history="1">
             <w:r>
               <w:rPr>
                 <w:rStyle w:val="Hyperlink"/>
                 <w:noProof/>
               </w:rPr>
-              <w:t>3.4 Population and Sampling</w:t>
+              <w:t>3.4 Method of Data Collection</w:t>
             </w:r>
             <w:r>
               <w:rPr>
@@ -2527,7 +2587,7 @@
                 <w:noProof/>
                 <w:webHidden/>
               </w:rPr>
-              <w:instrText xml:space="preserve"> PAGEREF _Toc217624821 \h </w:instrText>
+              <w:instrText xml:space="preserve"> PAGEREF _Toc220841272 \h </w:instrText>
             </w:r>
             <w:r>
               <w:rPr>
@@ -2548,6 +2608,154 @@
                 <w:webHidden/>
               </w:rPr>
               <w:t>14</w:t>
+            </w:r>
+            <w:r>
+              <w:rPr>
+                <w:noProof/>
+                <w:webHidden/>
+              </w:rPr>
+              <w:fldChar w:fldCharType="end"/>
+            </w:r>
+          </w:hyperlink>
+        </w:p>
+        <w:p>
+          <w:pPr>
+            <w:pStyle w:val="TOC3"/>
+            <w:tabs>
+              <w:tab w:val="right" w:pos="8630"/>
+            </w:tabs>
+            <w:rPr>
+              <w:rFonts w:cs="Mangal"/>
+              <w:noProof/>
+              <w:kern w:val="0"/>
+              <w:sz w:val="22"/>
+              <w:szCs w:val="20"/>
+              <w:lang w:eastAsia="en-US" w:bidi="ne-NP"/>
+              <w14:ligatures w14:val="none"/>
+            </w:rPr>
+          </w:pPr>
+          <w:hyperlink w:anchor="_Toc220841273" w:history="1">
+            <w:r>
+              <w:rPr>
+                <w:rStyle w:val="Hyperlink"/>
+                <w:noProof/>
+              </w:rPr>
+              <w:t>3.4.1 Observation</w:t>
+            </w:r>
+            <w:r>
+              <w:rPr>
+                <w:noProof/>
+                <w:webHidden/>
+              </w:rPr>
+              <w:tab/>
+            </w:r>
+            <w:r>
+              <w:rPr>
+                <w:noProof/>
+                <w:webHidden/>
+              </w:rPr>
+              <w:fldChar w:fldCharType="begin"/>
+            </w:r>
+            <w:r>
+              <w:rPr>
+                <w:noProof/>
+                <w:webHidden/>
+              </w:rPr>
+              <w:instrText xml:space="preserve"> PAGEREF _Toc220841273 \h </w:instrText>
+            </w:r>
+            <w:r>
+              <w:rPr>
+                <w:noProof/>
+                <w:webHidden/>
+              </w:rPr>
+            </w:r>
+            <w:r>
+              <w:rPr>
+                <w:noProof/>
+                <w:webHidden/>
+              </w:rPr>
+              <w:fldChar w:fldCharType="separate"/>
+            </w:r>
+            <w:r>
+              <w:rPr>
+                <w:noProof/>
+                <w:webHidden/>
+              </w:rPr>
+              <w:t>15</w:t>
+            </w:r>
+            <w:r>
+              <w:rPr>
+                <w:noProof/>
+                <w:webHidden/>
+              </w:rPr>
+              <w:fldChar w:fldCharType="end"/>
+            </w:r>
+          </w:hyperlink>
+        </w:p>
+        <w:p>
+          <w:pPr>
+            <w:pStyle w:val="TOC3"/>
+            <w:tabs>
+              <w:tab w:val="right" w:pos="8630"/>
+            </w:tabs>
+            <w:rPr>
+              <w:rFonts w:cs="Mangal"/>
+              <w:noProof/>
+              <w:kern w:val="0"/>
+              <w:sz w:val="22"/>
+              <w:szCs w:val="20"/>
+              <w:lang w:eastAsia="en-US" w:bidi="ne-NP"/>
+              <w14:ligatures w14:val="none"/>
+            </w:rPr>
+          </w:pPr>
+          <w:hyperlink w:anchor="_Toc220841274" w:history="1">
+            <w:r>
+              <w:rPr>
+                <w:rStyle w:val="Hyperlink"/>
+                <w:noProof/>
+              </w:rPr>
+              <w:t>3.4.2 Interview</w:t>
+            </w:r>
+            <w:r>
+              <w:rPr>
+                <w:noProof/>
+                <w:webHidden/>
+              </w:rPr>
+              <w:tab/>
+            </w:r>
+            <w:r>
+              <w:rPr>
+                <w:noProof/>
+                <w:webHidden/>
+              </w:rPr>
+              <w:fldChar w:fldCharType="begin"/>
+            </w:r>
+            <w:r>
+              <w:rPr>
+                <w:noProof/>
+                <w:webHidden/>
+              </w:rPr>
+              <w:instrText xml:space="preserve"> PAGEREF _Toc220841274 \h </w:instrText>
+            </w:r>
+            <w:r>
+              <w:rPr>
+                <w:noProof/>
+                <w:webHidden/>
+              </w:rPr>
+            </w:r>
+            <w:r>
+              <w:rPr>
+                <w:noProof/>
+                <w:webHidden/>
+              </w:rPr>
+              <w:fldChar w:fldCharType="separate"/>
+            </w:r>
+            <w:r>
+              <w:rPr>
+                <w:noProof/>
+                <w:webHidden/>
+              </w:rPr>
+              <w:t>15</w:t>
             </w:r>
             <w:r>
               <w:rPr>
@@ -2574,13 +2782,13 @@
               <w14:ligatures w14:val="none"/>
             </w:rPr>
           </w:pPr>
-          <w:hyperlink w:anchor="_Toc217624822" w:history="1">
+          <w:hyperlink w:anchor="_Toc220841275" w:history="1">
             <w:r>
               <w:rPr>
                 <w:rStyle w:val="Hyperlink"/>
                 <w:noProof/>
               </w:rPr>
-              <w:t>3.5 Method of Data Collection</w:t>
+              <w:t>3.5 Data Analysis and Presentation</w:t>
             </w:r>
             <w:r>
               <w:rPr>
@@ -2601,155 +2809,7 @@
                 <w:noProof/>
                 <w:webHidden/>
               </w:rPr>
-              <w:instrText xml:space="preserve"> PAGEREF _Toc217624822 \h </w:instrText>
-            </w:r>
-            <w:r>
-              <w:rPr>
-                <w:noProof/>
-                <w:webHidden/>
-              </w:rPr>
-            </w:r>
-            <w:r>
-              <w:rPr>
-                <w:noProof/>
-                <w:webHidden/>
-              </w:rPr>
-              <w:fldChar w:fldCharType="separate"/>
-            </w:r>
-            <w:r>
-              <w:rPr>
-                <w:noProof/>
-                <w:webHidden/>
-              </w:rPr>
-              <w:t>14</w:t>
-            </w:r>
-            <w:r>
-              <w:rPr>
-                <w:noProof/>
-                <w:webHidden/>
-              </w:rPr>
-              <w:fldChar w:fldCharType="end"/>
-            </w:r>
-          </w:hyperlink>
-        </w:p>
-        <w:p>
-          <w:pPr>
-            <w:pStyle w:val="TOC3"/>
-            <w:tabs>
-              <w:tab w:val="right" w:pos="8630"/>
-            </w:tabs>
-            <w:rPr>
-              <w:rFonts w:cs="Mangal"/>
-              <w:noProof/>
-              <w:kern w:val="0"/>
-              <w:sz w:val="22"/>
-              <w:szCs w:val="20"/>
-              <w:lang w:eastAsia="en-US" w:bidi="ne-NP"/>
-              <w14:ligatures w14:val="none"/>
-            </w:rPr>
-          </w:pPr>
-          <w:hyperlink w:anchor="_Toc217624823" w:history="1">
-            <w:r>
-              <w:rPr>
-                <w:rStyle w:val="Hyperlink"/>
-                <w:noProof/>
-              </w:rPr>
-              <w:t>3.5.1 Observation</w:t>
-            </w:r>
-            <w:r>
-              <w:rPr>
-                <w:noProof/>
-                <w:webHidden/>
-              </w:rPr>
-              <w:tab/>
-            </w:r>
-            <w:r>
-              <w:rPr>
-                <w:noProof/>
-                <w:webHidden/>
-              </w:rPr>
-              <w:fldChar w:fldCharType="begin"/>
-            </w:r>
-            <w:r>
-              <w:rPr>
-                <w:noProof/>
-                <w:webHidden/>
-              </w:rPr>
-              <w:instrText xml:space="preserve"> PAGEREF _Toc217624823 \h </w:instrText>
-            </w:r>
-            <w:r>
-              <w:rPr>
-                <w:noProof/>
-                <w:webHidden/>
-              </w:rPr>
-            </w:r>
-            <w:r>
-              <w:rPr>
-                <w:noProof/>
-                <w:webHidden/>
-              </w:rPr>
-              <w:fldChar w:fldCharType="separate"/>
-            </w:r>
-            <w:r>
-              <w:rPr>
-                <w:noProof/>
-                <w:webHidden/>
-              </w:rPr>
-              <w:t>14</w:t>
-            </w:r>
-            <w:r>
-              <w:rPr>
-                <w:noProof/>
-                <w:webHidden/>
-              </w:rPr>
-              <w:fldChar w:fldCharType="end"/>
-            </w:r>
-          </w:hyperlink>
-        </w:p>
-        <w:p>
-          <w:pPr>
-            <w:pStyle w:val="TOC3"/>
-            <w:tabs>
-              <w:tab w:val="right" w:pos="8630"/>
-            </w:tabs>
-            <w:rPr>
-              <w:rFonts w:cs="Mangal"/>
-              <w:noProof/>
-              <w:kern w:val="0"/>
-              <w:sz w:val="22"/>
-              <w:szCs w:val="20"/>
-              <w:lang w:eastAsia="en-US" w:bidi="ne-NP"/>
-              <w14:ligatures w14:val="none"/>
-            </w:rPr>
-          </w:pPr>
-          <w:hyperlink w:anchor="_Toc217624824" w:history="1">
-            <w:r>
-              <w:rPr>
-                <w:rStyle w:val="Hyperlink"/>
-                <w:noProof/>
-              </w:rPr>
-              <w:t>3.5.2 Interview</w:t>
-            </w:r>
-            <w:r>
-              <w:rPr>
-                <w:noProof/>
-                <w:webHidden/>
-              </w:rPr>
-              <w:tab/>
-            </w:r>
-            <w:r>
-              <w:rPr>
-                <w:noProof/>
-                <w:webHidden/>
-              </w:rPr>
-              <w:fldChar w:fldCharType="begin"/>
-            </w:r>
-            <w:r>
-              <w:rPr>
-                <w:noProof/>
-                <w:webHidden/>
-              </w:rPr>
-              <w:instrText xml:space="preserve"> PAGEREF _Toc217624824 \h </w:instrText>
+              <w:instrText xml:space="preserve"> PAGEREF _Toc220841275 \h </w:instrText>
             </w:r>
             <w:r>
               <w:rPr>
@@ -2796,13 +2856,13 @@
               <w14:ligatures w14:val="none"/>
             </w:rPr>
           </w:pPr>
-          <w:hyperlink w:anchor="_Toc217624825" w:history="1">
+          <w:hyperlink w:anchor="_Toc220841276" w:history="1">
             <w:r>
               <w:rPr>
                 <w:rStyle w:val="Hyperlink"/>
                 <w:noProof/>
               </w:rPr>
-              <w:t>3.6 Data Analysis and Presentation</w:t>
+              <w:t>3.6 Ethical Consideration</w:t>
             </w:r>
             <w:r>
               <w:rPr>
@@ -2823,81 +2883,7 @@
                 <w:noProof/>
                 <w:webHidden/>
               </w:rPr>
-              <w:instrText xml:space="preserve"> PAGEREF _Toc217624825 \h </w:instrText>
-            </w:r>
-            <w:r>
-              <w:rPr>
-                <w:noProof/>
-                <w:webHidden/>
-              </w:rPr>
-            </w:r>
-            <w:r>
-              <w:rPr>
-                <w:noProof/>
-                <w:webHidden/>
-              </w:rPr>
-              <w:fldChar w:fldCharType="separate"/>
-            </w:r>
-            <w:r>
-              <w:rPr>
-                <w:noProof/>
-                <w:webHidden/>
-              </w:rPr>
-              <w:t>15</w:t>
-            </w:r>
-            <w:r>
-              <w:rPr>
-                <w:noProof/>
-                <w:webHidden/>
-              </w:rPr>
-              <w:fldChar w:fldCharType="end"/>
-            </w:r>
-          </w:hyperlink>
-        </w:p>
-        <w:p>
-          <w:pPr>
-            <w:pStyle w:val="TOC2"/>
-            <w:tabs>
-              <w:tab w:val="right" w:pos="8630"/>
-            </w:tabs>
-            <w:rPr>
-              <w:rFonts w:cs="Mangal"/>
-              <w:noProof/>
-              <w:kern w:val="0"/>
-              <w:sz w:val="22"/>
-              <w:szCs w:val="20"/>
-              <w:lang w:eastAsia="en-US" w:bidi="ne-NP"/>
-              <w14:ligatures w14:val="none"/>
-            </w:rPr>
-          </w:pPr>
-          <w:hyperlink w:anchor="_Toc217624826" w:history="1">
-            <w:r>
-              <w:rPr>
-                <w:rStyle w:val="Hyperlink"/>
-                <w:noProof/>
-              </w:rPr>
-              <w:t>3.7 Ethical Consideration</w:t>
-            </w:r>
-            <w:r>
-              <w:rPr>
-                <w:noProof/>
-                <w:webHidden/>
-              </w:rPr>
-              <w:tab/>
-            </w:r>
-            <w:r>
-              <w:rPr>
-                <w:noProof/>
-                <w:webHidden/>
-              </w:rPr>
-              <w:fldChar w:fldCharType="begin"/>
-            </w:r>
-            <w:r>
-              <w:rPr>
-                <w:noProof/>
-                <w:webHidden/>
-              </w:rPr>
-              <w:instrText xml:space="preserve"> PAGEREF _Toc217624826 \h </w:instrText>
+              <w:instrText xml:space="preserve"> PAGEREF _Toc220841276 \h </w:instrText>
             </w:r>
             <w:r>
               <w:rPr>
@@ -2944,7 +2930,7 @@
               <w14:ligatures w14:val="none"/>
             </w:rPr>
           </w:pPr>
-          <w:hyperlink w:anchor="_Toc217624827" w:history="1">
+          <w:hyperlink w:anchor="_Toc220841277" w:history="1">
             <w:r>
               <w:rPr>
                 <w:rStyle w:val="Hyperlink"/>
@@ -2971,7 +2957,7 @@
                 <w:noProof/>
                 <w:webHidden/>
               </w:rPr>
-              <w:instrText xml:space="preserve"> PAGEREF _Toc217624827 \h </w:instrText>
+              <w:instrText xml:space="preserve"> PAGEREF _Toc220841277 \h </w:instrText>
             </w:r>
             <w:r>
               <w:rPr>
@@ -3034,7 +3020,7 @@
           <w:bCs w:val="0"/>
         </w:rPr>
       </w:pPr>
-      <w:bookmarkStart w:id="1" w:name="_Toc217624801"/>
+      <w:bookmarkStart w:id="1" w:name="_Toc220841251"/>
       <w:r>
         <w:rPr>
           <w:rStyle w:val="Strong"/>
@@ -3062,7 +3048,7 @@
           <w:szCs w:val="38"/>
         </w:rPr>
       </w:pPr>
-      <w:bookmarkStart w:id="2" w:name="_Toc217624802"/>
+      <w:bookmarkStart w:id="2" w:name="_Toc220841252"/>
       <w:r>
         <w:rPr>
           <w:sz w:val="28"/>
@@ -3076,7 +3062,7 @@
       <w:pPr>
         <w:pStyle w:val="Heading2"/>
       </w:pPr>
-      <w:bookmarkStart w:id="3" w:name="_Toc217624803"/>
+      <w:bookmarkStart w:id="3" w:name="_Toc220841253"/>
       <w:r>
         <w:t>1.</w:t>
       </w:r>
@@ -3147,12 +3133,7 @@
         <w:t xml:space="preserve">Migration is not only the factor of population change there is other </w:t>
       </w:r>
       <w:r>
-        <w:t>biologic</w:t>
-      </w:r>
-      <w:bookmarkStart w:id="4" w:name="_GoBack"/>
-      <w:bookmarkEnd w:id="4"/>
-      <w:r>
-        <w:t>al factor</w:t>
+        <w:t>biological factor</w:t>
       </w:r>
       <w:r>
         <w:t xml:space="preserve"> namely fertility and mortality which have adverse effect in </w:t>
@@ -3510,7 +3491,7 @@
       <w:pPr>
         <w:pStyle w:val="Heading2"/>
       </w:pPr>
-      <w:bookmarkStart w:id="5" w:name="_Toc217624804"/>
+      <w:bookmarkStart w:id="4" w:name="_Toc220841254"/>
       <w:r>
         <w:lastRenderedPageBreak/>
         <w:t>1.2</w:t>
@@ -3524,180 +3505,221 @@
       <w:r>
         <w:t>roblem</w:t>
       </w:r>
+      <w:bookmarkEnd w:id="4"/>
+    </w:p>
+    <w:p>
+      <w:pPr>
+        <w:pStyle w:val="BodyText"/>
+      </w:pPr>
+      <w:r>
+        <w:t xml:space="preserve">The process of migration has been gradually intensifying the existing settlement problem as well as creating new problem both at the place of origin and the place of destination. Migration is an important component in the socio economic and demographic land space of Nepal. Terai still continues to be the main recipient of both the internal and international migrants. </w:t>
+      </w:r>
+      <w:r>
+        <w:t>Immigration</w:t>
+      </w:r>
+      <w:r>
+        <w:t xml:space="preserve"> is nowadays one of the major issues for most developing countries. Nepal is no exception and also suffering from the critical issues in migration. Nepal has culturally and ethically complex society where is the result of migration activities, which range in physical type and cultural from Indians in </w:t>
+      </w:r>
+      <w:r>
+        <w:t>south and Tibetan in the north.</w:t>
+      </w:r>
+    </w:p>
+    <w:p>
+      <w:pPr>
+        <w:pStyle w:val="BodyText"/>
+      </w:pPr>
+      <w:r>
+        <w:t xml:space="preserve">The cause of migration can easily be identified but it is very difficult to find out the quality of the consequences of migration. Migration has </w:t>
+      </w:r>
+      <w:r>
+        <w:t>short, medium and long-term</w:t>
+      </w:r>
+      <w:r>
+        <w:t xml:space="preserve"> effects show their evidence from so many </w:t>
+      </w:r>
+      <w:r>
+        <w:t>years'</w:t>
+      </w:r>
+      <w:r>
+        <w:t xml:space="preserve"> migration and accept them as part of culture and society. In such a case only a very sensible and eventful research can identify such consequences.</w:t>
+      </w:r>
+    </w:p>
+    <w:p>
+      <w:pPr>
+        <w:pStyle w:val="BodyText"/>
+      </w:pPr>
+      <w:r>
+        <w:t>Th</w:t>
+      </w:r>
+      <w:r>
+        <w:t xml:space="preserve">is study area is ward no. 9 of </w:t>
+      </w:r>
+      <w:proofErr w:type="spellStart"/>
+      <w:r>
+        <w:t>Shankharapur</w:t>
+      </w:r>
+      <w:proofErr w:type="spellEnd"/>
+      <w:r>
+        <w:t xml:space="preserve"> </w:t>
+      </w:r>
+      <w:r>
+        <w:t>M</w:t>
+      </w:r>
+      <w:r>
+        <w:t xml:space="preserve">unicipality which lies in the northern part of the country and of the developing municipality of capital city Kathmandu. This municipality is facing the continuous </w:t>
+      </w:r>
+      <w:r>
+        <w:t>flow of im</w:t>
+      </w:r>
+      <w:r>
+        <w:t>migration day by day which in turn have to faces many consequences that is positive or negative both side by side.</w:t>
+      </w:r>
+    </w:p>
+    <w:p>
+      <w:pPr>
+        <w:pStyle w:val="BodyText"/>
+        <w:rPr>
+          <w:color w:val="00B050"/>
+        </w:rPr>
+      </w:pPr>
+      <w:r>
+        <w:rPr>
+          <w:color w:val="00B050"/>
+        </w:rPr>
+        <w:t xml:space="preserve">What are the primary factors driving migration in </w:t>
+      </w:r>
+      <w:r>
+        <w:rPr>
+          <w:color w:val="00B050"/>
+        </w:rPr>
+        <w:t>the study area</w:t>
+      </w:r>
+      <w:r>
+        <w:rPr>
+          <w:color w:val="00B050"/>
+        </w:rPr>
+        <w:t xml:space="preserve">? </w:t>
+      </w:r>
+    </w:p>
+    <w:p>
+      <w:pPr>
+        <w:pStyle w:val="BodyText"/>
+        <w:rPr>
+          <w:color w:val="00B050"/>
+        </w:rPr>
+      </w:pPr>
+      <w:r>
+        <w:rPr>
+          <w:color w:val="00B050"/>
+        </w:rPr>
+        <w:t xml:space="preserve">How have patterns, trends, and forms of migration evolved over time? </w:t>
+      </w:r>
+    </w:p>
+    <w:p>
+      <w:pPr>
+        <w:pStyle w:val="BodyText"/>
+        <w:rPr>
+          <w:color w:val="00B050"/>
+        </w:rPr>
+      </w:pPr>
+      <w:r>
+        <w:rPr>
+          <w:color w:val="00B050"/>
+        </w:rPr>
+        <w:t xml:space="preserve">What are the social, economic, and political consequences of migration for </w:t>
+      </w:r>
+      <w:r>
+        <w:rPr>
+          <w:color w:val="00B050"/>
+        </w:rPr>
+        <w:t>destination area</w:t>
+      </w:r>
+      <w:r>
+        <w:rPr>
+          <w:color w:val="00B050"/>
+        </w:rPr>
+        <w:t>?</w:t>
+      </w:r>
+    </w:p>
+    <w:p>
+      <w:pPr>
+        <w:pStyle w:val="BodyText"/>
+      </w:pPr>
+      <w:r>
+        <w:t xml:space="preserve">So, the </w:t>
+      </w:r>
+      <w:r>
+        <w:t>main issue</w:t>
+      </w:r>
+      <w:r>
+        <w:t xml:space="preserve"> of this study is to examine the main trends, causes and consequences of </w:t>
+      </w:r>
+      <w:r>
+        <w:t>immigration</w:t>
+      </w:r>
+      <w:r>
+        <w:t xml:space="preserve"> in the study area.</w:t>
+      </w:r>
+      <w:bookmarkStart w:id="5" w:name="_GoBack"/>
       <w:bookmarkEnd w:id="5"/>
     </w:p>
     <w:p>
       <w:pPr>
+        <w:pStyle w:val="Heading2"/>
+      </w:pPr>
+      <w:bookmarkStart w:id="6" w:name="_Toc220841255"/>
+      <w:r>
+        <w:t>1.3</w:t>
+      </w:r>
+      <w:r>
+        <w:t xml:space="preserve"> </w:t>
+      </w:r>
+      <w:r>
+        <w:t>Objectives of the Study</w:t>
+      </w:r>
+      <w:bookmarkEnd w:id="6"/>
+      <w:r>
+        <w:t xml:space="preserve"> </w:t>
+      </w:r>
+    </w:p>
+    <w:p>
+      <w:pPr>
         <w:pStyle w:val="BodyText"/>
       </w:pPr>
       <w:r>
-        <w:t xml:space="preserve">The process of migration has been gradually intensifying the existing settlement problem as well as creating new problem both at the place of origin and the place of destination. Migration is an important component in the socio economic and demographic land space of Nepal. Terai still continues to be the main recipient of both the internal and international migrants. </w:t>
-      </w:r>
-      <w:r>
-        <w:t>Immigration</w:t>
-      </w:r>
-      <w:r>
-        <w:t xml:space="preserve"> is nowadays one of the major issues for most developing countries. Nepal is no exception and also suffering from the critical issues in migration. Nepal has culturally and ethically complex society where is the result of migration activities, which range in physical type and cultural from Indians in </w:t>
-      </w:r>
-      <w:r>
-        <w:t>south and Tibetan in the north.</w:t>
-      </w:r>
-    </w:p>
-    <w:p>
-      <w:pPr>
-        <w:pStyle w:val="BodyText"/>
-      </w:pPr>
-      <w:r>
-        <w:t xml:space="preserve">The cause of migration can easily be identified but it is very difficult to find out the quality of the consequences of migration. Migration has </w:t>
-      </w:r>
-      <w:r>
-        <w:t>short, medium and long-term</w:t>
-      </w:r>
-      <w:r>
-        <w:t xml:space="preserve"> effects show their evidence from so many </w:t>
-      </w:r>
-      <w:r>
-        <w:t>years'</w:t>
-      </w:r>
-      <w:r>
-        <w:t xml:space="preserve"> migration and accept them as part of culture and society. In such a case only a very sensible and eventful research can identify such consequences.</w:t>
-      </w:r>
-    </w:p>
-    <w:p>
-      <w:pPr>
-        <w:pStyle w:val="BodyText"/>
-      </w:pPr>
-      <w:r>
-        <w:t>Th</w:t>
-      </w:r>
-      <w:r>
-        <w:t xml:space="preserve">is study area is ward no. 9 of </w:t>
+        <w:t xml:space="preserve">The general objective of the study is to assess </w:t>
+      </w:r>
+      <w:r>
+        <w:t>the status,</w:t>
+      </w:r>
+      <w:r>
+        <w:t xml:space="preserve"> causes and consequences of im</w:t>
+      </w:r>
+      <w:r>
+        <w:t>migration</w:t>
+      </w:r>
+      <w:r>
+        <w:t xml:space="preserve"> </w:t>
+      </w:r>
+      <w:r>
+        <w:t xml:space="preserve">in </w:t>
       </w:r>
       <w:proofErr w:type="spellStart"/>
       <w:r>
-        <w:t>Shankharapur</w:t>
+        <w:t>S</w:t>
+      </w:r>
+      <w:r>
+        <w:t>h</w:t>
+      </w:r>
+      <w:r>
+        <w:t>ankharap</w:t>
+      </w:r>
+      <w:r>
+        <w:t>ur</w:t>
       </w:r>
       <w:proofErr w:type="spellEnd"/>
       <w:r>
-        <w:t xml:space="preserve"> </w:t>
-      </w:r>
-      <w:r>
-        <w:t>M</w:t>
-      </w:r>
-      <w:r>
-        <w:t xml:space="preserve">unicipality which lies in the northern part of the country and of the developing municipality of capital city Kathmandu. This municipality is facing the continuous </w:t>
-      </w:r>
-      <w:r>
-        <w:t>flow of im</w:t>
-      </w:r>
-      <w:r>
-        <w:t>migration day by day which in turn have to faces many consequences that is positive or negative both side by side.</w:t>
-      </w:r>
-    </w:p>
-    <w:p>
-      <w:pPr>
-        <w:pStyle w:val="BodyText"/>
-      </w:pPr>
-      <w:r>
-        <w:t>What are the trends of this movement?</w:t>
-      </w:r>
-    </w:p>
-    <w:p>
-      <w:pPr>
-        <w:pStyle w:val="BodyText"/>
-      </w:pPr>
-      <w:r>
-        <w:t xml:space="preserve">What are the </w:t>
-      </w:r>
-      <w:r>
-        <w:t>causes of this movement?</w:t>
-      </w:r>
-    </w:p>
-    <w:p>
-      <w:pPr>
-        <w:pStyle w:val="BodyText"/>
-      </w:pPr>
-      <w:r>
-        <w:t>What are the consequences of this movement?</w:t>
-      </w:r>
-    </w:p>
-    <w:p>
-      <w:pPr>
-        <w:pStyle w:val="BodyText"/>
-      </w:pPr>
-      <w:r>
-        <w:t xml:space="preserve">So, the </w:t>
-      </w:r>
-      <w:r>
-        <w:t>main issue</w:t>
-      </w:r>
-      <w:r>
-        <w:t xml:space="preserve"> of this study is to examine the main trends, causes and consequences of </w:t>
-      </w:r>
-      <w:r>
-        <w:t>immigration</w:t>
-      </w:r>
-      <w:r>
-        <w:t xml:space="preserve"> in the study area.</w:t>
-      </w:r>
-    </w:p>
-    <w:p>
-      <w:pPr>
-        <w:pStyle w:val="Heading2"/>
-      </w:pPr>
-      <w:bookmarkStart w:id="6" w:name="_Toc217624805"/>
-      <w:r>
-        <w:t>1.3</w:t>
-      </w:r>
-      <w:r>
-        <w:t xml:space="preserve"> </w:t>
-      </w:r>
-      <w:r>
-        <w:t>Objectives of the Study</w:t>
-      </w:r>
-      <w:bookmarkEnd w:id="6"/>
-      <w:r>
-        <w:t xml:space="preserve"> </w:t>
-      </w:r>
-    </w:p>
-    <w:p>
-      <w:pPr>
-        <w:pStyle w:val="BodyText"/>
-      </w:pPr>
-      <w:r>
-        <w:t xml:space="preserve">The general objective of the study is to assess </w:t>
-      </w:r>
-      <w:r>
-        <w:t>the status, trends an</w:t>
-      </w:r>
-      <w:r>
-        <w:t>d causes and consequences of im</w:t>
-      </w:r>
-      <w:r>
-        <w:t>migration</w:t>
-      </w:r>
-      <w:r>
-        <w:t xml:space="preserve"> </w:t>
-      </w:r>
-      <w:r>
-        <w:t xml:space="preserve">in </w:t>
-      </w:r>
-      <w:proofErr w:type="spellStart"/>
-      <w:r>
-        <w:t>S</w:t>
-      </w:r>
-      <w:r>
-        <w:t>h</w:t>
-      </w:r>
-      <w:r>
-        <w:t>ankharap</w:t>
-      </w:r>
-      <w:r>
-        <w:t>ur</w:t>
-      </w:r>
-      <w:proofErr w:type="spellEnd"/>
-      <w:r>
-        <w:t xml:space="preserve"> municipality of ward no. 9.</w:t>
+        <w:t xml:space="preserve"> municipality of Kathmandu district. The specific objectives are as follows:</w:t>
       </w:r>
     </w:p>
     <w:p>
@@ -3711,22 +3733,23 @@
         <w:jc w:val="both"/>
       </w:pPr>
       <w:r>
-        <w:t xml:space="preserve">To identify </w:t>
-      </w:r>
-      <w:r>
-        <w:t>the</w:t>
-      </w:r>
-      <w:r>
-        <w:t xml:space="preserve"> main causes of </w:t>
+        <w:lastRenderedPageBreak/>
+        <w:t xml:space="preserve">To </w:t>
+      </w:r>
+      <w:r>
+        <w:t>analyze the</w:t>
+      </w:r>
+      <w:r>
+        <w:t xml:space="preserve"> causes of </w:t>
       </w:r>
       <w:r>
         <w:t>immigration</w:t>
       </w:r>
       <w:r>
-        <w:t xml:space="preserve"> of </w:t>
-      </w:r>
-      <w:r>
-        <w:t>people.</w:t>
+        <w:t xml:space="preserve"> in the study area</w:t>
+      </w:r>
+      <w:r>
+        <w:t>.</w:t>
       </w:r>
       <w:r>
         <w:t xml:space="preserve"> </w:t>
@@ -3743,17 +3766,10 @@
         <w:jc w:val="both"/>
       </w:pPr>
       <w:r>
-        <w:lastRenderedPageBreak/>
         <w:t xml:space="preserve">To </w:t>
       </w:r>
       <w:r>
-        <w:t>analyze</w:t>
-      </w:r>
-      <w:r>
-        <w:t xml:space="preserve"> demographic migration trend</w:t>
-      </w:r>
-      <w:r>
-        <w:t>s.</w:t>
+        <w:t>assess the existing nature and composition of migrant people.</w:t>
       </w:r>
     </w:p>
     <w:p>
@@ -3767,16 +3783,10 @@
         <w:jc w:val="both"/>
       </w:pPr>
       <w:r>
-        <w:t>To examin</w:t>
-      </w:r>
-      <w:r>
-        <w:t>e causes and c</w:t>
-      </w:r>
-      <w:r>
-        <w:t>onsequences of</w:t>
-      </w:r>
-      <w:r>
-        <w:t xml:space="preserve"> immigration</w:t>
+        <w:t xml:space="preserve">To </w:t>
+      </w:r>
+      <w:r>
+        <w:t>explore the consequences of immigration to the destination.</w:t>
       </w:r>
       <w:r>
         <w:t xml:space="preserve"> </w:t>
@@ -3786,7 +3796,7 @@
       <w:pPr>
         <w:pStyle w:val="Heading2"/>
       </w:pPr>
-      <w:bookmarkStart w:id="7" w:name="_Toc217624806"/>
+      <w:bookmarkStart w:id="7" w:name="_Toc220841256"/>
       <w:r>
         <w:t>1</w:t>
       </w:r>
@@ -3825,28 +3835,6 @@
     </w:p>
     <w:p>
       <w:pPr>
-        <w:spacing w:after="0" w:line="240" w:lineRule="auto"/>
-        <w:rPr>
-          <w:rFonts w:ascii="Times New Roman" w:eastAsia="Times New Roman" w:hAnsi="Times New Roman" w:cs="Times New Roman"/>
-          <w:kern w:val="0"/>
-          <w:lang w:eastAsia="en-US" w:bidi="ne-NP"/>
-          <w14:ligatures w14:val="none"/>
-        </w:rPr>
-      </w:pPr>
-      <w:r>
-        <w:rPr>
-          <w:rFonts w:ascii="Times New Roman" w:eastAsia="Times New Roman" w:hAnsi="Times New Roman" w:cs="Times New Roman"/>
-          <w:b/>
-          <w:bCs/>
-          <w:kern w:val="0"/>
-          <w:lang w:eastAsia="en-US" w:bidi="ne-NP"/>
-          <w14:ligatures w14:val="none"/>
-        </w:rPr>
-        <w:t>Theoretical Significance</w:t>
-      </w:r>
-    </w:p>
-    <w:p>
-      <w:pPr>
         <w:pStyle w:val="BodyText"/>
       </w:pPr>
       <w:r>
@@ -3861,28 +3849,6 @@
     </w:p>
     <w:p>
       <w:pPr>
-        <w:spacing w:after="0" w:line="240" w:lineRule="auto"/>
-        <w:rPr>
-          <w:rFonts w:ascii="Times New Roman" w:eastAsia="Times New Roman" w:hAnsi="Times New Roman" w:cs="Times New Roman"/>
-          <w:kern w:val="0"/>
-          <w:lang w:eastAsia="en-US" w:bidi="ne-NP"/>
-          <w14:ligatures w14:val="none"/>
-        </w:rPr>
-      </w:pPr>
-      <w:r>
-        <w:rPr>
-          <w:rFonts w:ascii="Times New Roman" w:eastAsia="Times New Roman" w:hAnsi="Times New Roman" w:cs="Times New Roman"/>
-          <w:b/>
-          <w:bCs/>
-          <w:kern w:val="0"/>
-          <w:lang w:eastAsia="en-US" w:bidi="ne-NP"/>
-          <w14:ligatures w14:val="none"/>
-        </w:rPr>
-        <w:t>Applied Significance</w:t>
-      </w:r>
-    </w:p>
-    <w:p>
-      <w:pPr>
         <w:pStyle w:val="BodyText"/>
       </w:pPr>
       <w:r>
@@ -3894,15 +3860,34 @@
       <w:r>
         <w:t xml:space="preserve"> dynamics that can be used to strengthen public participation and promote sustainable urban growth within the municipality. Ultimately, these practical outcomes are intended to help local authorities manage the continuous daily influx of migrants and the resulting pressure on social services and community security</w:t>
       </w:r>
+      <w:r>
+        <w:t>.</w:t>
+      </w:r>
     </w:p>
     <w:p>
       <w:pPr>
         <w:pStyle w:val="Heading2"/>
       </w:pPr>
-      <w:bookmarkStart w:id="8" w:name="_Toc217624807"/>
+      <w:bookmarkStart w:id="8" w:name="_Toc220841257"/>
       <w:r>
         <w:lastRenderedPageBreak/>
-        <w:t>1.5 Limitations of the study</w:t>
+        <w:t>1.5</w:t>
+      </w:r>
+      <w:r>
+        <w:t xml:space="preserve"> </w:t>
+      </w:r>
+      <w:r>
+        <w:t xml:space="preserve">Rationale </w:t>
+      </w:r>
+      <w:r>
+        <w:softHyphen/>
+      </w:r>
+      <w:r>
+        <w:softHyphen/>
+      </w:r>
+      <w:r>
+        <w:softHyphen/>
+        <w:t>of Selection of Study Area</w:t>
       </w:r>
       <w:bookmarkEnd w:id="8"/>
     </w:p>
@@ -3911,6 +3896,115 @@
         <w:pStyle w:val="BodyText"/>
       </w:pPr>
       <w:r>
+        <w:t xml:space="preserve">The choice of </w:t>
+      </w:r>
+      <w:proofErr w:type="spellStart"/>
+      <w:r>
+        <w:t>Shankharapur</w:t>
+      </w:r>
+      <w:proofErr w:type="spellEnd"/>
+      <w:r>
+        <w:t xml:space="preserve"> Municipality Ward 9 (</w:t>
+      </w:r>
+      <w:proofErr w:type="spellStart"/>
+      <w:r>
+        <w:t>Sankhu</w:t>
+      </w:r>
+      <w:proofErr w:type="spellEnd"/>
+      <w:r>
+        <w:t>) as the focal point for this research is based on the following strategic justifications:</w:t>
+      </w:r>
+    </w:p>
+    <w:p>
+      <w:pPr>
+        <w:pStyle w:val="BodyText"/>
+        <w:rPr>
+          <w:lang w:eastAsia="en-US"/>
+        </w:rPr>
+      </w:pPr>
+      <w:proofErr w:type="spellStart"/>
+      <w:r>
+        <w:t>Shankharapur</w:t>
+      </w:r>
+      <w:proofErr w:type="spellEnd"/>
+      <w:r>
+        <w:t xml:space="preserve"> is a rapidly developing municipality on the periphery of Kathmandu that is currently experiencing a continuous, daily influx of in-migrants. This constant population movement creates an immediate and high-priority need to investigate the resulting socio-economic and demographic consequences, whether positive or negative.</w:t>
+      </w:r>
+    </w:p>
+    <w:p>
+      <w:pPr>
+        <w:pStyle w:val="BodyText"/>
+        <w:rPr>
+          <w:lang w:eastAsia="en-US"/>
+        </w:rPr>
+      </w:pPr>
+      <w:r>
+        <w:t>The selection of Ward 9 is highly practical for a Master’s</w:t>
+      </w:r>
+      <w:r>
+        <w:t xml:space="preserve"> level study. With a total of 82</w:t>
+      </w:r>
+      <w:r>
+        <w:t xml:space="preserve"> households, the ward provides a sample size that is manageable within the researcher's specific constraints of time, financial resources, and expert manpower, ensuring the study can be implemented with the required depth.</w:t>
+      </w:r>
+    </w:p>
+    <w:p>
+      <w:pPr>
+        <w:pStyle w:val="BodyText"/>
+        <w:rPr>
+          <w:lang w:eastAsia="en-US"/>
+        </w:rPr>
+      </w:pPr>
+      <w:r>
+        <w:t>To ensure the study remains objective and free from researcher bias, the area was chosen through a random sampling method from the Kathmandu district level. Subsequently, a purposive sampling method will be applied to draw relevant data from the migrant population within those households.</w:t>
+      </w:r>
+    </w:p>
+    <w:p>
+      <w:pPr>
+        <w:pStyle w:val="BodyText"/>
+        <w:rPr>
+          <w:lang w:eastAsia="en-US"/>
+        </w:rPr>
+      </w:pPr>
+      <w:r>
+        <w:t>Existing literature on migration in Nepal is largely dominated by macro-level or city-wide analyses. There is a significant lack of context-specific research that integrates demographic, socio-economic, and policy perspectives at a localized ward level, particularly in areas like Ward 9 that have seen shifts following the 2015 earthquake.</w:t>
+      </w:r>
+    </w:p>
+    <w:p>
+      <w:pPr>
+        <w:pStyle w:val="BodyText"/>
+        <w:rPr>
+          <w:lang w:eastAsia="en-US"/>
+        </w:rPr>
+      </w:pPr>
+      <w:r>
+        <w:t>This specific ward serves as an ideal "laboratory" to identify localized dynamics that can help planners and development practitioners design targeted interventions. The findings will identify new perspectives to enhance public participation and accelerate sustainable urban development within the municipality.</w:t>
+      </w:r>
+    </w:p>
+    <w:p>
+      <w:pPr>
+        <w:pStyle w:val="BodyText"/>
+      </w:pPr>
+    </w:p>
+    <w:p>
+      <w:pPr>
+        <w:pStyle w:val="Heading2"/>
+      </w:pPr>
+      <w:bookmarkStart w:id="9" w:name="_Toc220841258"/>
+      <w:r>
+        <w:lastRenderedPageBreak/>
+        <w:t>1.6</w:t>
+      </w:r>
+      <w:r>
+        <w:t xml:space="preserve"> Limitations of the study</w:t>
+      </w:r>
+      <w:bookmarkEnd w:id="9"/>
+    </w:p>
+    <w:p>
+      <w:pPr>
+        <w:pStyle w:val="BodyText"/>
+      </w:pPr>
+      <w:r>
         <w:t xml:space="preserve">This study has several limitations that should be considered while interpreting the results. The research was conducted within a limited time frame, which constrained detailed primary data collection through interviews and limited the extent of secondary data collection from local-level institutions, particularly the ward office. The sample size was also limited, and therefore may not fully represent the entire migrant population of the study area. Moreover, the study is geographically confined to </w:t>
       </w:r>
       <w:proofErr w:type="spellStart"/>
@@ -3942,11 +4036,14 @@
       <w:pPr>
         <w:pStyle w:val="Heading2"/>
       </w:pPr>
-      <w:bookmarkStart w:id="9" w:name="_Toc217624808"/>
-      <w:r>
-        <w:t>1.6 Organization of the Study</w:t>
-      </w:r>
-      <w:bookmarkEnd w:id="9"/>
+      <w:bookmarkStart w:id="10" w:name="_Toc220841259"/>
+      <w:r>
+        <w:t>1.7</w:t>
+      </w:r>
+      <w:r>
+        <w:t xml:space="preserve"> Organization of the Study</w:t>
+      </w:r>
+      <w:bookmarkEnd w:id="10"/>
     </w:p>
     <w:p>
       <w:pPr>
@@ -3971,7 +4068,7 @@
           <w:bCs w:val="0"/>
         </w:rPr>
       </w:pPr>
-      <w:bookmarkStart w:id="10" w:name="_Toc217624809"/>
+      <w:bookmarkStart w:id="11" w:name="_Toc220841260"/>
       <w:r>
         <w:rPr>
           <w:rStyle w:val="Strong"/>
@@ -3989,7 +4086,7 @@
         </w:rPr>
         <w:t>Two</w:t>
       </w:r>
-      <w:bookmarkEnd w:id="10"/>
+      <w:bookmarkEnd w:id="11"/>
     </w:p>
     <w:p>
       <w:pPr>
@@ -3999,7 +4096,7 @@
           <w:szCs w:val="38"/>
         </w:rPr>
       </w:pPr>
-      <w:bookmarkStart w:id="11" w:name="_Toc217624810"/>
+      <w:bookmarkStart w:id="12" w:name="_Toc220841261"/>
       <w:r>
         <w:rPr>
           <w:sz w:val="28"/>
@@ -4007,7 +4104,7 @@
         </w:rPr>
         <w:t>Literature Review</w:t>
       </w:r>
-      <w:bookmarkEnd w:id="11"/>
+      <w:bookmarkEnd w:id="12"/>
     </w:p>
     <w:p>
       <w:pPr>
@@ -4388,11 +4485,11 @@
       <w:pPr>
         <w:pStyle w:val="Heading2"/>
       </w:pPr>
-      <w:bookmarkStart w:id="12" w:name="_Toc217624811"/>
+      <w:bookmarkStart w:id="13" w:name="_Toc220841262"/>
       <w:r>
         <w:t>2.1 Theoretical Review</w:t>
       </w:r>
-      <w:bookmarkEnd w:id="12"/>
+      <w:bookmarkEnd w:id="13"/>
     </w:p>
     <w:p>
       <w:pPr>
@@ -4428,11 +4525,11 @@
       <w:pPr>
         <w:pStyle w:val="Heading2"/>
       </w:pPr>
-      <w:bookmarkStart w:id="13" w:name="_Toc217624812"/>
+      <w:bookmarkStart w:id="14" w:name="_Toc220841263"/>
       <w:r>
         <w:t>2.2 Empirical Review</w:t>
       </w:r>
-      <w:bookmarkEnd w:id="13"/>
+      <w:bookmarkEnd w:id="14"/>
     </w:p>
     <w:p>
       <w:pPr>
@@ -4458,11 +4555,11 @@
       <w:pPr>
         <w:pStyle w:val="Heading2"/>
       </w:pPr>
-      <w:bookmarkStart w:id="14" w:name="_Toc217624813"/>
+      <w:bookmarkStart w:id="15" w:name="_Toc220841264"/>
       <w:r>
         <w:t>2.3 Policy Review</w:t>
       </w:r>
-      <w:bookmarkEnd w:id="14"/>
+      <w:bookmarkEnd w:id="15"/>
     </w:p>
     <w:p>
       <w:pPr>
@@ -4482,11 +4579,11 @@
       <w:pPr>
         <w:pStyle w:val="Heading2"/>
       </w:pPr>
-      <w:bookmarkStart w:id="15" w:name="_Toc217624814"/>
+      <w:bookmarkStart w:id="16" w:name="_Toc220841265"/>
       <w:r>
         <w:t>2.4 Research Gap</w:t>
       </w:r>
-      <w:bookmarkEnd w:id="15"/>
+      <w:bookmarkEnd w:id="16"/>
     </w:p>
     <w:p>
       <w:pPr>
@@ -4552,12 +4649,12 @@
       <w:pPr>
         <w:pStyle w:val="Heading2"/>
       </w:pPr>
-      <w:bookmarkStart w:id="16" w:name="_Toc217624815"/>
+      <w:bookmarkStart w:id="17" w:name="_Toc220841266"/>
       <w:r>
         <w:lastRenderedPageBreak/>
         <w:t>2.5 Conceptual Framework</w:t>
       </w:r>
-      <w:bookmarkEnd w:id="16"/>
+      <w:bookmarkEnd w:id="17"/>
     </w:p>
     <w:p>
       <w:pPr>
@@ -6369,7 +6466,7 @@
               </wp:anchor>
             </w:drawing>
           </mc:Choice>
-          <mc:Fallback xmlns:cx1="http://schemas.microsoft.com/office/drawing/2015/9/8/chartex" xmlns:cx2="http://schemas.microsoft.com/office/drawing/2015/10/21/chartex" xmlns:cx3="http://schemas.microsoft.com/office/drawing/2016/5/9/chartex" xmlns:cx4="http://schemas.microsoft.com/office/drawing/2016/5/10/chartex" xmlns:cx5="http://schemas.microsoft.com/office/drawing/2016/5/11/chartex" xmlns:cx6="http://schemas.microsoft.com/office/drawing/2016/5/12/chartex" xmlns:cx7="http://schemas.microsoft.com/office/drawing/2016/5/13/chartex" xmlns:cx8="http://schemas.microsoft.com/office/drawing/2016/5/14/chartex" xmlns:aink="http://schemas.microsoft.com/office/drawing/2016/ink" xmlns:am3d="http://schemas.microsoft.com/office/drawing/2017/model3d" xmlns:oel="http://schemas.microsoft.com/office/2019/extlst" xmlns:w16cex="http://schemas.microsoft.com/office/word/2018/wordml/cex" xmlns:w16cid="http://schemas.microsoft.com/office/word/2016/wordml/cid" xmlns:w16="http://schemas.microsoft.com/office/word/2018/wordml" xmlns:w16du="http://schemas.microsoft.com/office/word/2023/wordml/word16du" xmlns:w16sdtdh="http://schemas.microsoft.com/office/word/2020/wordml/sdtdatahash" xmlns:w16sdtfl="http://schemas.microsoft.com/office/word/2024/wordml/sdtformatlock">
+          <mc:Fallback xmlns:w16sdtfl="http://schemas.microsoft.com/office/word/2024/wordml/sdtformatlock" xmlns:w16sdtdh="http://schemas.microsoft.com/office/word/2020/wordml/sdtdatahash" xmlns:w16du="http://schemas.microsoft.com/office/word/2023/wordml/word16du" xmlns:w16="http://schemas.microsoft.com/office/word/2018/wordml" xmlns:w16cid="http://schemas.microsoft.com/office/word/2016/wordml/cid" xmlns:w16cex="http://schemas.microsoft.com/office/word/2018/wordml/cex" xmlns:oel="http://schemas.microsoft.com/office/2019/extlst" xmlns:am3d="http://schemas.microsoft.com/office/drawing/2017/model3d" xmlns:aink="http://schemas.microsoft.com/office/drawing/2016/ink" xmlns:cx8="http://schemas.microsoft.com/office/drawing/2016/5/14/chartex" xmlns:cx7="http://schemas.microsoft.com/office/drawing/2016/5/13/chartex" xmlns:cx6="http://schemas.microsoft.com/office/drawing/2016/5/12/chartex" xmlns:cx5="http://schemas.microsoft.com/office/drawing/2016/5/11/chartex" xmlns:cx4="http://schemas.microsoft.com/office/drawing/2016/5/10/chartex" xmlns:cx3="http://schemas.microsoft.com/office/drawing/2016/5/9/chartex" xmlns:cx2="http://schemas.microsoft.com/office/drawing/2015/10/21/chartex" xmlns:cx1="http://schemas.microsoft.com/office/drawing/2015/9/8/chartex">
             <w:pict>
               <v:shape w14:anchorId="62B55028" id="Straight Arrow Connector 2" o:spid="_x0000_s1026" type="#_x0000_t32" style="position:absolute;margin-left:113.2pt;margin-top:12.1pt;width:30.65pt;height:0;flip:x;z-index:251681792;visibility:visible;mso-wrap-style:square;mso-wrap-distance-left:9pt;mso-wrap-distance-top:0;mso-wrap-distance-right:9pt;mso-wrap-distance-bottom:0;mso-position-horizontal:absolute;mso-position-horizontal-relative:text;mso-position-vertical:absolute;mso-position-vertical-relative:text" o:gfxdata="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" strokecolor="black [3200]" strokeweight=".5pt">
                 <v:stroke endarrow="block" joinstyle="miter"/>
@@ -6454,14 +6551,27 @@
       <w:r>
         <w:t>2.</w:t>
       </w:r>
-      <w:fldSimple w:instr=" SEQ Figure \* ARABIC ">
-        <w:r>
-          <w:rPr>
-            <w:noProof/>
-          </w:rPr>
-          <w:t>1</w:t>
-        </w:r>
-      </w:fldSimple>
+      <w:r>
+        <w:fldChar w:fldCharType="begin"/>
+      </w:r>
+      <w:r>
+        <w:instrText xml:space="preserve"> SEQ Figure \* ARABIC </w:instrText>
+      </w:r>
+      <w:r>
+        <w:fldChar w:fldCharType="separate"/>
+      </w:r>
+      <w:r>
+        <w:rPr>
+          <w:noProof/>
+        </w:rPr>
+        <w:t>1</w:t>
+      </w:r>
+      <w:r>
+        <w:rPr>
+          <w:noProof/>
+        </w:rPr>
+        <w:fldChar w:fldCharType="end"/>
+      </w:r>
       <w:r>
         <w:t xml:space="preserve"> Conceptual Framework of Migration Study</w:t>
       </w:r>
@@ -6574,7 +6684,7 @@
         </w:rPr>
         <w:br w:type="page"/>
       </w:r>
-      <w:bookmarkStart w:id="17" w:name="_Toc217624816"/>
+      <w:bookmarkStart w:id="18" w:name="_Toc220841267"/>
       <w:r>
         <w:rPr>
           <w:rStyle w:val="Strong"/>
@@ -6592,12 +6702,19 @@
         </w:rPr>
         <w:t>Three</w:t>
       </w:r>
-      <w:bookmarkEnd w:id="17"/>
+      <w:bookmarkEnd w:id="18"/>
     </w:p>
     <w:p>
       <w:pPr>
         <w:pStyle w:val="Heading1"/>
         <w:spacing w:line="360" w:lineRule="auto"/>
+        <w:rPr>
+          <w:sz w:val="28"/>
+          <w:szCs w:val="38"/>
+        </w:rPr>
+      </w:pPr>
+      <w:bookmarkStart w:id="19" w:name="_Toc220841268"/>
+      <w:r>
         <w:rPr>
           <w:rStyle w:val="Strong"/>
           <w:b/>
@@ -6605,57 +6722,128 @@
           <w:sz w:val="28"/>
           <w:szCs w:val="38"/>
         </w:rPr>
-      </w:pPr>
-      <w:bookmarkStart w:id="18" w:name="_Toc217624817"/>
-      <w:r>
-        <w:rPr>
-          <w:rStyle w:val="Strong"/>
-          <w:b/>
-          <w:bCs w:val="0"/>
-          <w:sz w:val="28"/>
-          <w:szCs w:val="38"/>
-        </w:rPr>
         <w:t>Research methodology</w:t>
       </w:r>
-      <w:bookmarkEnd w:id="18"/>
+      <w:bookmarkEnd w:id="19"/>
     </w:p>
     <w:p>
       <w:pPr>
         <w:pStyle w:val="Heading2"/>
       </w:pPr>
-      <w:bookmarkStart w:id="19" w:name="_Toc217624818"/>
-      <w:r>
-        <w:t xml:space="preserve">3.1 </w:t>
-      </w:r>
-      <w:r>
-        <w:t xml:space="preserve">Rationale </w:t>
-      </w:r>
-      <w:r>
-        <w:softHyphen/>
-      </w:r>
-      <w:r>
-        <w:softHyphen/>
-      </w:r>
-      <w:r>
-        <w:softHyphen/>
-      </w:r>
-      <w:r>
-        <w:t xml:space="preserve">of Selection </w:t>
-      </w:r>
-      <w:r>
-        <w:t xml:space="preserve">of </w:t>
-      </w:r>
-      <w:r>
-        <w:t>Study Area</w:t>
-      </w:r>
-      <w:bookmarkEnd w:id="19"/>
+      <w:bookmarkStart w:id="20" w:name="_Toc220841269"/>
+      <w:r>
+        <w:t>3</w:t>
+      </w:r>
+      <w:r>
+        <w:t>.1</w:t>
+      </w:r>
+      <w:r>
+        <w:t xml:space="preserve"> Research Design</w:t>
+      </w:r>
+      <w:bookmarkEnd w:id="20"/>
     </w:p>
     <w:p>
       <w:pPr>
         <w:pStyle w:val="BodyText"/>
       </w:pPr>
       <w:r>
-        <w:t xml:space="preserve">The choice of </w:t>
+        <w:t xml:space="preserve">The main objective of this research is to explore the </w:t>
+      </w:r>
+      <w:r>
+        <w:t xml:space="preserve">trend, causes and consequences of </w:t>
+      </w:r>
+      <w:r>
+        <w:t>immigration</w:t>
+      </w:r>
+      <w:r>
+        <w:t xml:space="preserve"> of the study area.  </w:t>
+      </w:r>
+      <w:r>
+        <w:t xml:space="preserve">In order to carry out the research properly, both descriptive and exploratory research designs will be used. It will explore the </w:t>
+      </w:r>
+      <w:r>
+        <w:t>causes</w:t>
+      </w:r>
+      <w:r>
+        <w:t xml:space="preserve"> concerned with </w:t>
+      </w:r>
+      <w:r>
+        <w:t>immigration</w:t>
+      </w:r>
+      <w:r>
+        <w:t xml:space="preserve"> within the </w:t>
+      </w:r>
+      <w:r>
+        <w:t>immigrant</w:t>
+      </w:r>
+      <w:r>
+        <w:t>s</w:t>
+      </w:r>
+      <w:r>
+        <w:t xml:space="preserve">. </w:t>
+      </w:r>
+    </w:p>
+    <w:p>
+      <w:pPr>
+        <w:pStyle w:val="Heading2"/>
+      </w:pPr>
+      <w:bookmarkStart w:id="21" w:name="_Toc220841270"/>
+      <w:r>
+        <w:t>3.2</w:t>
+      </w:r>
+      <w:r>
+        <w:t xml:space="preserve"> </w:t>
+      </w:r>
+      <w:r>
+        <w:t>Nature and source of data</w:t>
+      </w:r>
+      <w:bookmarkEnd w:id="21"/>
+    </w:p>
+    <w:p>
+      <w:pPr>
+        <w:pStyle w:val="BodyText"/>
+      </w:pPr>
+      <w:r>
+        <w:t xml:space="preserve">This study will base on both primary and secondary data. Primary data will be collected in the field with the help of different tools and techniques; interview and observation. On the </w:t>
+      </w:r>
+      <w:r>
+        <w:t>other hand,</w:t>
+      </w:r>
+      <w:r>
+        <w:t xml:space="preserve"> the secondary data will be obtained from library, published and unpublished articles, documents, books and CBS records</w:t>
+      </w:r>
+      <w:r>
+        <w:t xml:space="preserve"> and the municipality record of the study area</w:t>
+      </w:r>
+      <w:r>
+        <w:t>.</w:t>
+      </w:r>
+    </w:p>
+    <w:p>
+      <w:pPr>
+        <w:pStyle w:val="Heading2"/>
+      </w:pPr>
+      <w:r>
+        <w:t xml:space="preserve"> </w:t>
+      </w:r>
+      <w:bookmarkStart w:id="22" w:name="_Toc220841271"/>
+      <w:r>
+        <w:t>3.3</w:t>
+      </w:r>
+      <w:r>
+        <w:t xml:space="preserve"> </w:t>
+      </w:r>
+      <w:r>
+        <w:t>Population and Sampling</w:t>
+      </w:r>
+      <w:bookmarkEnd w:id="22"/>
+    </w:p>
+    <w:p>
+      <w:pPr>
+        <w:pStyle w:val="BodyText"/>
+      </w:pPr>
+      <w:r>
+        <w:t xml:space="preserve">The </w:t>
       </w:r>
       <w:proofErr w:type="spellStart"/>
       <w:r>
@@ -6663,497 +6851,284 @@
       </w:r>
       <w:proofErr w:type="spellEnd"/>
       <w:r>
-        <w:t xml:space="preserve"> Municipality Ward 9 (</w:t>
-      </w:r>
-      <w:proofErr w:type="spellStart"/>
-      <w:r>
-        <w:t>Sankhu</w:t>
-      </w:r>
-      <w:proofErr w:type="spellEnd"/>
-      <w:r>
-        <w:t>) as the focal point for this research is based on the following strategic justifications:</w:t>
+        <w:t xml:space="preserve"> M</w:t>
+      </w:r>
+      <w:r>
+        <w:t>unicipality ward 9</w:t>
+      </w:r>
+      <w:r>
+        <w:t xml:space="preserve"> profile </w:t>
+      </w:r>
+      <w:r>
+        <w:t>–</w:t>
+      </w:r>
+      <w:r>
+        <w:t xml:space="preserve"> </w:t>
+      </w:r>
+      <w:r>
+        <w:t>20</w:t>
+      </w:r>
+      <w:r>
+        <w:t>82 BS</w:t>
+      </w:r>
+      <w:r>
+        <w:t xml:space="preserve"> sh</w:t>
+      </w:r>
+      <w:r>
+        <w:t xml:space="preserve">ows that there </w:t>
+      </w:r>
+      <w:r>
+        <w:t>is</w:t>
+      </w:r>
+      <w:r>
+        <w:t xml:space="preserve"> a total </w:t>
+      </w:r>
+      <w:r>
+        <w:t>population of about</w:t>
+      </w:r>
+      <w:r>
+        <w:t xml:space="preserve"> </w:t>
+      </w:r>
+      <w:r>
+        <w:t>4345</w:t>
+      </w:r>
+      <w:r>
+        <w:t>. Out of 9 wards, ward no.</w:t>
+      </w:r>
+      <w:r>
+        <w:t>9</w:t>
+      </w:r>
+      <w:r>
+        <w:t xml:space="preserve"> will be considered</w:t>
+      </w:r>
+      <w:r>
+        <w:t xml:space="preserve"> as</w:t>
+      </w:r>
+      <w:r>
+        <w:t xml:space="preserve"> st</w:t>
+      </w:r>
+      <w:r>
+        <w:t xml:space="preserve">udy area. This ward </w:t>
+      </w:r>
+      <w:r>
+        <w:t>welcomed</w:t>
+      </w:r>
+      <w:r>
+        <w:t xml:space="preserve"> 82</w:t>
+      </w:r>
+      <w:r>
+        <w:t xml:space="preserve"> </w:t>
+      </w:r>
+      <w:r>
+        <w:t>households</w:t>
+      </w:r>
+      <w:r>
+        <w:t xml:space="preserve"> with total count of 336 immigrants from year 2074 BS to 2082 BS</w:t>
+      </w:r>
+      <w:r>
+        <w:t>. These households will be</w:t>
+      </w:r>
+      <w:r>
+        <w:t xml:space="preserve"> sampled for the study</w:t>
+      </w:r>
+      <w:r>
+        <w:t>. B</w:t>
+      </w:r>
+      <w:r>
+        <w:t>ecause of the time, resources, expert manpower and p</w:t>
+      </w:r>
+      <w:r>
+        <w:t>roper implication of the study, r</w:t>
+      </w:r>
+      <w:r>
+        <w:t>andom sampling</w:t>
+      </w:r>
+      <w:r>
+        <w:t xml:space="preserve"> method will be used to </w:t>
+      </w:r>
+      <w:r>
+        <w:t>sample these households.</w:t>
+      </w:r>
+      <w:r>
+        <w:t xml:space="preserve"> </w:t>
+      </w:r>
+      <w:r>
+        <w:t xml:space="preserve">To draw the sample from whole population, purposive method will be used. </w:t>
+      </w:r>
+    </w:p>
+    <w:p>
+      <w:pPr>
+        <w:pStyle w:val="Heading2"/>
+      </w:pPr>
+      <w:bookmarkStart w:id="23" w:name="_Toc220841272"/>
+      <w:r>
+        <w:t>3.4</w:t>
+      </w:r>
+      <w:r>
+        <w:t xml:space="preserve"> </w:t>
+      </w:r>
+      <w:r>
+        <w:t>Method of Data Collection</w:t>
+      </w:r>
+      <w:bookmarkEnd w:id="23"/>
+      <w:r>
+        <w:t xml:space="preserve"> </w:t>
       </w:r>
     </w:p>
     <w:p>
       <w:pPr>
         <w:pStyle w:val="BodyText"/>
-        <w:rPr>
-          <w:lang w:eastAsia="en-US"/>
-        </w:rPr>
-      </w:pPr>
-      <w:proofErr w:type="spellStart"/>
-      <w:r>
-        <w:t>Shankharapur</w:t>
-      </w:r>
-      <w:proofErr w:type="spellEnd"/>
-      <w:r>
-        <w:t xml:space="preserve"> is a rapidly developing municipality on the periphery of Kathmandu that is currently experiencing a continuous, daily influx of in-migrants. This constant population movement creates an immediate and high-priority need to investigate the resulting socio-economic and demographic consequences, whether positive or negative.</w:t>
-      </w:r>
+      </w:pPr>
+      <w:r>
+        <w:t>In order to obtain necessary and reliable data for thus study the researcher will use the method such as observation, unstructured interview and some case study.</w:t>
+      </w:r>
+    </w:p>
+    <w:p>
+      <w:pPr>
+        <w:pStyle w:val="Heading3"/>
+      </w:pPr>
+      <w:bookmarkStart w:id="24" w:name="_Toc220841273"/>
+      <w:r>
+        <w:lastRenderedPageBreak/>
+        <w:t>3.4</w:t>
+      </w:r>
+      <w:r>
+        <w:t xml:space="preserve">.1 </w:t>
+      </w:r>
+      <w:r>
+        <w:t>Observation</w:t>
+      </w:r>
+      <w:bookmarkEnd w:id="24"/>
     </w:p>
     <w:p>
       <w:pPr>
         <w:pStyle w:val="BodyText"/>
-        <w:rPr>
-          <w:lang w:eastAsia="en-US"/>
-        </w:rPr>
-      </w:pPr>
-      <w:r>
-        <w:t>The selection of Ward 9 is highly practical for a Master’s</w:t>
-      </w:r>
-      <w:r>
-        <w:t xml:space="preserve"> level study. With a total of 82</w:t>
-      </w:r>
-      <w:r>
-        <w:t xml:space="preserve"> households, the ward provides a sample size that is manageable within the researcher's specific constraints of time, financial resources, and expert manpower, ensuring the study can be implemented with the required depth.</w:t>
-      </w:r>
+      </w:pPr>
+      <w:r>
+        <w:t xml:space="preserve">Observation method will use to collect the observable information such as </w:t>
+      </w:r>
+      <w:r>
+        <w:t>social status. Community participation, role in community decision making, their rel</w:t>
+      </w:r>
+      <w:r>
+        <w:t xml:space="preserve">ationship between the </w:t>
+      </w:r>
+      <w:r>
+        <w:t>immigrants</w:t>
+      </w:r>
+      <w:r>
+        <w:t xml:space="preserve"> and residential. The </w:t>
+      </w:r>
+      <w:r>
+        <w:t>immigration</w:t>
+      </w:r>
+      <w:r>
+        <w:t xml:space="preserve"> will be observed to find out the causes and consequences in the development sector of the study area</w:t>
+      </w:r>
+    </w:p>
+    <w:p>
+      <w:pPr>
+        <w:pStyle w:val="Heading3"/>
+      </w:pPr>
+      <w:bookmarkStart w:id="25" w:name="_Toc220841274"/>
+      <w:r>
+        <w:t>3.4.</w:t>
+      </w:r>
+      <w:r>
+        <w:t>2 In</w:t>
+      </w:r>
+      <w:r>
+        <w:t>terview</w:t>
+      </w:r>
+      <w:bookmarkEnd w:id="25"/>
     </w:p>
     <w:p>
       <w:pPr>
         <w:pStyle w:val="BodyText"/>
-        <w:rPr>
-          <w:lang w:eastAsia="en-US"/>
-        </w:rPr>
-      </w:pPr>
-      <w:r>
-        <w:t>To ensure the study remains objective and free from researcher bias, the area was chosen through a random sampling method from the Kathmandu district level. Subsequently, a purposive sampling method will be applied to draw relevant data from the migrant population within those households.</w:t>
-      </w:r>
+      </w:pPr>
+      <w:r>
+        <w:t>An unstructured interview will be taken so as to meet the purpo</w:t>
+      </w:r>
+      <w:r>
+        <w:t xml:space="preserve">ses. The questionnaire will be </w:t>
+      </w:r>
+      <w:r>
+        <w:t xml:space="preserve">divided into four sections. The first section deals with the purpose of getting information </w:t>
+      </w:r>
+      <w:r>
+        <w:t>about demographic variable</w:t>
+      </w:r>
+      <w:r>
+        <w:t>s. The second section will deal</w:t>
+      </w:r>
+      <w:r>
+        <w:t xml:space="preserve"> with the main reason behind the </w:t>
+      </w:r>
+      <w:r>
+        <w:t>immigration</w:t>
+      </w:r>
+      <w:r>
+        <w:t>,</w:t>
+      </w:r>
+      <w:r>
+        <w:t xml:space="preserve"> while the third section will be the </w:t>
+      </w:r>
+      <w:r>
+        <w:t>socio-economic</w:t>
+      </w:r>
+      <w:r>
+        <w:t xml:space="preserve"> </w:t>
+      </w:r>
+      <w:r>
+        <w:t>variables. The</w:t>
+      </w:r>
+      <w:r>
+        <w:t xml:space="preserve"> last section includes the miscellaneous questionnaire about the causes and consequences of</w:t>
+      </w:r>
+      <w:r>
+        <w:t xml:space="preserve"> </w:t>
+      </w:r>
+      <w:r>
+        <w:t>immigration</w:t>
+      </w:r>
+      <w:r>
+        <w:t xml:space="preserve"> within</w:t>
+      </w:r>
+      <w:r>
+        <w:t xml:space="preserve"> the study area.</w:t>
+      </w:r>
+    </w:p>
+    <w:p>
+      <w:pPr>
+        <w:pStyle w:val="Heading2"/>
+      </w:pPr>
+      <w:bookmarkStart w:id="26" w:name="_Toc220841275"/>
+      <w:r>
+        <w:t>3.5</w:t>
+      </w:r>
+      <w:r>
+        <w:t xml:space="preserve"> </w:t>
+      </w:r>
+      <w:r>
+        <w:t>Data Analysis and Presentation</w:t>
+      </w:r>
+      <w:bookmarkEnd w:id="26"/>
     </w:p>
     <w:p>
       <w:pPr>
         <w:pStyle w:val="BodyText"/>
-        <w:rPr>
-          <w:lang w:eastAsia="en-US"/>
-        </w:rPr>
-      </w:pPr>
-      <w:r>
-        <w:t xml:space="preserve">Existing literature on migration in Nepal is largely dominated by macro-level or city-wide analyses. There is a significant lack of context-specific research that integrates demographic, socio-economic, and policy perspectives at a </w:t>
-      </w:r>
-      <w:r>
-        <w:t>localized</w:t>
-      </w:r>
-      <w:r>
-        <w:t xml:space="preserve"> ward level, particularly in areas like Ward 9 that have seen shifts following the 2015 earthquake.</w:t>
-      </w:r>
-    </w:p>
-    <w:p>
-      <w:pPr>
-        <w:pStyle w:val="BodyText"/>
-        <w:rPr>
-          <w:lang w:eastAsia="en-US"/>
-        </w:rPr>
-      </w:pPr>
-      <w:r>
-        <w:t xml:space="preserve">This specific ward serves as an ideal "laboratory" to identify </w:t>
-      </w:r>
-      <w:r>
-        <w:t>localized</w:t>
-      </w:r>
-      <w:r>
-        <w:t xml:space="preserve"> dynamics that can help planners and development practitioners design targeted interventions. The findings will identify new perspectives to enhance public participation and accelerate sustainable urban development within the municipality.</w:t>
-      </w:r>
-    </w:p>
-    <w:p/>
+      </w:pPr>
+      <w:r>
+        <w:t>Qualitative data will be presented on tabular form. Both qualitative and quantitative methods will be used to analyze the obtain information.</w:t>
+      </w:r>
+    </w:p>
     <w:p>
       <w:pPr>
         <w:pStyle w:val="Heading2"/>
       </w:pPr>
-      <w:bookmarkStart w:id="20" w:name="_Toc217624819"/>
-      <w:r>
-        <w:lastRenderedPageBreak/>
-        <w:t>3.2</w:t>
-      </w:r>
-      <w:r>
-        <w:t xml:space="preserve"> Research Design</w:t>
-      </w:r>
-      <w:bookmarkEnd w:id="20"/>
-    </w:p>
-    <w:p>
-      <w:pPr>
-        <w:pStyle w:val="BodyText"/>
-      </w:pPr>
-      <w:r>
-        <w:t xml:space="preserve">The main objective of this research is to explore the </w:t>
-      </w:r>
-      <w:r>
-        <w:t xml:space="preserve">trend, causes and consequences of </w:t>
-      </w:r>
-      <w:r>
-        <w:t>immigration</w:t>
-      </w:r>
-      <w:r>
-        <w:t xml:space="preserve"> of the study area.  </w:t>
-      </w:r>
-      <w:r>
-        <w:t xml:space="preserve">In order to carry out the research properly, both descriptive and exploratory research designs will be used. It will explore the </w:t>
-      </w:r>
-      <w:r>
-        <w:t>causes</w:t>
-      </w:r>
-      <w:r>
-        <w:t xml:space="preserve"> concerned with </w:t>
-      </w:r>
-      <w:r>
-        <w:t>immigration</w:t>
-      </w:r>
-      <w:r>
-        <w:t xml:space="preserve"> within the </w:t>
-      </w:r>
-      <w:r>
-        <w:t>immigrant</w:t>
-      </w:r>
-      <w:r>
-        <w:t>s</w:t>
-      </w:r>
-      <w:r>
-        <w:t xml:space="preserve">. </w:t>
-      </w:r>
-    </w:p>
-    <w:p>
-      <w:pPr>
-        <w:pStyle w:val="Heading2"/>
-      </w:pPr>
-      <w:bookmarkStart w:id="21" w:name="_Toc217624820"/>
-      <w:r>
-        <w:t>3.3</w:t>
-      </w:r>
-      <w:r>
-        <w:t xml:space="preserve"> </w:t>
-      </w:r>
-      <w:r>
-        <w:t>Nature and source of data</w:t>
-      </w:r>
-      <w:bookmarkEnd w:id="21"/>
-    </w:p>
-    <w:p>
-      <w:pPr>
-        <w:pStyle w:val="BodyText"/>
-      </w:pPr>
-      <w:r>
-        <w:t xml:space="preserve">This study will base on both primary and secondary data. Primary data will be collected in the field with the help of different tools and techniques; interview and observation. On the </w:t>
-      </w:r>
-      <w:r>
-        <w:t>other hand,</w:t>
-      </w:r>
-      <w:r>
-        <w:t xml:space="preserve"> the secondary data will be obtained from library, published and unpublished articles, documents, books and CBS records</w:t>
-      </w:r>
-      <w:r>
-        <w:t xml:space="preserve"> and the municipality record of the study area</w:t>
-      </w:r>
-      <w:r>
-        <w:t>.</w:t>
-      </w:r>
-    </w:p>
-    <w:p>
-      <w:pPr>
-        <w:pStyle w:val="Heading2"/>
-      </w:pPr>
-      <w:r>
-        <w:t xml:space="preserve"> </w:t>
-      </w:r>
-      <w:bookmarkStart w:id="22" w:name="_Toc217624821"/>
-      <w:r>
-        <w:t>3.4</w:t>
-      </w:r>
-      <w:r>
-        <w:t xml:space="preserve"> </w:t>
-      </w:r>
-      <w:r>
-        <w:t>Population and Sampling</w:t>
-      </w:r>
-      <w:bookmarkEnd w:id="22"/>
-    </w:p>
-    <w:p>
-      <w:pPr>
-        <w:pStyle w:val="BodyText"/>
-      </w:pPr>
-      <w:r>
-        <w:t xml:space="preserve">The </w:t>
-      </w:r>
-      <w:proofErr w:type="spellStart"/>
-      <w:r>
-        <w:t>Shankharapur</w:t>
-      </w:r>
-      <w:proofErr w:type="spellEnd"/>
-      <w:r>
-        <w:t xml:space="preserve"> M</w:t>
-      </w:r>
-      <w:r>
-        <w:t>unicipality ward 9</w:t>
-      </w:r>
-      <w:r>
-        <w:t xml:space="preserve"> profile </w:t>
-      </w:r>
-      <w:r>
-        <w:t>–</w:t>
-      </w:r>
-      <w:r>
-        <w:t xml:space="preserve"> </w:t>
-      </w:r>
-      <w:r>
-        <w:t>20</w:t>
-      </w:r>
-      <w:r>
-        <w:t>82 BS</w:t>
-      </w:r>
-      <w:r>
-        <w:t xml:space="preserve"> sh</w:t>
-      </w:r>
-      <w:r>
-        <w:t xml:space="preserve">ows that there </w:t>
-      </w:r>
-      <w:r>
-        <w:t>is</w:t>
-      </w:r>
-      <w:r>
-        <w:t xml:space="preserve"> a total </w:t>
-      </w:r>
-      <w:r>
-        <w:t>population of about</w:t>
-      </w:r>
-      <w:r>
-        <w:t xml:space="preserve"> </w:t>
-      </w:r>
-      <w:r>
-        <w:t>4345</w:t>
-      </w:r>
-      <w:r>
-        <w:t>. Out of 9 wards, ward no.</w:t>
-      </w:r>
-      <w:r>
-        <w:t>9</w:t>
-      </w:r>
-      <w:r>
-        <w:t xml:space="preserve"> will be considered</w:t>
-      </w:r>
-      <w:r>
-        <w:t xml:space="preserve"> as</w:t>
-      </w:r>
-      <w:r>
-        <w:t xml:space="preserve"> st</w:t>
-      </w:r>
-      <w:r>
-        <w:t xml:space="preserve">udy area. This ward </w:t>
-      </w:r>
-      <w:r>
-        <w:t>welcomed</w:t>
-      </w:r>
-      <w:r>
-        <w:t xml:space="preserve"> 82</w:t>
-      </w:r>
-      <w:r>
-        <w:t xml:space="preserve"> </w:t>
-      </w:r>
-      <w:r>
-        <w:t>households</w:t>
-      </w:r>
-      <w:r>
-        <w:t xml:space="preserve"> with total count of 336 immigrants from year 2074 BS to 2082 BS</w:t>
-      </w:r>
-      <w:r>
-        <w:t>. These households will be</w:t>
-      </w:r>
-      <w:r>
-        <w:t xml:space="preserve"> sampled for the study</w:t>
-      </w:r>
-      <w:r>
-        <w:t>. B</w:t>
-      </w:r>
-      <w:r>
-        <w:t>ecause of the time, resources, expert manpower and p</w:t>
-      </w:r>
-      <w:r>
-        <w:t>roper implication of the study, r</w:t>
-      </w:r>
-      <w:r>
-        <w:t>andom sampling</w:t>
-      </w:r>
-      <w:r>
-        <w:t xml:space="preserve"> method will be used to </w:t>
-      </w:r>
-      <w:r>
-        <w:t>sample these households.</w:t>
-      </w:r>
-      <w:r>
-        <w:t xml:space="preserve"> </w:t>
-      </w:r>
-      <w:r>
-        <w:t xml:space="preserve">To draw the sample from whole population, purposive method will be used. </w:t>
-      </w:r>
-    </w:p>
-    <w:p>
-      <w:pPr>
-        <w:pStyle w:val="Heading2"/>
-      </w:pPr>
-      <w:bookmarkStart w:id="23" w:name="_Toc217624822"/>
-      <w:r>
-        <w:t>3.5</w:t>
-      </w:r>
-      <w:r>
-        <w:t xml:space="preserve"> </w:t>
-      </w:r>
-      <w:r>
-        <w:t>Method of Data Collection</w:t>
-      </w:r>
-      <w:bookmarkEnd w:id="23"/>
-      <w:r>
-        <w:t xml:space="preserve"> </w:t>
-      </w:r>
-    </w:p>
-    <w:p>
-      <w:pPr>
-        <w:pStyle w:val="BodyText"/>
-      </w:pPr>
-      <w:r>
-        <w:t>In order to obtain necessary and reliable data for thus study the researcher will use the method such as observation, unstructured interview and some case study.</w:t>
-      </w:r>
-    </w:p>
-    <w:p>
-      <w:pPr>
-        <w:pStyle w:val="Heading3"/>
-      </w:pPr>
-      <w:bookmarkStart w:id="24" w:name="_Toc217624823"/>
-      <w:r>
-        <w:t>3.5</w:t>
-      </w:r>
-      <w:r>
-        <w:t xml:space="preserve">.1 </w:t>
-      </w:r>
-      <w:r>
-        <w:t>Observation</w:t>
-      </w:r>
-      <w:bookmarkEnd w:id="24"/>
-    </w:p>
-    <w:p>
-      <w:pPr>
-        <w:pStyle w:val="BodyText"/>
-      </w:pPr>
-      <w:r>
-        <w:t xml:space="preserve">Observation method will use to collect the observable information such as </w:t>
-      </w:r>
-      <w:r>
-        <w:t>social status. Community participation, role in community decision making, their rel</w:t>
-      </w:r>
-      <w:r>
-        <w:t xml:space="preserve">ationship between the </w:t>
-      </w:r>
-      <w:r>
-        <w:t>immigrants</w:t>
-      </w:r>
-      <w:r>
-        <w:t xml:space="preserve"> and residential. The </w:t>
-      </w:r>
-      <w:r>
-        <w:t>immigration</w:t>
-      </w:r>
-      <w:r>
-        <w:t xml:space="preserve"> will be observed to find out the causes and consequences in the development sector of the study area</w:t>
-      </w:r>
-    </w:p>
-    <w:p>
-      <w:pPr>
-        <w:pStyle w:val="Heading3"/>
-      </w:pPr>
-      <w:bookmarkStart w:id="25" w:name="_Toc217624824"/>
-      <w:r>
-        <w:lastRenderedPageBreak/>
-        <w:t>3.5</w:t>
-      </w:r>
-      <w:r>
-        <w:t>.2 In</w:t>
-      </w:r>
-      <w:r>
-        <w:t>terview</w:t>
-      </w:r>
-      <w:bookmarkEnd w:id="25"/>
-    </w:p>
-    <w:p>
-      <w:pPr>
-        <w:pStyle w:val="BodyText"/>
-      </w:pPr>
-      <w:r>
-        <w:t>An unstructured interview will be taken so as to meet the purpo</w:t>
-      </w:r>
-      <w:r>
-        <w:t xml:space="preserve">ses. The questionnaire will be </w:t>
-      </w:r>
-      <w:r>
-        <w:t xml:space="preserve">divided into four sections. The first section deals with the purpose of getting information </w:t>
-      </w:r>
-      <w:r>
-        <w:t>about demographic variable</w:t>
-      </w:r>
-      <w:r>
-        <w:t>s. The second section will deal</w:t>
-      </w:r>
-      <w:r>
-        <w:t xml:space="preserve"> with the main reason behind the </w:t>
-      </w:r>
-      <w:r>
-        <w:t>immigration</w:t>
-      </w:r>
-      <w:r>
-        <w:t>,</w:t>
-      </w:r>
-      <w:r>
-        <w:t xml:space="preserve"> while the third section will be the </w:t>
-      </w:r>
-      <w:r>
-        <w:t>socio-economic</w:t>
-      </w:r>
-      <w:r>
-        <w:t xml:space="preserve"> </w:t>
-      </w:r>
-      <w:r>
-        <w:t>variables. The</w:t>
-      </w:r>
-      <w:r>
-        <w:t xml:space="preserve"> last section includes the miscellaneous questionnaire about the causes and consequences of</w:t>
-      </w:r>
-      <w:r>
-        <w:t xml:space="preserve"> </w:t>
-      </w:r>
-      <w:r>
-        <w:t>immigration</w:t>
-      </w:r>
-      <w:r>
-        <w:t xml:space="preserve"> within</w:t>
-      </w:r>
-      <w:r>
-        <w:t xml:space="preserve"> the study area.</w:t>
-      </w:r>
-    </w:p>
-    <w:p>
-      <w:pPr>
-        <w:pStyle w:val="Heading2"/>
-      </w:pPr>
-      <w:bookmarkStart w:id="26" w:name="_Toc217624825"/>
+      <w:bookmarkStart w:id="27" w:name="_Toc220841276"/>
       <w:r>
         <w:t>3.6</w:t>
-      </w:r>
-      <w:r>
-        <w:t xml:space="preserve"> </w:t>
-      </w:r>
-      <w:r>
-        <w:t>Data Analysis and Presentation</w:t>
-      </w:r>
-      <w:bookmarkEnd w:id="26"/>
-    </w:p>
-    <w:p>
-      <w:pPr>
-        <w:pStyle w:val="BodyText"/>
-      </w:pPr>
-      <w:r>
-        <w:t>Qualitative data will be presented on tabular form. Both qualitative and quantitative methods will be used to analyze the obtain information.</w:t>
-      </w:r>
-    </w:p>
-    <w:p>
-      <w:pPr>
-        <w:pStyle w:val="Heading2"/>
-      </w:pPr>
-      <w:bookmarkStart w:id="27" w:name="_Toc217624826"/>
-      <w:r>
-        <w:t>3.7</w:t>
       </w:r>
       <w:r>
         <w:t xml:space="preserve"> </w:t>
@@ -7242,7 +7217,7 @@
         <w:br w:type="page"/>
       </w:r>
     </w:p>
-    <w:bookmarkStart w:id="28" w:name="_Toc217624827" w:displacedByCustomXml="next"/>
+    <w:bookmarkStart w:id="28" w:name="_Toc220841277" w:displacedByCustomXml="next"/>
     <w:sdt>
       <w:sdtPr>
         <w:rPr>
@@ -7990,7 +7965,7 @@
           <w:rPr>
             <w:noProof/>
           </w:rPr>
-          <w:t>2</w:t>
+          <w:t>17</w:t>
         </w:r>
         <w:r>
           <w:rPr>
@@ -11650,7 +11625,7 @@
 </file>
 
 <file path=customXml/itemProps1.xml><?xml version="1.0" encoding="utf-8"?>
-<ds:datastoreItem xmlns:ds="http://schemas.openxmlformats.org/officeDocument/2006/customXml" ds:itemID="{B51460E5-0E28-457A-B4A0-19F83168E09F}">
+<ds:datastoreItem xmlns:ds="http://schemas.openxmlformats.org/officeDocument/2006/customXml" ds:itemID="{C0AA9870-0A40-4C10-82F5-370C3E9FA3EA}">
   <ds:schemaRefs>
     <ds:schemaRef ds:uri="http://schemas.openxmlformats.org/officeDocument/2006/bibliography"/>
   </ds:schemaRefs>

</xml_diff>

<commit_message>
valuation chap bhanjyang bajrayogini and gh sketchup
</commit_message>
<xml_diff>
--- a/migration/Migration is one of the major component of population change which is basically cause by socio (1).docx
+++ b/migration/Migration is one of the major component of population change which is basically cause by socio (1).docx
@@ -1,6 +1,6 @@
 
 <file path=word/document.xml><?xml version="1.0" encoding="utf-8"?>
-<w:document xmlns:wpc="http://schemas.microsoft.com/office/word/2010/wordprocessingCanvas" xmlns:cx="http://schemas.microsoft.com/office/drawing/2014/chartex" xmlns:mc="http://schemas.openxmlformats.org/markup-compatibility/2006" xmlns:o="urn:schemas-microsoft-com:office:office" xmlns:r="http://schemas.openxmlformats.org/officeDocument/2006/relationships" xmlns:m="http://schemas.openxmlformats.org/officeDocument/2006/math" xmlns:v="urn:schemas-microsoft-com:vml" xmlns:wp14="http://schemas.microsoft.com/office/word/2010/wordprocessingDrawing" xmlns:wp="http://schemas.openxmlformats.org/drawingml/2006/wordprocessingDrawing" xmlns:w10="urn:schemas-microsoft-com:office:word" xmlns:w="http://schemas.openxmlformats.org/wordprocessingml/2006/main" xmlns:w14="http://schemas.microsoft.com/office/word/2010/wordml" xmlns:w15="http://schemas.microsoft.com/office/word/2012/wordml" xmlns:w16se="http://schemas.microsoft.com/office/word/2015/wordml/symex" xmlns:wpg="http://schemas.microsoft.com/office/word/2010/wordprocessingGroup" xmlns:wpi="http://schemas.microsoft.com/office/word/2010/wordprocessingInk" xmlns:wne="http://schemas.microsoft.com/office/word/2006/wordml" xmlns:wps="http://schemas.microsoft.com/office/word/2010/wordprocessingShape" mc:Ignorable="w14 w15 w16se wp14">
+<w:document xmlns:wpc="http://schemas.microsoft.com/office/word/2010/wordprocessingCanvas" xmlns:cx="http://schemas.microsoft.com/office/drawing/2014/chartex" xmlns:cx1="http://schemas.microsoft.com/office/drawing/2015/9/8/chartex" xmlns:cx2="http://schemas.microsoft.com/office/drawing/2015/10/21/chartex" xmlns:cx3="http://schemas.microsoft.com/office/drawing/2016/5/9/chartex" xmlns:cx4="http://schemas.microsoft.com/office/drawing/2016/5/10/chartex" xmlns:cx5="http://schemas.microsoft.com/office/drawing/2016/5/11/chartex" xmlns:cx6="http://schemas.microsoft.com/office/drawing/2016/5/12/chartex" xmlns:cx7="http://schemas.microsoft.com/office/drawing/2016/5/13/chartex" xmlns:cx8="http://schemas.microsoft.com/office/drawing/2016/5/14/chartex" xmlns:mc="http://schemas.openxmlformats.org/markup-compatibility/2006" xmlns:aink="http://schemas.microsoft.com/office/drawing/2016/ink" xmlns:am3d="http://schemas.microsoft.com/office/drawing/2017/model3d" xmlns:o="urn:schemas-microsoft-com:office:office" xmlns:oel="http://schemas.microsoft.com/office/2019/extlst" xmlns:r="http://schemas.openxmlformats.org/officeDocument/2006/relationships" xmlns:m="http://schemas.openxmlformats.org/officeDocument/2006/math" xmlns:v="urn:schemas-microsoft-com:vml" xmlns:wp14="http://schemas.microsoft.com/office/word/2010/wordprocessingDrawing" xmlns:wp="http://schemas.openxmlformats.org/drawingml/2006/wordprocessingDrawing" xmlns:w10="urn:schemas-microsoft-com:office:word" xmlns:w="http://schemas.openxmlformats.org/wordprocessingml/2006/main" xmlns:w14="http://schemas.microsoft.com/office/word/2010/wordml" xmlns:w15="http://schemas.microsoft.com/office/word/2012/wordml" xmlns:w16cex="http://schemas.microsoft.com/office/word/2018/wordml/cex" xmlns:w16cid="http://schemas.microsoft.com/office/word/2016/wordml/cid" xmlns:w16="http://schemas.microsoft.com/office/word/2018/wordml" xmlns:w16du="http://schemas.microsoft.com/office/word/2023/wordml/word16du" xmlns:w16sdtdh="http://schemas.microsoft.com/office/word/2020/wordml/sdtdatahash" xmlns:w16sdtfl="http://schemas.microsoft.com/office/word/2024/wordml/sdtformatlock" xmlns:w16se="http://schemas.microsoft.com/office/word/2015/wordml/symex" xmlns:wpg="http://schemas.microsoft.com/office/word/2010/wordprocessingGroup" xmlns:wpi="http://schemas.microsoft.com/office/word/2010/wordprocessingInk" xmlns:wne="http://schemas.microsoft.com/office/word/2006/wordml" xmlns:wps="http://schemas.microsoft.com/office/word/2010/wordprocessingShape" mc:Ignorable="w14 w15 w16se w16cid w16 w16cex w16sdtdh w16sdtfl w16du wp14">
   <w:body>
     <w:p>
       <w:pPr>
@@ -709,8 +709,9 @@
           <w:szCs w:val="28"/>
           <w:shd w:val="clear" w:color="auto" w:fill="FFFFFF"/>
         </w:rPr>
-        <w:t>Exam-Roll.N</w:t>
-      </w:r>
+        <w:t>Exam-</w:t>
+      </w:r>
+      <w:proofErr w:type="spellStart"/>
       <w:r>
         <w:rPr>
           <w:rFonts w:ascii="Times New Roman" w:eastAsia="Times New Roman" w:hAnsi="Times New Roman" w:cs="Times New Roman"/>
@@ -718,8 +719,18 @@
           <w:szCs w:val="28"/>
           <w:shd w:val="clear" w:color="auto" w:fill="FFFFFF"/>
         </w:rPr>
+        <w:t>Roll.N</w:t>
+      </w:r>
+      <w:r>
+        <w:rPr>
+          <w:rFonts w:ascii="Times New Roman" w:eastAsia="Times New Roman" w:hAnsi="Times New Roman" w:cs="Times New Roman"/>
+          <w:sz w:val="28"/>
+          <w:szCs w:val="28"/>
+          <w:shd w:val="clear" w:color="auto" w:fill="FFFFFF"/>
+        </w:rPr>
         <w:t>o</w:t>
       </w:r>
+      <w:proofErr w:type="spellEnd"/>
       <w:r>
         <w:rPr>
           <w:rFonts w:ascii="Times New Roman" w:eastAsia="Times New Roman" w:hAnsi="Times New Roman" w:cs="Times New Roman"/>
@@ -977,13 +988,9 @@
               <w:tab w:val="right" w:pos="8630"/>
             </w:tabs>
             <w:rPr>
-              <w:rFonts w:cs="Mangal"/>
               <w:noProof/>
-              <w:kern w:val="0"/>
-              <w:sz w:val="22"/>
-              <w:szCs w:val="20"/>
+              <w:szCs w:val="21"/>
               <w:lang w:eastAsia="en-US" w:bidi="ne-NP"/>
-              <w14:ligatures w14:val="none"/>
             </w:rPr>
           </w:pPr>
           <w:r>
@@ -995,7 +1002,7 @@
           <w:r>
             <w:fldChar w:fldCharType="separate"/>
           </w:r>
-          <w:hyperlink w:anchor="_Toc220841251" w:history="1">
+          <w:hyperlink w:anchor="_Toc229995991" w:history="1">
             <w:r>
               <w:rPr>
                 <w:rStyle w:val="Hyperlink"/>
@@ -1022,7 +1029,7 @@
                 <w:noProof/>
                 <w:webHidden/>
               </w:rPr>
-              <w:instrText xml:space="preserve"> PAGEREF _Toc220841251 \h </w:instrText>
+              <w:instrText xml:space="preserve"> PAGEREF _Toc229995991 \h </w:instrText>
             </w:r>
             <w:r>
               <w:rPr>
@@ -1060,16 +1067,12 @@
               <w:tab w:val="right" w:pos="8630"/>
             </w:tabs>
             <w:rPr>
-              <w:rFonts w:cs="Mangal"/>
               <w:noProof/>
-              <w:kern w:val="0"/>
-              <w:sz w:val="22"/>
-              <w:szCs w:val="20"/>
+              <w:szCs w:val="21"/>
               <w:lang w:eastAsia="en-US" w:bidi="ne-NP"/>
-              <w14:ligatures w14:val="none"/>
             </w:rPr>
           </w:pPr>
-          <w:hyperlink w:anchor="_Toc220841252" w:history="1">
+          <w:hyperlink w:anchor="_Toc229995992" w:history="1">
             <w:r>
               <w:rPr>
                 <w:rStyle w:val="Hyperlink"/>
@@ -1096,7 +1099,7 @@
                 <w:noProof/>
                 <w:webHidden/>
               </w:rPr>
-              <w:instrText xml:space="preserve"> PAGEREF _Toc220841252 \h </w:instrText>
+              <w:instrText xml:space="preserve"> PAGEREF _Toc229995992 \h </w:instrText>
             </w:r>
             <w:r>
               <w:rPr>
@@ -1134,16 +1137,12 @@
               <w:tab w:val="right" w:pos="8630"/>
             </w:tabs>
             <w:rPr>
-              <w:rFonts w:cs="Mangal"/>
               <w:noProof/>
-              <w:kern w:val="0"/>
-              <w:sz w:val="22"/>
-              <w:szCs w:val="20"/>
+              <w:szCs w:val="21"/>
               <w:lang w:eastAsia="en-US" w:bidi="ne-NP"/>
-              <w14:ligatures w14:val="none"/>
             </w:rPr>
           </w:pPr>
-          <w:hyperlink w:anchor="_Toc220841253" w:history="1">
+          <w:hyperlink w:anchor="_Toc229995993" w:history="1">
             <w:r>
               <w:rPr>
                 <w:rStyle w:val="Hyperlink"/>
@@ -1170,7 +1169,7 @@
                 <w:noProof/>
                 <w:webHidden/>
               </w:rPr>
-              <w:instrText xml:space="preserve"> PAGEREF _Toc220841253 \h </w:instrText>
+              <w:instrText xml:space="preserve"> PAGEREF _Toc229995993 \h </w:instrText>
             </w:r>
             <w:r>
               <w:rPr>
@@ -1208,16 +1207,12 @@
               <w:tab w:val="right" w:pos="8630"/>
             </w:tabs>
             <w:rPr>
-              <w:rFonts w:cs="Mangal"/>
               <w:noProof/>
-              <w:kern w:val="0"/>
-              <w:sz w:val="22"/>
-              <w:szCs w:val="20"/>
+              <w:szCs w:val="21"/>
               <w:lang w:eastAsia="en-US" w:bidi="ne-NP"/>
-              <w14:ligatures w14:val="none"/>
             </w:rPr>
           </w:pPr>
-          <w:hyperlink w:anchor="_Toc220841254" w:history="1">
+          <w:hyperlink w:anchor="_Toc229995994" w:history="1">
             <w:r>
               <w:rPr>
                 <w:rStyle w:val="Hyperlink"/>
@@ -1244,7 +1239,7 @@
                 <w:noProof/>
                 <w:webHidden/>
               </w:rPr>
-              <w:instrText xml:space="preserve"> PAGEREF _Toc220841254 \h </w:instrText>
+              <w:instrText xml:space="preserve"> PAGEREF _Toc229995994 \h </w:instrText>
             </w:r>
             <w:r>
               <w:rPr>
@@ -1282,16 +1277,12 @@
               <w:tab w:val="right" w:pos="8630"/>
             </w:tabs>
             <w:rPr>
-              <w:rFonts w:cs="Mangal"/>
               <w:noProof/>
-              <w:kern w:val="0"/>
-              <w:sz w:val="22"/>
-              <w:szCs w:val="20"/>
+              <w:szCs w:val="21"/>
               <w:lang w:eastAsia="en-US" w:bidi="ne-NP"/>
-              <w14:ligatures w14:val="none"/>
             </w:rPr>
           </w:pPr>
-          <w:hyperlink w:anchor="_Toc220841255" w:history="1">
+          <w:hyperlink w:anchor="_Toc229995995" w:history="1">
             <w:r>
               <w:rPr>
                 <w:rStyle w:val="Hyperlink"/>
@@ -1318,7 +1309,7 @@
                 <w:noProof/>
                 <w:webHidden/>
               </w:rPr>
-              <w:instrText xml:space="preserve"> PAGEREF _Toc220841255 \h </w:instrText>
+              <w:instrText xml:space="preserve"> PAGEREF _Toc229995995 \h </w:instrText>
             </w:r>
             <w:r>
               <w:rPr>
@@ -1356,16 +1347,12 @@
               <w:tab w:val="right" w:pos="8630"/>
             </w:tabs>
             <w:rPr>
-              <w:rFonts w:cs="Mangal"/>
               <w:noProof/>
-              <w:kern w:val="0"/>
-              <w:sz w:val="22"/>
-              <w:szCs w:val="20"/>
+              <w:szCs w:val="21"/>
               <w:lang w:eastAsia="en-US" w:bidi="ne-NP"/>
-              <w14:ligatures w14:val="none"/>
             </w:rPr>
           </w:pPr>
-          <w:hyperlink w:anchor="_Toc220841256" w:history="1">
+          <w:hyperlink w:anchor="_Toc229995996" w:history="1">
             <w:r>
               <w:rPr>
                 <w:rStyle w:val="Hyperlink"/>
@@ -1392,7 +1379,7 @@
                 <w:noProof/>
                 <w:webHidden/>
               </w:rPr>
-              <w:instrText xml:space="preserve"> PAGEREF _Toc220841256 \h </w:instrText>
+              <w:instrText xml:space="preserve"> PAGEREF _Toc229995996 \h </w:instrText>
             </w:r>
             <w:r>
               <w:rPr>
@@ -1430,16 +1417,12 @@
               <w:tab w:val="right" w:pos="8630"/>
             </w:tabs>
             <w:rPr>
-              <w:rFonts w:cs="Mangal"/>
               <w:noProof/>
-              <w:kern w:val="0"/>
-              <w:sz w:val="22"/>
-              <w:szCs w:val="20"/>
+              <w:szCs w:val="21"/>
               <w:lang w:eastAsia="en-US" w:bidi="ne-NP"/>
-              <w14:ligatures w14:val="none"/>
             </w:rPr>
           </w:pPr>
-          <w:hyperlink w:anchor="_Toc220841257" w:history="1">
+          <w:hyperlink w:anchor="_Toc229995997" w:history="1">
             <w:r>
               <w:rPr>
                 <w:rStyle w:val="Hyperlink"/>
@@ -1466,7 +1449,7 @@
                 <w:noProof/>
                 <w:webHidden/>
               </w:rPr>
-              <w:instrText xml:space="preserve"> PAGEREF _Toc220841257 \h </w:instrText>
+              <w:instrText xml:space="preserve"> PAGEREF _Toc229995997 \h </w:instrText>
             </w:r>
             <w:r>
               <w:rPr>
@@ -1504,16 +1487,12 @@
               <w:tab w:val="right" w:pos="8630"/>
             </w:tabs>
             <w:rPr>
-              <w:rFonts w:cs="Mangal"/>
               <w:noProof/>
-              <w:kern w:val="0"/>
-              <w:sz w:val="22"/>
-              <w:szCs w:val="20"/>
+              <w:szCs w:val="21"/>
               <w:lang w:eastAsia="en-US" w:bidi="ne-NP"/>
-              <w14:ligatures w14:val="none"/>
             </w:rPr>
           </w:pPr>
-          <w:hyperlink w:anchor="_Toc220841258" w:history="1">
+          <w:hyperlink w:anchor="_Toc229995998" w:history="1">
             <w:r>
               <w:rPr>
                 <w:rStyle w:val="Hyperlink"/>
@@ -1540,7 +1519,7 @@
                 <w:noProof/>
                 <w:webHidden/>
               </w:rPr>
-              <w:instrText xml:space="preserve"> PAGEREF _Toc220841258 \h </w:instrText>
+              <w:instrText xml:space="preserve"> PAGEREF _Toc229995998 \h </w:instrText>
             </w:r>
             <w:r>
               <w:rPr>
@@ -1578,16 +1557,12 @@
               <w:tab w:val="right" w:pos="8630"/>
             </w:tabs>
             <w:rPr>
-              <w:rFonts w:cs="Mangal"/>
               <w:noProof/>
-              <w:kern w:val="0"/>
-              <w:sz w:val="22"/>
-              <w:szCs w:val="20"/>
+              <w:szCs w:val="21"/>
               <w:lang w:eastAsia="en-US" w:bidi="ne-NP"/>
-              <w14:ligatures w14:val="none"/>
             </w:rPr>
           </w:pPr>
-          <w:hyperlink w:anchor="_Toc220841259" w:history="1">
+          <w:hyperlink w:anchor="_Toc229995999" w:history="1">
             <w:r>
               <w:rPr>
                 <w:rStyle w:val="Hyperlink"/>
@@ -1614,7 +1589,7 @@
                 <w:noProof/>
                 <w:webHidden/>
               </w:rPr>
-              <w:instrText xml:space="preserve"> PAGEREF _Toc220841259 \h </w:instrText>
+              <w:instrText xml:space="preserve"> PAGEREF _Toc229995999 \h </w:instrText>
             </w:r>
             <w:r>
               <w:rPr>
@@ -1652,16 +1627,12 @@
               <w:tab w:val="right" w:pos="8630"/>
             </w:tabs>
             <w:rPr>
-              <w:rFonts w:cs="Mangal"/>
               <w:noProof/>
-              <w:kern w:val="0"/>
-              <w:sz w:val="22"/>
-              <w:szCs w:val="20"/>
+              <w:szCs w:val="21"/>
               <w:lang w:eastAsia="en-US" w:bidi="ne-NP"/>
-              <w14:ligatures w14:val="none"/>
             </w:rPr>
           </w:pPr>
-          <w:hyperlink w:anchor="_Toc220841260" w:history="1">
+          <w:hyperlink w:anchor="_Toc229996000" w:history="1">
             <w:r>
               <w:rPr>
                 <w:rStyle w:val="Hyperlink"/>
@@ -1688,7 +1659,7 @@
                 <w:noProof/>
                 <w:webHidden/>
               </w:rPr>
-              <w:instrText xml:space="preserve"> PAGEREF _Toc220841260 \h </w:instrText>
+              <w:instrText xml:space="preserve"> PAGEREF _Toc229996000 \h </w:instrText>
             </w:r>
             <w:r>
               <w:rPr>
@@ -1726,16 +1697,12 @@
               <w:tab w:val="right" w:pos="8630"/>
             </w:tabs>
             <w:rPr>
-              <w:rFonts w:cs="Mangal"/>
               <w:noProof/>
-              <w:kern w:val="0"/>
-              <w:sz w:val="22"/>
-              <w:szCs w:val="20"/>
+              <w:szCs w:val="21"/>
               <w:lang w:eastAsia="en-US" w:bidi="ne-NP"/>
-              <w14:ligatures w14:val="none"/>
             </w:rPr>
           </w:pPr>
-          <w:hyperlink w:anchor="_Toc220841261" w:history="1">
+          <w:hyperlink w:anchor="_Toc229996001" w:history="1">
             <w:r>
               <w:rPr>
                 <w:rStyle w:val="Hyperlink"/>
@@ -1762,7 +1729,7 @@
                 <w:noProof/>
                 <w:webHidden/>
               </w:rPr>
-              <w:instrText xml:space="preserve"> PAGEREF _Toc220841261 \h </w:instrText>
+              <w:instrText xml:space="preserve"> PAGEREF _Toc229996001 \h </w:instrText>
             </w:r>
             <w:r>
               <w:rPr>
@@ -1800,16 +1767,12 @@
               <w:tab w:val="right" w:pos="8630"/>
             </w:tabs>
             <w:rPr>
-              <w:rFonts w:cs="Mangal"/>
               <w:noProof/>
-              <w:kern w:val="0"/>
-              <w:sz w:val="22"/>
-              <w:szCs w:val="20"/>
+              <w:szCs w:val="21"/>
               <w:lang w:eastAsia="en-US" w:bidi="ne-NP"/>
-              <w14:ligatures w14:val="none"/>
             </w:rPr>
           </w:pPr>
-          <w:hyperlink w:anchor="_Toc220841262" w:history="1">
+          <w:hyperlink w:anchor="_Toc229996002" w:history="1">
             <w:r>
               <w:rPr>
                 <w:rStyle w:val="Hyperlink"/>
@@ -1836,7 +1799,7 @@
                 <w:noProof/>
                 <w:webHidden/>
               </w:rPr>
-              <w:instrText xml:space="preserve"> PAGEREF _Toc220841262 \h </w:instrText>
+              <w:instrText xml:space="preserve"> PAGEREF _Toc229996002 \h </w:instrText>
             </w:r>
             <w:r>
               <w:rPr>
@@ -1874,16 +1837,12 @@
               <w:tab w:val="right" w:pos="8630"/>
             </w:tabs>
             <w:rPr>
-              <w:rFonts w:cs="Mangal"/>
               <w:noProof/>
-              <w:kern w:val="0"/>
-              <w:sz w:val="22"/>
-              <w:szCs w:val="20"/>
+              <w:szCs w:val="21"/>
               <w:lang w:eastAsia="en-US" w:bidi="ne-NP"/>
-              <w14:ligatures w14:val="none"/>
             </w:rPr>
           </w:pPr>
-          <w:hyperlink w:anchor="_Toc220841263" w:history="1">
+          <w:hyperlink w:anchor="_Toc229996003" w:history="1">
             <w:r>
               <w:rPr>
                 <w:rStyle w:val="Hyperlink"/>
@@ -1910,7 +1869,7 @@
                 <w:noProof/>
                 <w:webHidden/>
               </w:rPr>
-              <w:instrText xml:space="preserve"> PAGEREF _Toc220841263 \h </w:instrText>
+              <w:instrText xml:space="preserve"> PAGEREF _Toc229996003 \h </w:instrText>
             </w:r>
             <w:r>
               <w:rPr>
@@ -1930,7 +1889,7 @@
                 <w:noProof/>
                 <w:webHidden/>
               </w:rPr>
-              <w:t>11</w:t>
+              <w:t>12</w:t>
             </w:r>
             <w:r>
               <w:rPr>
@@ -1948,16 +1907,12 @@
               <w:tab w:val="right" w:pos="8630"/>
             </w:tabs>
             <w:rPr>
-              <w:rFonts w:cs="Mangal"/>
               <w:noProof/>
-              <w:kern w:val="0"/>
-              <w:sz w:val="22"/>
-              <w:szCs w:val="20"/>
+              <w:szCs w:val="21"/>
               <w:lang w:eastAsia="en-US" w:bidi="ne-NP"/>
-              <w14:ligatures w14:val="none"/>
             </w:rPr>
           </w:pPr>
-          <w:hyperlink w:anchor="_Toc220841264" w:history="1">
+          <w:hyperlink w:anchor="_Toc229996004" w:history="1">
             <w:r>
               <w:rPr>
                 <w:rStyle w:val="Hyperlink"/>
@@ -1984,7 +1939,7 @@
                 <w:noProof/>
                 <w:webHidden/>
               </w:rPr>
-              <w:instrText xml:space="preserve"> PAGEREF _Toc220841264 \h </w:instrText>
+              <w:instrText xml:space="preserve"> PAGEREF _Toc229996004 \h </w:instrText>
             </w:r>
             <w:r>
               <w:rPr>
@@ -2004,7 +1959,7 @@
                 <w:noProof/>
                 <w:webHidden/>
               </w:rPr>
-              <w:t>12</w:t>
+              <w:t>14</w:t>
             </w:r>
             <w:r>
               <w:rPr>
@@ -2022,16 +1977,12 @@
               <w:tab w:val="right" w:pos="8630"/>
             </w:tabs>
             <w:rPr>
-              <w:rFonts w:cs="Mangal"/>
               <w:noProof/>
-              <w:kern w:val="0"/>
-              <w:sz w:val="22"/>
-              <w:szCs w:val="20"/>
+              <w:szCs w:val="21"/>
               <w:lang w:eastAsia="en-US" w:bidi="ne-NP"/>
-              <w14:ligatures w14:val="none"/>
             </w:rPr>
           </w:pPr>
-          <w:hyperlink w:anchor="_Toc220841265" w:history="1">
+          <w:hyperlink w:anchor="_Toc229996005" w:history="1">
             <w:r>
               <w:rPr>
                 <w:rStyle w:val="Hyperlink"/>
@@ -2058,7 +2009,7 @@
                 <w:noProof/>
                 <w:webHidden/>
               </w:rPr>
-              <w:instrText xml:space="preserve"> PAGEREF _Toc220841265 \h </w:instrText>
+              <w:instrText xml:space="preserve"> PAGEREF _Toc229996005 \h </w:instrText>
             </w:r>
             <w:r>
               <w:rPr>
@@ -2078,7 +2029,7 @@
                 <w:noProof/>
                 <w:webHidden/>
               </w:rPr>
-              <w:t>12</w:t>
+              <w:t>15</w:t>
             </w:r>
             <w:r>
               <w:rPr>
@@ -2096,16 +2047,12 @@
               <w:tab w:val="right" w:pos="8630"/>
             </w:tabs>
             <w:rPr>
-              <w:rFonts w:cs="Mangal"/>
               <w:noProof/>
-              <w:kern w:val="0"/>
-              <w:sz w:val="22"/>
-              <w:szCs w:val="20"/>
+              <w:szCs w:val="21"/>
               <w:lang w:eastAsia="en-US" w:bidi="ne-NP"/>
-              <w14:ligatures w14:val="none"/>
             </w:rPr>
           </w:pPr>
-          <w:hyperlink w:anchor="_Toc220841266" w:history="1">
+          <w:hyperlink w:anchor="_Toc229996006" w:history="1">
             <w:r>
               <w:rPr>
                 <w:rStyle w:val="Hyperlink"/>
@@ -2132,7 +2079,7 @@
                 <w:noProof/>
                 <w:webHidden/>
               </w:rPr>
-              <w:instrText xml:space="preserve"> PAGEREF _Toc220841266 \h </w:instrText>
+              <w:instrText xml:space="preserve"> PAGEREF _Toc229996006 \h </w:instrText>
             </w:r>
             <w:r>
               <w:rPr>
@@ -2152,7 +2099,7 @@
                 <w:noProof/>
                 <w:webHidden/>
               </w:rPr>
-              <w:t>13</w:t>
+              <w:t>15</w:t>
             </w:r>
             <w:r>
               <w:rPr>
@@ -2170,16 +2117,12 @@
               <w:tab w:val="right" w:pos="8630"/>
             </w:tabs>
             <w:rPr>
-              <w:rFonts w:cs="Mangal"/>
               <w:noProof/>
-              <w:kern w:val="0"/>
-              <w:sz w:val="22"/>
-              <w:szCs w:val="20"/>
+              <w:szCs w:val="21"/>
               <w:lang w:eastAsia="en-US" w:bidi="ne-NP"/>
-              <w14:ligatures w14:val="none"/>
             </w:rPr>
           </w:pPr>
-          <w:hyperlink w:anchor="_Toc220841267" w:history="1">
+          <w:hyperlink w:anchor="_Toc229996007" w:history="1">
             <w:r>
               <w:rPr>
                 <w:rStyle w:val="Hyperlink"/>
@@ -2206,7 +2149,7 @@
                 <w:noProof/>
                 <w:webHidden/>
               </w:rPr>
-              <w:instrText xml:space="preserve"> PAGEREF _Toc220841267 \h </w:instrText>
+              <w:instrText xml:space="preserve"> PAGEREF _Toc229996007 \h </w:instrText>
             </w:r>
             <w:r>
               <w:rPr>
@@ -2226,7 +2169,7 @@
                 <w:noProof/>
                 <w:webHidden/>
               </w:rPr>
-              <w:t>14</w:t>
+              <w:t>18</w:t>
             </w:r>
             <w:r>
               <w:rPr>
@@ -2244,16 +2187,12 @@
               <w:tab w:val="right" w:pos="8630"/>
             </w:tabs>
             <w:rPr>
-              <w:rFonts w:cs="Mangal"/>
               <w:noProof/>
-              <w:kern w:val="0"/>
-              <w:sz w:val="22"/>
-              <w:szCs w:val="20"/>
+              <w:szCs w:val="21"/>
               <w:lang w:eastAsia="en-US" w:bidi="ne-NP"/>
-              <w14:ligatures w14:val="none"/>
             </w:rPr>
           </w:pPr>
-          <w:hyperlink w:anchor="_Toc220841268" w:history="1">
+          <w:hyperlink w:anchor="_Toc229996008" w:history="1">
             <w:r>
               <w:rPr>
                 <w:rStyle w:val="Hyperlink"/>
@@ -2280,7 +2219,7 @@
                 <w:noProof/>
                 <w:webHidden/>
               </w:rPr>
-              <w:instrText xml:space="preserve"> PAGEREF _Toc220841268 \h </w:instrText>
+              <w:instrText xml:space="preserve"> PAGEREF _Toc229996008 \h </w:instrText>
             </w:r>
             <w:r>
               <w:rPr>
@@ -2300,7 +2239,7 @@
                 <w:noProof/>
                 <w:webHidden/>
               </w:rPr>
-              <w:t>14</w:t>
+              <w:t>18</w:t>
             </w:r>
             <w:r>
               <w:rPr>
@@ -2318,16 +2257,12 @@
               <w:tab w:val="right" w:pos="8630"/>
             </w:tabs>
             <w:rPr>
-              <w:rFonts w:cs="Mangal"/>
               <w:noProof/>
-              <w:kern w:val="0"/>
-              <w:sz w:val="22"/>
-              <w:szCs w:val="20"/>
+              <w:szCs w:val="21"/>
               <w:lang w:eastAsia="en-US" w:bidi="ne-NP"/>
-              <w14:ligatures w14:val="none"/>
             </w:rPr>
           </w:pPr>
-          <w:hyperlink w:anchor="_Toc220841269" w:history="1">
+          <w:hyperlink w:anchor="_Toc229996009" w:history="1">
             <w:r>
               <w:rPr>
                 <w:rStyle w:val="Hyperlink"/>
@@ -2354,7 +2289,7 @@
                 <w:noProof/>
                 <w:webHidden/>
               </w:rPr>
-              <w:instrText xml:space="preserve"> PAGEREF _Toc220841269 \h </w:instrText>
+              <w:instrText xml:space="preserve"> PAGEREF _Toc229996009 \h </w:instrText>
             </w:r>
             <w:r>
               <w:rPr>
@@ -2374,7 +2309,7 @@
                 <w:noProof/>
                 <w:webHidden/>
               </w:rPr>
-              <w:t>14</w:t>
+              <w:t>18</w:t>
             </w:r>
             <w:r>
               <w:rPr>
@@ -2392,16 +2327,12 @@
               <w:tab w:val="right" w:pos="8630"/>
             </w:tabs>
             <w:rPr>
-              <w:rFonts w:cs="Mangal"/>
               <w:noProof/>
-              <w:kern w:val="0"/>
-              <w:sz w:val="22"/>
-              <w:szCs w:val="20"/>
+              <w:szCs w:val="21"/>
               <w:lang w:eastAsia="en-US" w:bidi="ne-NP"/>
-              <w14:ligatures w14:val="none"/>
             </w:rPr>
           </w:pPr>
-          <w:hyperlink w:anchor="_Toc220841270" w:history="1">
+          <w:hyperlink w:anchor="_Toc229996010" w:history="1">
             <w:r>
               <w:rPr>
                 <w:rStyle w:val="Hyperlink"/>
@@ -2428,7 +2359,7 @@
                 <w:noProof/>
                 <w:webHidden/>
               </w:rPr>
-              <w:instrText xml:space="preserve"> PAGEREF _Toc220841270 \h </w:instrText>
+              <w:instrText xml:space="preserve"> PAGEREF _Toc229996010 \h </w:instrText>
             </w:r>
             <w:r>
               <w:rPr>
@@ -2448,7 +2379,7 @@
                 <w:noProof/>
                 <w:webHidden/>
               </w:rPr>
-              <w:t>14</w:t>
+              <w:t>18</w:t>
             </w:r>
             <w:r>
               <w:rPr>
@@ -2466,22 +2397,18 @@
               <w:tab w:val="right" w:pos="8630"/>
             </w:tabs>
             <w:rPr>
-              <w:rFonts w:cs="Mangal"/>
               <w:noProof/>
-              <w:kern w:val="0"/>
-              <w:sz w:val="22"/>
-              <w:szCs w:val="20"/>
+              <w:szCs w:val="21"/>
               <w:lang w:eastAsia="en-US" w:bidi="ne-NP"/>
-              <w14:ligatures w14:val="none"/>
             </w:rPr>
           </w:pPr>
-          <w:hyperlink w:anchor="_Toc220841271" w:history="1">
+          <w:hyperlink w:anchor="_Toc229996011" w:history="1">
             <w:r>
               <w:rPr>
                 <w:rStyle w:val="Hyperlink"/>
                 <w:noProof/>
               </w:rPr>
-              <w:t>3.3 Population and Sampling</w:t>
+              <w:t xml:space="preserve"> 3.3 Population and Sampling</w:t>
             </w:r>
             <w:r>
               <w:rPr>
@@ -2502,7 +2429,7 @@
                 <w:noProof/>
                 <w:webHidden/>
               </w:rPr>
-              <w:instrText xml:space="preserve"> PAGEREF _Toc220841271 \h </w:instrText>
+              <w:instrText xml:space="preserve"> PAGEREF _Toc229996011 \h </w:instrText>
             </w:r>
             <w:r>
               <w:rPr>
@@ -2522,7 +2449,7 @@
                 <w:noProof/>
                 <w:webHidden/>
               </w:rPr>
-              <w:t>14</w:t>
+              <w:t>18</w:t>
             </w:r>
             <w:r>
               <w:rPr>
@@ -2540,21 +2467,87 @@
               <w:tab w:val="right" w:pos="8630"/>
             </w:tabs>
             <w:rPr>
-              <w:rFonts w:cs="Mangal"/>
               <w:noProof/>
-              <w:kern w:val="0"/>
-              <w:sz w:val="22"/>
-              <w:szCs w:val="20"/>
+              <w:szCs w:val="21"/>
               <w:lang w:eastAsia="en-US" w:bidi="ne-NP"/>
-              <w14:ligatures w14:val="none"/>
             </w:rPr>
           </w:pPr>
-          <w:hyperlink w:anchor="_Toc220841272" w:history="1">
+          <w:hyperlink w:anchor="_Toc229996012" w:history="1">
             <w:r>
               <w:rPr>
                 <w:rStyle w:val="Hyperlink"/>
                 <w:noProof/>
               </w:rPr>
+              <w:t>3.3.1 Sample Size Determination</w:t>
+            </w:r>
+            <w:r>
+              <w:rPr>
+                <w:noProof/>
+                <w:webHidden/>
+              </w:rPr>
+              <w:tab/>
+            </w:r>
+            <w:r>
+              <w:rPr>
+                <w:noProof/>
+                <w:webHidden/>
+              </w:rPr>
+              <w:fldChar w:fldCharType="begin"/>
+            </w:r>
+            <w:r>
+              <w:rPr>
+                <w:noProof/>
+                <w:webHidden/>
+              </w:rPr>
+              <w:instrText xml:space="preserve"> PAGEREF _Toc229996012 \h </w:instrText>
+            </w:r>
+            <w:r>
+              <w:rPr>
+                <w:noProof/>
+                <w:webHidden/>
+              </w:rPr>
+            </w:r>
+            <w:r>
+              <w:rPr>
+                <w:noProof/>
+                <w:webHidden/>
+              </w:rPr>
+              <w:fldChar w:fldCharType="separate"/>
+            </w:r>
+            <w:r>
+              <w:rPr>
+                <w:noProof/>
+                <w:webHidden/>
+              </w:rPr>
+              <w:t>18</w:t>
+            </w:r>
+            <w:r>
+              <w:rPr>
+                <w:noProof/>
+                <w:webHidden/>
+              </w:rPr>
+              <w:fldChar w:fldCharType="end"/>
+            </w:r>
+          </w:hyperlink>
+        </w:p>
+        <w:p>
+          <w:pPr>
+            <w:pStyle w:val="TOC2"/>
+            <w:tabs>
+              <w:tab w:val="right" w:pos="8630"/>
+            </w:tabs>
+            <w:rPr>
+              <w:noProof/>
+              <w:szCs w:val="21"/>
+              <w:lang w:eastAsia="en-US" w:bidi="ne-NP"/>
+            </w:rPr>
+          </w:pPr>
+          <w:hyperlink w:anchor="_Toc229996013" w:history="1">
+            <w:r>
+              <w:rPr>
+                <w:rStyle w:val="Hyperlink"/>
+                <w:noProof/>
+              </w:rPr>
               <w:t>3.4 Method of Data Collection</w:t>
             </w:r>
             <w:r>
@@ -2576,7 +2569,7 @@
                 <w:noProof/>
                 <w:webHidden/>
               </w:rPr>
-              <w:instrText xml:space="preserve"> PAGEREF _Toc220841272 \h </w:instrText>
+              <w:instrText xml:space="preserve"> PAGEREF _Toc229996013 \h </w:instrText>
             </w:r>
             <w:r>
               <w:rPr>
@@ -2596,7 +2589,7 @@
                 <w:noProof/>
                 <w:webHidden/>
               </w:rPr>
-              <w:t>14</w:t>
+              <w:t>19</w:t>
             </w:r>
             <w:r>
               <w:rPr>
@@ -2614,16 +2607,12 @@
               <w:tab w:val="right" w:pos="8630"/>
             </w:tabs>
             <w:rPr>
-              <w:rFonts w:cs="Mangal"/>
               <w:noProof/>
-              <w:kern w:val="0"/>
-              <w:sz w:val="22"/>
-              <w:szCs w:val="20"/>
+              <w:szCs w:val="21"/>
               <w:lang w:eastAsia="en-US" w:bidi="ne-NP"/>
-              <w14:ligatures w14:val="none"/>
             </w:rPr>
           </w:pPr>
-          <w:hyperlink w:anchor="_Toc220841273" w:history="1">
+          <w:hyperlink w:anchor="_Toc229996014" w:history="1">
             <w:r>
               <w:rPr>
                 <w:rStyle w:val="Hyperlink"/>
@@ -2650,7 +2639,7 @@
                 <w:noProof/>
                 <w:webHidden/>
               </w:rPr>
-              <w:instrText xml:space="preserve"> PAGEREF _Toc220841273 \h </w:instrText>
+              <w:instrText xml:space="preserve"> PAGEREF _Toc229996014 \h </w:instrText>
             </w:r>
             <w:r>
               <w:rPr>
@@ -2670,81 +2659,7 @@
                 <w:noProof/>
                 <w:webHidden/>
               </w:rPr>
-              <w:t>15</w:t>
-            </w:r>
-            <w:r>
-              <w:rPr>
-                <w:noProof/>
-                <w:webHidden/>
-              </w:rPr>
-              <w:fldChar w:fldCharType="end"/>
-            </w:r>
-          </w:hyperlink>
-        </w:p>
-        <w:p>
-          <w:pPr>
-            <w:pStyle w:val="TOC3"/>
-            <w:tabs>
-              <w:tab w:val="right" w:pos="8630"/>
-            </w:tabs>
-            <w:rPr>
-              <w:rFonts w:cs="Mangal"/>
-              <w:noProof/>
-              <w:kern w:val="0"/>
-              <w:sz w:val="22"/>
-              <w:szCs w:val="20"/>
-              <w:lang w:eastAsia="en-US" w:bidi="ne-NP"/>
-              <w14:ligatures w14:val="none"/>
-            </w:rPr>
-          </w:pPr>
-          <w:hyperlink w:anchor="_Toc220841274" w:history="1">
-            <w:r>
-              <w:rPr>
-                <w:rStyle w:val="Hyperlink"/>
-                <w:noProof/>
-              </w:rPr>
-              <w:t>3.4.2 Interview</w:t>
-            </w:r>
-            <w:r>
-              <w:rPr>
-                <w:noProof/>
-                <w:webHidden/>
-              </w:rPr>
-              <w:tab/>
-            </w:r>
-            <w:r>
-              <w:rPr>
-                <w:noProof/>
-                <w:webHidden/>
-              </w:rPr>
-              <w:fldChar w:fldCharType="begin"/>
-            </w:r>
-            <w:r>
-              <w:rPr>
-                <w:noProof/>
-                <w:webHidden/>
-              </w:rPr>
-              <w:instrText xml:space="preserve"> PAGEREF _Toc220841274 \h </w:instrText>
-            </w:r>
-            <w:r>
-              <w:rPr>
-                <w:noProof/>
-                <w:webHidden/>
-              </w:rPr>
-            </w:r>
-            <w:r>
-              <w:rPr>
-                <w:noProof/>
-                <w:webHidden/>
-              </w:rPr>
-              <w:fldChar w:fldCharType="separate"/>
-            </w:r>
-            <w:r>
-              <w:rPr>
-                <w:noProof/>
-                <w:webHidden/>
-              </w:rPr>
-              <w:t>15</w:t>
+              <w:t>19</w:t>
             </w:r>
             <w:r>
               <w:rPr>
@@ -2762,16 +2677,12 @@
               <w:tab w:val="right" w:pos="8630"/>
             </w:tabs>
             <w:rPr>
-              <w:rFonts w:cs="Mangal"/>
               <w:noProof/>
-              <w:kern w:val="0"/>
-              <w:sz w:val="22"/>
-              <w:szCs w:val="20"/>
+              <w:szCs w:val="21"/>
               <w:lang w:eastAsia="en-US" w:bidi="ne-NP"/>
-              <w14:ligatures w14:val="none"/>
             </w:rPr>
           </w:pPr>
-          <w:hyperlink w:anchor="_Toc220841275" w:history="1">
+          <w:hyperlink w:anchor="_Toc229996015" w:history="1">
             <w:r>
               <w:rPr>
                 <w:rStyle w:val="Hyperlink"/>
@@ -2798,7 +2709,7 @@
                 <w:noProof/>
                 <w:webHidden/>
               </w:rPr>
-              <w:instrText xml:space="preserve"> PAGEREF _Toc220841275 \h </w:instrText>
+              <w:instrText xml:space="preserve"> PAGEREF _Toc229996015 \h </w:instrText>
             </w:r>
             <w:r>
               <w:rPr>
@@ -2818,7 +2729,7 @@
                 <w:noProof/>
                 <w:webHidden/>
               </w:rPr>
-              <w:t>15</w:t>
+              <w:t>19</w:t>
             </w:r>
             <w:r>
               <w:rPr>
@@ -2836,16 +2747,12 @@
               <w:tab w:val="right" w:pos="8630"/>
             </w:tabs>
             <w:rPr>
-              <w:rFonts w:cs="Mangal"/>
               <w:noProof/>
-              <w:kern w:val="0"/>
-              <w:sz w:val="22"/>
-              <w:szCs w:val="20"/>
+              <w:szCs w:val="21"/>
               <w:lang w:eastAsia="en-US" w:bidi="ne-NP"/>
-              <w14:ligatures w14:val="none"/>
             </w:rPr>
           </w:pPr>
-          <w:hyperlink w:anchor="_Toc220841276" w:history="1">
+          <w:hyperlink w:anchor="_Toc229996016" w:history="1">
             <w:r>
               <w:rPr>
                 <w:rStyle w:val="Hyperlink"/>
@@ -2872,7 +2779,7 @@
                 <w:noProof/>
                 <w:webHidden/>
               </w:rPr>
-              <w:instrText xml:space="preserve"> PAGEREF _Toc220841276 \h </w:instrText>
+              <w:instrText xml:space="preserve"> PAGEREF _Toc229996016 \h </w:instrText>
             </w:r>
             <w:r>
               <w:rPr>
@@ -2892,7 +2799,7 @@
                 <w:noProof/>
                 <w:webHidden/>
               </w:rPr>
-              <w:t>15</w:t>
+              <w:t>20</w:t>
             </w:r>
             <w:r>
               <w:rPr>
@@ -2910,16 +2817,12 @@
               <w:tab w:val="right" w:pos="8630"/>
             </w:tabs>
             <w:rPr>
-              <w:rFonts w:cs="Mangal"/>
               <w:noProof/>
-              <w:kern w:val="0"/>
-              <w:sz w:val="22"/>
-              <w:szCs w:val="20"/>
+              <w:szCs w:val="21"/>
               <w:lang w:eastAsia="en-US" w:bidi="ne-NP"/>
-              <w14:ligatures w14:val="none"/>
             </w:rPr>
           </w:pPr>
-          <w:hyperlink w:anchor="_Toc220841277" w:history="1">
+          <w:hyperlink w:anchor="_Toc229996017" w:history="1">
             <w:r>
               <w:rPr>
                 <w:rStyle w:val="Hyperlink"/>
@@ -2946,7 +2849,7 @@
                 <w:noProof/>
                 <w:webHidden/>
               </w:rPr>
-              <w:instrText xml:space="preserve"> PAGEREF _Toc220841277 \h </w:instrText>
+              <w:instrText xml:space="preserve"> PAGEREF _Toc229996017 \h </w:instrText>
             </w:r>
             <w:r>
               <w:rPr>
@@ -2966,7 +2869,7 @@
                 <w:noProof/>
                 <w:webHidden/>
               </w:rPr>
-              <w:t>16</w:t>
+              <w:t>21</w:t>
             </w:r>
             <w:r>
               <w:rPr>
@@ -3009,7 +2912,7 @@
           <w:bCs w:val="0"/>
         </w:rPr>
       </w:pPr>
-      <w:bookmarkStart w:id="1" w:name="_Toc220841251"/>
+      <w:bookmarkStart w:id="1" w:name="_Toc229995991"/>
       <w:r>
         <w:rPr>
           <w:rStyle w:val="Strong"/>
@@ -3037,7 +2940,7 @@
           <w:szCs w:val="38"/>
         </w:rPr>
       </w:pPr>
-      <w:bookmarkStart w:id="2" w:name="_Toc220841252"/>
+      <w:bookmarkStart w:id="2" w:name="_Toc229995992"/>
       <w:r>
         <w:rPr>
           <w:sz w:val="28"/>
@@ -3051,7 +2954,7 @@
       <w:pPr>
         <w:pStyle w:val="Heading2"/>
       </w:pPr>
-      <w:bookmarkStart w:id="3" w:name="_Toc220841253"/>
+      <w:bookmarkStart w:id="3" w:name="_Toc229995993"/>
       <w:r>
         <w:t>1.</w:t>
       </w:r>
@@ -3216,7 +3119,6 @@
           <w:id w:val="1332419690"/>
           <w:citation/>
         </w:sdtPr>
-        <w:sdtEndPr/>
         <w:sdtContent>
           <w:r>
             <w:fldChar w:fldCharType="begin"/>
@@ -3311,7 +3213,17 @@
         <w:pStyle w:val="BodyText"/>
       </w:pPr>
       <w:r>
-        <w:t>Process of migration is as old as human society. In early days there was primitive migration in which the natural forces were vital but as the time passed on gradually different types of migration appears in a early period. Natural force, primitive people shift them from one place to another but present there are not only forced immigration but also voluntary migration can be seen. In forced migration natural force, political force, political factors play an important role to shift the residence. Nepal has a long</w:t>
+        <w:t xml:space="preserve">Process of migration is as old as human society. In early days there was primitive migration in which the natural forces were vital but as the time passed on gradually different types of migration appears in </w:t>
+      </w:r>
+      <w:proofErr w:type="spellStart"/>
+      <w:proofErr w:type="gramStart"/>
+      <w:r>
+        <w:t>a</w:t>
+      </w:r>
+      <w:proofErr w:type="spellEnd"/>
+      <w:proofErr w:type="gramEnd"/>
+      <w:r>
+        <w:t xml:space="preserve"> early period. Natural force, primitive people shift them from one place to another but present there are not only forced immigration but also voluntary migration can be seen. In forced migration natural force, political force, political factors play an important role to shift the residence. Nepal has a long</w:t>
       </w:r>
       <w:r>
         <w:t xml:space="preserve"> </w:t>
@@ -3381,7 +3293,6 @@
           <w:id w:val="2068140665"/>
           <w:citation/>
         </w:sdtPr>
-        <w:sdtEndPr/>
         <w:sdtContent>
           <w:r>
             <w:fldChar w:fldCharType="begin"/>
@@ -3470,7 +3381,7 @@
       <w:pPr>
         <w:pStyle w:val="Heading2"/>
       </w:pPr>
-      <w:bookmarkStart w:id="4" w:name="_Toc220841254"/>
+      <w:bookmarkStart w:id="4" w:name="_Toc229995994"/>
       <w:r>
         <w:lastRenderedPageBreak/>
         <w:t>1.2</w:t>
@@ -3533,9 +3444,11 @@
       <w:r>
         <w:t xml:space="preserve">is study area is ward no. 9 of </w:t>
       </w:r>
+      <w:proofErr w:type="spellStart"/>
       <w:r>
         <w:t>Shankharapur</w:t>
       </w:r>
+      <w:proofErr w:type="spellEnd"/>
       <w:r>
         <w:t xml:space="preserve"> </w:t>
       </w:r>
@@ -3555,66 +3468,30 @@
     <w:p>
       <w:pPr>
         <w:pStyle w:val="BodyText"/>
-        <w:rPr>
-          <w:color w:val="00B050"/>
-        </w:rPr>
-      </w:pPr>
-      <w:r>
-        <w:rPr>
-          <w:color w:val="00B050"/>
-        </w:rPr>
-        <w:t xml:space="preserve">What are the primary factors driving migration in </w:t>
-      </w:r>
-      <w:r>
-        <w:rPr>
-          <w:color w:val="00B050"/>
-        </w:rPr>
-        <w:t>the study area</w:t>
-      </w:r>
-      <w:r>
-        <w:rPr>
-          <w:color w:val="00B050"/>
-        </w:rPr>
-        <w:t xml:space="preserve">? </w:t>
+      </w:pPr>
+      <w:r>
+        <w:t xml:space="preserve">What are the primary factors driving migration in the study area? </w:t>
       </w:r>
     </w:p>
     <w:p>
       <w:pPr>
         <w:pStyle w:val="BodyText"/>
-        <w:rPr>
-          <w:color w:val="00B050"/>
-        </w:rPr>
-      </w:pPr>
-      <w:r>
-        <w:rPr>
-          <w:color w:val="00B050"/>
-        </w:rPr>
+      </w:pPr>
+      <w:r>
         <w:t xml:space="preserve">How have patterns, trends, and forms of migration evolved over time? </w:t>
       </w:r>
     </w:p>
     <w:p>
       <w:pPr>
         <w:pStyle w:val="BodyText"/>
-        <w:rPr>
-          <w:color w:val="00B050"/>
-        </w:rPr>
-      </w:pPr>
-      <w:r>
-        <w:rPr>
-          <w:color w:val="00B050"/>
-        </w:rPr>
+      </w:pPr>
+      <w:r>
         <w:t xml:space="preserve">What are the social, economic, and political consequences of migration for </w:t>
       </w:r>
       <w:r>
-        <w:rPr>
-          <w:color w:val="00B050"/>
-        </w:rPr>
         <w:t>destination area</w:t>
       </w:r>
       <w:r>
-        <w:rPr>
-          <w:color w:val="00B050"/>
-        </w:rPr>
         <w:t>?</w:t>
       </w:r>
     </w:p>
@@ -3642,7 +3519,7 @@
       <w:pPr>
         <w:pStyle w:val="Heading2"/>
       </w:pPr>
-      <w:bookmarkStart w:id="5" w:name="_Toc220841255"/>
+      <w:bookmarkStart w:id="5" w:name="_Toc229995995"/>
       <w:r>
         <w:t>1.3</w:t>
       </w:r>
@@ -3677,7 +3554,11 @@
         <w:t xml:space="preserve"> </w:t>
       </w:r>
       <w:r>
-        <w:t>in S</w:t>
+        <w:t xml:space="preserve">in </w:t>
+      </w:r>
+      <w:proofErr w:type="spellStart"/>
+      <w:r>
+        <w:t>S</w:t>
       </w:r>
       <w:r>
         <w:t>h</w:t>
@@ -3686,7 +3567,11 @@
         <w:t>ankharap</w:t>
       </w:r>
       <w:r>
-        <w:t>ur municipality of Kathmandu district. The specific objectives are as follows:</w:t>
+        <w:t>ur</w:t>
+      </w:r>
+      <w:proofErr w:type="spellEnd"/>
+      <w:r>
+        <w:t xml:space="preserve"> municipality of Kathmandu district. The specific objectives are as follows:</w:t>
       </w:r>
     </w:p>
     <w:p>
@@ -3763,7 +3648,7 @@
       <w:pPr>
         <w:pStyle w:val="Heading2"/>
       </w:pPr>
-      <w:bookmarkStart w:id="6" w:name="_Toc220841256"/>
+      <w:bookmarkStart w:id="6" w:name="_Toc229995996"/>
       <w:r>
         <w:t>1</w:t>
       </w:r>
@@ -3786,7 +3671,15 @@
         <w:pStyle w:val="BodyText"/>
       </w:pPr>
       <w:r>
-        <w:t>This research is highly significant as it provides a comprehensive investigation into the causes, consequences, and socio-economic and demographic characteristics of migrants in Shankharapur Municipality Ward 9. Understanding these specific factors is critical for explaining the broader patterns and impacts of immigration within the context of rapid urban transformation</w:t>
+        <w:t xml:space="preserve">This research is highly significant as it provides a comprehensive investigation into the causes, consequences, and socio-economic and demographic characteristics of migrants in </w:t>
+      </w:r>
+      <w:proofErr w:type="spellStart"/>
+      <w:r>
+        <w:t>Shankharapur</w:t>
+      </w:r>
+      <w:proofErr w:type="spellEnd"/>
+      <w:r>
+        <w:t xml:space="preserve"> Municipality Ward 9. Understanding these specific factors is critical for explaining the broader patterns and impacts of immigration within the context of rapid urban transformation</w:t>
       </w:r>
       <w:r>
         <w:t>.</w:t>
@@ -3827,7 +3720,7 @@
       <w:pPr>
         <w:pStyle w:val="Heading2"/>
       </w:pPr>
-      <w:bookmarkStart w:id="7" w:name="_Toc220841257"/>
+      <w:bookmarkStart w:id="7" w:name="_Toc229995997"/>
       <w:r>
         <w:lastRenderedPageBreak/>
         <w:t>1.5</w:t>
@@ -3855,7 +3748,23 @@
         <w:pStyle w:val="BodyText"/>
       </w:pPr>
       <w:r>
-        <w:t>The choice of Shankharapur Municipality Ward 9 (Sankhu) as the focal point for this research is based on the following strategic justifications:</w:t>
+        <w:t xml:space="preserve">The choice of </w:t>
+      </w:r>
+      <w:proofErr w:type="spellStart"/>
+      <w:r>
+        <w:t>Shankharapur</w:t>
+      </w:r>
+      <w:proofErr w:type="spellEnd"/>
+      <w:r>
+        <w:t xml:space="preserve"> Municipality Ward 9 (</w:t>
+      </w:r>
+      <w:proofErr w:type="spellStart"/>
+      <w:r>
+        <w:t>Sankhu</w:t>
+      </w:r>
+      <w:proofErr w:type="spellEnd"/>
+      <w:r>
+        <w:t>) as the focal point for this research is based on the following strategic justifications:</w:t>
       </w:r>
     </w:p>
     <w:p>
@@ -3865,8 +3774,13 @@
           <w:lang w:eastAsia="en-US"/>
         </w:rPr>
       </w:pPr>
-      <w:r>
-        <w:t>Shankharapur is a rapidly developing municipality on the periphery of Kathmandu that is currently experiencing a continuous, daily influx of in-migrants. This constant population movement creates an immediate and high-priority need to investigate the resulting socio-economic and demographic consequences, whether positive or negative.</w:t>
+      <w:proofErr w:type="spellStart"/>
+      <w:r>
+        <w:t>Shankharapur</w:t>
+      </w:r>
+      <w:proofErr w:type="spellEnd"/>
+      <w:r>
+        <w:t xml:space="preserve"> is a rapidly developing municipality on the periphery of Kathmandu that is currently experiencing a continuous, daily influx of in-migrants. This constant population movement creates an immediate and high-priority need to investigate the resulting socio-economic and demographic consequences, whether positive or negative.</w:t>
       </w:r>
     </w:p>
     <w:p>
@@ -3928,7 +3842,7 @@
       <w:pPr>
         <w:pStyle w:val="Heading2"/>
       </w:pPr>
-      <w:bookmarkStart w:id="8" w:name="_Toc220841258"/>
+      <w:bookmarkStart w:id="8" w:name="_Toc229995998"/>
       <w:r>
         <w:lastRenderedPageBreak/>
         <w:t>1.6</w:t>
@@ -3943,7 +3857,23 @@
         <w:pStyle w:val="BodyText"/>
       </w:pPr>
       <w:r>
-        <w:t>This study has several limitations that should be considered while interpreting the results. The research was conducted within a limited time frame, which constrained detailed primary data collection through interviews and limited the extent of secondary data collection from local-level institutions, particularly the ward office. The sample size was also limited, and therefore may not fully represent the entire migrant population of the study area. Moreover, the study is geographically confined to Shankharapur Municipality, Ward No. 9 (Sankhu), which restricts the generalization of findings to other areas. The study largely depends on information provided by respondents, which may be influenced by personal perceptions or reluctance to disclose sensitive economic and social information. In addition, financial and resource constraints restricted extensive fieldwork, and certain groups of migrants, such as temporary or seasonal migrants, may not have been adequately covered.</w:t>
+        <w:t xml:space="preserve">This study has several limitations that should be considered while interpreting the results. The research was conducted within a limited time frame, which constrained detailed primary data collection through interviews and limited the extent of secondary data collection from local-level institutions, particularly the ward office. The sample size was also limited, and therefore may not fully represent the entire migrant population of the study area. Moreover, the study is geographically confined to </w:t>
+      </w:r>
+      <w:proofErr w:type="spellStart"/>
+      <w:r>
+        <w:t>Shankharapur</w:t>
+      </w:r>
+      <w:proofErr w:type="spellEnd"/>
+      <w:r>
+        <w:t xml:space="preserve"> Municipality, Ward No. 9 (</w:t>
+      </w:r>
+      <w:proofErr w:type="spellStart"/>
+      <w:r>
+        <w:t>Sankhu</w:t>
+      </w:r>
+      <w:proofErr w:type="spellEnd"/>
+      <w:r>
+        <w:t>), which restricts the generalization of findings to other areas. The study largely depends on information provided by respondents, which may be influenced by personal perceptions or reluctance to disclose sensitive economic and social information. In addition, financial and resource constraints restricted extensive fieldwork, and certain groups of migrants, such as temporary or seasonal migrants, may not have been adequately covered.</w:t>
       </w:r>
     </w:p>
     <w:p>
@@ -3958,7 +3888,7 @@
       <w:pPr>
         <w:pStyle w:val="Heading2"/>
       </w:pPr>
-      <w:bookmarkStart w:id="9" w:name="_Toc220841259"/>
+      <w:bookmarkStart w:id="9" w:name="_Toc229995999"/>
       <w:r>
         <w:t>1.7</w:t>
       </w:r>
@@ -3990,7 +3920,7 @@
           <w:bCs w:val="0"/>
         </w:rPr>
       </w:pPr>
-      <w:bookmarkStart w:id="10" w:name="_Toc220841260"/>
+      <w:bookmarkStart w:id="10" w:name="_Toc229996000"/>
       <w:r>
         <w:rPr>
           <w:rStyle w:val="Strong"/>
@@ -4018,7 +3948,7 @@
           <w:szCs w:val="38"/>
         </w:rPr>
       </w:pPr>
-      <w:bookmarkStart w:id="11" w:name="_Toc220841261"/>
+      <w:bookmarkStart w:id="11" w:name="_Toc229996001"/>
       <w:r>
         <w:rPr>
           <w:sz w:val="28"/>
@@ -4085,13 +4015,21 @@
         <w:t xml:space="preserve"> </w:t>
       </w:r>
       <w:r>
-        <w:t>is the father of migration studies. He had brought the concept of migration and its stream. He explained that push and pull factors are the foundation of theory of migration. This article which is linked with demographic and economic variable in relation to distance and volume of migration also depends on distance. R</w:t>
+        <w:t xml:space="preserve">is the father of migration studies. He had brought the concept of migration and its stream. He explained that push and pull factors are the foundation of theory of migration. This article which is linked with demographic and economic variable in relation to distance and volume of migration also depends on distance. </w:t>
+      </w:r>
+      <w:proofErr w:type="spellStart"/>
+      <w:r>
+        <w:t>R</w:t>
       </w:r>
       <w:r>
         <w:t>a</w:t>
       </w:r>
       <w:r>
-        <w:t xml:space="preserve">venstein </w:t>
+        <w:t>venstein</w:t>
+      </w:r>
+      <w:proofErr w:type="spellEnd"/>
+      <w:r>
+        <w:t xml:space="preserve"> </w:t>
       </w:r>
       <w:r>
         <w:t>“Law</w:t>
@@ -4142,13 +4080,20 @@
         <w:t xml:space="preserve"> </w:t>
       </w:r>
       <w:r>
-        <w:t xml:space="preserve">have attempted to explain the movement of individual. </w:t>
+        <w:t>has</w:t>
+      </w:r>
+      <w:r>
+        <w:t xml:space="preserve"> attempted to explain the movement of individual. </w:t>
       </w:r>
       <w:r>
         <w:t xml:space="preserve">His </w:t>
       </w:r>
       <w:r>
-        <w:t>theory is known as “Gravitational Theory” which states that the numbers of persons who move between two areas are directly proportional to the two populations and inversely proportional to the distance between them. Zipf was agreed with R</w:t>
+        <w:t xml:space="preserve">theory is known as “Gravitational Theory” which states that the numbers of persons who move between two areas are directly proportional to the two populations and inversely proportional to the distance between them. Zipf was agreed with </w:t>
+      </w:r>
+      <w:proofErr w:type="spellStart"/>
+      <w:r>
+        <w:t>R</w:t>
       </w:r>
       <w:r>
         <w:t>a</w:t>
@@ -4165,6 +4110,7 @@
       <w:r>
         <w:t>s</w:t>
       </w:r>
+      <w:proofErr w:type="spellEnd"/>
       <w:r>
         <w:t xml:space="preserve"> view regarding to irritation. Gravity Model m=a* u/v, where</w:t>
       </w:r>
@@ -4202,7 +4148,11 @@
         <w:t>“The</w:t>
       </w:r>
       <w:r>
-        <w:t xml:space="preserve"> principle of least effort”. His model was based on R</w:t>
+        <w:t xml:space="preserve"> principle of least effort”. His model was based on </w:t>
+      </w:r>
+      <w:proofErr w:type="spellStart"/>
+      <w:r>
+        <w:t>R</w:t>
       </w:r>
       <w:r>
         <w:t>a</w:t>
@@ -4214,7 +4164,15 @@
         <w:t>'</w:t>
       </w:r>
       <w:r>
-        <w:t>s theory of migration. He was agreed with R</w:t>
+        <w:t>s</w:t>
+      </w:r>
+      <w:proofErr w:type="spellEnd"/>
+      <w:r>
+        <w:t xml:space="preserve"> theory of migration. He was agreed with </w:t>
+      </w:r>
+      <w:proofErr w:type="spellStart"/>
+      <w:r>
+        <w:t>R</w:t>
       </w:r>
       <w:r>
         <w:t>a</w:t>
@@ -4223,7 +4181,11 @@
         <w:t>venstein'</w:t>
       </w:r>
       <w:r>
-        <w:t>s view regarding migration is inversely related to the distance to be travelled. According to him, the greater distance is effort required to overcome the difficulty and therefore the similar is the number of migrants. Similarly</w:t>
+        <w:t>s</w:t>
+      </w:r>
+      <w:proofErr w:type="spellEnd"/>
+      <w:r>
+        <w:t xml:space="preserve"> view regarding migration is inversely related to the distance to be travelled. According to him, the greater distance is effort required to overcome the difficulty and therefore the similar is the number of migrants. Similarly</w:t>
       </w:r>
       <w:r>
         <w:t>,</w:t>
@@ -4314,9 +4276,11 @@
       <w:pPr>
         <w:pStyle w:val="BodyText"/>
       </w:pPr>
+      <w:proofErr w:type="spellStart"/>
       <w:r>
         <w:t>Mabogunje</w:t>
       </w:r>
+      <w:proofErr w:type="spellEnd"/>
       <w:r>
         <w:t xml:space="preserve"> (1970) applied a concept of system theory in the system of rural to urban migration operates having economic, social, technological and government component. He attempted to relate </w:t>
       </w:r>
@@ -4374,7 +4338,7 @@
       <w:pPr>
         <w:pStyle w:val="Heading2"/>
       </w:pPr>
-      <w:bookmarkStart w:id="12" w:name="_Toc220841262"/>
+      <w:bookmarkStart w:id="12" w:name="_Toc229996002"/>
       <w:r>
         <w:t>2.1 Theoretical Review</w:t>
       </w:r>
@@ -4385,11 +4349,27 @@
         <w:pStyle w:val="BodyText"/>
       </w:pPr>
       <w:r>
-        <w:t>Migration is a complex phenomenon influenced by economic, social, and environmental factors. Several theories have been developed to explain the process of migration. Ravenstein (1885), known as the father of migration studies, introduced the concept of migration streams and counter</w:t>
+        <w:t xml:space="preserve">Migration is a complex phenomenon influenced by economic, social, and environmental factors. Several theories have been developed to explain the process of migration. </w:t>
+      </w:r>
+      <w:proofErr w:type="spellStart"/>
+      <w:r>
+        <w:t>Ravenstein</w:t>
+      </w:r>
+      <w:proofErr w:type="spellEnd"/>
+      <w:r>
+        <w:t xml:space="preserve"> (1885), known as the father of migration studies, introduced the concept of migration streams and counter</w:t>
       </w:r>
       <w:r>
         <w:noBreakHyphen/>
-        <w:t>streams, emphasizing that migration flows occur systematically between regions. He also highlighted the importance of distance in migration patterns. Lee (1966) extended this idea through the push–pull framework, explaining that migration decisions are influenced by factors at the origin (push) and destination (pull), as well as intervening obstacles such as distance, transportation, and cost. Personal characteristics like age, sex, and education further shape migration decisions. Zipf (1964) proposed the Gravitational Theory, suggesting that the number of migrants between two areas is directly proportional to their populations and inversely proportional to the distance separating them. Todaro (1976) added an economic perspective, emphasizing that expected income differentials, rather than actual earnings, largely drive migration. Together, these theories provide the conceptual foundation for understanding the causes and patterns of migration in Ward 9, Sankhu.</w:t>
+        <w:t xml:space="preserve">streams, emphasizing that migration flows occur systematically between regions. He also highlighted the importance of distance in migration patterns. Lee (1966) extended this idea through the push–pull framework, explaining that migration decisions are influenced by factors at the origin (push) and destination (pull), as well as intervening obstacles such as distance, transportation, and cost. Personal characteristics like age, sex, and education further shape migration decisions. Zipf (1964) proposed the Gravitational Theory, suggesting that the number of migrants between two areas is directly proportional to their populations and inversely proportional to the distance separating them. Todaro (1976) added an economic perspective, emphasizing that expected income differentials, rather than actual earnings, largely drive migration. Together, these theories provide the conceptual foundation for understanding the causes and patterns of migration in Ward 9, </w:t>
+      </w:r>
+      <w:proofErr w:type="spellStart"/>
+      <w:r>
+        <w:t>Sankhu</w:t>
+      </w:r>
+      <w:proofErr w:type="spellEnd"/>
+      <w:r>
+        <w:t>.</w:t>
       </w:r>
     </w:p>
     <w:p>
@@ -4405,11 +4385,32 @@
       </w:r>
       <w:r>
         <w:lastRenderedPageBreak/>
-        <w:t>origin and destination areas; in the Nepali context, this is visible in established corridors from specific villages to large cities or foreign labour markets, where existing migrants inform newcomers and stabilize routes. The segmented labour</w:t>
-      </w:r>
+        <w:t xml:space="preserve">origin and destination areas; in the Nepali context, this is visible in established corridors from specific villages to large cities or foreign </w:t>
+      </w:r>
+      <w:proofErr w:type="spellStart"/>
+      <w:r>
+        <w:t>labour</w:t>
+      </w:r>
+      <w:proofErr w:type="spellEnd"/>
+      <w:r>
+        <w:t xml:space="preserve"> markets, where existing migrants inform newcomers and stabilize routes. The segmented </w:t>
+      </w:r>
+      <w:proofErr w:type="spellStart"/>
+      <w:r>
+        <w:t>labour</w:t>
+      </w:r>
+      <w:proofErr w:type="spellEnd"/>
       <w:r>
         <w:noBreakHyphen/>
-        <w:t>market theory (Piore, 1979) explains that migrants often fill low</w:t>
+        <w:t>market theory (</w:t>
+      </w:r>
+      <w:proofErr w:type="spellStart"/>
+      <w:r>
+        <w:t>Piore</w:t>
+      </w:r>
+      <w:proofErr w:type="spellEnd"/>
+      <w:r>
+        <w:t>, 1979) explains that migrants often fill low</w:t>
       </w:r>
       <w:r>
         <w:noBreakHyphen/>
@@ -4417,11 +4418,35 @@
       </w:r>
       <w:r>
         <w:noBreakHyphen/>
-        <w:t>sector jobs that local workers avoid, such as construction, domestic work, and daily wage labour, reinforcing inequalities between residents and in</w:t>
+        <w:t xml:space="preserve">sector jobs that local workers avoid, such as construction, domestic work, and daily wage </w:t>
+      </w:r>
+      <w:proofErr w:type="spellStart"/>
+      <w:r>
+        <w:t>labour</w:t>
+      </w:r>
+      <w:proofErr w:type="spellEnd"/>
+      <w:r>
+        <w:t>, reinforcing inequalities between residents and in</w:t>
       </w:r>
       <w:r>
         <w:noBreakHyphen/>
-        <w:t>migrants in urban wards like Sankhu. Social capital and network theory (Granovetter, 1973; Portes, 1998) highlight how kinship, caste, and locality ties facilitate migration by providing information, loans, shelter, and job referrals, making mobility more feasible for certain groups and producing spatial clustering within wards. Finally, critical and autonomy</w:t>
+        <w:t xml:space="preserve">migrants in urban wards like </w:t>
+      </w:r>
+      <w:proofErr w:type="spellStart"/>
+      <w:r>
+        <w:t>Sankhu</w:t>
+      </w:r>
+      <w:proofErr w:type="spellEnd"/>
+      <w:r>
+        <w:t>. Social capital and network theory (</w:t>
+      </w:r>
+      <w:proofErr w:type="spellStart"/>
+      <w:r>
+        <w:t>Granovetter</w:t>
+      </w:r>
+      <w:proofErr w:type="spellEnd"/>
+      <w:r>
+        <w:t>, 1973; Portes, 1998) highlight how kinship, caste, and locality ties facilitate migration by providing information, loans, shelter, and job referrals, making mobility more feasible for certain groups and producing spatial clustering within wards. Finally, critical and autonomy</w:t>
       </w:r>
       <w:r>
         <w:noBreakHyphen/>
@@ -4429,7 +4454,15 @@
       </w:r>
       <w:r>
         <w:noBreakHyphen/>
-        <w:t>migration perspectives (Mezzadra &amp; Neilson, 2013; Bhagat, 2025) treat migration as an active, resistant practice through which people creatively bypass restrictive laws, use informal channels, and negotiate precarious conditions to pursue better livelihoods, underscoring the agency and everyday strategies of in</w:t>
+        <w:t>migration perspectives (</w:t>
+      </w:r>
+      <w:proofErr w:type="spellStart"/>
+      <w:r>
+        <w:t>Mezzadra</w:t>
+      </w:r>
+      <w:proofErr w:type="spellEnd"/>
+      <w:r>
+        <w:t xml:space="preserve"> &amp; Neilson, 2013; Bhagat, 2025) treat migration as an active, resistant practice through which people creatively bypass restrictive laws, use informal channels, and negotiate precarious conditions to pursue better livelihoods, underscoring the agency and everyday strategies of in</w:t>
       </w:r>
       <w:r>
         <w:noBreakHyphen/>
@@ -4437,14 +4470,22 @@
       </w:r>
       <w:r>
         <w:noBreakHyphen/>
-        <w:t>urban and urban spaces like Ward 9, Sankhu.</w:t>
+        <w:t xml:space="preserve">urban and urban spaces like Ward 9, </w:t>
+      </w:r>
+      <w:proofErr w:type="spellStart"/>
+      <w:r>
+        <w:t>Sankhu</w:t>
+      </w:r>
+      <w:proofErr w:type="spellEnd"/>
+      <w:r>
+        <w:t>.</w:t>
       </w:r>
     </w:p>
     <w:p>
       <w:pPr>
         <w:pStyle w:val="Heading2"/>
       </w:pPr>
-      <w:bookmarkStart w:id="13" w:name="_Toc220841263"/>
+      <w:bookmarkStart w:id="13" w:name="_Toc229996003"/>
       <w:r>
         <w:t>2.2 Empirical Review</w:t>
       </w:r>
@@ -4458,7 +4499,15 @@
         <w:t>Empirical studies in Nepal and similar contexts provide insights into migration trends and consequences. CEDA (1977) observed that over 50 percent of migrants in Kathmandu were</w:t>
       </w:r>
       <w:r>
-        <w:t xml:space="preserve"> aged 20–30 years, with economic opportunities being the primary cause. Gurung (1984) identified population pressure, land scarcity, and environmental stress in the hills as push factors, and fertile land, government incentives, and social networks in the Terai as pull factors. K.C. (1998) analyzed both micro and macro-level determinants of migration, including literacy, age distribution, family kinship, and government resettlement projects. Kunwar (2015) applied multivariate analysis and found that low productivity and insufficient land prompted migration, while availability of facilities and presence of relatives influenced the decision to move. Niroula (2016) noted that during the Maoist insurgency, migration from hills to Terai accelerated due to population pressure, infrastructure development, and employment opportunities. These studies demonstrate the relevance of economic, social, and environmental factors in driving migration and highlight the need for a localized study in Ward 9, Sankhu.</w:t>
+        <w:t xml:space="preserve"> aged 20–30 years, with economic opportunities being the primary cause. Gurung (1984) identified population pressure, land scarcity, and environmental stress in the hills as push factors, and fertile land, government incentives, and social networks in the Terai as pull factors. K.C. (1998) analyzed both micro and macro-level determinants of migration, including literacy, age distribution, family kinship, and government resettlement projects. Kunwar (2015) applied multivariate analysis and found that low productivity and insufficient land prompted migration, while availability of facilities and presence of relatives influenced the decision to move. Niroula (2016) noted that during the Maoist insurgency, migration from hills to Terai accelerated due to population pressure, infrastructure development, and employment opportunities. These studies demonstrate the relevance of economic, social, and environmental factors in driving migration and highlight the need for a localized study in Ward 9, </w:t>
+      </w:r>
+      <w:proofErr w:type="spellStart"/>
+      <w:r>
+        <w:t>Sankhu</w:t>
+      </w:r>
+      <w:proofErr w:type="spellEnd"/>
+      <w:r>
+        <w:t>.</w:t>
       </w:r>
     </w:p>
     <w:p>
@@ -4489,11 +4538,43 @@
       </w:r>
       <w:r>
         <w:noBreakHyphen/>
-        <w:t>urban and urban settings similar to Sankhu. Studies on municipalities such as Ratnanagar, Kirtipur, and Pokhara show that in</w:t>
+        <w:t xml:space="preserve">urban and urban settings similar to </w:t>
+      </w:r>
+      <w:proofErr w:type="spellStart"/>
+      <w:r>
+        <w:t>Sankhu</w:t>
+      </w:r>
+      <w:proofErr w:type="spellEnd"/>
+      <w:r>
+        <w:t xml:space="preserve">. Studies on municipalities such as </w:t>
+      </w:r>
+      <w:proofErr w:type="spellStart"/>
+      <w:r>
+        <w:t>Ratnanagar</w:t>
+      </w:r>
+      <w:proofErr w:type="spellEnd"/>
+      <w:r>
+        <w:t xml:space="preserve">, </w:t>
+      </w:r>
+      <w:proofErr w:type="spellStart"/>
+      <w:r>
+        <w:t>Kirtipur</w:t>
+      </w:r>
+      <w:proofErr w:type="spellEnd"/>
+      <w:r>
+        <w:t>, and Pokhara show that in</w:t>
       </w:r>
       <w:r>
         <w:noBreakHyphen/>
-        <w:t>migration is increasingly driven not only by land scarcity and agricultural distress but also by the growth of construction, services, and small industries around urban centres, reinforcing the neoclassical and Todaro</w:t>
+        <w:t xml:space="preserve">migration is increasingly driven not only by land scarcity and agricultural distress but also by the growth of construction, services, and small industries around urban </w:t>
+      </w:r>
+      <w:proofErr w:type="spellStart"/>
+      <w:r>
+        <w:t>centres</w:t>
+      </w:r>
+      <w:proofErr w:type="spellEnd"/>
+      <w:r>
+        <w:t>, reinforcing the neoclassical and Todaro</w:t>
       </w:r>
       <w:r>
         <w:noBreakHyphen/>
@@ -4513,8 +4594,13 @@
       </w:r>
       <w:r>
         <w:noBreakHyphen/>
-        <w:t>migration flows, confirming that economic opportunity and labour</w:t>
-      </w:r>
+        <w:t xml:space="preserve">migration flows, confirming that economic opportunity and </w:t>
+      </w:r>
+      <w:proofErr w:type="spellStart"/>
+      <w:r>
+        <w:t>labour</w:t>
+      </w:r>
+      <w:proofErr w:type="spellEnd"/>
       <w:r>
         <w:noBreakHyphen/>
         <w:t>market expectations remain central push–pull forces. Parallel studies also underline that migration decisions are shaped by household</w:t>
@@ -4541,11 +4627,25 @@
       </w:r>
       <w:r>
         <w:noBreakHyphen/>
-        <w:t>migration is often clustered in certain neighbourhoods or streets within municipalities, mirroring findings from Gurung (1984) and Niroula (2016) that migration is not random but embedded in social and spatial structures. In peri</w:t>
+        <w:t xml:space="preserve">migration is often clustered in certain </w:t>
+      </w:r>
+      <w:r>
+        <w:t>neighborhoods</w:t>
+      </w:r>
+      <w:r>
+        <w:t xml:space="preserve"> or streets within municipalities, mirroring findings from Gurung (1984) and Niroula (2016) that migration is not random but embedded in social and spatial structures. In peri</w:t>
       </w:r>
       <w:r>
         <w:noBreakHyphen/>
-        <w:t>urban wards like Sankhu, such networks likely intensify when infrastructure improves and road connectivity increases, making it easier for people from nearby rural areas to move in and settle informally.</w:t>
+        <w:t xml:space="preserve">urban wards like </w:t>
+      </w:r>
+      <w:proofErr w:type="spellStart"/>
+      <w:r>
+        <w:t>Sankhu</w:t>
+      </w:r>
+      <w:proofErr w:type="spellEnd"/>
+      <w:r>
+        <w:t>, such networks likely intensify when infrastructure improves and road connectivity increases, making it easier for people from nearby rural areas to move in and settle informally.</w:t>
       </w:r>
     </w:p>
     <w:p>
@@ -4567,7 +4667,21 @@
       </w:r>
       <w:r>
         <w:noBreakHyphen/>
-        <w:t>migration supplies labour for construction, services, and small businesses and supports local economic growth, echoing CEDA’s observation that Kathmandu’s growth was partly fuelled by in</w:t>
+        <w:t xml:space="preserve">migration supplies </w:t>
+      </w:r>
+      <w:proofErr w:type="spellStart"/>
+      <w:r>
+        <w:t>labour</w:t>
+      </w:r>
+      <w:proofErr w:type="spellEnd"/>
+      <w:r>
+        <w:t xml:space="preserve"> for construction, services, and small businesses and supports local economic growth, echoing CEDA’s observation that Kathmandu’s growth was partly </w:t>
+      </w:r>
+      <w:r>
+        <w:t>fueled</w:t>
+      </w:r>
+      <w:r>
+        <w:t xml:space="preserve"> by in</w:t>
       </w:r>
       <w:r>
         <w:noBreakHyphen/>
@@ -4639,7 +4753,15 @@
       </w:r>
       <w:r>
         <w:noBreakHyphen/>
-        <w:t>making. For Ward 9, Sankhu, this implies that understanding the </w:t>
+        <w:t xml:space="preserve">making. For Ward 9, </w:t>
+      </w:r>
+      <w:proofErr w:type="spellStart"/>
+      <w:r>
+        <w:t>Sankhu</w:t>
+      </w:r>
+      <w:proofErr w:type="spellEnd"/>
+      <w:r>
+        <w:t>, this implies that understanding the </w:t>
       </w:r>
       <w:r>
         <w:rPr>
@@ -4661,7 +4783,15 @@
       </w:r>
       <w:r>
         <w:noBreakHyphen/>
-        <w:t>level findings and instead examine how local push–pull factors, household strategies, social networks, and municipal governance interact on the ground. In this sense, earlier empirical work by CEDA, Gurung, K.C., Kunwar, and Niroula provides a strong base, but a localized study in Sankhu is necessary to capture the specific dynamics of in</w:t>
+        <w:t xml:space="preserve">level findings and instead examine how local push–pull factors, household strategies, social networks, and municipal governance interact on the ground. In this sense, earlier empirical work by CEDA, Gurung, K.C., Kunwar, and Niroula provides a strong base, but a localized study in </w:t>
+      </w:r>
+      <w:proofErr w:type="spellStart"/>
+      <w:r>
+        <w:t>Sankhu</w:t>
+      </w:r>
+      <w:proofErr w:type="spellEnd"/>
+      <w:r>
+        <w:t xml:space="preserve"> is necessary to capture the specific dynamics of in</w:t>
       </w:r>
       <w:r>
         <w:noBreakHyphen/>
@@ -4681,7 +4811,7 @@
       <w:pPr>
         <w:pStyle w:val="Heading2"/>
       </w:pPr>
-      <w:bookmarkStart w:id="14" w:name="_Toc220841264"/>
+      <w:bookmarkStart w:id="14" w:name="_Toc229996004"/>
       <w:r>
         <w:t>2.3 Policy Review</w:t>
       </w:r>
@@ -4709,7 +4839,7 @@
       <w:pPr>
         <w:pStyle w:val="Heading2"/>
       </w:pPr>
-      <w:bookmarkStart w:id="15" w:name="_Toc220841265"/>
+      <w:bookmarkStart w:id="15" w:name="_Toc229996005"/>
       <w:r>
         <w:t>2.4 Research Gap</w:t>
       </w:r>
@@ -4731,7 +4861,15 @@
         <w:t>macro-level or city-wide</w:t>
       </w:r>
       <w:r>
-        <w:t xml:space="preserve">, lacking focus on specific wards like Ward 9, Sankhu. Few studies integrate </w:t>
+        <w:t xml:space="preserve">, lacking focus on specific wards like Ward 9, </w:t>
+      </w:r>
+      <w:proofErr w:type="spellStart"/>
+      <w:r>
+        <w:t>Sankhu</w:t>
+      </w:r>
+      <w:proofErr w:type="spellEnd"/>
+      <w:r>
+        <w:t xml:space="preserve">. Few studies integrate </w:t>
       </w:r>
       <w:r>
         <w:rPr>
@@ -4771,7 +4909,7 @@
       <w:pPr>
         <w:pStyle w:val="Heading2"/>
       </w:pPr>
-      <w:bookmarkStart w:id="16" w:name="_Toc220841266"/>
+      <w:bookmarkStart w:id="16" w:name="_Toc229996006"/>
       <w:r>
         <w:t>2.5 Conceptual Framework</w:t>
       </w:r>
@@ -4898,110 +5036,26 @@
         </w:drawing>
       </w:r>
     </w:p>
-    <w:p/>
     <w:p>
       <w:pPr>
         <w:pStyle w:val="Caption"/>
         <w:spacing w:before="240"/>
         <w:jc w:val="center"/>
       </w:pPr>
-    </w:p>
-    <w:p>
-      <w:pPr>
-        <w:pStyle w:val="Caption"/>
-        <w:spacing w:before="240"/>
-        <w:jc w:val="center"/>
-      </w:pPr>
-    </w:p>
-    <w:p>
-      <w:pPr>
-        <w:pStyle w:val="Caption"/>
-        <w:spacing w:before="240"/>
-        <w:jc w:val="center"/>
-      </w:pPr>
-    </w:p>
-    <w:p>
-      <w:pPr>
-        <w:pStyle w:val="Caption"/>
-        <w:spacing w:before="240"/>
-        <w:jc w:val="center"/>
-      </w:pPr>
-    </w:p>
-    <w:p>
-      <w:pPr>
-        <w:pStyle w:val="Caption"/>
-        <w:spacing w:before="240"/>
-        <w:jc w:val="center"/>
-      </w:pPr>
-    </w:p>
-    <w:p>
-      <w:pPr>
-        <w:pStyle w:val="Caption"/>
-        <w:spacing w:before="240"/>
-        <w:jc w:val="center"/>
-      </w:pPr>
-    </w:p>
-    <w:p>
-      <w:pPr>
-        <w:pStyle w:val="Caption"/>
-        <w:spacing w:before="240"/>
-        <w:jc w:val="center"/>
-      </w:pPr>
-    </w:p>
-    <w:p>
-      <w:pPr>
-        <w:pStyle w:val="Caption"/>
-        <w:spacing w:before="240"/>
-        <w:jc w:val="center"/>
-      </w:pPr>
-    </w:p>
-    <w:p>
-      <w:pPr>
-        <w:pStyle w:val="Caption"/>
-        <w:spacing w:before="240"/>
-        <w:jc w:val="center"/>
-      </w:pPr>
-    </w:p>
-    <w:p>
-      <w:pPr>
-        <w:pStyle w:val="Caption"/>
-        <w:spacing w:before="240"/>
-      </w:pPr>
-    </w:p>
-    <w:p/>
-    <w:p>
-      <w:pPr>
-        <w:pStyle w:val="Caption"/>
-        <w:spacing w:before="240"/>
-        <w:jc w:val="center"/>
-      </w:pPr>
       <w:r>
         <w:t xml:space="preserve">Figure </w:t>
       </w:r>
       <w:r>
         <w:t>2.</w:t>
       </w:r>
-      <w:r>
-        <w:fldChar w:fldCharType="begin"/>
-      </w:r>
-      <w:r>
-        <w:instrText xml:space="preserve"> SEQ Figure \* ARABIC </w:instrText>
-      </w:r>
-      <w:r>
-        <w:fldChar w:fldCharType="separate"/>
-      </w:r>
-      <w:r>
-        <w:rPr>
-          <w:noProof/>
-        </w:rPr>
-        <w:t>1</w:t>
-      </w:r>
-      <w:r>
-        <w:rPr>
-          <w:noProof/>
-        </w:rPr>
-        <w:fldChar w:fldCharType="end"/>
-      </w:r>
+      <w:fldSimple w:instr=" SEQ Figure \* ARABIC ">
+        <w:r>
+          <w:rPr>
+            <w:noProof/>
+          </w:rPr>
+          <w:t>1</w:t>
+        </w:r>
+      </w:fldSimple>
       <w:r>
         <w:t xml:space="preserve"> Conceptual Framework of Migration Study</w:t>
       </w:r>
@@ -5011,11 +5065,27 @@
         <w:pStyle w:val="BodyText"/>
       </w:pPr>
       <w:r>
-        <w:t xml:space="preserve">The conceptual framework of this study explains the relationship between the causes and consequences of internal migration. The framework identifies various socio-economic, </w:t>
+        <w:t>The conceptual framework of this study explains the relationship between the causes and consequences of internal migration. The framework identifies various socio-economic, environmental, and demographic factors as independent variables that influence people’s decision to migrate from one place to another within the country. Factors such as poverty, unemployment, lack of educational and health facilities, natural disasters, and search for better opportunities are considered major causes of internal migration.</w:t>
+      </w:r>
+    </w:p>
+    <w:p>
+      <w:pPr>
+        <w:pStyle w:val="BodyText"/>
+      </w:pPr>
+      <w:r>
+        <w:t>These factors contribute to the movement of people from rural to urban areas or from one region to another in search of improved living conditions. Internal migration itself acts as the central process connecting the causes and consequences.</w:t>
+      </w:r>
+    </w:p>
+    <w:p>
+      <w:pPr>
+        <w:pStyle w:val="BodyText"/>
+      </w:pPr>
+      <w:r>
+        <w:t xml:space="preserve">The dependent variables in the framework are the consequences or outcomes of migration. Internal migration may produce both positive and negative effects on migrants, families, and society. Positive consequences may include increased income, improved access to services, and better employment opportunities, while negative consequences may include </w:t>
       </w:r>
       <w:r>
         <w:lastRenderedPageBreak/>
-        <w:t>environmental, and demographic factors as independent variables that influence people’s decision to migrate from one place to another within the country. Factors such as poverty, unemployment, lack of educational and health facilities, natural disasters, and search for better opportunities are considered major causes of internal migration.</w:t>
+        <w:t>urban overcrowding, pressure on infrastructure, unemployment, family separation, and social adjustment problems.</w:t>
       </w:r>
     </w:p>
     <w:p>
@@ -5023,34 +5093,21 @@
         <w:pStyle w:val="BodyText"/>
       </w:pPr>
       <w:r>
-        <w:t>These factors contribute to the movement of people from rural to urban areas or from one region to another in search of improved living conditions. Internal migration itself acts as the central process connecting the causes and consequences.</w:t>
-      </w:r>
-    </w:p>
-    <w:p>
-      <w:pPr>
-        <w:pStyle w:val="BodyText"/>
-      </w:pPr>
-      <w:r>
-        <w:t>The dependent variables in the framework are the consequences or outcomes of migration. Internal migration may produce both positive and negative effects on migrants, families, and society. Positive consequences may include increased income, improved access to services, and better employment opportunities, while negative consequences may include urban overcrowding, pressure on infrastructure, unemployment, family separation, and social adjustment problems.</w:t>
-      </w:r>
-    </w:p>
-    <w:p>
-      <w:pPr>
-        <w:pStyle w:val="BodyText"/>
-      </w:pPr>
-    </w:p>
-    <w:p>
-      <w:pPr>
-        <w:pStyle w:val="BodyText"/>
-      </w:pPr>
-      <w:r>
         <w:t>The framework guides the research methodology, data collection, and analysis, ensuring that</w:t>
       </w:r>
       <w:r>
         <w:t xml:space="preserve"> the study captures the causes</w:t>
       </w:r>
       <w:r>
-        <w:t xml:space="preserve"> and consequences of migration in Ward 9, Sankhu.</w:t>
+        <w:t xml:space="preserve"> and consequences of migration in Ward 9, </w:t>
+      </w:r>
+      <w:proofErr w:type="spellStart"/>
+      <w:r>
+        <w:t>Sankhu</w:t>
+      </w:r>
+      <w:proofErr w:type="spellEnd"/>
+      <w:r>
+        <w:t>.</w:t>
       </w:r>
     </w:p>
     <w:p>
@@ -5069,7 +5126,7 @@
         </w:rPr>
         <w:br w:type="page"/>
       </w:r>
-      <w:bookmarkStart w:id="17" w:name="_Toc220841267"/>
+      <w:bookmarkStart w:id="17" w:name="_Toc229996007"/>
       <w:r>
         <w:rPr>
           <w:rStyle w:val="Strong"/>
@@ -5098,7 +5155,7 @@
           <w:szCs w:val="38"/>
         </w:rPr>
       </w:pPr>
-      <w:bookmarkStart w:id="18" w:name="_Toc220841268"/>
+      <w:bookmarkStart w:id="18" w:name="_Toc229996008"/>
       <w:r>
         <w:rPr>
           <w:rStyle w:val="Strong"/>
@@ -5115,7 +5172,7 @@
       <w:pPr>
         <w:pStyle w:val="Heading2"/>
       </w:pPr>
-      <w:bookmarkStart w:id="19" w:name="_Toc220841269"/>
+      <w:bookmarkStart w:id="19" w:name="_Toc229996009"/>
       <w:r>
         <w:t>3</w:t>
       </w:r>
@@ -5126,6 +5183,23 @@
         <w:t xml:space="preserve"> Research Design</w:t>
       </w:r>
       <w:bookmarkEnd w:id="19"/>
+    </w:p>
+    <w:p>
+      <w:pPr>
+        <w:pStyle w:val="BodyText"/>
+        <w:rPr>
+          <w:b/>
+        </w:rPr>
+      </w:pPr>
+      <w:r>
+        <w:t xml:space="preserve">This study will adopt a descriptive and analytical research design to examine the causes and consequences of internal migration in rural areas of Nepal. The descriptive design will help </w:t>
+      </w:r>
+      <w:r>
+        <w:t xml:space="preserve">describe </w:t>
+      </w:r>
+      <w:r>
+        <w:t>major causes and consequences of migration. The analytical aspect will help analyze the relationship between different factors influencing migration and their impacts on rural households.</w:t>
+      </w:r>
     </w:p>
     <w:p>
       <w:pPr>
@@ -5139,216 +5213,194 @@
           <w:lang w:bidi="ne-NP"/>
         </w:rPr>
       </w:pPr>
-      <w:bookmarkStart w:id="20" w:name="_Toc220841270"/>
-      <w:r>
-        <w:rPr>
-          <w:rFonts w:eastAsiaTheme="minorEastAsia" w:cs="Times New Roman"/>
-          <w:b w:val="0"/>
-          <w:kern w:val="0"/>
-          <w:sz w:val="24"/>
-          <w:szCs w:val="24"/>
-          <w:lang w:bidi="ne-NP"/>
-        </w:rPr>
-        <w:t xml:space="preserve">This study will adopt a descriptive and analytical research design to examine the causes and consequences of internal migration in rural areas of Nepal. The descriptive design will help </w:t>
-      </w:r>
-      <w:r>
-        <w:rPr>
-          <w:rFonts w:eastAsiaTheme="minorEastAsia" w:cs="Times New Roman"/>
-          <w:b w:val="0"/>
-          <w:kern w:val="0"/>
-          <w:sz w:val="24"/>
-          <w:szCs w:val="24"/>
-          <w:lang w:bidi="ne-NP"/>
-        </w:rPr>
-        <w:t xml:space="preserve">describe </w:t>
-      </w:r>
-      <w:r>
-        <w:rPr>
-          <w:rFonts w:eastAsiaTheme="minorEastAsia" w:cs="Times New Roman"/>
-          <w:b w:val="0"/>
-          <w:kern w:val="0"/>
-          <w:sz w:val="24"/>
-          <w:szCs w:val="24"/>
-          <w:lang w:bidi="ne-NP"/>
-        </w:rPr>
-        <w:t>major causes and consequences of migration. The analytical aspect will help analyze the relationship between different factors influencing migration and their impacts on rural households.</w:t>
+      <w:bookmarkStart w:id="20" w:name="_Toc229996010"/>
+      <w:r>
+        <w:t>3.2</w:t>
+      </w:r>
+      <w:r>
+        <w:t xml:space="preserve"> </w:t>
+      </w:r>
+      <w:r>
+        <w:t>Nature and source of data</w:t>
+      </w:r>
+      <w:bookmarkEnd w:id="20"/>
+    </w:p>
+    <w:p>
+      <w:pPr>
+        <w:pStyle w:val="NormalWeb"/>
+      </w:pPr>
+      <w:r>
+        <w:t>The study will use both primary and secondary sources of data.</w:t>
+      </w:r>
+    </w:p>
+    <w:p>
+      <w:pPr>
+        <w:pStyle w:val="BodyText"/>
+        <w:spacing w:after="0"/>
+        <w:rPr>
+          <w:b/>
+          <w:bCs/>
+        </w:rPr>
+      </w:pPr>
+      <w:r>
+        <w:rPr>
+          <w:b/>
+          <w:bCs/>
+        </w:rPr>
+        <w:t>Primary Data</w:t>
+      </w:r>
+    </w:p>
+    <w:p>
+      <w:pPr>
+        <w:pStyle w:val="NormalWeb"/>
+      </w:pPr>
+      <w:r>
+        <w:t>Primary data will be collected directly from respondents through questionnaires administered to households and migrants in the selected rural area. The primary data will provide information regarding the causes, patterns, and consequences of internal migration.</w:t>
+      </w:r>
+    </w:p>
+    <w:p>
+      <w:pPr>
+        <w:pStyle w:val="BodyText"/>
+        <w:spacing w:after="0"/>
+        <w:rPr>
+          <w:b/>
+          <w:bCs/>
+        </w:rPr>
+      </w:pPr>
+      <w:r>
+        <w:rPr>
+          <w:b/>
+          <w:bCs/>
+        </w:rPr>
+        <w:t>Secondary Data</w:t>
+      </w:r>
+    </w:p>
+    <w:p>
+      <w:pPr>
+        <w:pStyle w:val="NormalWeb"/>
+      </w:pPr>
+      <w:r>
+        <w:t>Secondary data will be collected from ward offices, local government records, census reports, books, journals, published reports, and other relevant documents related to migration.</w:t>
       </w:r>
     </w:p>
     <w:p>
       <w:pPr>
         <w:pStyle w:val="Heading2"/>
-        <w:rPr>
-          <w:rFonts w:eastAsiaTheme="minorEastAsia" w:cs="Times New Roman"/>
-          <w:b w:val="0"/>
-          <w:kern w:val="0"/>
-          <w:sz w:val="24"/>
-          <w:szCs w:val="24"/>
-          <w:lang w:bidi="ne-NP"/>
-        </w:rPr>
-      </w:pPr>
-      <w:r>
-        <w:t>3.2</w:t>
+      </w:pPr>
+      <w:bookmarkStart w:id="21" w:name="_Toc229996011"/>
+      <w:r>
+        <w:softHyphen/>
       </w:r>
       <w:r>
         <w:t xml:space="preserve"> </w:t>
       </w:r>
       <w:r>
-        <w:t>Nature and source of data</w:t>
-      </w:r>
-      <w:bookmarkEnd w:id="20"/>
-    </w:p>
-    <w:p>
-      <w:pPr>
-        <w:pStyle w:val="NormalWeb"/>
-      </w:pPr>
-      <w:r>
-        <w:t>The study will use both primary and secondary sources of data.</w:t>
-      </w:r>
-    </w:p>
-    <w:p>
-      <w:pPr>
-        <w:pStyle w:val="Heading3"/>
-      </w:pPr>
-      <w:r>
-        <w:t>Primary Data</w:t>
-      </w:r>
-    </w:p>
-    <w:p>
-      <w:pPr>
-        <w:pStyle w:val="NormalWeb"/>
-      </w:pPr>
-      <w:r>
-        <w:t>Primary data will be collected directly from respondents through questionnaires administered to households and migrants in the selected rural area. The primary data will provide information regarding the causes, patterns, and consequences of internal migration.</w:t>
-      </w:r>
-    </w:p>
-    <w:p>
-      <w:pPr>
-        <w:pStyle w:val="Heading3"/>
-      </w:pPr>
-      <w:r>
-        <w:t>Secondary Data</w:t>
-      </w:r>
-    </w:p>
-    <w:p>
-      <w:pPr>
-        <w:pStyle w:val="NormalWeb"/>
-      </w:pPr>
-      <w:r>
-        <w:t>Secondary data will be collected from ward offices, local government records, census reports, books, journals, published reports, and other relevant documents related to migration.</w:t>
+        <w:t>3.3</w:t>
+      </w:r>
+      <w:r>
+        <w:t xml:space="preserve"> </w:t>
+      </w:r>
+      <w:r>
+        <w:t>Population and Sampling</w:t>
+      </w:r>
+      <w:bookmarkEnd w:id="21"/>
+    </w:p>
+    <w:p>
+      <w:pPr>
+        <w:pStyle w:val="BodyText"/>
+      </w:pPr>
+      <w:r>
+        <w:t xml:space="preserve">The </w:t>
+      </w:r>
+      <w:proofErr w:type="spellStart"/>
+      <w:r>
+        <w:t>Shankharapur</w:t>
+      </w:r>
+      <w:proofErr w:type="spellEnd"/>
+      <w:r>
+        <w:t xml:space="preserve"> M</w:t>
+      </w:r>
+      <w:r>
+        <w:t>unicipality ward 9</w:t>
+      </w:r>
+      <w:r>
+        <w:t xml:space="preserve"> profile </w:t>
+      </w:r>
+      <w:r>
+        <w:t>–</w:t>
+      </w:r>
+      <w:r>
+        <w:t xml:space="preserve"> </w:t>
+      </w:r>
+      <w:r>
+        <w:t>20</w:t>
+      </w:r>
+      <w:r>
+        <w:t>82 BS</w:t>
+      </w:r>
+      <w:r>
+        <w:t xml:space="preserve"> sh</w:t>
+      </w:r>
+      <w:r>
+        <w:t xml:space="preserve">ows that there </w:t>
+      </w:r>
+      <w:r>
+        <w:t>is</w:t>
+      </w:r>
+      <w:r>
+        <w:t xml:space="preserve"> a total </w:t>
+      </w:r>
+      <w:r>
+        <w:t>population of about</w:t>
+      </w:r>
+      <w:r>
+        <w:t xml:space="preserve"> </w:t>
+      </w:r>
+      <w:r>
+        <w:t>4345</w:t>
+      </w:r>
+      <w:r>
+        <w:t>. Out of 9 wards, ward no.</w:t>
+      </w:r>
+      <w:r>
+        <w:t>9</w:t>
+      </w:r>
+      <w:r>
+        <w:t xml:space="preserve"> will be considered</w:t>
+      </w:r>
+      <w:r>
+        <w:t xml:space="preserve"> as</w:t>
+      </w:r>
+      <w:r>
+        <w:t xml:space="preserve"> st</w:t>
+      </w:r>
+      <w:r>
+        <w:t xml:space="preserve">udy area. This ward </w:t>
+      </w:r>
+      <w:r>
+        <w:t>welcomed</w:t>
+      </w:r>
+      <w:r>
+        <w:t xml:space="preserve"> 82</w:t>
+      </w:r>
+      <w:r>
+        <w:t xml:space="preserve"> </w:t>
+      </w:r>
+      <w:r>
+        <w:t>households</w:t>
+      </w:r>
+      <w:r>
+        <w:t xml:space="preserve"> with total count of 336 immigrants from year 2074 BS to 2082 BS</w:t>
+      </w:r>
+      <w:r>
+        <w:t xml:space="preserve">. </w:t>
       </w:r>
     </w:p>
     <w:p>
       <w:pPr>
         <w:pStyle w:val="Heading2"/>
       </w:pPr>
-      <w:r>
-        <w:softHyphen/>
-      </w:r>
-      <w:r>
-        <w:t xml:space="preserve"> </w:t>
-      </w:r>
-      <w:bookmarkStart w:id="21" w:name="_Toc220841271"/>
-      <w:r>
-        <w:t>3.3</w:t>
-      </w:r>
-      <w:r>
-        <w:t xml:space="preserve"> </w:t>
-      </w:r>
-      <w:r>
-        <w:t>Population and Sampling</w:t>
-      </w:r>
-      <w:bookmarkEnd w:id="21"/>
-    </w:p>
-    <w:p>
-      <w:pPr>
-        <w:pStyle w:val="BodyText"/>
-      </w:pPr>
-      <w:r>
-        <w:t xml:space="preserve">The </w:t>
-      </w:r>
-      <w:r>
-        <w:t>Shankharapur M</w:t>
-      </w:r>
-      <w:r>
-        <w:t>unicipality ward 9</w:t>
-      </w:r>
-      <w:r>
-        <w:t xml:space="preserve"> profile </w:t>
-      </w:r>
-      <w:r>
-        <w:t>–</w:t>
-      </w:r>
-      <w:r>
-        <w:t xml:space="preserve"> </w:t>
-      </w:r>
-      <w:r>
-        <w:t>20</w:t>
-      </w:r>
-      <w:r>
-        <w:t>82 BS</w:t>
-      </w:r>
-      <w:r>
-        <w:t xml:space="preserve"> sh</w:t>
-      </w:r>
-      <w:r>
-        <w:t xml:space="preserve">ows that there </w:t>
-      </w:r>
-      <w:r>
-        <w:t>is</w:t>
-      </w:r>
-      <w:r>
-        <w:t xml:space="preserve"> a total </w:t>
-      </w:r>
-      <w:r>
-        <w:t>population of about</w:t>
-      </w:r>
-      <w:r>
-        <w:t xml:space="preserve"> </w:t>
-      </w:r>
-      <w:r>
-        <w:t>4345</w:t>
-      </w:r>
-      <w:r>
-        <w:t>. Out of 9 wards, ward no.</w:t>
-      </w:r>
-      <w:r>
-        <w:t>9</w:t>
-      </w:r>
-      <w:r>
-        <w:t xml:space="preserve"> will be considered</w:t>
-      </w:r>
-      <w:r>
-        <w:t xml:space="preserve"> as</w:t>
-      </w:r>
-      <w:r>
-        <w:t xml:space="preserve"> st</w:t>
-      </w:r>
-      <w:r>
-        <w:t xml:space="preserve">udy area. This ward </w:t>
-      </w:r>
-      <w:r>
-        <w:t>welcomed</w:t>
-      </w:r>
-      <w:r>
-        <w:t xml:space="preserve"> 82</w:t>
-      </w:r>
-      <w:r>
-        <w:t xml:space="preserve"> </w:t>
-      </w:r>
-      <w:r>
-        <w:t>households</w:t>
-      </w:r>
-      <w:r>
-        <w:t xml:space="preserve"> with total count of 336 immigrants from year 2074 BS to 2082 BS</w:t>
-      </w:r>
-      <w:r>
-        <w:t xml:space="preserve">. </w:t>
-      </w:r>
-    </w:p>
-    <w:p>
-      <w:pPr>
-        <w:pStyle w:val="Heading2"/>
-      </w:pPr>
+      <w:bookmarkStart w:id="22" w:name="_Toc229996012"/>
       <w:r>
         <w:t xml:space="preserve">3.3.1 </w:t>
       </w:r>
@@ -5360,13 +5412,18 @@
         </w:rPr>
         <w:t>Sample Size Determination</w:t>
       </w:r>
+      <w:bookmarkEnd w:id="22"/>
     </w:p>
     <w:p>
       <w:pPr>
         <w:pStyle w:val="NormalWeb"/>
       </w:pPr>
       <w:r>
-        <w:t>The study was conducted in a small ward where the total number of households that experienced migration over the last ten years was 83. Since the population size was relatively small and fully identifiable through ward-level records, a census approach was considered more appropriate than selecting a sample using statistical formulas.</w:t>
+        <w:t xml:space="preserve">The study was conducted in a small ward where the total number of households that experienced migration over the last ten years was 83. Since the population size was </w:t>
+      </w:r>
+      <w:r>
+        <w:lastRenderedPageBreak/>
+        <w:t>relatively small and fully identifiable through ward-level records, a census approach was considered more appropriate than selecting a sample using statistical formulas.</w:t>
       </w:r>
     </w:p>
     <w:p>
@@ -5374,7 +5431,6 @@
         <w:pStyle w:val="NormalWeb"/>
       </w:pPr>
       <w:r>
-        <w:lastRenderedPageBreak/>
         <w:t>Sample size determination formulas such as Slovin’s or Cochran’s are generally applied when the population is large or when complete enumeration is not feasible. However, in this study, covering all 83 households ensured complete representation of the target population and improved the accuracy and reliability of the findings by eliminating sampling error.</w:t>
       </w:r>
     </w:p>
@@ -5388,51 +5444,46 @@
     </w:p>
     <w:p>
       <w:pPr>
+        <w:pStyle w:val="Heading2"/>
+      </w:pPr>
+      <w:bookmarkStart w:id="23" w:name="_Toc229996013"/>
+      <w:r>
+        <w:t>3.4</w:t>
+      </w:r>
+      <w:r>
+        <w:t xml:space="preserve"> </w:t>
+      </w:r>
+      <w:r>
+        <w:t>Method of Data Collection</w:t>
+      </w:r>
+      <w:bookmarkEnd w:id="23"/>
+      <w:r>
+        <w:t xml:space="preserve"> </w:t>
+      </w:r>
+    </w:p>
+    <w:p>
+      <w:pPr>
         <w:pStyle w:val="BodyText"/>
       </w:pPr>
-    </w:p>
-    <w:p>
-      <w:pPr>
-        <w:pStyle w:val="Heading2"/>
-      </w:pPr>
-      <w:bookmarkStart w:id="22" w:name="_Toc220841272"/>
+      <w:r>
+        <w:t>In order to obtain necessary and reliable data for thus study the researcher will use the method such as observation, unstructured interview and some case study.</w:t>
+      </w:r>
+    </w:p>
+    <w:p>
+      <w:pPr>
+        <w:pStyle w:val="Heading3"/>
+      </w:pPr>
+      <w:bookmarkStart w:id="24" w:name="_Toc229996014"/>
       <w:r>
         <w:t>3.4</w:t>
       </w:r>
       <w:r>
-        <w:t xml:space="preserve"> </w:t>
-      </w:r>
-      <w:r>
-        <w:t>Method of Data Collection</w:t>
-      </w:r>
-      <w:bookmarkEnd w:id="22"/>
-      <w:r>
-        <w:t xml:space="preserve"> </w:t>
-      </w:r>
-    </w:p>
-    <w:p>
-      <w:pPr>
-        <w:pStyle w:val="BodyText"/>
-      </w:pPr>
-      <w:r>
-        <w:t>In order to obtain necessary and reliable data for thus study the researcher will use the method such as observation, unstructured interview and some case study.</w:t>
-      </w:r>
-    </w:p>
-    <w:p>
-      <w:pPr>
-        <w:pStyle w:val="Heading3"/>
-      </w:pPr>
-      <w:bookmarkStart w:id="23" w:name="_Toc220841273"/>
-      <w:r>
-        <w:t>3.4</w:t>
-      </w:r>
-      <w:r>
         <w:t xml:space="preserve">.1 </w:t>
       </w:r>
       <w:r>
         <w:t>Observation</w:t>
       </w:r>
-      <w:bookmarkEnd w:id="23"/>
+      <w:bookmarkEnd w:id="24"/>
     </w:p>
     <w:p>
       <w:pPr>
@@ -5444,7 +5495,6 @@
           <w14:ligatures w14:val="none"/>
         </w:rPr>
       </w:pPr>
-      <w:bookmarkStart w:id="24" w:name="_Toc220841274"/>
       <w:r>
         <w:rPr>
           <w:rFonts w:ascii="Times New Roman" w:eastAsia="Times New Roman" w:hAnsi="Times New Roman" w:cs="Times New Roman"/>
@@ -5511,8 +5561,7 @@
       <w:pPr>
         <w:pStyle w:val="Heading2"/>
       </w:pPr>
-      <w:bookmarkStart w:id="25" w:name="_Toc220841275"/>
-      <w:bookmarkEnd w:id="24"/>
+      <w:bookmarkStart w:id="25" w:name="_Toc229996015"/>
       <w:r>
         <w:t>3.5</w:t>
       </w:r>
@@ -5534,7 +5583,6 @@
           <w14:ligatures w14:val="none"/>
         </w:rPr>
       </w:pPr>
-      <w:bookmarkStart w:id="26" w:name="_Toc220841276"/>
       <w:r>
         <w:rPr>
           <w:rFonts w:ascii="Times New Roman" w:eastAsia="Times New Roman" w:hAnsi="Times New Roman" w:cs="Times New Roman"/>
@@ -5590,6 +5638,7 @@
       <w:pPr>
         <w:pStyle w:val="Heading2"/>
       </w:pPr>
+      <w:bookmarkStart w:id="26" w:name="_Toc229996016"/>
       <w:r>
         <w:t>3.6</w:t>
       </w:r>
@@ -5679,10 +5728,8 @@
         </w:rPr>
         <w:br w:type="page"/>
       </w:r>
-      <w:bookmarkStart w:id="27" w:name="_GoBack"/>
-      <w:bookmarkEnd w:id="27"/>
-    </w:p>
-    <w:bookmarkStart w:id="28" w:name="_Toc220841277" w:displacedByCustomXml="next"/>
+    </w:p>
+    <w:bookmarkStart w:id="27" w:name="_Toc229996017" w:displacedByCustomXml="next"/>
     <w:sdt>
       <w:sdtPr>
         <w:rPr>
@@ -5697,7 +5744,6 @@
           <w:docPartUnique/>
         </w:docPartObj>
       </w:sdtPr>
-      <w:sdtEndPr/>
       <w:sdtContent>
         <w:p>
           <w:pPr>
@@ -5706,14 +5752,13 @@
           <w:r>
             <w:t>References</w:t>
           </w:r>
-          <w:bookmarkEnd w:id="28"/>
+          <w:bookmarkEnd w:id="27"/>
         </w:p>
         <w:sdt>
           <w:sdtPr>
             <w:id w:val="-573587230"/>
             <w:bibliography/>
           </w:sdtPr>
-          <w:sdtEndPr/>
           <w:sdtContent>
             <w:p>
               <w:pPr>
@@ -6085,7 +6130,6 @@
                 <w:rPr>
                   <w:noProof/>
                 </w:rPr>
-                <w:lastRenderedPageBreak/>
                 <w:t xml:space="preserve">Ravenstein, E. G. (1885). The laws of migration. </w:t>
               </w:r>
               <w:r>
@@ -6115,6 +6159,7 @@
                 <w:rPr>
                   <w:noProof/>
                 </w:rPr>
+                <w:lastRenderedPageBreak/>
                 <w:t xml:space="preserve">Stewart, Q. J. (1950). The development of social physics. </w:t>
               </w:r>
               <w:r>
@@ -6317,7 +6362,7 @@
 </file>
 
 <file path=word/endnotes.xml><?xml version="1.0" encoding="utf-8"?>
-<w:endnotes xmlns:wpc="http://schemas.microsoft.com/office/word/2010/wordprocessingCanvas" xmlns:cx="http://schemas.microsoft.com/office/drawing/2014/chartex" xmlns:mc="http://schemas.openxmlformats.org/markup-compatibility/2006" xmlns:o="urn:schemas-microsoft-com:office:office" xmlns:r="http://schemas.openxmlformats.org/officeDocument/2006/relationships" xmlns:m="http://schemas.openxmlformats.org/officeDocument/2006/math" xmlns:v="urn:schemas-microsoft-com:vml" xmlns:wp14="http://schemas.microsoft.com/office/word/2010/wordprocessingDrawing" xmlns:wp="http://schemas.openxmlformats.org/drawingml/2006/wordprocessingDrawing" xmlns:w10="urn:schemas-microsoft-com:office:word" xmlns:w="http://schemas.openxmlformats.org/wordprocessingml/2006/main" xmlns:w14="http://schemas.microsoft.com/office/word/2010/wordml" xmlns:w15="http://schemas.microsoft.com/office/word/2012/wordml" xmlns:w16se="http://schemas.microsoft.com/office/word/2015/wordml/symex" xmlns:wpg="http://schemas.microsoft.com/office/word/2010/wordprocessingGroup" xmlns:wpi="http://schemas.microsoft.com/office/word/2010/wordprocessingInk" xmlns:wne="http://schemas.microsoft.com/office/word/2006/wordml" xmlns:wps="http://schemas.microsoft.com/office/word/2010/wordprocessingShape" mc:Ignorable="w14 w15 w16se wp14">
+<w:endnotes xmlns:wpc="http://schemas.microsoft.com/office/word/2010/wordprocessingCanvas" xmlns:cx="http://schemas.microsoft.com/office/drawing/2014/chartex" xmlns:cx1="http://schemas.microsoft.com/office/drawing/2015/9/8/chartex" xmlns:cx2="http://schemas.microsoft.com/office/drawing/2015/10/21/chartex" xmlns:cx3="http://schemas.microsoft.com/office/drawing/2016/5/9/chartex" xmlns:cx4="http://schemas.microsoft.com/office/drawing/2016/5/10/chartex" xmlns:cx5="http://schemas.microsoft.com/office/drawing/2016/5/11/chartex" xmlns:cx6="http://schemas.microsoft.com/office/drawing/2016/5/12/chartex" xmlns:cx7="http://schemas.microsoft.com/office/drawing/2016/5/13/chartex" xmlns:cx8="http://schemas.microsoft.com/office/drawing/2016/5/14/chartex" xmlns:mc="http://schemas.openxmlformats.org/markup-compatibility/2006" xmlns:aink="http://schemas.microsoft.com/office/drawing/2016/ink" xmlns:am3d="http://schemas.microsoft.com/office/drawing/2017/model3d" xmlns:o="urn:schemas-microsoft-com:office:office" xmlns:oel="http://schemas.microsoft.com/office/2019/extlst" xmlns:r="http://schemas.openxmlformats.org/officeDocument/2006/relationships" xmlns:m="http://schemas.openxmlformats.org/officeDocument/2006/math" xmlns:v="urn:schemas-microsoft-com:vml" xmlns:wp14="http://schemas.microsoft.com/office/word/2010/wordprocessingDrawing" xmlns:wp="http://schemas.openxmlformats.org/drawingml/2006/wordprocessingDrawing" xmlns:w10="urn:schemas-microsoft-com:office:word" xmlns:w="http://schemas.openxmlformats.org/wordprocessingml/2006/main" xmlns:w14="http://schemas.microsoft.com/office/word/2010/wordml" xmlns:w15="http://schemas.microsoft.com/office/word/2012/wordml" xmlns:w16cex="http://schemas.microsoft.com/office/word/2018/wordml/cex" xmlns:w16cid="http://schemas.microsoft.com/office/word/2016/wordml/cid" xmlns:w16="http://schemas.microsoft.com/office/word/2018/wordml" xmlns:w16du="http://schemas.microsoft.com/office/word/2023/wordml/word16du" xmlns:w16sdtdh="http://schemas.microsoft.com/office/word/2020/wordml/sdtdatahash" xmlns:w16sdtfl="http://schemas.microsoft.com/office/word/2024/wordml/sdtformatlock" xmlns:w16se="http://schemas.microsoft.com/office/word/2015/wordml/symex" xmlns:wpg="http://schemas.microsoft.com/office/word/2010/wordprocessingGroup" xmlns:wpi="http://schemas.microsoft.com/office/word/2010/wordprocessingInk" xmlns:wne="http://schemas.microsoft.com/office/word/2006/wordml" xmlns:wps="http://schemas.microsoft.com/office/word/2010/wordprocessingShape" mc:Ignorable="w14 w15 w16se w16cid w16 w16cex w16sdtdh w16sdtfl w16du wp14">
   <w:endnote w:type="separator" w:id="-1">
     <w:p>
       <w:pPr>
@@ -6342,7 +6387,7 @@
 </file>
 
 <file path=word/footer1.xml><?xml version="1.0" encoding="utf-8"?>
-<w:ftr xmlns:wpc="http://schemas.microsoft.com/office/word/2010/wordprocessingCanvas" xmlns:cx="http://schemas.microsoft.com/office/drawing/2014/chartex" xmlns:mc="http://schemas.openxmlformats.org/markup-compatibility/2006" xmlns:o="urn:schemas-microsoft-com:office:office" xmlns:r="http://schemas.openxmlformats.org/officeDocument/2006/relationships" xmlns:m="http://schemas.openxmlformats.org/officeDocument/2006/math" xmlns:v="urn:schemas-microsoft-com:vml" xmlns:wp14="http://schemas.microsoft.com/office/word/2010/wordprocessingDrawing" xmlns:wp="http://schemas.openxmlformats.org/drawingml/2006/wordprocessingDrawing" xmlns:w10="urn:schemas-microsoft-com:office:word" xmlns:w="http://schemas.openxmlformats.org/wordprocessingml/2006/main" xmlns:w14="http://schemas.microsoft.com/office/word/2010/wordml" xmlns:w15="http://schemas.microsoft.com/office/word/2012/wordml" xmlns:w16se="http://schemas.microsoft.com/office/word/2015/wordml/symex" xmlns:wpg="http://schemas.microsoft.com/office/word/2010/wordprocessingGroup" xmlns:wpi="http://schemas.microsoft.com/office/word/2010/wordprocessingInk" xmlns:wne="http://schemas.microsoft.com/office/word/2006/wordml" xmlns:wps="http://schemas.microsoft.com/office/word/2010/wordprocessingShape" mc:Ignorable="w14 w15 w16se wp14">
+<w:ftr xmlns:wpc="http://schemas.microsoft.com/office/word/2010/wordprocessingCanvas" xmlns:cx="http://schemas.microsoft.com/office/drawing/2014/chartex" xmlns:cx1="http://schemas.microsoft.com/office/drawing/2015/9/8/chartex" xmlns:cx2="http://schemas.microsoft.com/office/drawing/2015/10/21/chartex" xmlns:cx3="http://schemas.microsoft.com/office/drawing/2016/5/9/chartex" xmlns:cx4="http://schemas.microsoft.com/office/drawing/2016/5/10/chartex" xmlns:cx5="http://schemas.microsoft.com/office/drawing/2016/5/11/chartex" xmlns:cx6="http://schemas.microsoft.com/office/drawing/2016/5/12/chartex" xmlns:cx7="http://schemas.microsoft.com/office/drawing/2016/5/13/chartex" xmlns:cx8="http://schemas.microsoft.com/office/drawing/2016/5/14/chartex" xmlns:mc="http://schemas.openxmlformats.org/markup-compatibility/2006" xmlns:aink="http://schemas.microsoft.com/office/drawing/2016/ink" xmlns:am3d="http://schemas.microsoft.com/office/drawing/2017/model3d" xmlns:o="urn:schemas-microsoft-com:office:office" xmlns:oel="http://schemas.microsoft.com/office/2019/extlst" xmlns:r="http://schemas.openxmlformats.org/officeDocument/2006/relationships" xmlns:m="http://schemas.openxmlformats.org/officeDocument/2006/math" xmlns:v="urn:schemas-microsoft-com:vml" xmlns:wp14="http://schemas.microsoft.com/office/word/2010/wordprocessingDrawing" xmlns:wp="http://schemas.openxmlformats.org/drawingml/2006/wordprocessingDrawing" xmlns:w10="urn:schemas-microsoft-com:office:word" xmlns:w="http://schemas.openxmlformats.org/wordprocessingml/2006/main" xmlns:w14="http://schemas.microsoft.com/office/word/2010/wordml" xmlns:w15="http://schemas.microsoft.com/office/word/2012/wordml" xmlns:w16cex="http://schemas.microsoft.com/office/word/2018/wordml/cex" xmlns:w16cid="http://schemas.microsoft.com/office/word/2016/wordml/cid" xmlns:w16="http://schemas.microsoft.com/office/word/2018/wordml" xmlns:w16du="http://schemas.microsoft.com/office/word/2023/wordml/word16du" xmlns:w16sdtdh="http://schemas.microsoft.com/office/word/2020/wordml/sdtdatahash" xmlns:w16sdtfl="http://schemas.microsoft.com/office/word/2024/wordml/sdtformatlock" xmlns:w16se="http://schemas.microsoft.com/office/word/2015/wordml/symex" xmlns:wpg="http://schemas.microsoft.com/office/word/2010/wordprocessingGroup" xmlns:wpi="http://schemas.microsoft.com/office/word/2010/wordprocessingInk" xmlns:wne="http://schemas.microsoft.com/office/word/2006/wordml" xmlns:wps="http://schemas.microsoft.com/office/word/2010/wordprocessingShape" mc:Ignorable="w14 w15 w16se w16cid w16 w16cex w16sdtdh w16sdtfl w16du wp14">
   <w:p>
     <w:pPr>
       <w:pStyle w:val="Footer"/>
@@ -6352,7 +6397,7 @@
 </file>
 
 <file path=word/footer2.xml><?xml version="1.0" encoding="utf-8"?>
-<w:ftr xmlns:wpc="http://schemas.microsoft.com/office/word/2010/wordprocessingCanvas" xmlns:cx="http://schemas.microsoft.com/office/drawing/2014/chartex" xmlns:mc="http://schemas.openxmlformats.org/markup-compatibility/2006" xmlns:o="urn:schemas-microsoft-com:office:office" xmlns:r="http://schemas.openxmlformats.org/officeDocument/2006/relationships" xmlns:m="http://schemas.openxmlformats.org/officeDocument/2006/math" xmlns:v="urn:schemas-microsoft-com:vml" xmlns:wp14="http://schemas.microsoft.com/office/word/2010/wordprocessingDrawing" xmlns:wp="http://schemas.openxmlformats.org/drawingml/2006/wordprocessingDrawing" xmlns:w10="urn:schemas-microsoft-com:office:word" xmlns:w="http://schemas.openxmlformats.org/wordprocessingml/2006/main" xmlns:w14="http://schemas.microsoft.com/office/word/2010/wordml" xmlns:w15="http://schemas.microsoft.com/office/word/2012/wordml" xmlns:w16se="http://schemas.microsoft.com/office/word/2015/wordml/symex" xmlns:wpg="http://schemas.microsoft.com/office/word/2010/wordprocessingGroup" xmlns:wpi="http://schemas.microsoft.com/office/word/2010/wordprocessingInk" xmlns:wne="http://schemas.microsoft.com/office/word/2006/wordml" xmlns:wps="http://schemas.microsoft.com/office/word/2010/wordprocessingShape" mc:Ignorable="w14 w15 w16se wp14">
+<w:ftr xmlns:wpc="http://schemas.microsoft.com/office/word/2010/wordprocessingCanvas" xmlns:cx="http://schemas.microsoft.com/office/drawing/2014/chartex" xmlns:cx1="http://schemas.microsoft.com/office/drawing/2015/9/8/chartex" xmlns:cx2="http://schemas.microsoft.com/office/drawing/2015/10/21/chartex" xmlns:cx3="http://schemas.microsoft.com/office/drawing/2016/5/9/chartex" xmlns:cx4="http://schemas.microsoft.com/office/drawing/2016/5/10/chartex" xmlns:cx5="http://schemas.microsoft.com/office/drawing/2016/5/11/chartex" xmlns:cx6="http://schemas.microsoft.com/office/drawing/2016/5/12/chartex" xmlns:cx7="http://schemas.microsoft.com/office/drawing/2016/5/13/chartex" xmlns:cx8="http://schemas.microsoft.com/office/drawing/2016/5/14/chartex" xmlns:mc="http://schemas.openxmlformats.org/markup-compatibility/2006" xmlns:aink="http://schemas.microsoft.com/office/drawing/2016/ink" xmlns:am3d="http://schemas.microsoft.com/office/drawing/2017/model3d" xmlns:o="urn:schemas-microsoft-com:office:office" xmlns:oel="http://schemas.microsoft.com/office/2019/extlst" xmlns:r="http://schemas.openxmlformats.org/officeDocument/2006/relationships" xmlns:m="http://schemas.openxmlformats.org/officeDocument/2006/math" xmlns:v="urn:schemas-microsoft-com:vml" xmlns:wp14="http://schemas.microsoft.com/office/word/2010/wordprocessingDrawing" xmlns:wp="http://schemas.openxmlformats.org/drawingml/2006/wordprocessingDrawing" xmlns:w10="urn:schemas-microsoft-com:office:word" xmlns:w="http://schemas.openxmlformats.org/wordprocessingml/2006/main" xmlns:w14="http://schemas.microsoft.com/office/word/2010/wordml" xmlns:w15="http://schemas.microsoft.com/office/word/2012/wordml" xmlns:w16cex="http://schemas.microsoft.com/office/word/2018/wordml/cex" xmlns:w16cid="http://schemas.microsoft.com/office/word/2016/wordml/cid" xmlns:w16="http://schemas.microsoft.com/office/word/2018/wordml" xmlns:w16du="http://schemas.microsoft.com/office/word/2023/wordml/word16du" xmlns:w16sdtdh="http://schemas.microsoft.com/office/word/2020/wordml/sdtdatahash" xmlns:w16sdtfl="http://schemas.microsoft.com/office/word/2024/wordml/sdtformatlock" xmlns:w16se="http://schemas.microsoft.com/office/word/2015/wordml/symex" xmlns:wpg="http://schemas.microsoft.com/office/word/2010/wordprocessingGroup" xmlns:wpi="http://schemas.microsoft.com/office/word/2010/wordprocessingInk" xmlns:wne="http://schemas.microsoft.com/office/word/2006/wordml" xmlns:wps="http://schemas.microsoft.com/office/word/2010/wordprocessingShape" mc:Ignorable="w14 w15 w16se w16cid w16 w16cex w16sdtdh w16sdtfl w16du wp14">
   <w:p>
     <w:pPr>
       <w:pStyle w:val="Footer"/>
@@ -6362,7 +6407,7 @@
 </file>
 
 <file path=word/footnotes.xml><?xml version="1.0" encoding="utf-8"?>
-<w:footnotes xmlns:wpc="http://schemas.microsoft.com/office/word/2010/wordprocessingCanvas" xmlns:cx="http://schemas.microsoft.com/office/drawing/2014/chartex" xmlns:mc="http://schemas.openxmlformats.org/markup-compatibility/2006" xmlns:o="urn:schemas-microsoft-com:office:office" xmlns:r="http://schemas.openxmlformats.org/officeDocument/2006/relationships" xmlns:m="http://schemas.openxmlformats.org/officeDocument/2006/math" xmlns:v="urn:schemas-microsoft-com:vml" xmlns:wp14="http://schemas.microsoft.com/office/word/2010/wordprocessingDrawing" xmlns:wp="http://schemas.openxmlformats.org/drawingml/2006/wordprocessingDrawing" xmlns:w10="urn:schemas-microsoft-com:office:word" xmlns:w="http://schemas.openxmlformats.org/wordprocessingml/2006/main" xmlns:w14="http://schemas.microsoft.com/office/word/2010/wordml" xmlns:w15="http://schemas.microsoft.com/office/word/2012/wordml" xmlns:w16se="http://schemas.microsoft.com/office/word/2015/wordml/symex" xmlns:wpg="http://schemas.microsoft.com/office/word/2010/wordprocessingGroup" xmlns:wpi="http://schemas.microsoft.com/office/word/2010/wordprocessingInk" xmlns:wne="http://schemas.microsoft.com/office/word/2006/wordml" xmlns:wps="http://schemas.microsoft.com/office/word/2010/wordprocessingShape" mc:Ignorable="w14 w15 w16se wp14">
+<w:footnotes xmlns:wpc="http://schemas.microsoft.com/office/word/2010/wordprocessingCanvas" xmlns:cx="http://schemas.microsoft.com/office/drawing/2014/chartex" xmlns:cx1="http://schemas.microsoft.com/office/drawing/2015/9/8/chartex" xmlns:cx2="http://schemas.microsoft.com/office/drawing/2015/10/21/chartex" xmlns:cx3="http://schemas.microsoft.com/office/drawing/2016/5/9/chartex" xmlns:cx4="http://schemas.microsoft.com/office/drawing/2016/5/10/chartex" xmlns:cx5="http://schemas.microsoft.com/office/drawing/2016/5/11/chartex" xmlns:cx6="http://schemas.microsoft.com/office/drawing/2016/5/12/chartex" xmlns:cx7="http://schemas.microsoft.com/office/drawing/2016/5/13/chartex" xmlns:cx8="http://schemas.microsoft.com/office/drawing/2016/5/14/chartex" xmlns:mc="http://schemas.openxmlformats.org/markup-compatibility/2006" xmlns:aink="http://schemas.microsoft.com/office/drawing/2016/ink" xmlns:am3d="http://schemas.microsoft.com/office/drawing/2017/model3d" xmlns:o="urn:schemas-microsoft-com:office:office" xmlns:oel="http://schemas.microsoft.com/office/2019/extlst" xmlns:r="http://schemas.openxmlformats.org/officeDocument/2006/relationships" xmlns:m="http://schemas.openxmlformats.org/officeDocument/2006/math" xmlns:v="urn:schemas-microsoft-com:vml" xmlns:wp14="http://schemas.microsoft.com/office/word/2010/wordprocessingDrawing" xmlns:wp="http://schemas.openxmlformats.org/drawingml/2006/wordprocessingDrawing" xmlns:w10="urn:schemas-microsoft-com:office:word" xmlns:w="http://schemas.openxmlformats.org/wordprocessingml/2006/main" xmlns:w14="http://schemas.microsoft.com/office/word/2010/wordml" xmlns:w15="http://schemas.microsoft.com/office/word/2012/wordml" xmlns:w16cex="http://schemas.microsoft.com/office/word/2018/wordml/cex" xmlns:w16cid="http://schemas.microsoft.com/office/word/2016/wordml/cid" xmlns:w16="http://schemas.microsoft.com/office/word/2018/wordml" xmlns:w16du="http://schemas.microsoft.com/office/word/2023/wordml/word16du" xmlns:w16sdtdh="http://schemas.microsoft.com/office/word/2020/wordml/sdtdatahash" xmlns:w16sdtfl="http://schemas.microsoft.com/office/word/2024/wordml/sdtformatlock" xmlns:w16se="http://schemas.microsoft.com/office/word/2015/wordml/symex" xmlns:wpg="http://schemas.microsoft.com/office/word/2010/wordprocessingGroup" xmlns:wpi="http://schemas.microsoft.com/office/word/2010/wordprocessingInk" xmlns:wne="http://schemas.microsoft.com/office/word/2006/wordml" xmlns:wps="http://schemas.microsoft.com/office/word/2010/wordprocessingShape" mc:Ignorable="w14 w15 w16se w16cid w16 w16cex w16sdtdh w16sdtfl w16du wp14">
   <w:footnote w:type="separator" w:id="-1">
     <w:p>
       <w:pPr>
@@ -6387,7 +6432,7 @@
 </file>
 
 <file path=word/header1.xml><?xml version="1.0" encoding="utf-8"?>
-<w:hdr xmlns:wpc="http://schemas.microsoft.com/office/word/2010/wordprocessingCanvas" xmlns:cx="http://schemas.microsoft.com/office/drawing/2014/chartex" xmlns:mc="http://schemas.openxmlformats.org/markup-compatibility/2006" xmlns:o="urn:schemas-microsoft-com:office:office" xmlns:r="http://schemas.openxmlformats.org/officeDocument/2006/relationships" xmlns:m="http://schemas.openxmlformats.org/officeDocument/2006/math" xmlns:v="urn:schemas-microsoft-com:vml" xmlns:wp14="http://schemas.microsoft.com/office/word/2010/wordprocessingDrawing" xmlns:wp="http://schemas.openxmlformats.org/drawingml/2006/wordprocessingDrawing" xmlns:w10="urn:schemas-microsoft-com:office:word" xmlns:w="http://schemas.openxmlformats.org/wordprocessingml/2006/main" xmlns:w14="http://schemas.microsoft.com/office/word/2010/wordml" xmlns:w15="http://schemas.microsoft.com/office/word/2012/wordml" xmlns:w16se="http://schemas.microsoft.com/office/word/2015/wordml/symex" xmlns:wpg="http://schemas.microsoft.com/office/word/2010/wordprocessingGroup" xmlns:wpi="http://schemas.microsoft.com/office/word/2010/wordprocessingInk" xmlns:wne="http://schemas.microsoft.com/office/word/2006/wordml" xmlns:wps="http://schemas.microsoft.com/office/word/2010/wordprocessingShape" mc:Ignorable="w14 w15 w16se wp14">
+<w:hdr xmlns:wpc="http://schemas.microsoft.com/office/word/2010/wordprocessingCanvas" xmlns:cx="http://schemas.microsoft.com/office/drawing/2014/chartex" xmlns:cx1="http://schemas.microsoft.com/office/drawing/2015/9/8/chartex" xmlns:cx2="http://schemas.microsoft.com/office/drawing/2015/10/21/chartex" xmlns:cx3="http://schemas.microsoft.com/office/drawing/2016/5/9/chartex" xmlns:cx4="http://schemas.microsoft.com/office/drawing/2016/5/10/chartex" xmlns:cx5="http://schemas.microsoft.com/office/drawing/2016/5/11/chartex" xmlns:cx6="http://schemas.microsoft.com/office/drawing/2016/5/12/chartex" xmlns:cx7="http://schemas.microsoft.com/office/drawing/2016/5/13/chartex" xmlns:cx8="http://schemas.microsoft.com/office/drawing/2016/5/14/chartex" xmlns:mc="http://schemas.openxmlformats.org/markup-compatibility/2006" xmlns:aink="http://schemas.microsoft.com/office/drawing/2016/ink" xmlns:am3d="http://schemas.microsoft.com/office/drawing/2017/model3d" xmlns:o="urn:schemas-microsoft-com:office:office" xmlns:oel="http://schemas.microsoft.com/office/2019/extlst" xmlns:r="http://schemas.openxmlformats.org/officeDocument/2006/relationships" xmlns:m="http://schemas.openxmlformats.org/officeDocument/2006/math" xmlns:v="urn:schemas-microsoft-com:vml" xmlns:wp14="http://schemas.microsoft.com/office/word/2010/wordprocessingDrawing" xmlns:wp="http://schemas.openxmlformats.org/drawingml/2006/wordprocessingDrawing" xmlns:w10="urn:schemas-microsoft-com:office:word" xmlns:w="http://schemas.openxmlformats.org/wordprocessingml/2006/main" xmlns:w14="http://schemas.microsoft.com/office/word/2010/wordml" xmlns:w15="http://schemas.microsoft.com/office/word/2012/wordml" xmlns:w16cex="http://schemas.microsoft.com/office/word/2018/wordml/cex" xmlns:w16cid="http://schemas.microsoft.com/office/word/2016/wordml/cid" xmlns:w16="http://schemas.microsoft.com/office/word/2018/wordml" xmlns:w16du="http://schemas.microsoft.com/office/word/2023/wordml/word16du" xmlns:w16sdtdh="http://schemas.microsoft.com/office/word/2020/wordml/sdtdatahash" xmlns:w16sdtfl="http://schemas.microsoft.com/office/word/2024/wordml/sdtformatlock" xmlns:w16se="http://schemas.microsoft.com/office/word/2015/wordml/symex" xmlns:wpg="http://schemas.microsoft.com/office/word/2010/wordprocessingGroup" xmlns:wpi="http://schemas.microsoft.com/office/word/2010/wordprocessingInk" xmlns:wne="http://schemas.microsoft.com/office/word/2006/wordml" xmlns:wps="http://schemas.microsoft.com/office/word/2010/wordprocessingShape" mc:Ignorable="w14 w15 w16se w16cid w16 w16cex w16sdtdh w16sdtfl w16du wp14">
   <w:p>
     <w:pPr>
       <w:pStyle w:val="Header"/>
@@ -6397,7 +6442,7 @@
 </file>
 
 <file path=word/header2.xml><?xml version="1.0" encoding="utf-8"?>
-<w:hdr xmlns:wpc="http://schemas.microsoft.com/office/word/2010/wordprocessingCanvas" xmlns:cx="http://schemas.microsoft.com/office/drawing/2014/chartex" xmlns:mc="http://schemas.openxmlformats.org/markup-compatibility/2006" xmlns:o="urn:schemas-microsoft-com:office:office" xmlns:r="http://schemas.openxmlformats.org/officeDocument/2006/relationships" xmlns:m="http://schemas.openxmlformats.org/officeDocument/2006/math" xmlns:v="urn:schemas-microsoft-com:vml" xmlns:wp14="http://schemas.microsoft.com/office/word/2010/wordprocessingDrawing" xmlns:wp="http://schemas.openxmlformats.org/drawingml/2006/wordprocessingDrawing" xmlns:w10="urn:schemas-microsoft-com:office:word" xmlns:w="http://schemas.openxmlformats.org/wordprocessingml/2006/main" xmlns:w14="http://schemas.microsoft.com/office/word/2010/wordml" xmlns:w15="http://schemas.microsoft.com/office/word/2012/wordml" xmlns:w16se="http://schemas.microsoft.com/office/word/2015/wordml/symex" xmlns:wpg="http://schemas.microsoft.com/office/word/2010/wordprocessingGroup" xmlns:wpi="http://schemas.microsoft.com/office/word/2010/wordprocessingInk" xmlns:wne="http://schemas.microsoft.com/office/word/2006/wordml" xmlns:wps="http://schemas.microsoft.com/office/word/2010/wordprocessingShape" mc:Ignorable="w14 w15 w16se wp14">
+<w:hdr xmlns:wpc="http://schemas.microsoft.com/office/word/2010/wordprocessingCanvas" xmlns:cx="http://schemas.microsoft.com/office/drawing/2014/chartex" xmlns:cx1="http://schemas.microsoft.com/office/drawing/2015/9/8/chartex" xmlns:cx2="http://schemas.microsoft.com/office/drawing/2015/10/21/chartex" xmlns:cx3="http://schemas.microsoft.com/office/drawing/2016/5/9/chartex" xmlns:cx4="http://schemas.microsoft.com/office/drawing/2016/5/10/chartex" xmlns:cx5="http://schemas.microsoft.com/office/drawing/2016/5/11/chartex" xmlns:cx6="http://schemas.microsoft.com/office/drawing/2016/5/12/chartex" xmlns:cx7="http://schemas.microsoft.com/office/drawing/2016/5/13/chartex" xmlns:cx8="http://schemas.microsoft.com/office/drawing/2016/5/14/chartex" xmlns:mc="http://schemas.openxmlformats.org/markup-compatibility/2006" xmlns:aink="http://schemas.microsoft.com/office/drawing/2016/ink" xmlns:am3d="http://schemas.microsoft.com/office/drawing/2017/model3d" xmlns:o="urn:schemas-microsoft-com:office:office" xmlns:oel="http://schemas.microsoft.com/office/2019/extlst" xmlns:r="http://schemas.openxmlformats.org/officeDocument/2006/relationships" xmlns:m="http://schemas.openxmlformats.org/officeDocument/2006/math" xmlns:v="urn:schemas-microsoft-com:vml" xmlns:wp14="http://schemas.microsoft.com/office/word/2010/wordprocessingDrawing" xmlns:wp="http://schemas.openxmlformats.org/drawingml/2006/wordprocessingDrawing" xmlns:w10="urn:schemas-microsoft-com:office:word" xmlns:w="http://schemas.openxmlformats.org/wordprocessingml/2006/main" xmlns:w14="http://schemas.microsoft.com/office/word/2010/wordml" xmlns:w15="http://schemas.microsoft.com/office/word/2012/wordml" xmlns:w16cex="http://schemas.microsoft.com/office/word/2018/wordml/cex" xmlns:w16cid="http://schemas.microsoft.com/office/word/2016/wordml/cid" xmlns:w16="http://schemas.microsoft.com/office/word/2018/wordml" xmlns:w16du="http://schemas.microsoft.com/office/word/2023/wordml/word16du" xmlns:w16sdtdh="http://schemas.microsoft.com/office/word/2020/wordml/sdtdatahash" xmlns:w16sdtfl="http://schemas.microsoft.com/office/word/2024/wordml/sdtformatlock" xmlns:w16se="http://schemas.microsoft.com/office/word/2015/wordml/symex" xmlns:wpg="http://schemas.microsoft.com/office/word/2010/wordprocessingGroup" xmlns:wpi="http://schemas.microsoft.com/office/word/2010/wordprocessingInk" xmlns:wne="http://schemas.microsoft.com/office/word/2006/wordml" xmlns:wps="http://schemas.microsoft.com/office/word/2010/wordprocessingShape" mc:Ignorable="w14 w15 w16se w16cid w16 w16cex w16sdtdh w16sdtfl w16du wp14">
   <w:sdt>
     <w:sdtPr>
       <w:id w:val="101004192"/>
@@ -6450,7 +6495,7 @@
 </file>
 
 <file path=word/numbering.xml><?xml version="1.0" encoding="utf-8"?>
-<w:numbering xmlns:wpc="http://schemas.microsoft.com/office/word/2010/wordprocessingCanvas" xmlns:cx="http://schemas.microsoft.com/office/drawing/2014/chartex" xmlns:mc="http://schemas.openxmlformats.org/markup-compatibility/2006" xmlns:o="urn:schemas-microsoft-com:office:office" xmlns:r="http://schemas.openxmlformats.org/officeDocument/2006/relationships" xmlns:m="http://schemas.openxmlformats.org/officeDocument/2006/math" xmlns:v="urn:schemas-microsoft-com:vml" xmlns:wp14="http://schemas.microsoft.com/office/word/2010/wordprocessingDrawing" xmlns:wp="http://schemas.openxmlformats.org/drawingml/2006/wordprocessingDrawing" xmlns:w10="urn:schemas-microsoft-com:office:word" xmlns:w="http://schemas.openxmlformats.org/wordprocessingml/2006/main" xmlns:w14="http://schemas.microsoft.com/office/word/2010/wordml" xmlns:w15="http://schemas.microsoft.com/office/word/2012/wordml" xmlns:w16se="http://schemas.microsoft.com/office/word/2015/wordml/symex" xmlns:wpg="http://schemas.microsoft.com/office/word/2010/wordprocessingGroup" xmlns:wpi="http://schemas.microsoft.com/office/word/2010/wordprocessingInk" xmlns:wne="http://schemas.microsoft.com/office/word/2006/wordml" xmlns:wps="http://schemas.microsoft.com/office/word/2010/wordprocessingShape" mc:Ignorable="w14 w15 w16se wp14">
+<w:numbering xmlns:wpc="http://schemas.microsoft.com/office/word/2010/wordprocessingCanvas" xmlns:cx="http://schemas.microsoft.com/office/drawing/2014/chartex" xmlns:cx1="http://schemas.microsoft.com/office/drawing/2015/9/8/chartex" xmlns:cx2="http://schemas.microsoft.com/office/drawing/2015/10/21/chartex" xmlns:cx3="http://schemas.microsoft.com/office/drawing/2016/5/9/chartex" xmlns:cx4="http://schemas.microsoft.com/office/drawing/2016/5/10/chartex" xmlns:cx5="http://schemas.microsoft.com/office/drawing/2016/5/11/chartex" xmlns:cx6="http://schemas.microsoft.com/office/drawing/2016/5/12/chartex" xmlns:cx7="http://schemas.microsoft.com/office/drawing/2016/5/13/chartex" xmlns:cx8="http://schemas.microsoft.com/office/drawing/2016/5/14/chartex" xmlns:mc="http://schemas.openxmlformats.org/markup-compatibility/2006" xmlns:aink="http://schemas.microsoft.com/office/drawing/2016/ink" xmlns:am3d="http://schemas.microsoft.com/office/drawing/2017/model3d" xmlns:o="urn:schemas-microsoft-com:office:office" xmlns:oel="http://schemas.microsoft.com/office/2019/extlst" xmlns:r="http://schemas.openxmlformats.org/officeDocument/2006/relationships" xmlns:m="http://schemas.openxmlformats.org/officeDocument/2006/math" xmlns:v="urn:schemas-microsoft-com:vml" xmlns:wp14="http://schemas.microsoft.com/office/word/2010/wordprocessingDrawing" xmlns:wp="http://schemas.openxmlformats.org/drawingml/2006/wordprocessingDrawing" xmlns:w10="urn:schemas-microsoft-com:office:word" xmlns:w="http://schemas.openxmlformats.org/wordprocessingml/2006/main" xmlns:w14="http://schemas.microsoft.com/office/word/2010/wordml" xmlns:w15="http://schemas.microsoft.com/office/word/2012/wordml" xmlns:w16cex="http://schemas.microsoft.com/office/word/2018/wordml/cex" xmlns:w16cid="http://schemas.microsoft.com/office/word/2016/wordml/cid" xmlns:w16="http://schemas.microsoft.com/office/word/2018/wordml" xmlns:w16du="http://schemas.microsoft.com/office/word/2023/wordml/word16du" xmlns:w16sdtdh="http://schemas.microsoft.com/office/word/2020/wordml/sdtdatahash" xmlns:w16sdtfl="http://schemas.microsoft.com/office/word/2024/wordml/sdtformatlock" xmlns:w16se="http://schemas.microsoft.com/office/word/2015/wordml/symex" xmlns:wpg="http://schemas.microsoft.com/office/word/2010/wordprocessingGroup" xmlns:wpi="http://schemas.microsoft.com/office/word/2010/wordprocessingInk" xmlns:wne="http://schemas.microsoft.com/office/word/2006/wordml" xmlns:wps="http://schemas.microsoft.com/office/word/2010/wordprocessingShape" mc:Ignorable="w14 w15 w16se w16cid w16 w16cex w16sdtdh w16sdtfl w16du wp14">
   <w:abstractNum w:abstractNumId="0" w15:restartNumberingAfterBreak="0">
     <w:nsid w:val="07C42043"/>
     <w:multiLevelType w:val="hybridMultilevel"/>
@@ -8057,13 +8102,13 @@
       </w:rPr>
     </w:lvl>
   </w:abstractNum>
-  <w:num w:numId="1">
+  <w:num w:numId="1" w16cid:durableId="1605116289">
     <w:abstractNumId w:val="4"/>
   </w:num>
-  <w:num w:numId="2">
+  <w:num w:numId="2" w16cid:durableId="2092770631">
     <w:abstractNumId w:val="14"/>
   </w:num>
-  <w:num w:numId="3">
+  <w:num w:numId="3" w16cid:durableId="1010642693">
     <w:abstractNumId w:val="6"/>
     <w:lvlOverride w:ilvl="0">
       <w:startOverride w:val="3"/>
@@ -8093,7 +8138,7 @@
       <w:startOverride w:val="1"/>
     </w:lvlOverride>
   </w:num>
-  <w:num w:numId="4">
+  <w:num w:numId="4" w16cid:durableId="1186676651">
     <w:abstractNumId w:val="1"/>
     <w:lvlOverride w:ilvl="0">
       <w:startOverride w:val="3"/>
@@ -8123,47 +8168,47 @@
       <w:startOverride w:val="1"/>
     </w:lvlOverride>
   </w:num>
-  <w:num w:numId="5">
+  <w:num w:numId="5" w16cid:durableId="1001199959">
     <w:abstractNumId w:val="0"/>
   </w:num>
-  <w:num w:numId="6">
+  <w:num w:numId="6" w16cid:durableId="1838379507">
     <w:abstractNumId w:val="5"/>
   </w:num>
-  <w:num w:numId="7">
+  <w:num w:numId="7" w16cid:durableId="390157979">
     <w:abstractNumId w:val="9"/>
   </w:num>
-  <w:num w:numId="8">
+  <w:num w:numId="8" w16cid:durableId="974068590">
     <w:abstractNumId w:val="2"/>
   </w:num>
-  <w:num w:numId="9">
+  <w:num w:numId="9" w16cid:durableId="838468074">
     <w:abstractNumId w:val="7"/>
   </w:num>
-  <w:num w:numId="10">
+  <w:num w:numId="10" w16cid:durableId="1417247166">
     <w:abstractNumId w:val="12"/>
   </w:num>
-  <w:num w:numId="11">
+  <w:num w:numId="11" w16cid:durableId="1158034984">
     <w:abstractNumId w:val="3"/>
   </w:num>
-  <w:num w:numId="12">
+  <w:num w:numId="12" w16cid:durableId="557476002">
     <w:abstractNumId w:val="11"/>
   </w:num>
-  <w:num w:numId="13">
+  <w:num w:numId="13" w16cid:durableId="1788500957">
     <w:abstractNumId w:val="15"/>
   </w:num>
-  <w:num w:numId="14">
+  <w:num w:numId="14" w16cid:durableId="202718862">
     <w:abstractNumId w:val="10"/>
   </w:num>
-  <w:num w:numId="15">
+  <w:num w:numId="15" w16cid:durableId="669598957">
     <w:abstractNumId w:val="13"/>
   </w:num>
-  <w:num w:numId="16">
+  <w:num w:numId="16" w16cid:durableId="1594164398">
     <w:abstractNumId w:val="8"/>
   </w:num>
 </w:numbering>
 </file>
 
 <file path=word/styles.xml><?xml version="1.0" encoding="utf-8"?>
-<w:styles xmlns:mc="http://schemas.openxmlformats.org/markup-compatibility/2006" xmlns:r="http://schemas.openxmlformats.org/officeDocument/2006/relationships" xmlns:w="http://schemas.openxmlformats.org/wordprocessingml/2006/main" xmlns:w14="http://schemas.microsoft.com/office/word/2010/wordml" xmlns:w15="http://schemas.microsoft.com/office/word/2012/wordml" xmlns:w16se="http://schemas.microsoft.com/office/word/2015/wordml/symex" mc:Ignorable="w14 w15 w16se">
+<w:styles xmlns:mc="http://schemas.openxmlformats.org/markup-compatibility/2006" xmlns:r="http://schemas.openxmlformats.org/officeDocument/2006/relationships" xmlns:w="http://schemas.openxmlformats.org/wordprocessingml/2006/main" xmlns:w14="http://schemas.microsoft.com/office/word/2010/wordml" xmlns:w15="http://schemas.microsoft.com/office/word/2012/wordml" xmlns:w16cex="http://schemas.microsoft.com/office/word/2018/wordml/cex" xmlns:w16cid="http://schemas.microsoft.com/office/word/2016/wordml/cid" xmlns:w16="http://schemas.microsoft.com/office/word/2018/wordml" xmlns:w16du="http://schemas.microsoft.com/office/word/2023/wordml/word16du" xmlns:w16sdtdh="http://schemas.microsoft.com/office/word/2020/wordml/sdtdatahash" xmlns:w16sdtfl="http://schemas.microsoft.com/office/word/2024/wordml/sdtformatlock" xmlns:w16se="http://schemas.microsoft.com/office/word/2015/wordml/symex" mc:Ignorable="w14 w15 w16se w16cid w16 w16cex w16sdtdh w16sdtfl w16du">
   <w:docDefaults>
     <w:rPrDefault>
       <w:rPr>
@@ -8181,7 +8226,7 @@
       </w:pPr>
     </w:pPrDefault>
   </w:docDefaults>
-  <w:latentStyles w:defLockedState="0" w:defUIPriority="99" w:defSemiHidden="0" w:defUnhideWhenUsed="0" w:defQFormat="0" w:count="371">
+  <w:latentStyles w:defLockedState="0" w:defUIPriority="99" w:defSemiHidden="0" w:defUnhideWhenUsed="0" w:defQFormat="0" w:count="376">
     <w:lsdException w:name="Normal" w:uiPriority="0" w:qFormat="1"/>
     <w:lsdException w:name="heading 1" w:uiPriority="9" w:qFormat="1"/>
     <w:lsdException w:name="heading 2" w:semiHidden="1" w:uiPriority="9" w:unhideWhenUsed="1" w:qFormat="1"/>
@@ -8553,6 +8598,11 @@
     <w:lsdException w:name="List Table 5 Dark Accent 6" w:uiPriority="50"/>
     <w:lsdException w:name="List Table 6 Colorful Accent 6" w:uiPriority="51"/>
     <w:lsdException w:name="List Table 7 Colorful Accent 6" w:uiPriority="52"/>
+    <w:lsdException w:name="Mention" w:semiHidden="1" w:unhideWhenUsed="1"/>
+    <w:lsdException w:name="Smart Hyperlink" w:semiHidden="1" w:unhideWhenUsed="1"/>
+    <w:lsdException w:name="Hashtag" w:semiHidden="1" w:unhideWhenUsed="1"/>
+    <w:lsdException w:name="Unresolved Mention" w:semiHidden="1" w:unhideWhenUsed="1"/>
+    <w:lsdException w:name="Smart Link" w:semiHidden="1" w:unhideWhenUsed="1"/>
   </w:latentStyles>
   <w:style w:type="paragraph" w:default="1" w:styleId="Normal">
     <w:name w:val="Normal"/>
@@ -8759,6 +8809,7 @@
   <w:style w:type="character" w:default="1" w:styleId="DefaultParagraphFont">
     <w:name w:val="Default Paragraph Font"/>
     <w:uiPriority w:val="1"/>
+    <w:semiHidden/>
     <w:unhideWhenUsed/>
   </w:style>
   <w:style w:type="table" w:default="1" w:styleId="TableNormal">
@@ -9341,7 +9392,6 @@
     <w:name w:val="Normal (Web)"/>
     <w:basedOn w:val="Normal"/>
     <w:uiPriority w:val="99"/>
-    <w:semiHidden/>
     <w:unhideWhenUsed/>
     <w:rsid w:val="00B863BD"/>
     <w:rPr>

</xml_diff>

<commit_message>
update w method ad questionnaire
</commit_message>
<xml_diff>
--- a/migration/Migration is one of the major component of population change which is basically cause by socio (1).docx
+++ b/migration/Migration is one of the major component of population change which is basically cause by socio (1).docx
@@ -341,6 +341,7 @@
           <w:shd w:val="clear" w:color="auto" w:fill="FFFFFF"/>
         </w:rPr>
       </w:pPr>
+      <w:proofErr w:type="spellStart"/>
       <w:r>
         <w:rPr>
           <w:rFonts w:ascii="Times New Roman" w:eastAsia="Times New Roman" w:hAnsi="Times New Roman" w:cs="Times New Roman"/>
@@ -350,13 +351,10 @@
           <w:szCs w:val="28"/>
           <w:shd w:val="clear" w:color="auto" w:fill="FFFFFF"/>
         </w:rPr>
-        <w:t>Tribhuvan University</w:t>
-      </w:r>
-    </w:p>
-    <w:p>
-      <w:pPr>
-        <w:spacing w:after="0" w:line="360" w:lineRule="auto"/>
-        <w:jc w:val="center"/>
+        <w:t>Tribhuvan</w:t>
+      </w:r>
+      <w:proofErr w:type="spellEnd"/>
+      <w:r>
         <w:rPr>
           <w:rFonts w:ascii="Times New Roman" w:eastAsia="Times New Roman" w:hAnsi="Times New Roman" w:cs="Times New Roman"/>
           <w:b/>
@@ -365,8 +363,13 @@
           <w:szCs w:val="28"/>
           <w:shd w:val="clear" w:color="auto" w:fill="FFFFFF"/>
         </w:rPr>
-      </w:pPr>
-      <w:r>
+        <w:t xml:space="preserve"> University</w:t>
+      </w:r>
+    </w:p>
+    <w:p>
+      <w:pPr>
+        <w:spacing w:after="0" w:line="360" w:lineRule="auto"/>
+        <w:jc w:val="center"/>
         <w:rPr>
           <w:rFonts w:ascii="Times New Roman" w:eastAsia="Times New Roman" w:hAnsi="Times New Roman" w:cs="Times New Roman"/>
           <w:b/>
@@ -375,8 +378,8 @@
           <w:szCs w:val="28"/>
           <w:shd w:val="clear" w:color="auto" w:fill="FFFFFF"/>
         </w:rPr>
-        <w:t>Bhaktapur Multiple Campus</w:t>
-      </w:r>
+      </w:pPr>
+      <w:proofErr w:type="spellStart"/>
       <w:r>
         <w:rPr>
           <w:rFonts w:ascii="Times New Roman" w:eastAsia="Times New Roman" w:hAnsi="Times New Roman" w:cs="Times New Roman"/>
@@ -386,8 +389,9 @@
           <w:szCs w:val="28"/>
           <w:shd w:val="clear" w:color="auto" w:fill="FFFFFF"/>
         </w:rPr>
-        <w:t xml:space="preserve"> </w:t>
-      </w:r>
+        <w:t>Bhaktapur</w:t>
+      </w:r>
+      <w:proofErr w:type="spellEnd"/>
       <w:r>
         <w:rPr>
           <w:rFonts w:ascii="Times New Roman" w:eastAsia="Times New Roman" w:hAnsi="Times New Roman" w:cs="Times New Roman"/>
@@ -397,7 +401,7 @@
           <w:szCs w:val="28"/>
           <w:shd w:val="clear" w:color="auto" w:fill="FFFFFF"/>
         </w:rPr>
-        <w:softHyphen/>
+        <w:t xml:space="preserve"> Multiple Campus</w:t>
       </w:r>
       <w:r>
         <w:rPr>
@@ -408,7 +412,7 @@
           <w:szCs w:val="28"/>
           <w:shd w:val="clear" w:color="auto" w:fill="FFFFFF"/>
         </w:rPr>
-        <w:softHyphen/>
+        <w:t xml:space="preserve"> </w:t>
       </w:r>
       <w:r>
         <w:rPr>
@@ -421,11 +425,7 @@
         </w:rPr>
         <w:softHyphen/>
       </w:r>
-    </w:p>
-    <w:p>
-      <w:pPr>
-        <w:spacing w:after="0" w:line="360" w:lineRule="auto"/>
-        <w:jc w:val="center"/>
+      <w:r>
         <w:rPr>
           <w:rFonts w:ascii="Times New Roman" w:eastAsia="Times New Roman" w:hAnsi="Times New Roman" w:cs="Times New Roman"/>
           <w:b/>
@@ -434,7 +434,8 @@
           <w:szCs w:val="28"/>
           <w:shd w:val="clear" w:color="auto" w:fill="FFFFFF"/>
         </w:rPr>
-      </w:pPr>
+        <w:softHyphen/>
+      </w:r>
       <w:r>
         <w:rPr>
           <w:rFonts w:ascii="Times New Roman" w:eastAsia="Times New Roman" w:hAnsi="Times New Roman" w:cs="Times New Roman"/>
@@ -444,7 +445,7 @@
           <w:szCs w:val="28"/>
           <w:shd w:val="clear" w:color="auto" w:fill="FFFFFF"/>
         </w:rPr>
-        <w:t>Department of Rural Development</w:t>
+        <w:softHyphen/>
       </w:r>
     </w:p>
     <w:p>
@@ -469,7 +470,7 @@
           <w:szCs w:val="28"/>
           <w:shd w:val="clear" w:color="auto" w:fill="FFFFFF"/>
         </w:rPr>
-        <w:t>Faculty of Humanities &amp; Social Sciences</w:t>
+        <w:t>Department of Rural Development</w:t>
       </w:r>
     </w:p>
     <w:p>
@@ -494,9 +495,13 @@
           <w:szCs w:val="28"/>
           <w:shd w:val="clear" w:color="auto" w:fill="FFFFFF"/>
         </w:rPr>
-        <w:t xml:space="preserve">In Partial </w:t>
-      </w:r>
-      <w:r>
+        <w:t>Faculty of Humanities &amp; Social Sciences</w:t>
+      </w:r>
+    </w:p>
+    <w:p>
+      <w:pPr>
+        <w:spacing w:after="0" w:line="360" w:lineRule="auto"/>
+        <w:jc w:val="center"/>
         <w:rPr>
           <w:rFonts w:ascii="Times New Roman" w:eastAsia="Times New Roman" w:hAnsi="Times New Roman" w:cs="Times New Roman"/>
           <w:b/>
@@ -505,8 +510,7 @@
           <w:szCs w:val="28"/>
           <w:shd w:val="clear" w:color="auto" w:fill="FFFFFF"/>
         </w:rPr>
-        <w:t>Fulfillment of</w:t>
-      </w:r>
+      </w:pPr>
       <w:r>
         <w:rPr>
           <w:rFonts w:ascii="Times New Roman" w:eastAsia="Times New Roman" w:hAnsi="Times New Roman" w:cs="Times New Roman"/>
@@ -516,7 +520,7 @@
           <w:szCs w:val="28"/>
           <w:shd w:val="clear" w:color="auto" w:fill="FFFFFF"/>
         </w:rPr>
-        <w:t xml:space="preserve"> the Requirement for Master of Arts</w:t>
+        <w:t xml:space="preserve">In Partial </w:t>
       </w:r>
       <w:r>
         <w:rPr>
@@ -527,13 +531,9 @@
           <w:szCs w:val="28"/>
           <w:shd w:val="clear" w:color="auto" w:fill="FFFFFF"/>
         </w:rPr>
-        <w:t xml:space="preserve"> in Rural </w:t>
-      </w:r>
-    </w:p>
-    <w:p>
-      <w:pPr>
-        <w:spacing w:after="0" w:line="360" w:lineRule="auto"/>
-        <w:jc w:val="center"/>
+        <w:t>Fulfillment of</w:t>
+      </w:r>
+      <w:r>
         <w:rPr>
           <w:rFonts w:ascii="Times New Roman" w:eastAsia="Times New Roman" w:hAnsi="Times New Roman" w:cs="Times New Roman"/>
           <w:b/>
@@ -542,7 +542,8 @@
           <w:szCs w:val="28"/>
           <w:shd w:val="clear" w:color="auto" w:fill="FFFFFF"/>
         </w:rPr>
-      </w:pPr>
+        <w:t xml:space="preserve"> the Requirement for Master of Arts</w:t>
+      </w:r>
       <w:r>
         <w:rPr>
           <w:rFonts w:ascii="Times New Roman" w:eastAsia="Times New Roman" w:hAnsi="Times New Roman" w:cs="Times New Roman"/>
@@ -552,80 +553,8 @@
           <w:szCs w:val="28"/>
           <w:shd w:val="clear" w:color="auto" w:fill="FFFFFF"/>
         </w:rPr>
-        <w:t xml:space="preserve">Development </w:t>
-      </w:r>
-    </w:p>
-    <w:p>
-      <w:pPr>
-        <w:spacing w:after="0" w:line="360" w:lineRule="auto"/>
-        <w:jc w:val="center"/>
-        <w:rPr>
-          <w:rFonts w:ascii="Times New Roman" w:eastAsia="Times New Roman" w:hAnsi="Times New Roman" w:cs="Times New Roman"/>
-          <w:sz w:val="28"/>
-          <w:szCs w:val="28"/>
-          <w:shd w:val="clear" w:color="auto" w:fill="FFFFFF"/>
-        </w:rPr>
-      </w:pPr>
-    </w:p>
-    <w:p>
-      <w:pPr>
-        <w:spacing w:after="0" w:line="360" w:lineRule="auto"/>
-        <w:jc w:val="center"/>
-        <w:rPr>
-          <w:rFonts w:ascii="Times New Roman" w:eastAsia="Times New Roman" w:hAnsi="Times New Roman" w:cs="Times New Roman"/>
-          <w:sz w:val="28"/>
-          <w:szCs w:val="28"/>
-          <w:shd w:val="clear" w:color="auto" w:fill="FFFFFF"/>
-        </w:rPr>
-      </w:pPr>
-    </w:p>
-    <w:p>
-      <w:pPr>
-        <w:spacing w:after="0" w:line="360" w:lineRule="auto"/>
-        <w:jc w:val="center"/>
-        <w:rPr>
-          <w:rFonts w:ascii="Times New Roman" w:eastAsia="Times New Roman" w:hAnsi="Times New Roman" w:cs="Times New Roman"/>
-          <w:sz w:val="28"/>
-          <w:szCs w:val="28"/>
-          <w:shd w:val="clear" w:color="auto" w:fill="FFFFFF"/>
-        </w:rPr>
-      </w:pPr>
-    </w:p>
-    <w:p>
-      <w:pPr>
-        <w:spacing w:after="0" w:line="360" w:lineRule="auto"/>
-        <w:jc w:val="center"/>
-        <w:rPr>
-          <w:rFonts w:ascii="Times New Roman" w:eastAsia="Times New Roman" w:hAnsi="Times New Roman" w:cs="Times New Roman"/>
-          <w:sz w:val="28"/>
-          <w:szCs w:val="28"/>
-          <w:shd w:val="clear" w:color="auto" w:fill="FFFFFF"/>
-        </w:rPr>
-      </w:pPr>
-    </w:p>
-    <w:p>
-      <w:pPr>
-        <w:spacing w:after="0" w:line="360" w:lineRule="auto"/>
-        <w:jc w:val="center"/>
-        <w:rPr>
-          <w:rFonts w:ascii="Times New Roman" w:eastAsia="Times New Roman" w:hAnsi="Times New Roman" w:cs="Times New Roman"/>
-          <w:sz w:val="28"/>
-          <w:szCs w:val="28"/>
-          <w:shd w:val="clear" w:color="auto" w:fill="FFFFFF"/>
-        </w:rPr>
-      </w:pPr>
-    </w:p>
-    <w:p>
-      <w:pPr>
-        <w:spacing w:after="0" w:line="360" w:lineRule="auto"/>
-        <w:jc w:val="center"/>
-        <w:rPr>
-          <w:rFonts w:ascii="Times New Roman" w:eastAsia="Times New Roman" w:hAnsi="Times New Roman" w:cs="Times New Roman"/>
-          <w:sz w:val="28"/>
-          <w:szCs w:val="28"/>
-          <w:shd w:val="clear" w:color="auto" w:fill="FFFFFF"/>
-        </w:rPr>
-      </w:pPr>
+        <w:t xml:space="preserve"> in Rural </w:t>
+      </w:r>
     </w:p>
     <w:p>
       <w:pPr>
@@ -649,7 +578,7 @@
           <w:szCs w:val="28"/>
           <w:shd w:val="clear" w:color="auto" w:fill="FFFFFF"/>
         </w:rPr>
-        <w:t>Submitted By:</w:t>
+        <w:t xml:space="preserve">Development </w:t>
       </w:r>
     </w:p>
     <w:p>
@@ -663,24 +592,30 @@
           <w:shd w:val="clear" w:color="auto" w:fill="FFFFFF"/>
         </w:rPr>
       </w:pPr>
-      <w:r>
+    </w:p>
+    <w:p>
+      <w:pPr>
+        <w:spacing w:after="0" w:line="360" w:lineRule="auto"/>
+        <w:jc w:val="center"/>
         <w:rPr>
           <w:rFonts w:ascii="Times New Roman" w:eastAsia="Times New Roman" w:hAnsi="Times New Roman" w:cs="Times New Roman"/>
           <w:sz w:val="28"/>
           <w:szCs w:val="28"/>
           <w:shd w:val="clear" w:color="auto" w:fill="FFFFFF"/>
         </w:rPr>
-        <w:t xml:space="preserve">Name: </w:t>
-      </w:r>
-      <w:r>
+      </w:pPr>
+    </w:p>
+    <w:p>
+      <w:pPr>
+        <w:spacing w:after="0" w:line="360" w:lineRule="auto"/>
+        <w:jc w:val="center"/>
         <w:rPr>
           <w:rFonts w:ascii="Times New Roman" w:eastAsia="Times New Roman" w:hAnsi="Times New Roman" w:cs="Times New Roman"/>
           <w:sz w:val="28"/>
           <w:szCs w:val="28"/>
           <w:shd w:val="clear" w:color="auto" w:fill="FFFFFF"/>
         </w:rPr>
-        <w:t>Kristal Suwal</w:t>
-      </w:r>
+      </w:pPr>
     </w:p>
     <w:p>
       <w:pPr>
@@ -693,6 +628,132 @@
           <w:shd w:val="clear" w:color="auto" w:fill="FFFFFF"/>
         </w:rPr>
       </w:pPr>
+    </w:p>
+    <w:p>
+      <w:pPr>
+        <w:spacing w:after="0" w:line="360" w:lineRule="auto"/>
+        <w:jc w:val="center"/>
+        <w:rPr>
+          <w:rFonts w:ascii="Times New Roman" w:eastAsia="Times New Roman" w:hAnsi="Times New Roman" w:cs="Times New Roman"/>
+          <w:sz w:val="28"/>
+          <w:szCs w:val="28"/>
+          <w:shd w:val="clear" w:color="auto" w:fill="FFFFFF"/>
+        </w:rPr>
+      </w:pPr>
+    </w:p>
+    <w:p>
+      <w:pPr>
+        <w:spacing w:after="0" w:line="360" w:lineRule="auto"/>
+        <w:jc w:val="center"/>
+        <w:rPr>
+          <w:rFonts w:ascii="Times New Roman" w:eastAsia="Times New Roman" w:hAnsi="Times New Roman" w:cs="Times New Roman"/>
+          <w:sz w:val="28"/>
+          <w:szCs w:val="28"/>
+          <w:shd w:val="clear" w:color="auto" w:fill="FFFFFF"/>
+        </w:rPr>
+      </w:pPr>
+    </w:p>
+    <w:p>
+      <w:pPr>
+        <w:spacing w:after="0" w:line="360" w:lineRule="auto"/>
+        <w:jc w:val="center"/>
+        <w:rPr>
+          <w:rFonts w:ascii="Times New Roman" w:eastAsia="Times New Roman" w:hAnsi="Times New Roman" w:cs="Times New Roman"/>
+          <w:b/>
+          <w:bCs/>
+          <w:sz w:val="28"/>
+          <w:szCs w:val="28"/>
+          <w:shd w:val="clear" w:color="auto" w:fill="FFFFFF"/>
+        </w:rPr>
+      </w:pPr>
+      <w:r>
+        <w:rPr>
+          <w:rFonts w:ascii="Times New Roman" w:eastAsia="Times New Roman" w:hAnsi="Times New Roman" w:cs="Times New Roman"/>
+          <w:b/>
+          <w:bCs/>
+          <w:sz w:val="28"/>
+          <w:szCs w:val="28"/>
+          <w:shd w:val="clear" w:color="auto" w:fill="FFFFFF"/>
+        </w:rPr>
+        <w:t xml:space="preserve">Submitted </w:t>
+      </w:r>
+      <w:proofErr w:type="gramStart"/>
+      <w:r>
+        <w:rPr>
+          <w:rFonts w:ascii="Times New Roman" w:eastAsia="Times New Roman" w:hAnsi="Times New Roman" w:cs="Times New Roman"/>
+          <w:b/>
+          <w:bCs/>
+          <w:sz w:val="28"/>
+          <w:szCs w:val="28"/>
+          <w:shd w:val="clear" w:color="auto" w:fill="FFFFFF"/>
+        </w:rPr>
+        <w:t>By</w:t>
+      </w:r>
+      <w:proofErr w:type="gramEnd"/>
+      <w:r>
+        <w:rPr>
+          <w:rFonts w:ascii="Times New Roman" w:eastAsia="Times New Roman" w:hAnsi="Times New Roman" w:cs="Times New Roman"/>
+          <w:b/>
+          <w:bCs/>
+          <w:sz w:val="28"/>
+          <w:szCs w:val="28"/>
+          <w:shd w:val="clear" w:color="auto" w:fill="FFFFFF"/>
+        </w:rPr>
+        <w:t>:</w:t>
+      </w:r>
+    </w:p>
+    <w:p>
+      <w:pPr>
+        <w:spacing w:after="0" w:line="360" w:lineRule="auto"/>
+        <w:jc w:val="center"/>
+        <w:rPr>
+          <w:rFonts w:ascii="Times New Roman" w:eastAsia="Times New Roman" w:hAnsi="Times New Roman" w:cs="Times New Roman"/>
+          <w:sz w:val="28"/>
+          <w:szCs w:val="28"/>
+          <w:shd w:val="clear" w:color="auto" w:fill="FFFFFF"/>
+        </w:rPr>
+      </w:pPr>
+      <w:r>
+        <w:rPr>
+          <w:rFonts w:ascii="Times New Roman" w:eastAsia="Times New Roman" w:hAnsi="Times New Roman" w:cs="Times New Roman"/>
+          <w:sz w:val="28"/>
+          <w:szCs w:val="28"/>
+          <w:shd w:val="clear" w:color="auto" w:fill="FFFFFF"/>
+        </w:rPr>
+        <w:t xml:space="preserve">Name: </w:t>
+      </w:r>
+      <w:r>
+        <w:rPr>
+          <w:rFonts w:ascii="Times New Roman" w:eastAsia="Times New Roman" w:hAnsi="Times New Roman" w:cs="Times New Roman"/>
+          <w:sz w:val="28"/>
+          <w:szCs w:val="28"/>
+          <w:shd w:val="clear" w:color="auto" w:fill="FFFFFF"/>
+        </w:rPr>
+        <w:t xml:space="preserve">Kristal </w:t>
+      </w:r>
+      <w:proofErr w:type="spellStart"/>
+      <w:r>
+        <w:rPr>
+          <w:rFonts w:ascii="Times New Roman" w:eastAsia="Times New Roman" w:hAnsi="Times New Roman" w:cs="Times New Roman"/>
+          <w:sz w:val="28"/>
+          <w:szCs w:val="28"/>
+          <w:shd w:val="clear" w:color="auto" w:fill="FFFFFF"/>
+        </w:rPr>
+        <w:t>Suwal</w:t>
+      </w:r>
+      <w:proofErr w:type="spellEnd"/>
+    </w:p>
+    <w:p>
+      <w:pPr>
+        <w:spacing w:after="0" w:line="360" w:lineRule="auto"/>
+        <w:jc w:val="center"/>
+        <w:rPr>
+          <w:rFonts w:ascii="Times New Roman" w:eastAsia="Times New Roman" w:hAnsi="Times New Roman" w:cs="Times New Roman"/>
+          <w:sz w:val="28"/>
+          <w:szCs w:val="28"/>
+          <w:shd w:val="clear" w:color="auto" w:fill="FFFFFF"/>
+        </w:rPr>
+      </w:pPr>
       <w:r>
         <w:rPr>
           <w:rFonts w:ascii="Times New Roman" w:eastAsia="Times New Roman" w:hAnsi="Times New Roman" w:cs="Times New Roman"/>
@@ -709,8 +770,9 @@
           <w:szCs w:val="28"/>
           <w:shd w:val="clear" w:color="auto" w:fill="FFFFFF"/>
         </w:rPr>
-        <w:t>Exam-Roll.N</w:t>
-      </w:r>
+        <w:t>Exam-</w:t>
+      </w:r>
+      <w:proofErr w:type="spellStart"/>
       <w:r>
         <w:rPr>
           <w:rFonts w:ascii="Times New Roman" w:eastAsia="Times New Roman" w:hAnsi="Times New Roman" w:cs="Times New Roman"/>
@@ -718,8 +780,18 @@
           <w:szCs w:val="28"/>
           <w:shd w:val="clear" w:color="auto" w:fill="FFFFFF"/>
         </w:rPr>
+        <w:t>Roll.N</w:t>
+      </w:r>
+      <w:r>
+        <w:rPr>
+          <w:rFonts w:ascii="Times New Roman" w:eastAsia="Times New Roman" w:hAnsi="Times New Roman" w:cs="Times New Roman"/>
+          <w:sz w:val="28"/>
+          <w:szCs w:val="28"/>
+          <w:shd w:val="clear" w:color="auto" w:fill="FFFFFF"/>
+        </w:rPr>
         <w:t>o</w:t>
       </w:r>
+      <w:proofErr w:type="spellEnd"/>
       <w:r>
         <w:rPr>
           <w:rFonts w:ascii="Times New Roman" w:eastAsia="Times New Roman" w:hAnsi="Times New Roman" w:cs="Times New Roman"/>
@@ -3311,7 +3383,17 @@
         <w:pStyle w:val="BodyText"/>
       </w:pPr>
       <w:r>
-        <w:t>Process of migration is as old as human society. In early days there was primitive migration in which the natural forces were vital but as the time passed on gradually different types of migration appears in a early period. Natural force, primitive people shift them from one place to another but present there are not only forced immigration but also voluntary migration can be seen. In forced migration natural force, political force, political factors play an important role to shift the residence. Nepal has a long</w:t>
+        <w:t xml:space="preserve">Process of migration is as old as human society. In early days there was primitive migration in which the natural forces were vital but as the time passed on gradually different types of migration appears in </w:t>
+      </w:r>
+      <w:proofErr w:type="spellStart"/>
+      <w:proofErr w:type="gramStart"/>
+      <w:r>
+        <w:t>a</w:t>
+      </w:r>
+      <w:proofErr w:type="spellEnd"/>
+      <w:proofErr w:type="gramEnd"/>
+      <w:r>
+        <w:t xml:space="preserve"> early period. Natural force, primitive people shift them from one place to another but present there are not only forced immigration but also voluntary migration can be seen. In forced migration natural force, political force, political factors play an important role to shift the residence. Nepal has a long</w:t>
       </w:r>
       <w:r>
         <w:t xml:space="preserve"> </w:t>
@@ -3323,7 +3405,23 @@
         <w:t>program;</w:t>
       </w:r>
       <w:r>
-        <w:t xml:space="preserve"> the process of migration started from hill and mountain to Terai and inner Terai and low </w:t>
+        <w:t xml:space="preserve"> the process of migration started from hill and mountain to </w:t>
+      </w:r>
+      <w:proofErr w:type="spellStart"/>
+      <w:r>
+        <w:t>Terai</w:t>
+      </w:r>
+      <w:proofErr w:type="spellEnd"/>
+      <w:r>
+        <w:t xml:space="preserve"> and inner </w:t>
+      </w:r>
+      <w:proofErr w:type="spellStart"/>
+      <w:r>
+        <w:t>Terai</w:t>
+      </w:r>
+      <w:proofErr w:type="spellEnd"/>
+      <w:r>
+        <w:t xml:space="preserve"> and low </w:t>
       </w:r>
       <w:r>
         <w:t>land of the country.</w:t>
@@ -3334,7 +3432,15 @@
         <w:pStyle w:val="BodyText"/>
       </w:pPr>
       <w:r>
-        <w:t xml:space="preserve">Our country is divided into three ecological zones namely Mountain, Hill and Terai. These three ecological zones are divided into five development regions namely Eastern, Central, </w:t>
+        <w:t xml:space="preserve">Our country is divided into three ecological zones namely Mountain, Hill and </w:t>
+      </w:r>
+      <w:proofErr w:type="spellStart"/>
+      <w:r>
+        <w:t>Terai</w:t>
+      </w:r>
+      <w:proofErr w:type="spellEnd"/>
+      <w:r>
+        <w:t xml:space="preserve">. These three ecological zones are divided into five development regions namely Eastern, Central, </w:t>
       </w:r>
       <w:r>
         <w:lastRenderedPageBreak/>
@@ -3352,7 +3458,23 @@
         <w:pStyle w:val="BodyText"/>
       </w:pPr>
       <w:r>
-        <w:t>The trend of migration appears both in internal and international level where, India is the major destination place of international emigrants. The flow of internal migration also is increasing rapidly during the last two decades from the Hilly and Mountain regions to Terai due to infrastructural development and availability of the social services in Terai. This trend of migration has two major effects. The first effect is lack of skillful and independent human resources in the place of origin and the second is high pressure in the social services and security in the place of destination. Internal migration is responsible to uneven distribution of population in Nepal.</w:t>
+        <w:t xml:space="preserve">The trend of migration appears both in internal and international level where, India is the major destination place of international emigrants. The flow of internal migration also is increasing rapidly during the last two decades from the Hilly and Mountain regions to </w:t>
+      </w:r>
+      <w:proofErr w:type="spellStart"/>
+      <w:r>
+        <w:t>Terai</w:t>
+      </w:r>
+      <w:proofErr w:type="spellEnd"/>
+      <w:r>
+        <w:t xml:space="preserve"> due to infrastructural development and availability of the social services in </w:t>
+      </w:r>
+      <w:proofErr w:type="spellStart"/>
+      <w:r>
+        <w:t>Terai</w:t>
+      </w:r>
+      <w:proofErr w:type="spellEnd"/>
+      <w:r>
+        <w:t>. This trend of migration has two major effects. The first effect is lack of skillful and independent human resources in the place of origin and the second is high pressure in the social services and security in the place of destination. Internal migration is responsible to uneven distribution of population in Nepal.</w:t>
       </w:r>
     </w:p>
     <w:p>
@@ -3491,7 +3613,15 @@
         <w:pStyle w:val="BodyText"/>
       </w:pPr>
       <w:r>
-        <w:t xml:space="preserve">The process of migration has been gradually intensifying the existing settlement problem as well as creating new problem both at the place of origin and the place of destination. Migration is an important component in the socio economic and demographic land space of Nepal. Terai still continues to be the main recipient of both the internal and international migrants. </w:t>
+        <w:t xml:space="preserve">The process of migration has been gradually intensifying the existing settlement problem as well as creating new problem both at the place of origin and the place of destination. Migration is an important component in the socio economic and demographic land space of Nepal. </w:t>
+      </w:r>
+      <w:proofErr w:type="spellStart"/>
+      <w:r>
+        <w:t>Terai</w:t>
+      </w:r>
+      <w:proofErr w:type="spellEnd"/>
+      <w:r>
+        <w:t xml:space="preserve"> still continues to be the main recipient of both the internal and international migrants. </w:t>
       </w:r>
       <w:r>
         <w:t>Immigration</w:t>
@@ -3533,9 +3663,11 @@
       <w:r>
         <w:t xml:space="preserve">is study area is ward no. 9 of </w:t>
       </w:r>
+      <w:proofErr w:type="spellStart"/>
       <w:r>
         <w:t>Shankharapur</w:t>
       </w:r>
+      <w:proofErr w:type="spellEnd"/>
       <w:r>
         <w:t xml:space="preserve"> </w:t>
       </w:r>
@@ -3589,33 +3721,58 @@
         <w:rPr>
           <w:color w:val="00B050"/>
         </w:rPr>
-        <w:t xml:space="preserve">How have patterns, trends, and forms of migration evolved over time? </w:t>
+        <w:t xml:space="preserve">What are the social, economic, and political consequences of migration for </w:t>
+      </w:r>
+      <w:r>
+        <w:rPr>
+          <w:color w:val="00B050"/>
+        </w:rPr>
+        <w:t>destination area</w:t>
+      </w:r>
+      <w:r>
+        <w:rPr>
+          <w:color w:val="00B050"/>
+        </w:rPr>
+        <w:t>?</w:t>
       </w:r>
     </w:p>
     <w:p>
       <w:pPr>
         <w:pStyle w:val="BodyText"/>
-        <w:rPr>
-          <w:color w:val="00B050"/>
-        </w:rPr>
-      </w:pPr>
-      <w:r>
-        <w:rPr>
-          <w:color w:val="00B050"/>
-        </w:rPr>
-        <w:t xml:space="preserve">What are the social, economic, and political consequences of migration for </w:t>
-      </w:r>
-      <w:r>
-        <w:rPr>
-          <w:color w:val="00B050"/>
-        </w:rPr>
-        <w:t>destination area</w:t>
-      </w:r>
-      <w:r>
-        <w:rPr>
-          <w:color w:val="00B050"/>
-        </w:rPr>
-        <w:t>?</w:t>
+      </w:pPr>
+      <w:r>
+        <w:t xml:space="preserve">So, the </w:t>
+      </w:r>
+      <w:r>
+        <w:t>main issue</w:t>
+      </w:r>
+      <w:r>
+        <w:t xml:space="preserve"> of this study is to examine the main trends, causes and consequences of </w:t>
+      </w:r>
+      <w:r>
+        <w:t>immigration</w:t>
+      </w:r>
+      <w:r>
+        <w:t xml:space="preserve"> in the study area.</w:t>
+      </w:r>
+    </w:p>
+    <w:p>
+      <w:pPr>
+        <w:pStyle w:val="Heading2"/>
+      </w:pPr>
+      <w:bookmarkStart w:id="5" w:name="_Toc220841255"/>
+      <w:r>
+        <w:t>1.3</w:t>
+      </w:r>
+      <w:r>
+        <w:t xml:space="preserve"> </w:t>
+      </w:r>
+      <w:r>
+        <w:t>Objectives of the Study</w:t>
+      </w:r>
+      <w:bookmarkEnd w:id="5"/>
+      <w:r>
+        <w:t xml:space="preserve"> </w:t>
       </w:r>
     </w:p>
     <w:p>
@@ -3623,61 +3780,26 @@
         <w:pStyle w:val="BodyText"/>
       </w:pPr>
       <w:r>
-        <w:t xml:space="preserve">So, the </w:t>
-      </w:r>
-      <w:r>
-        <w:t>main issue</w:t>
-      </w:r>
-      <w:r>
-        <w:t xml:space="preserve"> of this study is to examine the main trends, causes and consequences of </w:t>
-      </w:r>
-      <w:r>
-        <w:t>immigration</w:t>
-      </w:r>
-      <w:r>
-        <w:t xml:space="preserve"> in the study area.</w:t>
-      </w:r>
-    </w:p>
-    <w:p>
-      <w:pPr>
-        <w:pStyle w:val="Heading2"/>
-      </w:pPr>
-      <w:bookmarkStart w:id="5" w:name="_Toc220841255"/>
-      <w:r>
-        <w:t>1.3</w:t>
+        <w:t xml:space="preserve">The general objective of the study is to assess </w:t>
+      </w:r>
+      <w:r>
+        <w:t>the status,</w:t>
+      </w:r>
+      <w:r>
+        <w:t xml:space="preserve"> causes and consequences of im</w:t>
+      </w:r>
+      <w:r>
+        <w:t>migration</w:t>
       </w:r>
       <w:r>
         <w:t xml:space="preserve"> </w:t>
       </w:r>
       <w:r>
-        <w:t>Objectives of the Study</w:t>
-      </w:r>
-      <w:bookmarkEnd w:id="5"/>
-      <w:r>
-        <w:t xml:space="preserve"> </w:t>
-      </w:r>
-    </w:p>
-    <w:p>
-      <w:pPr>
-        <w:pStyle w:val="BodyText"/>
-      </w:pPr>
-      <w:r>
-        <w:t xml:space="preserve">The general objective of the study is to assess </w:t>
-      </w:r>
-      <w:r>
-        <w:t>the status,</w:t>
-      </w:r>
-      <w:r>
-        <w:t xml:space="preserve"> causes and consequences of im</w:t>
-      </w:r>
-      <w:r>
-        <w:t>migration</w:t>
-      </w:r>
-      <w:r>
-        <w:t xml:space="preserve"> </w:t>
-      </w:r>
-      <w:r>
-        <w:t>in S</w:t>
+        <w:t xml:space="preserve">in </w:t>
+      </w:r>
+      <w:proofErr w:type="spellStart"/>
+      <w:r>
+        <w:t>S</w:t>
       </w:r>
       <w:r>
         <w:t>h</w:t>
@@ -3686,7 +3808,11 @@
         <w:t>ankharap</w:t>
       </w:r>
       <w:r>
-        <w:t>ur municipality of Kathmandu district. The specific objectives are as follows:</w:t>
+        <w:t>ur</w:t>
+      </w:r>
+      <w:proofErr w:type="spellEnd"/>
+      <w:r>
+        <w:t xml:space="preserve"> municipality of Kathmandu district. The specific objectives are as follows:</w:t>
       </w:r>
     </w:p>
     <w:p>
@@ -3700,7 +3826,6 @@
         <w:jc w:val="both"/>
       </w:pPr>
       <w:r>
-        <w:lastRenderedPageBreak/>
         <w:t xml:space="preserve">To </w:t>
       </w:r>
       <w:r>
@@ -3733,6 +3858,7 @@
         <w:jc w:val="both"/>
       </w:pPr>
       <w:r>
+        <w:lastRenderedPageBreak/>
         <w:t xml:space="preserve">To </w:t>
       </w:r>
       <w:r>
@@ -3786,7 +3912,15 @@
         <w:pStyle w:val="BodyText"/>
       </w:pPr>
       <w:r>
-        <w:t>This research is highly significant as it provides a comprehensive investigation into the causes, consequences, and socio-economic and demographic characteristics of migrants in Shankharapur Municipality Ward 9. Understanding these specific factors is critical for explaining the broader patterns and impacts of immigration within the context of rapid urban transformation</w:t>
+        <w:t xml:space="preserve">This research is highly significant as it provides a comprehensive investigation into the causes, consequences, and socio-economic and demographic characteristics of migrants in </w:t>
+      </w:r>
+      <w:proofErr w:type="spellStart"/>
+      <w:r>
+        <w:t>Shankharapur</w:t>
+      </w:r>
+      <w:proofErr w:type="spellEnd"/>
+      <w:r>
+        <w:t xml:space="preserve"> Municipality Ward 9. Understanding these specific factors is critical for explaining the broader patterns and impacts of immigration within the context of rapid urban transformation</w:t>
       </w:r>
       <w:r>
         <w:t>.</w:t>
@@ -3855,7 +3989,23 @@
         <w:pStyle w:val="BodyText"/>
       </w:pPr>
       <w:r>
-        <w:t>The choice of Shankharapur Municipality Ward 9 (Sankhu) as the focal point for this research is based on the following strategic justifications:</w:t>
+        <w:t xml:space="preserve">The choice of </w:t>
+      </w:r>
+      <w:proofErr w:type="spellStart"/>
+      <w:r>
+        <w:t>Shankharapur</w:t>
+      </w:r>
+      <w:proofErr w:type="spellEnd"/>
+      <w:r>
+        <w:t xml:space="preserve"> Municipality Ward 9 (</w:t>
+      </w:r>
+      <w:proofErr w:type="spellStart"/>
+      <w:r>
+        <w:t>Sankhu</w:t>
+      </w:r>
+      <w:proofErr w:type="spellEnd"/>
+      <w:r>
+        <w:t>) as the focal point for this research is based on the following strategic justifications:</w:t>
       </w:r>
     </w:p>
     <w:p>
@@ -3865,8 +4015,13 @@
           <w:lang w:eastAsia="en-US"/>
         </w:rPr>
       </w:pPr>
-      <w:r>
-        <w:t>Shankharapur is a rapidly developing municipality on the periphery of Kathmandu that is currently experiencing a continuous, daily influx of in-migrants. This constant population movement creates an immediate and high-priority need to investigate the resulting socio-economic and demographic consequences, whether positive or negative.</w:t>
+      <w:proofErr w:type="spellStart"/>
+      <w:r>
+        <w:t>Shankharapur</w:t>
+      </w:r>
+      <w:proofErr w:type="spellEnd"/>
+      <w:r>
+        <w:t xml:space="preserve"> is a rapidly developing municipality on the periphery of Kathmandu that is currently experiencing a continuous, daily influx of in-migrants. This constant population movement creates an immediate and high-priority need to investigate the resulting socio-economic and demographic consequences, whether positive or negative.</w:t>
       </w:r>
     </w:p>
     <w:p>
@@ -3943,7 +4098,23 @@
         <w:pStyle w:val="BodyText"/>
       </w:pPr>
       <w:r>
-        <w:t>This study has several limitations that should be considered while interpreting the results. The research was conducted within a limited time frame, which constrained detailed primary data collection through interviews and limited the extent of secondary data collection from local-level institutions, particularly the ward office. The sample size was also limited, and therefore may not fully represent the entire migrant population of the study area. Moreover, the study is geographically confined to Shankharapur Municipality, Ward No. 9 (Sankhu), which restricts the generalization of findings to other areas. The study largely depends on information provided by respondents, which may be influenced by personal perceptions or reluctance to disclose sensitive economic and social information. In addition, financial and resource constraints restricted extensive fieldwork, and certain groups of migrants, such as temporary or seasonal migrants, may not have been adequately covered.</w:t>
+        <w:t xml:space="preserve">This study has several limitations that should be considered while interpreting the results. The research was conducted within a limited time frame, which constrained detailed primary data collection through interviews and limited the extent of secondary data collection from local-level institutions, particularly the ward office. The sample size was also limited, and therefore may not fully represent the entire migrant population of the study area. Moreover, the study is geographically confined to </w:t>
+      </w:r>
+      <w:proofErr w:type="spellStart"/>
+      <w:r>
+        <w:t>Shankharapur</w:t>
+      </w:r>
+      <w:proofErr w:type="spellEnd"/>
+      <w:r>
+        <w:t xml:space="preserve"> Municipality, Ward No. 9 (</w:t>
+      </w:r>
+      <w:proofErr w:type="spellStart"/>
+      <w:r>
+        <w:t>Sankhu</w:t>
+      </w:r>
+      <w:proofErr w:type="spellEnd"/>
+      <w:r>
+        <w:t>), which restricts the generalization of findings to other areas. The study largely depends on information provided by respondents, which may be influenced by personal perceptions or reluctance to disclose sensitive economic and social information. In addition, financial and resource constraints restricted extensive fieldwork, and certain groups of migrants, such as temporary or seasonal migrants, may not have been adequately covered.</w:t>
       </w:r>
     </w:p>
     <w:p>
@@ -4085,13 +4256,21 @@
         <w:t xml:space="preserve"> </w:t>
       </w:r>
       <w:r>
-        <w:t>is the father of migration studies. He had brought the concept of migration and its stream. He explained that push and pull factors are the foundation of theory of migration. This article which is linked with demographic and economic variable in relation to distance and volume of migration also depends on distance. R</w:t>
+        <w:t xml:space="preserve">is the father of migration studies. He had brought the concept of migration and its stream. He explained that push and pull factors are the foundation of theory of migration. This article which is linked with demographic and economic variable in relation to distance and volume of migration also depends on distance. </w:t>
+      </w:r>
+      <w:proofErr w:type="spellStart"/>
+      <w:r>
+        <w:t>R</w:t>
       </w:r>
       <w:r>
         <w:t>a</w:t>
       </w:r>
       <w:r>
-        <w:t xml:space="preserve">venstein </w:t>
+        <w:t>venstein</w:t>
+      </w:r>
+      <w:proofErr w:type="spellEnd"/>
+      <w:r>
+        <w:t xml:space="preserve"> </w:t>
       </w:r>
       <w:r>
         <w:t>“Law</w:t>
@@ -4148,7 +4327,19 @@
         <w:t xml:space="preserve">His </w:t>
       </w:r>
       <w:r>
-        <w:t>theory is known as “Gravitational Theory” which states that the numbers of persons who move between two areas are directly proportional to the two populations and inversely proportional to the distance between them. Zipf was agreed with R</w:t>
+        <w:t xml:space="preserve">theory is known as “Gravitational Theory” which states that the numbers of persons who move between two areas are directly proportional to the two populations and inversely proportional to the distance between them. </w:t>
+      </w:r>
+      <w:proofErr w:type="spellStart"/>
+      <w:r>
+        <w:t>Zipf</w:t>
+      </w:r>
+      <w:proofErr w:type="spellEnd"/>
+      <w:r>
+        <w:t xml:space="preserve"> was agreed with </w:t>
+      </w:r>
+      <w:proofErr w:type="spellStart"/>
+      <w:r>
+        <w:t>R</w:t>
       </w:r>
       <w:r>
         <w:t>a</w:t>
@@ -4165,6 +4356,7 @@
       <w:r>
         <w:t>s</w:t>
       </w:r>
+      <w:proofErr w:type="spellEnd"/>
       <w:r>
         <w:t xml:space="preserve"> view regarding to irritation. Gravity Model m=a* u/v, where</w:t>
       </w:r>
@@ -4202,7 +4394,11 @@
         <w:t>“The</w:t>
       </w:r>
       <w:r>
-        <w:t xml:space="preserve"> principle of least effort”. His model was based on R</w:t>
+        <w:t xml:space="preserve"> principle of least effort”. His model was based on </w:t>
+      </w:r>
+      <w:proofErr w:type="spellStart"/>
+      <w:r>
+        <w:t>R</w:t>
       </w:r>
       <w:r>
         <w:t>a</w:t>
@@ -4214,7 +4410,15 @@
         <w:t>'</w:t>
       </w:r>
       <w:r>
-        <w:t>s theory of migration. He was agreed with R</w:t>
+        <w:t>s</w:t>
+      </w:r>
+      <w:proofErr w:type="spellEnd"/>
+      <w:r>
+        <w:t xml:space="preserve"> theory of migration. He was agreed with </w:t>
+      </w:r>
+      <w:proofErr w:type="spellStart"/>
+      <w:r>
+        <w:t>R</w:t>
       </w:r>
       <w:r>
         <w:t>a</w:t>
@@ -4223,7 +4427,11 @@
         <w:t>venstein'</w:t>
       </w:r>
       <w:r>
-        <w:t>s view regarding migration is inversely related to the distance to be travelled. According to him, the greater distance is effort required to overcome the difficulty and therefore the similar is the number of migrants. Similarly</w:t>
+        <w:t>s</w:t>
+      </w:r>
+      <w:proofErr w:type="spellEnd"/>
+      <w:r>
+        <w:t xml:space="preserve"> view regarding migration is inversely related to the distance to be travelled. According to him, the greater distance is effort required to overcome the difficulty and therefore the similar is the number of migrants. Similarly</w:t>
       </w:r>
       <w:r>
         <w:t>,</w:t>
@@ -4255,13 +4463,29 @@
         <w:t>Gurung (1984)</w:t>
       </w:r>
       <w:r>
-        <w:t xml:space="preserve"> analyzes in his book ‘Inter Regional Migration in Nepal’, showed that population pressure, land holding, shortage of food grain, environmental stress in mountain/hill were found as the push factors and fertile land, resource government incentives, planned resettlement, physical facilities, presence of friends and relatives in the Terai were found as the pull factors. </w:t>
+        <w:t xml:space="preserve"> analyzes in his book ‘Inter Regional Migration in Nepal’, showed that population pressure, land holding, shortage of food grain, environmental stress in mountain/hill were found as the push factors and fertile land, resource government incentives, planned resettlement, physical facilities, presence of friends and relatives in the </w:t>
+      </w:r>
+      <w:proofErr w:type="spellStart"/>
+      <w:r>
+        <w:t>Terai</w:t>
+      </w:r>
+      <w:proofErr w:type="spellEnd"/>
+      <w:r>
+        <w:t xml:space="preserve"> were found as the pull factors. </w:t>
       </w:r>
       <w:r>
         <w:t>Facilities</w:t>
       </w:r>
       <w:r>
-        <w:t>, presence of friends and relatives in the Terai were found as the pull factors.</w:t>
+        <w:t xml:space="preserve">, presence of friends and relatives in the </w:t>
+      </w:r>
+      <w:proofErr w:type="spellStart"/>
+      <w:r>
+        <w:t>Terai</w:t>
+      </w:r>
+      <w:proofErr w:type="spellEnd"/>
+      <w:r>
+        <w:t xml:space="preserve"> were found as the pull factors.</w:t>
       </w:r>
     </w:p>
     <w:p>
@@ -4273,7 +4497,15 @@
       </w:r>
       <w:r>
         <w:lastRenderedPageBreak/>
-        <w:t>derived from the agriculture government resettlement project in Terai, government increased investment in irrigation, industrial activities, and administrative activities in specific towns were structural determinants of migration. For the micro level analysis, K.C. has shown that literary rate, age distribution, local social factors like family kinship were found major factors for the migration.</w:t>
+        <w:t xml:space="preserve">derived from the agriculture government resettlement project in </w:t>
+      </w:r>
+      <w:proofErr w:type="spellStart"/>
+      <w:r>
+        <w:t>Terai</w:t>
+      </w:r>
+      <w:proofErr w:type="spellEnd"/>
+      <w:r>
+        <w:t>, government increased investment in irrigation, industrial activities, and administrative activities in specific towns were structural determinants of migration. For the micro level analysis, K.C. has shown that literary rate, age distribution, local social factors like family kinship were found major factors for the migration.</w:t>
       </w:r>
     </w:p>
     <w:p>
@@ -4301,22 +4533,45 @@
         <w:t>D</w:t>
       </w:r>
       <w:r>
-        <w:t>uring the time of Maoist insurgency people migrated from hill to Terai</w:t>
-      </w:r>
-      <w:r>
-        <w:t xml:space="preserve"> (Niroula, 2016)</w:t>
-      </w:r>
-      <w:r>
-        <w:t>. Other factors, which accelerated this process, were probably the population pressure creation of infrastructure and concentration of development activities that created opportunities for employment in the Terai. As a result, there are considerable changes in demographic, socio-economic and environmental condition both at the origin and destination.</w:t>
+        <w:t xml:space="preserve">uring the time of Maoist insurgency people migrated from hill to </w:t>
+      </w:r>
+      <w:proofErr w:type="spellStart"/>
+      <w:r>
+        <w:t>Terai</w:t>
+      </w:r>
+      <w:proofErr w:type="spellEnd"/>
+      <w:r>
+        <w:t xml:space="preserve"> (</w:t>
+      </w:r>
+      <w:proofErr w:type="spellStart"/>
+      <w:r>
+        <w:t>Niroula</w:t>
+      </w:r>
+      <w:proofErr w:type="spellEnd"/>
+      <w:r>
+        <w:t>, 2016)</w:t>
+      </w:r>
+      <w:r>
+        <w:t xml:space="preserve">. Other factors, which accelerated this process, were probably the population pressure creation of infrastructure and concentration of development activities that created opportunities for employment in the </w:t>
+      </w:r>
+      <w:proofErr w:type="spellStart"/>
+      <w:r>
+        <w:t>Terai</w:t>
+      </w:r>
+      <w:proofErr w:type="spellEnd"/>
+      <w:r>
+        <w:t>. As a result, there are considerable changes in demographic, socio-economic and environmental condition both at the origin and destination.</w:t>
       </w:r>
     </w:p>
     <w:p>
       <w:pPr>
         <w:pStyle w:val="BodyText"/>
       </w:pPr>
+      <w:proofErr w:type="spellStart"/>
       <w:r>
         <w:t>Mabogunje</w:t>
       </w:r>
+      <w:proofErr w:type="spellEnd"/>
       <w:r>
         <w:t xml:space="preserve"> (1970) applied a concept of system theory in the system of rural to urban migration operates having economic, social, technological and government component. He attempted to relate </w:t>
       </w:r>
@@ -4334,20 +4589,54 @@
       <w:r>
         <w:t xml:space="preserve">Another study done by </w:t>
       </w:r>
-      <w:r>
-        <w:t xml:space="preserve">Gurung </w:t>
-      </w:r>
-      <w:r>
-        <w:t>(1974) was on planned resettlement in western Terai. It was based on survey of Banke and Bardiya resettlement project. It included a view of resettlement scheme, characteristics of settlers in project area. Ethnic classification, income size of land holding and livestock of migrants.</w:t>
+      <w:proofErr w:type="spellStart"/>
+      <w:r>
+        <w:t>Gurung</w:t>
+      </w:r>
+      <w:proofErr w:type="spellEnd"/>
+      <w:r>
+        <w:t xml:space="preserve"> </w:t>
+      </w:r>
+      <w:r>
+        <w:t xml:space="preserve">(1974) was on planned resettlement in western </w:t>
+      </w:r>
+      <w:proofErr w:type="spellStart"/>
+      <w:r>
+        <w:t>Terai</w:t>
+      </w:r>
+      <w:proofErr w:type="spellEnd"/>
+      <w:r>
+        <w:t xml:space="preserve">. It was based on survey of </w:t>
+      </w:r>
+      <w:proofErr w:type="spellStart"/>
+      <w:r>
+        <w:t>Banke</w:t>
+      </w:r>
+      <w:proofErr w:type="spellEnd"/>
+      <w:r>
+        <w:t xml:space="preserve"> and </w:t>
+      </w:r>
+      <w:proofErr w:type="spellStart"/>
+      <w:r>
+        <w:t>Bardiya</w:t>
+      </w:r>
+      <w:proofErr w:type="spellEnd"/>
+      <w:r>
+        <w:t xml:space="preserve"> resettlement project. It included a view of resettlement scheme, characteristics of settlers in project area. Ethnic classification, income size of land holding and livestock of migrants.</w:t>
       </w:r>
     </w:p>
     <w:p>
       <w:pPr>
         <w:pStyle w:val="BodyText"/>
       </w:pPr>
+      <w:proofErr w:type="spellStart"/>
       <w:r>
         <w:lastRenderedPageBreak/>
-        <w:t>Subedi (1996) studied on population growth and migration in Kathmandu city in which he concluded the internal and international migration are the main factors to increase population in Kathmandu city.</w:t>
+        <w:t>Subedi</w:t>
+      </w:r>
+      <w:proofErr w:type="spellEnd"/>
+      <w:r>
+        <w:t xml:space="preserve"> (1996) studied on population growth and migration in Kathmandu city in which he concluded the internal and international migration are the main factors to increase population in Kathmandu city.</w:t>
       </w:r>
     </w:p>
     <w:p>
@@ -4385,11 +4674,43 @@
         <w:pStyle w:val="BodyText"/>
       </w:pPr>
       <w:r>
-        <w:t>Migration is a complex phenomenon influenced by economic, social, and environmental factors. Several theories have been developed to explain the process of migration. Ravenstein (1885), known as the father of migration studies, introduced the concept of migration streams and counter</w:t>
+        <w:t xml:space="preserve">Migration is a complex phenomenon influenced by economic, social, and environmental factors. Several theories have been developed to explain the process of migration. </w:t>
+      </w:r>
+      <w:proofErr w:type="spellStart"/>
+      <w:r>
+        <w:t>Ravenstein</w:t>
+      </w:r>
+      <w:proofErr w:type="spellEnd"/>
+      <w:r>
+        <w:t xml:space="preserve"> (1885), known as the father of migration studies, introduced the concept of migration streams and counter</w:t>
       </w:r>
       <w:r>
         <w:noBreakHyphen/>
-        <w:t>streams, emphasizing that migration flows occur systematically between regions. He also highlighted the importance of distance in migration patterns. Lee (1966) extended this idea through the push–pull framework, explaining that migration decisions are influenced by factors at the origin (push) and destination (pull), as well as intervening obstacles such as distance, transportation, and cost. Personal characteristics like age, sex, and education further shape migration decisions. Zipf (1964) proposed the Gravitational Theory, suggesting that the number of migrants between two areas is directly proportional to their populations and inversely proportional to the distance separating them. Todaro (1976) added an economic perspective, emphasizing that expected income differentials, rather than actual earnings, largely drive migration. Together, these theories provide the conceptual foundation for understanding the causes and patterns of migration in Ward 9, Sankhu.</w:t>
+        <w:t xml:space="preserve">streams, emphasizing that migration flows occur systematically between regions. He also highlighted the importance of distance in migration patterns. Lee (1966) extended this idea through the push–pull framework, explaining that migration decisions are influenced by factors at the origin (push) and destination (pull), as well as intervening obstacles such as distance, transportation, and cost. Personal characteristics like age, sex, and education further shape migration decisions. </w:t>
+      </w:r>
+      <w:proofErr w:type="spellStart"/>
+      <w:r>
+        <w:t>Zipf</w:t>
+      </w:r>
+      <w:proofErr w:type="spellEnd"/>
+      <w:r>
+        <w:t xml:space="preserve"> (1964) proposed the Gravitational Theory, suggesting that the number of migrants between two areas is directly proportional to their populations and inversely proportional to the distance separating them. </w:t>
+      </w:r>
+      <w:proofErr w:type="spellStart"/>
+      <w:r>
+        <w:t>Todaro</w:t>
+      </w:r>
+      <w:proofErr w:type="spellEnd"/>
+      <w:r>
+        <w:t xml:space="preserve"> (1976) added an economic perspective, emphasizing that expected income differentials, rather than actual earnings, largely drive migration. Together, these theories provide the conceptual foundation for understanding the causes and patterns of migration in Ward 9, </w:t>
+      </w:r>
+      <w:proofErr w:type="spellStart"/>
+      <w:r>
+        <w:t>Sankhu</w:t>
+      </w:r>
+      <w:proofErr w:type="spellEnd"/>
+      <w:r>
+        <w:t>.</w:t>
       </w:r>
     </w:p>
     <w:p>
@@ -4405,11 +4726,32 @@
       </w:r>
       <w:r>
         <w:lastRenderedPageBreak/>
-        <w:t>origin and destination areas; in the Nepali context, this is visible in established corridors from specific villages to large cities or foreign labour markets, where existing migrants inform newcomers and stabilize routes. The segmented labour</w:t>
-      </w:r>
+        <w:t xml:space="preserve">origin and destination areas; in the Nepali context, this is visible in established corridors from specific villages to large cities or foreign </w:t>
+      </w:r>
+      <w:proofErr w:type="spellStart"/>
+      <w:r>
+        <w:t>labour</w:t>
+      </w:r>
+      <w:proofErr w:type="spellEnd"/>
+      <w:r>
+        <w:t xml:space="preserve"> markets, where existing migrants inform newcomers and stabilize routes. The segmented </w:t>
+      </w:r>
+      <w:proofErr w:type="spellStart"/>
+      <w:r>
+        <w:t>labour</w:t>
+      </w:r>
+      <w:proofErr w:type="spellEnd"/>
       <w:r>
         <w:noBreakHyphen/>
-        <w:t>market theory (Piore, 1979) explains that migrants often fill low</w:t>
+        <w:t>market theory (</w:t>
+      </w:r>
+      <w:proofErr w:type="spellStart"/>
+      <w:r>
+        <w:t>Piore</w:t>
+      </w:r>
+      <w:proofErr w:type="spellEnd"/>
+      <w:r>
+        <w:t>, 1979) explains that migrants often fill low</w:t>
       </w:r>
       <w:r>
         <w:noBreakHyphen/>
@@ -4417,11 +4759,43 @@
       </w:r>
       <w:r>
         <w:noBreakHyphen/>
-        <w:t>sector jobs that local workers avoid, such as construction, domestic work, and daily wage labour, reinforcing inequalities between residents and in</w:t>
+        <w:t xml:space="preserve">sector jobs that local workers avoid, such as construction, domestic work, and daily wage </w:t>
+      </w:r>
+      <w:proofErr w:type="spellStart"/>
+      <w:r>
+        <w:t>labour</w:t>
+      </w:r>
+      <w:proofErr w:type="spellEnd"/>
+      <w:r>
+        <w:t>, reinforcing inequalities between residents and in</w:t>
       </w:r>
       <w:r>
         <w:noBreakHyphen/>
-        <w:t>migrants in urban wards like Sankhu. Social capital and network theory (Granovetter, 1973; Portes, 1998) highlight how kinship, caste, and locality ties facilitate migration by providing information, loans, shelter, and job referrals, making mobility more feasible for certain groups and producing spatial clustering within wards. Finally, critical and autonomy</w:t>
+        <w:t xml:space="preserve">migrants in urban wards like </w:t>
+      </w:r>
+      <w:proofErr w:type="spellStart"/>
+      <w:r>
+        <w:t>Sankhu</w:t>
+      </w:r>
+      <w:proofErr w:type="spellEnd"/>
+      <w:r>
+        <w:t>. Social capital and network theory (</w:t>
+      </w:r>
+      <w:proofErr w:type="spellStart"/>
+      <w:r>
+        <w:t>Granovetter</w:t>
+      </w:r>
+      <w:proofErr w:type="spellEnd"/>
+      <w:r>
+        <w:t xml:space="preserve">, 1973; </w:t>
+      </w:r>
+      <w:proofErr w:type="spellStart"/>
+      <w:r>
+        <w:t>Portes</w:t>
+      </w:r>
+      <w:proofErr w:type="spellEnd"/>
+      <w:r>
+        <w:t>, 1998) highlight how kinship, caste, and locality ties facilitate migration by providing information, loans, shelter, and job referrals, making mobility more feasible for certain groups and producing spatial clustering within wards. Finally, critical and autonomy</w:t>
       </w:r>
       <w:r>
         <w:noBreakHyphen/>
@@ -4429,15 +4803,44 @@
       </w:r>
       <w:r>
         <w:noBreakHyphen/>
-        <w:t>migration perspectives (Mezzadra &amp; Neilson, 2013; Bhagat, 2025) treat migration as an active, resistant practice through which people creatively bypass restrictive laws, use informal channels, and negotiate precarious conditions to pursue better livelihoods, underscoring the agency and everyday strategies of in</w:t>
+        <w:t>migration perspectives (</w:t>
+      </w:r>
+      <w:proofErr w:type="spellStart"/>
+      <w:r>
+        <w:t>Mezzadra</w:t>
+      </w:r>
+      <w:proofErr w:type="spellEnd"/>
+      <w:r>
+        <w:t xml:space="preserve"> &amp; Neilson, 2013; </w:t>
+      </w:r>
+      <w:proofErr w:type="spellStart"/>
+      <w:r>
+        <w:t>Bhagat</w:t>
+      </w:r>
+      <w:proofErr w:type="spellEnd"/>
+      <w:r>
+        <w:t>, 2025) treat migration as an active, resistant practice through which people creatively bypass restrictive laws, use informal channels, and negotiate precarious conditions to pursue better livelihoods, underscoring the agency and everyday strategies of in</w:t>
       </w:r>
       <w:r>
         <w:noBreakHyphen/>
-        <w:t>migrants in peri</w:t>
-      </w:r>
+        <w:t xml:space="preserve">migrants in </w:t>
+      </w:r>
+      <w:proofErr w:type="spellStart"/>
+      <w:r>
+        <w:t>peri</w:t>
+      </w:r>
+      <w:proofErr w:type="spellEnd"/>
       <w:r>
         <w:noBreakHyphen/>
-        <w:t>urban and urban spaces like Ward 9, Sankhu.</w:t>
+        <w:t xml:space="preserve">urban and urban spaces like Ward 9, </w:t>
+      </w:r>
+      <w:proofErr w:type="spellStart"/>
+      <w:r>
+        <w:t>Sankhu</w:t>
+      </w:r>
+      <w:proofErr w:type="spellEnd"/>
+      <w:r>
+        <w:t>.</w:t>
       </w:r>
     </w:p>
     <w:p>
@@ -4458,7 +4861,55 @@
         <w:t>Empirical studies in Nepal and similar contexts provide insights into migration trends and consequences. CEDA (1977) observed that over 50 percent of migrants in Kathmandu were</w:t>
       </w:r>
       <w:r>
-        <w:t xml:space="preserve"> aged 20–30 years, with economic opportunities being the primary cause. Gurung (1984) identified population pressure, land scarcity, and environmental stress in the hills as push factors, and fertile land, government incentives, and social networks in the Terai as pull factors. K.C. (1998) analyzed both micro and macro-level determinants of migration, including literacy, age distribution, family kinship, and government resettlement projects. Kunwar (2015) applied multivariate analysis and found that low productivity and insufficient land prompted migration, while availability of facilities and presence of relatives influenced the decision to move. Niroula (2016) noted that during the Maoist insurgency, migration from hills to Terai accelerated due to population pressure, infrastructure development, and employment opportunities. These studies demonstrate the relevance of economic, social, and environmental factors in driving migration and highlight the need for a localized study in Ward 9, Sankhu.</w:t>
+        <w:t xml:space="preserve"> aged 20–30 years, with economic opportunities being the primary cause. </w:t>
+      </w:r>
+      <w:proofErr w:type="spellStart"/>
+      <w:r>
+        <w:t>Gurung</w:t>
+      </w:r>
+      <w:proofErr w:type="spellEnd"/>
+      <w:r>
+        <w:t xml:space="preserve"> (1984) identified population pressure, land scarcity, and environmental stress in the hills as push factors, and fertile land, government incentives, and social networks in the </w:t>
+      </w:r>
+      <w:proofErr w:type="spellStart"/>
+      <w:r>
+        <w:t>Terai</w:t>
+      </w:r>
+      <w:proofErr w:type="spellEnd"/>
+      <w:r>
+        <w:t xml:space="preserve"> as pull factors. K.C. (1998) analyzed both micro and macro-level determinants of migration, including literacy, age distribution, family kinship, and government resettlement projects. </w:t>
+      </w:r>
+      <w:proofErr w:type="spellStart"/>
+      <w:r>
+        <w:t>Kunwar</w:t>
+      </w:r>
+      <w:proofErr w:type="spellEnd"/>
+      <w:r>
+        <w:t xml:space="preserve"> (2015) applied multivariate analysis and found that low productivity and insufficient land prompted migration, while availability of facilities and presence of relatives influenced the decision to move. </w:t>
+      </w:r>
+      <w:proofErr w:type="spellStart"/>
+      <w:r>
+        <w:t>Niroula</w:t>
+      </w:r>
+      <w:proofErr w:type="spellEnd"/>
+      <w:r>
+        <w:t xml:space="preserve"> (2016) noted that during the Maoist insurgency, migration from hills to </w:t>
+      </w:r>
+      <w:proofErr w:type="spellStart"/>
+      <w:r>
+        <w:t>Terai</w:t>
+      </w:r>
+      <w:proofErr w:type="spellEnd"/>
+      <w:r>
+        <w:t xml:space="preserve"> accelerated due to population pressure, infrastructure development, and employment opportunities. These studies demonstrate the relevance of economic, social, and environmental factors in driving migration and highlight the need for a localized study in Ward 9, </w:t>
+      </w:r>
+      <w:proofErr w:type="spellStart"/>
+      <w:r>
+        <w:t>Sankhu</w:t>
+      </w:r>
+      <w:proofErr w:type="spellEnd"/>
+      <w:r>
+        <w:t>.</w:t>
       </w:r>
     </w:p>
     <w:p>
@@ -4485,16 +4936,66 @@
         <w:t>migration</w:t>
       </w:r>
       <w:r>
-        <w:t>, especially in peri</w:t>
-      </w:r>
+        <w:t xml:space="preserve">, especially in </w:t>
+      </w:r>
+      <w:proofErr w:type="spellStart"/>
+      <w:r>
+        <w:t>peri</w:t>
+      </w:r>
+      <w:proofErr w:type="spellEnd"/>
       <w:r>
         <w:noBreakHyphen/>
-        <w:t>urban and urban settings similar to Sankhu. Studies on municipalities such as Ratnanagar, Kirtipur, and Pokhara show that in</w:t>
+        <w:t xml:space="preserve">urban and urban settings similar to </w:t>
+      </w:r>
+      <w:proofErr w:type="spellStart"/>
+      <w:r>
+        <w:t>Sankhu</w:t>
+      </w:r>
+      <w:proofErr w:type="spellEnd"/>
+      <w:r>
+        <w:t xml:space="preserve">. Studies on municipalities such as </w:t>
+      </w:r>
+      <w:proofErr w:type="spellStart"/>
+      <w:r>
+        <w:t>Ratnanagar</w:t>
+      </w:r>
+      <w:proofErr w:type="spellEnd"/>
+      <w:r>
+        <w:t xml:space="preserve">, </w:t>
+      </w:r>
+      <w:proofErr w:type="spellStart"/>
+      <w:r>
+        <w:t>Kirtipur</w:t>
+      </w:r>
+      <w:proofErr w:type="spellEnd"/>
+      <w:r>
+        <w:t xml:space="preserve">, and </w:t>
+      </w:r>
+      <w:proofErr w:type="spellStart"/>
+      <w:r>
+        <w:t>Pokhara</w:t>
+      </w:r>
+      <w:proofErr w:type="spellEnd"/>
+      <w:r>
+        <w:t xml:space="preserve"> show that in</w:t>
       </w:r>
       <w:r>
         <w:noBreakHyphen/>
-        <w:t>migration is increasingly driven not only by land scarcity and agricultural distress but also by the growth of construction, services, and small industries around urban centres, reinforcing the neoclassical and Todaro</w:t>
-      </w:r>
+        <w:t xml:space="preserve">migration is increasingly driven not only by land scarcity and agricultural distress but also by the growth of construction, services, and small industries around urban </w:t>
+      </w:r>
+      <w:proofErr w:type="spellStart"/>
+      <w:r>
+        <w:t>centres</w:t>
+      </w:r>
+      <w:proofErr w:type="spellEnd"/>
+      <w:r>
+        <w:t xml:space="preserve">, reinforcing the neoclassical and </w:t>
+      </w:r>
+      <w:proofErr w:type="spellStart"/>
+      <w:r>
+        <w:t>Todaro</w:t>
+      </w:r>
+      <w:proofErr w:type="spellEnd"/>
       <w:r>
         <w:noBreakHyphen/>
         <w:t>type expectation</w:t>
@@ -4513,8 +5014,13 @@
       </w:r>
       <w:r>
         <w:noBreakHyphen/>
-        <w:t>migration flows, confirming that economic opportunity and labour</w:t>
-      </w:r>
+        <w:t xml:space="preserve">migration flows, confirming that economic opportunity and </w:t>
+      </w:r>
+      <w:proofErr w:type="spellStart"/>
+      <w:r>
+        <w:t>labour</w:t>
+      </w:r>
+      <w:proofErr w:type="spellEnd"/>
       <w:r>
         <w:noBreakHyphen/>
         <w:t>market expectations remain central push–pull forces. Parallel studies also underline that migration decisions are shaped by household</w:t>
@@ -4537,15 +5043,68 @@
         <w:pStyle w:val="BodyText"/>
       </w:pPr>
       <w:r>
-        <w:t>In addition, empirical work on migration systems and social networks supports K.C.’s (1998) and Kunwar’s (2015) emphasis on kinship and relatives. Researchers have found that once migration routes are established—from specific hill villages to particular Terai towns or urban wards—new migrants tend to follow the same paths, relying on relatives for information, credit, and housing. This pattern helps explain why in</w:t>
+        <w:t xml:space="preserve">In addition, empirical work on migration systems and social networks supports K.C.’s (1998) and </w:t>
+      </w:r>
+      <w:proofErr w:type="spellStart"/>
+      <w:r>
+        <w:t>Kunwar’s</w:t>
+      </w:r>
+      <w:proofErr w:type="spellEnd"/>
+      <w:r>
+        <w:t xml:space="preserve"> (2015) emphasis on kinship and relatives. Researchers have found that once migration routes are established—from specific hill villages to particular </w:t>
+      </w:r>
+      <w:proofErr w:type="spellStart"/>
+      <w:r>
+        <w:t>Terai</w:t>
+      </w:r>
+      <w:proofErr w:type="spellEnd"/>
+      <w:r>
+        <w:t xml:space="preserve"> towns or urban wards—new migrants tend to follow the same paths, relying on relatives for information, credit, and housing. This pattern helps explain why in</w:t>
       </w:r>
       <w:r>
         <w:noBreakHyphen/>
-        <w:t>migration is often clustered in certain neighbourhoods or streets within municipalities, mirroring findings from Gurung (1984) and Niroula (2016) that migration is not random but embedded in social and spatial structures. In peri</w:t>
-      </w:r>
+        <w:t xml:space="preserve">migration is often clustered in certain </w:t>
+      </w:r>
+      <w:proofErr w:type="spellStart"/>
+      <w:r>
+        <w:t>neighbourhoods</w:t>
+      </w:r>
+      <w:proofErr w:type="spellEnd"/>
+      <w:r>
+        <w:t xml:space="preserve"> or streets within municipalities, mirroring findings from </w:t>
+      </w:r>
+      <w:proofErr w:type="spellStart"/>
+      <w:r>
+        <w:t>Gurung</w:t>
+      </w:r>
+      <w:proofErr w:type="spellEnd"/>
+      <w:r>
+        <w:t xml:space="preserve"> (1984) and </w:t>
+      </w:r>
+      <w:proofErr w:type="spellStart"/>
+      <w:r>
+        <w:t>Niroula</w:t>
+      </w:r>
+      <w:proofErr w:type="spellEnd"/>
+      <w:r>
+        <w:t xml:space="preserve"> (2016) that migration is not random but embedded in social and spatial structures. In </w:t>
+      </w:r>
+      <w:proofErr w:type="spellStart"/>
+      <w:r>
+        <w:t>peri</w:t>
+      </w:r>
+      <w:proofErr w:type="spellEnd"/>
       <w:r>
         <w:noBreakHyphen/>
-        <w:t>urban wards like Sankhu, such networks likely intensify when infrastructure improves and road connectivity increases, making it easier for people from nearby rural areas to move in and settle informally.</w:t>
+        <w:t xml:space="preserve">urban wards like </w:t>
+      </w:r>
+      <w:proofErr w:type="spellStart"/>
+      <w:r>
+        <w:t>Sankhu</w:t>
+      </w:r>
+      <w:proofErr w:type="spellEnd"/>
+      <w:r>
+        <w:t>, such networks likely intensify when infrastructure improves and road connectivity increases, making it easier for people from nearby rural areas to move in and settle informally.</w:t>
       </w:r>
     </w:p>
     <w:p>
@@ -4567,7 +5126,23 @@
       </w:r>
       <w:r>
         <w:noBreakHyphen/>
-        <w:t>migration supplies labour for construction, services, and small businesses and supports local economic growth, echoing CEDA’s observation that Kathmandu’s growth was partly fuelled by in</w:t>
+        <w:t xml:space="preserve">migration supplies </w:t>
+      </w:r>
+      <w:proofErr w:type="spellStart"/>
+      <w:r>
+        <w:t>labour</w:t>
+      </w:r>
+      <w:proofErr w:type="spellEnd"/>
+      <w:r>
+        <w:t xml:space="preserve"> for construction, services, and small businesses and supports local economic growth, echoing CEDA’s observation that Kathmandu’s growth was partly </w:t>
+      </w:r>
+      <w:proofErr w:type="spellStart"/>
+      <w:r>
+        <w:t>fuelled</w:t>
+      </w:r>
+      <w:proofErr w:type="spellEnd"/>
+      <w:r>
+        <w:t xml:space="preserve"> by in</w:t>
       </w:r>
       <w:r>
         <w:noBreakHyphen/>
@@ -4583,8 +5158,13 @@
       </w:r>
       <w:r>
         <w:lastRenderedPageBreak/>
-        <w:t>housing and sanitation, and environmental degradation, especially in peri</w:t>
-      </w:r>
+        <w:t xml:space="preserve">housing and sanitation, and environmental degradation, especially in </w:t>
+      </w:r>
+      <w:proofErr w:type="spellStart"/>
+      <w:r>
+        <w:t>peri</w:t>
+      </w:r>
+      <w:proofErr w:type="spellEnd"/>
       <w:r>
         <w:noBreakHyphen/>
         <w:t>urban fringes where land</w:t>
@@ -4639,7 +5219,15 @@
       </w:r>
       <w:r>
         <w:noBreakHyphen/>
-        <w:t>making. For Ward 9, Sankhu, this implies that understanding the </w:t>
+        <w:t xml:space="preserve">making. For Ward 9, </w:t>
+      </w:r>
+      <w:proofErr w:type="spellStart"/>
+      <w:r>
+        <w:t>Sankhu</w:t>
+      </w:r>
+      <w:proofErr w:type="spellEnd"/>
+      <w:r>
+        <w:t>, this implies that understanding the </w:t>
       </w:r>
       <w:r>
         <w:rPr>
@@ -4661,12 +5249,49 @@
       </w:r>
       <w:r>
         <w:noBreakHyphen/>
-        <w:t>level findings and instead examine how local push–pull factors, household strategies, social networks, and municipal governance interact on the ground. In this sense, earlier empirical work by CEDA, Gurung, K.C., Kunwar, and Niroula provides a strong base, but a localized study in Sankhu is necessary to capture the specific dynamics of in</w:t>
+        <w:t xml:space="preserve">level findings and instead examine how local push–pull factors, household strategies, social networks, and municipal governance interact on the ground. In this sense, earlier empirical work by CEDA, </w:t>
+      </w:r>
+      <w:proofErr w:type="spellStart"/>
+      <w:r>
+        <w:t>Gurung</w:t>
+      </w:r>
+      <w:proofErr w:type="spellEnd"/>
+      <w:r>
+        <w:t xml:space="preserve">, K.C., </w:t>
+      </w:r>
+      <w:proofErr w:type="spellStart"/>
+      <w:r>
+        <w:t>Kunwar</w:t>
+      </w:r>
+      <w:proofErr w:type="spellEnd"/>
+      <w:r>
+        <w:t xml:space="preserve">, and </w:t>
+      </w:r>
+      <w:proofErr w:type="spellStart"/>
+      <w:r>
+        <w:t>Niroula</w:t>
+      </w:r>
+      <w:proofErr w:type="spellEnd"/>
+      <w:r>
+        <w:t xml:space="preserve"> provides a strong base, but a localized study in </w:t>
+      </w:r>
+      <w:proofErr w:type="spellStart"/>
+      <w:r>
+        <w:t>Sankhu</w:t>
+      </w:r>
+      <w:proofErr w:type="spellEnd"/>
+      <w:r>
+        <w:t xml:space="preserve"> is necessary to capture the specific dynamics of in</w:t>
       </w:r>
       <w:r>
         <w:noBreakHyphen/>
-        <w:t>migration in a peri</w:t>
-      </w:r>
+        <w:t xml:space="preserve">migration in a </w:t>
+      </w:r>
+      <w:proofErr w:type="spellStart"/>
+      <w:r>
+        <w:t>peri</w:t>
+      </w:r>
+      <w:proofErr w:type="spellEnd"/>
       <w:r>
         <w:noBreakHyphen/>
         <w:t>urban ward undergoing rapid transformation.</w:t>
@@ -4692,11 +5317,21 @@
         <w:pStyle w:val="BodyText"/>
       </w:pPr>
       <w:r>
-        <w:t>Migration in Nepal has been shaped by both national and local policies. National policies, such as the Nepal Migration Policy and urban development strategies, aim to regulate population movement, improve resettlement programs, and create opportunities in underdeveloped regions. Local-level initiatives, including ward and municipal development plans, focus on infrastructure development, provision of basic services, and resettlement schemes to manage migration effectively. For example, previous resettlement projects in western Terai (</w:t>
-      </w:r>
+        <w:t xml:space="preserve">Migration in Nepal has been shaped by both national and local policies. National policies, such as the Nepal Migration Policy and urban development strategies, aim to regulate population movement, improve resettlement programs, and create opportunities in underdeveloped regions. Local-level initiatives, including ward and municipal development plans, focus on infrastructure development, provision of basic services, and resettlement schemes to manage migration effectively. For example, previous resettlement projects in western </w:t>
+      </w:r>
+      <w:proofErr w:type="spellStart"/>
+      <w:r>
+        <w:t>Terai</w:t>
+      </w:r>
+      <w:proofErr w:type="spellEnd"/>
+      <w:r>
+        <w:t xml:space="preserve"> (</w:t>
+      </w:r>
+      <w:proofErr w:type="spellStart"/>
       <w:r>
         <w:t>Gurung</w:t>
       </w:r>
+      <w:proofErr w:type="spellEnd"/>
       <w:r>
         <w:t xml:space="preserve">, 1974) aimed to relocate populations from densely populated hill areas, emphasizing land distribution, income support, and social integration. </w:t>
       </w:r>
@@ -4731,7 +5366,15 @@
         <w:t>macro-level or city-wide</w:t>
       </w:r>
       <w:r>
-        <w:t xml:space="preserve">, lacking focus on specific wards like Ward 9, Sankhu. Few studies integrate </w:t>
+        <w:t xml:space="preserve">, lacking focus on specific wards like Ward 9, </w:t>
+      </w:r>
+      <w:proofErr w:type="spellStart"/>
+      <w:r>
+        <w:t>Sankhu</w:t>
+      </w:r>
+      <w:proofErr w:type="spellEnd"/>
+      <w:r>
+        <w:t xml:space="preserve">. Few studies integrate </w:t>
       </w:r>
       <w:r>
         <w:rPr>
@@ -5050,7 +5693,15 @@
         <w:t xml:space="preserve"> the study captures the causes</w:t>
       </w:r>
       <w:r>
-        <w:t xml:space="preserve"> and consequences of migration in Ward 9, Sankhu.</w:t>
+        <w:t xml:space="preserve"> and consequences of migration in Ward 9, </w:t>
+      </w:r>
+      <w:proofErr w:type="spellStart"/>
+      <w:r>
+        <w:t>Sankhu</w:t>
+      </w:r>
+      <w:proofErr w:type="spellEnd"/>
+      <w:r>
+        <w:t>.</w:t>
       </w:r>
     </w:p>
     <w:p>
@@ -5264,86 +5915,38 @@
         <w:pStyle w:val="BodyText"/>
       </w:pPr>
       <w:r>
-        <w:t xml:space="preserve">The </w:t>
-      </w:r>
-      <w:r>
-        <w:t>Shankharapur M</w:t>
-      </w:r>
-      <w:r>
-        <w:t>unicipality ward 9</w:t>
-      </w:r>
-      <w:r>
-        <w:t xml:space="preserve"> profile </w:t>
-      </w:r>
-      <w:r>
-        <w:t>–</w:t>
-      </w:r>
-      <w:r>
-        <w:t xml:space="preserve"> </w:t>
-      </w:r>
-      <w:r>
-        <w:t>20</w:t>
-      </w:r>
-      <w:r>
-        <w:t>82 BS</w:t>
-      </w:r>
-      <w:r>
-        <w:t xml:space="preserve"> sh</w:t>
-      </w:r>
-      <w:r>
-        <w:t xml:space="preserve">ows that there </w:t>
-      </w:r>
-      <w:r>
-        <w:t>is</w:t>
-      </w:r>
-      <w:r>
-        <w:t xml:space="preserve"> a total </w:t>
-      </w:r>
-      <w:r>
-        <w:t>population of about</w:t>
-      </w:r>
-      <w:r>
-        <w:t xml:space="preserve"> </w:t>
-      </w:r>
-      <w:r>
-        <w:t>4345</w:t>
-      </w:r>
-      <w:r>
-        <w:t>. Out of 9 wards, ward no.</w:t>
-      </w:r>
-      <w:r>
-        <w:t>9</w:t>
-      </w:r>
-      <w:r>
-        <w:t xml:space="preserve"> will be considered</w:t>
-      </w:r>
-      <w:r>
-        <w:t xml:space="preserve"> as</w:t>
-      </w:r>
-      <w:r>
-        <w:t xml:space="preserve"> st</w:t>
-      </w:r>
-      <w:r>
-        <w:t xml:space="preserve">udy area. This ward </w:t>
-      </w:r>
-      <w:r>
-        <w:t>welcomed</w:t>
-      </w:r>
-      <w:r>
-        <w:t xml:space="preserve"> 82</w:t>
-      </w:r>
-      <w:r>
-        <w:t xml:space="preserve"> </w:t>
-      </w:r>
-      <w:r>
-        <w:t>households</w:t>
-      </w:r>
-      <w:r>
-        <w:t xml:space="preserve"> with total count of 336 immigrants from year 2074 BS to 2082 BS</w:t>
-      </w:r>
-      <w:r>
-        <w:t xml:space="preserve">. </w:t>
-      </w:r>
+        <w:t xml:space="preserve">The study population consisted of two categories of respondents: migrant households and local resident households of </w:t>
+      </w:r>
+      <w:proofErr w:type="spellStart"/>
+      <w:r>
+        <w:t>Shankharapur</w:t>
+      </w:r>
+      <w:proofErr w:type="spellEnd"/>
+      <w:r>
+        <w:t xml:space="preserve"> Municipality Ward No. 9.</w:t>
+      </w:r>
+    </w:p>
+    <w:p>
+      <w:pPr>
+        <w:pStyle w:val="BodyText"/>
+      </w:pPr>
+      <w:r>
+        <w:t>For the study of the causes of migration, migrant households residing in Ward No. 9 were considered as the primary respondents. According to the ward profile (2082 BS), a total of 83 migrant households had migrated into the ward between 2074 BS and 2082 BS. Since the total migrant households were relatively small and fully identifiable through ward records, the study adopted a census method to include all 83 migrant households in the survey.</w:t>
+      </w:r>
+    </w:p>
+    <w:p>
+      <w:pPr>
+        <w:pStyle w:val="BodyText"/>
+      </w:pPr>
+      <w:r>
+        <w:lastRenderedPageBreak/>
+        <w:t>For the study of the consequences of migration, local resident households of Ward No. 9 were considered as respondents because the impacts of migration such as pressure on infrastructure, population density, competition, pollution, and social change are experienced by the wider community. Since the number of local households was comparatively large, a sample survey method was adopted.</w:t>
+      </w:r>
+    </w:p>
+    <w:p>
+      <w:pPr>
+        <w:pStyle w:val="BodyText"/>
+      </w:pPr>
     </w:p>
     <w:p>
       <w:pPr>
@@ -5374,8 +5977,96 @@
         <w:pStyle w:val="NormalWeb"/>
       </w:pPr>
       <w:r>
+        <w:t>This study adopted two different approaches for sample size determination based on the nature of the objectives.</w:t>
+      </w:r>
+    </w:p>
+    <w:p>
+      <w:pPr>
+        <w:pStyle w:val="NormalWeb"/>
+      </w:pPr>
+      <w:r>
+        <w:t xml:space="preserve">For examining the causes of migration, the study used a census method. According to the ward profile of </w:t>
+      </w:r>
+      <w:proofErr w:type="spellStart"/>
+      <w:r>
+        <w:t>Shankharapur</w:t>
+      </w:r>
+      <w:proofErr w:type="spellEnd"/>
+      <w:r>
+        <w:t xml:space="preserve"> Municipality Ward No. 9, there were only 83 migrant households that had migrated into the ward between 2074 BS and 2082 BS. Since the population size was small, manageable, and completely identifiable, all 83 migrant households were included in the study. The census method ensured complete representation of the migrant population and eliminated sampling error.</w:t>
+      </w:r>
+    </w:p>
+    <w:p>
+      <w:pPr>
+        <w:pStyle w:val="NormalWeb"/>
+      </w:pPr>
+      <w:r>
+        <w:t>However, for examining the consequences of migration on the local community, a sample survey method was adopted among local resident households. Since the number of local households was relatively large, Yamane’s formula was used to determine an appropriate sample size.</w:t>
+      </w:r>
+    </w:p>
+    <w:p>
+      <w:pPr>
+        <w:pStyle w:val="NormalWeb"/>
+      </w:pPr>
+      <w:r>
+        <w:t>The Yamane formula is expressed as:</w:t>
+      </w:r>
+    </w:p>
+    <w:p>
+      <w:pPr>
+        <w:pStyle w:val="NormalWeb"/>
+      </w:pPr>
+      <w:r>
+        <w:t>n = N / (1 + N(e)^2)</w:t>
+      </w:r>
+    </w:p>
+    <w:p>
+      <w:pPr>
+        <w:pStyle w:val="NormalWeb"/>
+      </w:pPr>
+      <w:r>
+        <w:t>Where:</w:t>
+      </w:r>
+    </w:p>
+    <w:p>
+      <w:pPr>
+        <w:pStyle w:val="NormalWeb"/>
+      </w:pPr>
+      <w:r>
+        <w:t>n = required sample size</w:t>
+      </w:r>
+    </w:p>
+    <w:p>
+      <w:pPr>
+        <w:pStyle w:val="NormalWeb"/>
+      </w:pPr>
+      <w:r>
+        <w:t>N = total population size</w:t>
+      </w:r>
+    </w:p>
+    <w:p>
+      <w:pPr>
+        <w:pStyle w:val="NormalWeb"/>
+      </w:pPr>
+      <w:r>
+        <w:t>e = margin of error</w:t>
+      </w:r>
+    </w:p>
+    <w:p>
+      <w:pPr>
+        <w:pStyle w:val="NormalWeb"/>
+      </w:pPr>
+      <w:r>
+        <w:t>The study used a 95 percent confidence level and 5 percent margin of error for determining the sample size.</w:t>
+      </w:r>
+    </w:p>
+    <w:p>
+      <w:pPr>
+        <w:pStyle w:val="NormalWeb"/>
+      </w:pPr>
+      <w:r>
         <w:lastRenderedPageBreak/>
-        <w:t>Sample size determination formulas such as Slovin’s or Cochran’s are generally applied when the population is large or when complete enumeration is not feasible. However, in this study, covering all 83 households ensured complete representation of the target population and improved the accuracy and reliability of the findings by eliminating sampling error.</w:t>
+        <w:t>Yamane’s formula was selected because it is simple, reliable, and appropriate when the total population size is known. It is widely used in social science research for finite populations where complete enumeration is not feasible.</w:t>
       </w:r>
     </w:p>
     <w:p>
@@ -5383,7 +6074,7 @@
         <w:pStyle w:val="NormalWeb"/>
       </w:pPr>
       <w:r>
-        <w:t>Therefore, all 83 households were included in the study for data collection and analysis.</w:t>
+        <w:t>.</w:t>
       </w:r>
     </w:p>
     <w:p>
@@ -5679,10 +6370,8 @@
         </w:rPr>
         <w:br w:type="page"/>
       </w:r>
-      <w:bookmarkStart w:id="27" w:name="_GoBack"/>
-      <w:bookmarkEnd w:id="27"/>
-    </w:p>
-    <w:bookmarkStart w:id="28" w:name="_Toc220841277" w:displacedByCustomXml="next"/>
+    </w:p>
+    <w:bookmarkStart w:id="27" w:name="_Toc220841277" w:displacedByCustomXml="next"/>
     <w:sdt>
       <w:sdtPr>
         <w:rPr>
@@ -5706,7 +6395,7 @@
           <w:r>
             <w:t>References</w:t>
           </w:r>
-          <w:bookmarkEnd w:id="28"/>
+          <w:bookmarkEnd w:id="27"/>
         </w:p>
         <w:sdt>
           <w:sdtPr>
@@ -6303,6 +6992,2587 @@
         </w:rPr>
       </w:pPr>
     </w:p>
+    <w:p>
+      <w:pPr>
+        <w:spacing w:line="360" w:lineRule="auto"/>
+        <w:rPr>
+          <w:rFonts w:ascii="Times New Roman" w:hAnsi="Times New Roman" w:cs="Times New Roman"/>
+        </w:rPr>
+      </w:pPr>
+    </w:p>
+    <w:p>
+      <w:pPr>
+        <w:spacing w:line="360" w:lineRule="auto"/>
+        <w:rPr>
+          <w:rFonts w:ascii="Times New Roman" w:hAnsi="Times New Roman" w:cs="Times New Roman"/>
+        </w:rPr>
+      </w:pPr>
+    </w:p>
+    <w:p>
+      <w:pPr>
+        <w:spacing w:line="360" w:lineRule="auto"/>
+        <w:rPr>
+          <w:rFonts w:ascii="Times New Roman" w:hAnsi="Times New Roman" w:cs="Times New Roman"/>
+        </w:rPr>
+      </w:pPr>
+    </w:p>
+    <w:p>
+      <w:pPr>
+        <w:spacing w:line="360" w:lineRule="auto"/>
+        <w:rPr>
+          <w:rFonts w:ascii="Times New Roman" w:hAnsi="Times New Roman" w:cs="Times New Roman"/>
+        </w:rPr>
+      </w:pPr>
+    </w:p>
+    <w:p>
+      <w:pPr>
+        <w:spacing w:line="360" w:lineRule="auto"/>
+        <w:rPr>
+          <w:rFonts w:ascii="Times New Roman" w:hAnsi="Times New Roman" w:cs="Times New Roman"/>
+        </w:rPr>
+      </w:pPr>
+    </w:p>
+    <w:p>
+      <w:pPr>
+        <w:spacing w:line="360" w:lineRule="auto"/>
+        <w:rPr>
+          <w:rFonts w:ascii="Times New Roman" w:hAnsi="Times New Roman" w:cs="Times New Roman"/>
+        </w:rPr>
+      </w:pPr>
+    </w:p>
+    <w:p>
+      <w:pPr>
+        <w:spacing w:line="360" w:lineRule="auto"/>
+        <w:rPr>
+          <w:rFonts w:ascii="Times New Roman" w:hAnsi="Times New Roman" w:cs="Times New Roman"/>
+        </w:rPr>
+      </w:pPr>
+    </w:p>
+    <w:p>
+      <w:pPr>
+        <w:spacing w:line="360" w:lineRule="auto"/>
+        <w:rPr>
+          <w:rFonts w:ascii="Times New Roman" w:hAnsi="Times New Roman" w:cs="Times New Roman"/>
+        </w:rPr>
+      </w:pPr>
+    </w:p>
+    <w:p>
+      <w:pPr>
+        <w:spacing w:line="360" w:lineRule="auto"/>
+        <w:rPr>
+          <w:rFonts w:ascii="Times New Roman" w:hAnsi="Times New Roman" w:cs="Times New Roman"/>
+        </w:rPr>
+      </w:pPr>
+    </w:p>
+    <w:p>
+      <w:pPr>
+        <w:spacing w:line="360" w:lineRule="auto"/>
+        <w:rPr>
+          <w:rFonts w:ascii="Times New Roman" w:hAnsi="Times New Roman" w:cs="Times New Roman"/>
+        </w:rPr>
+      </w:pPr>
+    </w:p>
+    <w:p>
+      <w:pPr>
+        <w:jc w:val="center"/>
+      </w:pPr>
+      <w:r>
+        <w:rPr>
+          <w:b/>
+          <w:sz w:val="32"/>
+        </w:rPr>
+        <w:lastRenderedPageBreak/>
+        <w:t>APPENDIX: Research Questionnaire</w:t>
+      </w:r>
+    </w:p>
+    <w:p>
+      <w:pPr>
+        <w:jc w:val="center"/>
+      </w:pPr>
+      <w:r>
+        <w:rPr>
+          <w:b/>
+        </w:rPr>
+        <w:t xml:space="preserve">Questionnaire for the Data Collection of Causes and Consequences of In-Migration in </w:t>
+      </w:r>
+      <w:proofErr w:type="spellStart"/>
+      <w:r>
+        <w:rPr>
+          <w:b/>
+        </w:rPr>
+        <w:t>Shankharapur</w:t>
+      </w:r>
+      <w:proofErr w:type="spellEnd"/>
+      <w:r>
+        <w:rPr>
+          <w:b/>
+        </w:rPr>
+        <w:t xml:space="preserve"> Municipality Ward No. 9, Kathmandu District</w:t>
+      </w:r>
+    </w:p>
+    <w:p>
+      <w:pPr>
+        <w:pStyle w:val="Heading2"/>
+      </w:pPr>
+      <w:r>
+        <w:t>Part I: Household Information</w:t>
+      </w:r>
+    </w:p>
+    <w:p>
+      <w:r>
+        <w:rPr>
+          <w:b/>
+        </w:rPr>
+        <w:t>District: Kathmandu</w:t>
+      </w:r>
+      <w:r>
+        <w:rPr>
+          <w:b/>
+        </w:rPr>
+        <w:br/>
+        <w:t xml:space="preserve">Municipality: </w:t>
+      </w:r>
+      <w:proofErr w:type="spellStart"/>
+      <w:r>
+        <w:rPr>
+          <w:b/>
+        </w:rPr>
+        <w:t>Shankharapur</w:t>
+      </w:r>
+      <w:proofErr w:type="spellEnd"/>
+      <w:r>
+        <w:rPr>
+          <w:b/>
+        </w:rPr>
+        <w:br/>
+        <w:t>Ward No.: _____________________</w:t>
+      </w:r>
+      <w:r>
+        <w:rPr>
+          <w:b/>
+        </w:rPr>
+        <w:br/>
+      </w:r>
+      <w:proofErr w:type="spellStart"/>
+      <w:r>
+        <w:rPr>
+          <w:b/>
+        </w:rPr>
+        <w:t>Tole</w:t>
+      </w:r>
+      <w:proofErr w:type="spellEnd"/>
+      <w:r>
+        <w:rPr>
+          <w:b/>
+        </w:rPr>
+        <w:t>: _____________________</w:t>
+      </w:r>
+      <w:r>
+        <w:rPr>
+          <w:b/>
+        </w:rPr>
+        <w:br/>
+        <w:t>Household No.: _____________________</w:t>
+      </w:r>
+      <w:r>
+        <w:rPr>
+          <w:b/>
+        </w:rPr>
+        <w:br/>
+        <w:t>Name of Household Head: _____________________</w:t>
+      </w:r>
+      <w:r>
+        <w:rPr>
+          <w:b/>
+        </w:rPr>
+        <w:br/>
+        <w:t>Name of Respondent: _____________________</w:t>
+      </w:r>
+      <w:r>
+        <w:rPr>
+          <w:b/>
+        </w:rPr>
+        <w:br/>
+        <w:t>Religion:</w:t>
+      </w:r>
+      <w:r>
+        <w:rPr>
+          <w:b/>
+        </w:rPr>
+        <w:br/>
+      </w:r>
+      <w:r>
+        <w:t xml:space="preserve">  1) Hindu</w:t>
+      </w:r>
+      <w:r>
+        <w:br/>
+        <w:t xml:space="preserve">  2) Buddhist</w:t>
+      </w:r>
+      <w:r>
+        <w:br/>
+        <w:t xml:space="preserve">  3) Muslim</w:t>
+      </w:r>
+      <w:r>
+        <w:br/>
+        <w:t xml:space="preserve">  4) Christian</w:t>
+      </w:r>
+      <w:r>
+        <w:br/>
+        <w:t xml:space="preserve">  5) Others</w:t>
+      </w:r>
+    </w:p>
+    <w:p>
+      <w:pPr>
+        <w:pStyle w:val="Heading2"/>
+      </w:pPr>
+      <w:r>
+        <w:t>Section B: Household Survey Schedule</w:t>
+      </w:r>
+    </w:p>
+    <w:tbl>
+      <w:tblPr>
+        <w:tblStyle w:val="TableGrid"/>
+        <w:tblW w:w="0" w:type="auto"/>
+        <w:tblLook w:val="04A0" w:firstRow="1" w:lastRow="0" w:firstColumn="1" w:lastColumn="0" w:noHBand="0" w:noVBand="1"/>
+      </w:tblPr>
+      <w:tblGrid>
+        <w:gridCol w:w="608"/>
+        <w:gridCol w:w="767"/>
+        <w:gridCol w:w="1013"/>
+        <w:gridCol w:w="576"/>
+        <w:gridCol w:w="598"/>
+        <w:gridCol w:w="991"/>
+        <w:gridCol w:w="868"/>
+        <w:gridCol w:w="1328"/>
+        <w:gridCol w:w="811"/>
+        <w:gridCol w:w="1070"/>
+      </w:tblGrid>
+      <w:tr>
+        <w:tc>
+          <w:tcPr>
+            <w:tcW w:w="936" w:type="dxa"/>
+          </w:tcPr>
+          <w:p>
+            <w:r>
+              <w:rPr>
+                <w:b/>
+              </w:rPr>
+              <w:t>S.N.</w:t>
+            </w:r>
+          </w:p>
+        </w:tc>
+        <w:tc>
+          <w:tcPr>
+            <w:tcW w:w="936" w:type="dxa"/>
+          </w:tcPr>
+          <w:p>
+            <w:r>
+              <w:rPr>
+                <w:b/>
+              </w:rPr>
+              <w:t>Name</w:t>
+            </w:r>
+          </w:p>
+        </w:tc>
+        <w:tc>
+          <w:tcPr>
+            <w:tcW w:w="936" w:type="dxa"/>
+          </w:tcPr>
+          <w:p>
+            <w:r>
+              <w:rPr>
+                <w:b/>
+              </w:rPr>
+              <w:t>Relation to the HH</w:t>
+            </w:r>
+          </w:p>
+        </w:tc>
+        <w:tc>
+          <w:tcPr>
+            <w:tcW w:w="936" w:type="dxa"/>
+          </w:tcPr>
+          <w:p>
+            <w:r>
+              <w:rPr>
+                <w:b/>
+              </w:rPr>
+              <w:t>Sex</w:t>
+            </w:r>
+          </w:p>
+        </w:tc>
+        <w:tc>
+          <w:tcPr>
+            <w:tcW w:w="936" w:type="dxa"/>
+          </w:tcPr>
+          <w:p>
+            <w:r>
+              <w:rPr>
+                <w:b/>
+              </w:rPr>
+              <w:t>Age</w:t>
+            </w:r>
+          </w:p>
+        </w:tc>
+        <w:tc>
+          <w:tcPr>
+            <w:tcW w:w="936" w:type="dxa"/>
+          </w:tcPr>
+          <w:p>
+            <w:r>
+              <w:rPr>
+                <w:b/>
+              </w:rPr>
+              <w:t>Literacy Status</w:t>
+            </w:r>
+          </w:p>
+        </w:tc>
+        <w:tc>
+          <w:tcPr>
+            <w:tcW w:w="936" w:type="dxa"/>
+          </w:tcPr>
+          <w:p>
+            <w:r>
+              <w:rPr>
+                <w:b/>
+              </w:rPr>
+              <w:t>Marital Status</w:t>
+            </w:r>
+          </w:p>
+        </w:tc>
+        <w:tc>
+          <w:tcPr>
+            <w:tcW w:w="936" w:type="dxa"/>
+          </w:tcPr>
+          <w:p>
+            <w:r>
+              <w:rPr>
+                <w:b/>
+              </w:rPr>
+              <w:t>Occupation</w:t>
+            </w:r>
+          </w:p>
+        </w:tc>
+        <w:tc>
+          <w:tcPr>
+            <w:tcW w:w="936" w:type="dxa"/>
+          </w:tcPr>
+          <w:p>
+            <w:r>
+              <w:rPr>
+                <w:b/>
+              </w:rPr>
+              <w:t>Living Since</w:t>
+            </w:r>
+          </w:p>
+        </w:tc>
+        <w:tc>
+          <w:tcPr>
+            <w:tcW w:w="936" w:type="dxa"/>
+          </w:tcPr>
+          <w:p>
+            <w:r>
+              <w:rPr>
+                <w:b/>
+              </w:rPr>
+              <w:t>Remarks</w:t>
+            </w:r>
+          </w:p>
+        </w:tc>
+      </w:tr>
+      <w:tr>
+        <w:tc>
+          <w:tcPr>
+            <w:tcW w:w="936" w:type="dxa"/>
+          </w:tcPr>
+          <w:p>
+            <w:r>
+              <w:t>1</w:t>
+            </w:r>
+          </w:p>
+        </w:tc>
+        <w:tc>
+          <w:tcPr>
+            <w:tcW w:w="936" w:type="dxa"/>
+          </w:tcPr>
+          <w:p/>
+        </w:tc>
+        <w:tc>
+          <w:tcPr>
+            <w:tcW w:w="936" w:type="dxa"/>
+          </w:tcPr>
+          <w:p/>
+        </w:tc>
+        <w:tc>
+          <w:tcPr>
+            <w:tcW w:w="936" w:type="dxa"/>
+          </w:tcPr>
+          <w:p/>
+        </w:tc>
+        <w:tc>
+          <w:tcPr>
+            <w:tcW w:w="936" w:type="dxa"/>
+          </w:tcPr>
+          <w:p/>
+        </w:tc>
+        <w:tc>
+          <w:tcPr>
+            <w:tcW w:w="936" w:type="dxa"/>
+          </w:tcPr>
+          <w:p/>
+        </w:tc>
+        <w:tc>
+          <w:tcPr>
+            <w:tcW w:w="936" w:type="dxa"/>
+          </w:tcPr>
+          <w:p/>
+        </w:tc>
+        <w:tc>
+          <w:tcPr>
+            <w:tcW w:w="936" w:type="dxa"/>
+          </w:tcPr>
+          <w:p/>
+        </w:tc>
+        <w:tc>
+          <w:tcPr>
+            <w:tcW w:w="936" w:type="dxa"/>
+          </w:tcPr>
+          <w:p/>
+        </w:tc>
+        <w:tc>
+          <w:tcPr>
+            <w:tcW w:w="936" w:type="dxa"/>
+          </w:tcPr>
+          <w:p/>
+        </w:tc>
+      </w:tr>
+      <w:tr>
+        <w:tc>
+          <w:tcPr>
+            <w:tcW w:w="936" w:type="dxa"/>
+          </w:tcPr>
+          <w:p>
+            <w:r>
+              <w:t>2</w:t>
+            </w:r>
+          </w:p>
+        </w:tc>
+        <w:tc>
+          <w:tcPr>
+            <w:tcW w:w="936" w:type="dxa"/>
+          </w:tcPr>
+          <w:p/>
+        </w:tc>
+        <w:tc>
+          <w:tcPr>
+            <w:tcW w:w="936" w:type="dxa"/>
+          </w:tcPr>
+          <w:p/>
+        </w:tc>
+        <w:tc>
+          <w:tcPr>
+            <w:tcW w:w="936" w:type="dxa"/>
+          </w:tcPr>
+          <w:p/>
+        </w:tc>
+        <w:tc>
+          <w:tcPr>
+            <w:tcW w:w="936" w:type="dxa"/>
+          </w:tcPr>
+          <w:p/>
+        </w:tc>
+        <w:tc>
+          <w:tcPr>
+            <w:tcW w:w="936" w:type="dxa"/>
+          </w:tcPr>
+          <w:p/>
+        </w:tc>
+        <w:tc>
+          <w:tcPr>
+            <w:tcW w:w="936" w:type="dxa"/>
+          </w:tcPr>
+          <w:p/>
+        </w:tc>
+        <w:tc>
+          <w:tcPr>
+            <w:tcW w:w="936" w:type="dxa"/>
+          </w:tcPr>
+          <w:p/>
+        </w:tc>
+        <w:tc>
+          <w:tcPr>
+            <w:tcW w:w="936" w:type="dxa"/>
+          </w:tcPr>
+          <w:p/>
+        </w:tc>
+        <w:tc>
+          <w:tcPr>
+            <w:tcW w:w="936" w:type="dxa"/>
+          </w:tcPr>
+          <w:p/>
+        </w:tc>
+      </w:tr>
+      <w:tr>
+        <w:tc>
+          <w:tcPr>
+            <w:tcW w:w="936" w:type="dxa"/>
+          </w:tcPr>
+          <w:p>
+            <w:r>
+              <w:t>3</w:t>
+            </w:r>
+          </w:p>
+        </w:tc>
+        <w:tc>
+          <w:tcPr>
+            <w:tcW w:w="936" w:type="dxa"/>
+          </w:tcPr>
+          <w:p/>
+        </w:tc>
+        <w:tc>
+          <w:tcPr>
+            <w:tcW w:w="936" w:type="dxa"/>
+          </w:tcPr>
+          <w:p/>
+        </w:tc>
+        <w:tc>
+          <w:tcPr>
+            <w:tcW w:w="936" w:type="dxa"/>
+          </w:tcPr>
+          <w:p/>
+        </w:tc>
+        <w:tc>
+          <w:tcPr>
+            <w:tcW w:w="936" w:type="dxa"/>
+          </w:tcPr>
+          <w:p/>
+        </w:tc>
+        <w:tc>
+          <w:tcPr>
+            <w:tcW w:w="936" w:type="dxa"/>
+          </w:tcPr>
+          <w:p/>
+        </w:tc>
+        <w:tc>
+          <w:tcPr>
+            <w:tcW w:w="936" w:type="dxa"/>
+          </w:tcPr>
+          <w:p/>
+        </w:tc>
+        <w:tc>
+          <w:tcPr>
+            <w:tcW w:w="936" w:type="dxa"/>
+          </w:tcPr>
+          <w:p/>
+        </w:tc>
+        <w:tc>
+          <w:tcPr>
+            <w:tcW w:w="936" w:type="dxa"/>
+          </w:tcPr>
+          <w:p/>
+        </w:tc>
+        <w:tc>
+          <w:tcPr>
+            <w:tcW w:w="936" w:type="dxa"/>
+          </w:tcPr>
+          <w:p/>
+        </w:tc>
+      </w:tr>
+      <w:tr>
+        <w:tc>
+          <w:tcPr>
+            <w:tcW w:w="936" w:type="dxa"/>
+          </w:tcPr>
+          <w:p>
+            <w:r>
+              <w:t>4</w:t>
+            </w:r>
+          </w:p>
+        </w:tc>
+        <w:tc>
+          <w:tcPr>
+            <w:tcW w:w="936" w:type="dxa"/>
+          </w:tcPr>
+          <w:p/>
+        </w:tc>
+        <w:tc>
+          <w:tcPr>
+            <w:tcW w:w="936" w:type="dxa"/>
+          </w:tcPr>
+          <w:p/>
+        </w:tc>
+        <w:tc>
+          <w:tcPr>
+            <w:tcW w:w="936" w:type="dxa"/>
+          </w:tcPr>
+          <w:p/>
+        </w:tc>
+        <w:tc>
+          <w:tcPr>
+            <w:tcW w:w="936" w:type="dxa"/>
+          </w:tcPr>
+          <w:p/>
+        </w:tc>
+        <w:tc>
+          <w:tcPr>
+            <w:tcW w:w="936" w:type="dxa"/>
+          </w:tcPr>
+          <w:p/>
+        </w:tc>
+        <w:tc>
+          <w:tcPr>
+            <w:tcW w:w="936" w:type="dxa"/>
+          </w:tcPr>
+          <w:p/>
+        </w:tc>
+        <w:tc>
+          <w:tcPr>
+            <w:tcW w:w="936" w:type="dxa"/>
+          </w:tcPr>
+          <w:p/>
+        </w:tc>
+        <w:tc>
+          <w:tcPr>
+            <w:tcW w:w="936" w:type="dxa"/>
+          </w:tcPr>
+          <w:p/>
+        </w:tc>
+        <w:tc>
+          <w:tcPr>
+            <w:tcW w:w="936" w:type="dxa"/>
+          </w:tcPr>
+          <w:p/>
+        </w:tc>
+      </w:tr>
+      <w:tr>
+        <w:tc>
+          <w:tcPr>
+            <w:tcW w:w="936" w:type="dxa"/>
+          </w:tcPr>
+          <w:p>
+            <w:r>
+              <w:t>5</w:t>
+            </w:r>
+          </w:p>
+        </w:tc>
+        <w:tc>
+          <w:tcPr>
+            <w:tcW w:w="936" w:type="dxa"/>
+          </w:tcPr>
+          <w:p/>
+        </w:tc>
+        <w:tc>
+          <w:tcPr>
+            <w:tcW w:w="936" w:type="dxa"/>
+          </w:tcPr>
+          <w:p/>
+        </w:tc>
+        <w:tc>
+          <w:tcPr>
+            <w:tcW w:w="936" w:type="dxa"/>
+          </w:tcPr>
+          <w:p/>
+        </w:tc>
+        <w:tc>
+          <w:tcPr>
+            <w:tcW w:w="936" w:type="dxa"/>
+          </w:tcPr>
+          <w:p/>
+        </w:tc>
+        <w:tc>
+          <w:tcPr>
+            <w:tcW w:w="936" w:type="dxa"/>
+          </w:tcPr>
+          <w:p/>
+        </w:tc>
+        <w:tc>
+          <w:tcPr>
+            <w:tcW w:w="936" w:type="dxa"/>
+          </w:tcPr>
+          <w:p/>
+        </w:tc>
+        <w:tc>
+          <w:tcPr>
+            <w:tcW w:w="936" w:type="dxa"/>
+          </w:tcPr>
+          <w:p/>
+        </w:tc>
+        <w:tc>
+          <w:tcPr>
+            <w:tcW w:w="936" w:type="dxa"/>
+          </w:tcPr>
+          <w:p/>
+        </w:tc>
+        <w:tc>
+          <w:tcPr>
+            <w:tcW w:w="936" w:type="dxa"/>
+          </w:tcPr>
+          <w:p/>
+        </w:tc>
+      </w:tr>
+    </w:tbl>
+    <w:p>
+      <w:r>
+        <w:br/>
+        <w:t>* Codes for Household Survey Schedule column values are listed below under structural tables.</w:t>
+      </w:r>
+    </w:p>
+    <w:p>
+      <w:pPr>
+        <w:pStyle w:val="Heading2"/>
+      </w:pPr>
+      <w:r>
+        <w:t>Part II: Socio-Economic Characteristics of Household</w:t>
+      </w:r>
+    </w:p>
+    <w:tbl>
+      <w:tblPr>
+        <w:tblStyle w:val="TableGrid"/>
+        <w:tblW w:w="0" w:type="auto"/>
+        <w:tblLook w:val="04A0" w:firstRow="1" w:lastRow="0" w:firstColumn="1" w:lastColumn="0" w:noHBand="0" w:noVBand="1"/>
+      </w:tblPr>
+      <w:tblGrid>
+        <w:gridCol w:w="2797"/>
+        <w:gridCol w:w="2905"/>
+        <w:gridCol w:w="2928"/>
+      </w:tblGrid>
+      <w:tr>
+        <w:tc>
+          <w:tcPr>
+            <w:tcW w:w="3120" w:type="dxa"/>
+          </w:tcPr>
+          <w:p>
+            <w:r>
+              <w:t>1</w:t>
+            </w:r>
+          </w:p>
+        </w:tc>
+        <w:tc>
+          <w:tcPr>
+            <w:tcW w:w="3120" w:type="dxa"/>
+          </w:tcPr>
+          <w:p>
+            <w:r>
+              <w:t>How much land is owned by the household?</w:t>
+            </w:r>
+          </w:p>
+        </w:tc>
+        <w:tc>
+          <w:tcPr>
+            <w:tcW w:w="3120" w:type="dxa"/>
+          </w:tcPr>
+          <w:p>
+            <w:r>
+              <w:t xml:space="preserve">1. </w:t>
+            </w:r>
+            <w:proofErr w:type="spellStart"/>
+            <w:r>
+              <w:t>Ropani</w:t>
+            </w:r>
+            <w:proofErr w:type="spellEnd"/>
+            <w:r>
+              <w:br/>
+              <w:t xml:space="preserve">2. </w:t>
+            </w:r>
+            <w:proofErr w:type="spellStart"/>
+            <w:r>
+              <w:t>Aana</w:t>
+            </w:r>
+            <w:proofErr w:type="spellEnd"/>
+            <w:r>
+              <w:br/>
+              <w:t>3. Paisa</w:t>
+            </w:r>
+            <w:r>
+              <w:br/>
+              <w:t>4. Others</w:t>
+            </w:r>
+          </w:p>
+        </w:tc>
+      </w:tr>
+      <w:tr>
+        <w:tc>
+          <w:tcPr>
+            <w:tcW w:w="3120" w:type="dxa"/>
+          </w:tcPr>
+          <w:p>
+            <w:r>
+              <w:t>2</w:t>
+            </w:r>
+          </w:p>
+        </w:tc>
+        <w:tc>
+          <w:tcPr>
+            <w:tcW w:w="3120" w:type="dxa"/>
+          </w:tcPr>
+          <w:p>
+            <w:r>
+              <w:t>Main source of drinking water?</w:t>
+            </w:r>
+          </w:p>
+        </w:tc>
+        <w:tc>
+          <w:tcPr>
+            <w:tcW w:w="3120" w:type="dxa"/>
+          </w:tcPr>
+          <w:p>
+            <w:r>
+              <w:t>1. Piped</w:t>
+            </w:r>
+            <w:r>
+              <w:br/>
+              <w:t>2. Tube well</w:t>
+            </w:r>
+            <w:r>
+              <w:br/>
+              <w:t>3. Well</w:t>
+            </w:r>
+            <w:r>
+              <w:br/>
+              <w:t>4. River</w:t>
+            </w:r>
+            <w:r>
+              <w:br/>
+              <w:t>5. Others</w:t>
+            </w:r>
+          </w:p>
+        </w:tc>
+      </w:tr>
+      <w:tr>
+        <w:tc>
+          <w:tcPr>
+            <w:tcW w:w="3120" w:type="dxa"/>
+          </w:tcPr>
+          <w:p>
+            <w:r>
+              <w:lastRenderedPageBreak/>
+              <w:t>3</w:t>
+            </w:r>
+          </w:p>
+        </w:tc>
+        <w:tc>
+          <w:tcPr>
+            <w:tcW w:w="3120" w:type="dxa"/>
+          </w:tcPr>
+          <w:p>
+            <w:r>
+              <w:t>Main source of cooking fuel?</w:t>
+            </w:r>
+          </w:p>
+        </w:tc>
+        <w:tc>
+          <w:tcPr>
+            <w:tcW w:w="3120" w:type="dxa"/>
+          </w:tcPr>
+          <w:p>
+            <w:r>
+              <w:t>1. Wood</w:t>
+            </w:r>
+            <w:r>
+              <w:br/>
+              <w:t>2. Biogas</w:t>
+            </w:r>
+            <w:r>
+              <w:br/>
+              <w:t>3. LPG</w:t>
+            </w:r>
+            <w:r>
+              <w:br/>
+              <w:t>4. Kerosene</w:t>
+            </w:r>
+            <w:r>
+              <w:br/>
+              <w:t>5. Others</w:t>
+            </w:r>
+          </w:p>
+        </w:tc>
+      </w:tr>
+      <w:tr>
+        <w:tc>
+          <w:tcPr>
+            <w:tcW w:w="3120" w:type="dxa"/>
+          </w:tcPr>
+          <w:p>
+            <w:r>
+              <w:t>4</w:t>
+            </w:r>
+          </w:p>
+        </w:tc>
+        <w:tc>
+          <w:tcPr>
+            <w:tcW w:w="3120" w:type="dxa"/>
+          </w:tcPr>
+          <w:p>
+            <w:r>
+              <w:t>Is there a fixed toilet for the exclusive use of your family?</w:t>
+            </w:r>
+          </w:p>
+        </w:tc>
+        <w:tc>
+          <w:tcPr>
+            <w:tcW w:w="3120" w:type="dxa"/>
+          </w:tcPr>
+          <w:p>
+            <w:r>
+              <w:t>1. Yes</w:t>
+            </w:r>
+            <w:r>
+              <w:br/>
+              <w:t>2. No</w:t>
+            </w:r>
+          </w:p>
+        </w:tc>
+      </w:tr>
+      <w:tr>
+        <w:tc>
+          <w:tcPr>
+            <w:tcW w:w="3120" w:type="dxa"/>
+          </w:tcPr>
+          <w:p>
+            <w:r>
+              <w:t>5</w:t>
+            </w:r>
+          </w:p>
+        </w:tc>
+        <w:tc>
+          <w:tcPr>
+            <w:tcW w:w="3120" w:type="dxa"/>
+          </w:tcPr>
+          <w:p>
+            <w:r>
+              <w:t>If yes, which is the main type of toilet used?</w:t>
+            </w:r>
+          </w:p>
+        </w:tc>
+        <w:tc>
+          <w:tcPr>
+            <w:tcW w:w="3120" w:type="dxa"/>
+          </w:tcPr>
+          <w:p>
+            <w:r>
+              <w:t>1. General</w:t>
+            </w:r>
+            <w:r>
+              <w:br/>
+              <w:t>2. Closed pit</w:t>
+            </w:r>
+            <w:r>
+              <w:br/>
+              <w:t>3. Open pit</w:t>
+            </w:r>
+            <w:r>
+              <w:br/>
+              <w:t>4. Others</w:t>
+            </w:r>
+          </w:p>
+        </w:tc>
+      </w:tr>
+      <w:tr>
+        <w:tc>
+          <w:tcPr>
+            <w:tcW w:w="3120" w:type="dxa"/>
+          </w:tcPr>
+          <w:p>
+            <w:r>
+              <w:t>6</w:t>
+            </w:r>
+          </w:p>
+        </w:tc>
+        <w:tc>
+          <w:tcPr>
+            <w:tcW w:w="3120" w:type="dxa"/>
+          </w:tcPr>
+          <w:p>
+            <w:r>
+              <w:t>Which is the health facility you/your family usually go to?</w:t>
+            </w:r>
+          </w:p>
+        </w:tc>
+        <w:tc>
+          <w:tcPr>
+            <w:tcW w:w="3120" w:type="dxa"/>
+          </w:tcPr>
+          <w:p>
+            <w:r>
+              <w:t>1. PHC</w:t>
+            </w:r>
+            <w:r>
+              <w:br/>
+              <w:t>2. HP</w:t>
+            </w:r>
+            <w:r>
+              <w:br/>
+              <w:t>3. SHP</w:t>
+            </w:r>
+            <w:r>
+              <w:br/>
+              <w:t>4. Private clinic</w:t>
+            </w:r>
+            <w:r>
+              <w:br/>
+              <w:t>5. Others</w:t>
+            </w:r>
+          </w:p>
+        </w:tc>
+      </w:tr>
+      <w:tr>
+        <w:tc>
+          <w:tcPr>
+            <w:tcW w:w="3120" w:type="dxa"/>
+          </w:tcPr>
+          <w:p>
+            <w:r>
+              <w:t>7</w:t>
+            </w:r>
+          </w:p>
+        </w:tc>
+        <w:tc>
+          <w:tcPr>
+            <w:tcW w:w="3120" w:type="dxa"/>
+          </w:tcPr>
+          <w:p>
+            <w:r>
+              <w:t>Do you own or rent this dwelling?</w:t>
+            </w:r>
+          </w:p>
+        </w:tc>
+        <w:tc>
+          <w:tcPr>
+            <w:tcW w:w="3120" w:type="dxa"/>
+          </w:tcPr>
+          <w:p>
+            <w:r>
+              <w:t>1. Own</w:t>
+            </w:r>
+            <w:r>
+              <w:br/>
+              <w:t>2. Rent</w:t>
+            </w:r>
+          </w:p>
+        </w:tc>
+      </w:tr>
+      <w:tr>
+        <w:tc>
+          <w:tcPr>
+            <w:tcW w:w="3120" w:type="dxa"/>
+          </w:tcPr>
+          <w:p>
+            <w:r>
+              <w:t>8</w:t>
+            </w:r>
+          </w:p>
+        </w:tc>
+        <w:tc>
+          <w:tcPr>
+            <w:tcW w:w="3120" w:type="dxa"/>
+          </w:tcPr>
+          <w:p>
+            <w:r>
+              <w:t>Have you owned or installed the following in this dwelling?</w:t>
+            </w:r>
+          </w:p>
+        </w:tc>
+        <w:tc>
+          <w:tcPr>
+            <w:tcW w:w="3120" w:type="dxa"/>
+          </w:tcPr>
+          <w:p>
+            <w:r>
+              <w:t>1. Electricity</w:t>
+            </w:r>
+            <w:r>
+              <w:br/>
+              <w:t>2. Biogas</w:t>
+            </w:r>
+            <w:r>
+              <w:br/>
+              <w:t>3. Telephone</w:t>
+            </w:r>
+            <w:r>
+              <w:br/>
+              <w:t>4. Radio</w:t>
+            </w:r>
+            <w:r>
+              <w:br/>
+              <w:t>5. Television</w:t>
+            </w:r>
+            <w:r>
+              <w:br/>
+              <w:t>6. Internet</w:t>
+            </w:r>
+          </w:p>
+        </w:tc>
+      </w:tr>
+      <w:tr>
+        <w:tc>
+          <w:tcPr>
+            <w:tcW w:w="3120" w:type="dxa"/>
+          </w:tcPr>
+          <w:p>
+            <w:r>
+              <w:t>9</w:t>
+            </w:r>
+          </w:p>
+        </w:tc>
+        <w:tc>
+          <w:tcPr>
+            <w:tcW w:w="3120" w:type="dxa"/>
+          </w:tcPr>
+          <w:p>
+            <w:r>
+              <w:t>Main wall material of house?</w:t>
+            </w:r>
+          </w:p>
+        </w:tc>
+        <w:tc>
+          <w:tcPr>
+            <w:tcW w:w="3120" w:type="dxa"/>
+          </w:tcPr>
+          <w:p>
+            <w:r>
+              <w:t>1. Cement/Brick</w:t>
+            </w:r>
+            <w:r>
+              <w:br/>
+              <w:t>2. Tin</w:t>
+            </w:r>
+            <w:r>
+              <w:br/>
+              <w:t>3. Wood</w:t>
+            </w:r>
+            <w:r>
+              <w:br/>
+              <w:t>4. Mud</w:t>
+            </w:r>
+            <w:r>
+              <w:br/>
+              <w:t>5. Others</w:t>
+            </w:r>
+          </w:p>
+        </w:tc>
+      </w:tr>
+      <w:tr>
+        <w:tc>
+          <w:tcPr>
+            <w:tcW w:w="3120" w:type="dxa"/>
+          </w:tcPr>
+          <w:p>
+            <w:r>
+              <w:t>10</w:t>
+            </w:r>
+          </w:p>
+        </w:tc>
+        <w:tc>
+          <w:tcPr>
+            <w:tcW w:w="3120" w:type="dxa"/>
+          </w:tcPr>
+          <w:p>
+            <w:r>
+              <w:t>Main roofing material?</w:t>
+            </w:r>
+          </w:p>
+        </w:tc>
+        <w:tc>
+          <w:tcPr>
+            <w:tcW w:w="3120" w:type="dxa"/>
+          </w:tcPr>
+          <w:p>
+            <w:r>
+              <w:t>1. Concrete</w:t>
+            </w:r>
+            <w:r>
+              <w:br/>
+              <w:t>2. Tin</w:t>
+            </w:r>
+            <w:r>
+              <w:br/>
+              <w:t>3. Tile</w:t>
+            </w:r>
+            <w:r>
+              <w:br/>
+              <w:t>4. Bamboo</w:t>
+            </w:r>
+            <w:r>
+              <w:br/>
+              <w:t>5. Others</w:t>
+            </w:r>
+          </w:p>
+        </w:tc>
+      </w:tr>
+    </w:tbl>
+    <w:p>
+      <w:pPr>
+        <w:pStyle w:val="Heading2"/>
+      </w:pPr>
+      <w:r>
+        <w:t>Part III: Questionnaire for Causes of In-Migration</w:t>
+      </w:r>
+    </w:p>
+    <w:tbl>
+      <w:tblPr>
+        <w:tblStyle w:val="TableGrid"/>
+        <w:tblW w:w="0" w:type="auto"/>
+        <w:tblLook w:val="04A0" w:firstRow="1" w:lastRow="0" w:firstColumn="1" w:lastColumn="0" w:noHBand="0" w:noVBand="1"/>
+      </w:tblPr>
+      <w:tblGrid>
+        <w:gridCol w:w="2763"/>
+        <w:gridCol w:w="2963"/>
+        <w:gridCol w:w="2904"/>
+      </w:tblGrid>
+      <w:tr>
+        <w:tc>
+          <w:tcPr>
+            <w:tcW w:w="3120" w:type="dxa"/>
+          </w:tcPr>
+          <w:p>
+            <w:r>
+              <w:t>11</w:t>
+            </w:r>
+          </w:p>
+        </w:tc>
+        <w:tc>
+          <w:tcPr>
+            <w:tcW w:w="3120" w:type="dxa"/>
+          </w:tcPr>
+          <w:p>
+            <w:r>
+              <w:t>Main reason for migration to this place?</w:t>
+            </w:r>
+          </w:p>
+        </w:tc>
+        <w:tc>
+          <w:tcPr>
+            <w:tcW w:w="3120" w:type="dxa"/>
+          </w:tcPr>
+          <w:p>
+            <w:r>
+              <w:t>1. Employment</w:t>
+            </w:r>
+            <w:r>
+              <w:br/>
+              <w:t>2. Education</w:t>
+            </w:r>
+            <w:r>
+              <w:br/>
+              <w:t>3. Marriage</w:t>
+            </w:r>
+            <w:r>
+              <w:br/>
+              <w:t>4. Business</w:t>
+            </w:r>
+            <w:r>
+              <w:br/>
+              <w:t>5. Lack of Land</w:t>
+            </w:r>
+            <w:r>
+              <w:br/>
+              <w:t>6. Disaster</w:t>
+            </w:r>
+            <w:r>
+              <w:br/>
+              <w:t>7. Other</w:t>
+            </w:r>
+          </w:p>
+        </w:tc>
+      </w:tr>
+      <w:tr>
+        <w:tc>
+          <w:tcPr>
+            <w:tcW w:w="3120" w:type="dxa"/>
+          </w:tcPr>
+          <w:p>
+            <w:r>
+              <w:t>12</w:t>
+            </w:r>
+          </w:p>
+        </w:tc>
+        <w:tc>
+          <w:tcPr>
+            <w:tcW w:w="3120" w:type="dxa"/>
+          </w:tcPr>
+          <w:p>
+            <w:r>
+              <w:t>Previous place of residence?</w:t>
+            </w:r>
+          </w:p>
+        </w:tc>
+        <w:tc>
+          <w:tcPr>
+            <w:tcW w:w="3120" w:type="dxa"/>
+          </w:tcPr>
+          <w:p>
+            <w:r>
+              <w:t>1. Mountain</w:t>
+            </w:r>
+            <w:r>
+              <w:br/>
+              <w:t>2. Hill</w:t>
+            </w:r>
+            <w:r>
+              <w:br/>
+              <w:t xml:space="preserve">3. </w:t>
+            </w:r>
+            <w:proofErr w:type="spellStart"/>
+            <w:r>
+              <w:t>Terai</w:t>
+            </w:r>
+            <w:proofErr w:type="spellEnd"/>
+            <w:r>
+              <w:br/>
+              <w:t>4. Urban Area</w:t>
+            </w:r>
+            <w:r>
+              <w:br/>
+              <w:t>5. Rural Area</w:t>
+            </w:r>
+          </w:p>
+        </w:tc>
+      </w:tr>
+      <w:tr>
+        <w:tc>
+          <w:tcPr>
+            <w:tcW w:w="3120" w:type="dxa"/>
+          </w:tcPr>
+          <w:p>
+            <w:r>
+              <w:lastRenderedPageBreak/>
+              <w:t>13</w:t>
+            </w:r>
+          </w:p>
+        </w:tc>
+        <w:tc>
+          <w:tcPr>
+            <w:tcW w:w="3120" w:type="dxa"/>
+          </w:tcPr>
+          <w:p>
+            <w:r>
+              <w:t>Main attraction of this area?</w:t>
+            </w:r>
+          </w:p>
+        </w:tc>
+        <w:tc>
+          <w:tcPr>
+            <w:tcW w:w="3120" w:type="dxa"/>
+          </w:tcPr>
+          <w:p>
+            <w:r>
+              <w:t>1. Job Opportunity</w:t>
+            </w:r>
+            <w:r>
+              <w:br/>
+              <w:t>2. Education</w:t>
+            </w:r>
+            <w:r>
+              <w:br/>
+              <w:t>3. Health Services</w:t>
+            </w:r>
+            <w:r>
+              <w:br/>
+              <w:t>4. Infrastructure</w:t>
+            </w:r>
+            <w:r>
+              <w:br/>
+              <w:t>5. Relatives</w:t>
+            </w:r>
+            <w:r>
+              <w:br/>
+              <w:t>6. Other</w:t>
+            </w:r>
+          </w:p>
+        </w:tc>
+      </w:tr>
+      <w:tr>
+        <w:tc>
+          <w:tcPr>
+            <w:tcW w:w="3120" w:type="dxa"/>
+          </w:tcPr>
+          <w:p>
+            <w:r>
+              <w:t>14</w:t>
+            </w:r>
+          </w:p>
+        </w:tc>
+        <w:tc>
+          <w:tcPr>
+            <w:tcW w:w="3120" w:type="dxa"/>
+          </w:tcPr>
+          <w:p>
+            <w:r>
+              <w:t>Did your previous place have transportation facilities?</w:t>
+            </w:r>
+          </w:p>
+        </w:tc>
+        <w:tc>
+          <w:tcPr>
+            <w:tcW w:w="3120" w:type="dxa"/>
+          </w:tcPr>
+          <w:p>
+            <w:r>
+              <w:t>1. Yes</w:t>
+            </w:r>
+            <w:r>
+              <w:br/>
+              <w:t>2. No</w:t>
+            </w:r>
+          </w:p>
+        </w:tc>
+      </w:tr>
+      <w:tr>
+        <w:tc>
+          <w:tcPr>
+            <w:tcW w:w="3120" w:type="dxa"/>
+          </w:tcPr>
+          <w:p>
+            <w:r>
+              <w:t>15</w:t>
+            </w:r>
+          </w:p>
+        </w:tc>
+        <w:tc>
+          <w:tcPr>
+            <w:tcW w:w="3120" w:type="dxa"/>
+          </w:tcPr>
+          <w:p>
+            <w:r>
+              <w:t>Did your previous place have healthcare facilities?</w:t>
+            </w:r>
+          </w:p>
+        </w:tc>
+        <w:tc>
+          <w:tcPr>
+            <w:tcW w:w="3120" w:type="dxa"/>
+          </w:tcPr>
+          <w:p>
+            <w:r>
+              <w:t>1. Yes</w:t>
+            </w:r>
+            <w:r>
+              <w:br/>
+              <w:t>2. No</w:t>
+            </w:r>
+          </w:p>
+        </w:tc>
+      </w:tr>
+      <w:tr>
+        <w:tc>
+          <w:tcPr>
+            <w:tcW w:w="3120" w:type="dxa"/>
+          </w:tcPr>
+          <w:p>
+            <w:r>
+              <w:t>16</w:t>
+            </w:r>
+          </w:p>
+        </w:tc>
+        <w:tc>
+          <w:tcPr>
+            <w:tcW w:w="3120" w:type="dxa"/>
+          </w:tcPr>
+          <w:p>
+            <w:r>
+              <w:t>Did your previous place have good schools/colleges?</w:t>
+            </w:r>
+          </w:p>
+        </w:tc>
+        <w:tc>
+          <w:tcPr>
+            <w:tcW w:w="3120" w:type="dxa"/>
+          </w:tcPr>
+          <w:p>
+            <w:r>
+              <w:t>1. Yes</w:t>
+            </w:r>
+            <w:r>
+              <w:br/>
+              <w:t>2. No</w:t>
+            </w:r>
+          </w:p>
+        </w:tc>
+      </w:tr>
+      <w:tr>
+        <w:tc>
+          <w:tcPr>
+            <w:tcW w:w="3120" w:type="dxa"/>
+          </w:tcPr>
+          <w:p>
+            <w:r>
+              <w:t>17</w:t>
+            </w:r>
+          </w:p>
+        </w:tc>
+        <w:tc>
+          <w:tcPr>
+            <w:tcW w:w="3120" w:type="dxa"/>
+          </w:tcPr>
+          <w:p>
+            <w:r>
+              <w:t>Ethnic group?</w:t>
+            </w:r>
+          </w:p>
+        </w:tc>
+        <w:tc>
+          <w:tcPr>
+            <w:tcW w:w="3120" w:type="dxa"/>
+          </w:tcPr>
+          <w:p>
+            <w:r>
+              <w:t>1. Brahmin</w:t>
+            </w:r>
+            <w:r>
+              <w:br/>
+              <w:t xml:space="preserve">2. </w:t>
+            </w:r>
+            <w:proofErr w:type="spellStart"/>
+            <w:r>
+              <w:t>Chhetri</w:t>
+            </w:r>
+            <w:proofErr w:type="spellEnd"/>
+            <w:r>
+              <w:br/>
+              <w:t xml:space="preserve">3. </w:t>
+            </w:r>
+            <w:proofErr w:type="spellStart"/>
+            <w:r>
+              <w:t>Newar</w:t>
+            </w:r>
+            <w:proofErr w:type="spellEnd"/>
+            <w:r>
+              <w:br/>
+              <w:t xml:space="preserve">4. </w:t>
+            </w:r>
+            <w:proofErr w:type="spellStart"/>
+            <w:r>
+              <w:t>Tamang</w:t>
+            </w:r>
+            <w:proofErr w:type="spellEnd"/>
+            <w:r>
+              <w:br/>
+              <w:t xml:space="preserve">5. </w:t>
+            </w:r>
+            <w:proofErr w:type="spellStart"/>
+            <w:r>
+              <w:t>Gurung</w:t>
+            </w:r>
+            <w:proofErr w:type="spellEnd"/>
+            <w:r>
+              <w:br/>
+              <w:t>6. Dalit</w:t>
+            </w:r>
+            <w:r>
+              <w:br/>
+              <w:t>7. Others</w:t>
+            </w:r>
+          </w:p>
+        </w:tc>
+      </w:tr>
+      <w:tr>
+        <w:tc>
+          <w:tcPr>
+            <w:tcW w:w="3120" w:type="dxa"/>
+          </w:tcPr>
+          <w:p>
+            <w:r>
+              <w:t>18</w:t>
+            </w:r>
+          </w:p>
+        </w:tc>
+        <w:tc>
+          <w:tcPr>
+            <w:tcW w:w="3120" w:type="dxa"/>
+          </w:tcPr>
+          <w:p>
+            <w:r>
+              <w:t>Marital status before migration?</w:t>
+            </w:r>
+          </w:p>
+        </w:tc>
+        <w:tc>
+          <w:tcPr>
+            <w:tcW w:w="3120" w:type="dxa"/>
+          </w:tcPr>
+          <w:p>
+            <w:r>
+              <w:t>1. Unmarried</w:t>
+            </w:r>
+            <w:r>
+              <w:br/>
+              <w:t>2. Married</w:t>
+            </w:r>
+            <w:r>
+              <w:br/>
+              <w:t>3. Widowed</w:t>
+            </w:r>
+            <w:r>
+              <w:br/>
+              <w:t>4. Divorced</w:t>
+            </w:r>
+          </w:p>
+        </w:tc>
+      </w:tr>
+      <w:tr>
+        <w:tc>
+          <w:tcPr>
+            <w:tcW w:w="3120" w:type="dxa"/>
+          </w:tcPr>
+          <w:p>
+            <w:r>
+              <w:t>19</w:t>
+            </w:r>
+          </w:p>
+        </w:tc>
+        <w:tc>
+          <w:tcPr>
+            <w:tcW w:w="3120" w:type="dxa"/>
+          </w:tcPr>
+          <w:p>
+            <w:r>
+              <w:t>Main occupation before migration?</w:t>
+            </w:r>
+          </w:p>
+        </w:tc>
+        <w:tc>
+          <w:tcPr>
+            <w:tcW w:w="3120" w:type="dxa"/>
+          </w:tcPr>
+          <w:p>
+            <w:r>
+              <w:t>1. Agriculture</w:t>
+            </w:r>
+            <w:r>
+              <w:br/>
+              <w:t>2. Business</w:t>
+            </w:r>
+            <w:r>
+              <w:br/>
+              <w:t>3. Service</w:t>
+            </w:r>
+            <w:r>
+              <w:br/>
+              <w:t>4. Foreign Employment</w:t>
+            </w:r>
+            <w:r>
+              <w:br/>
+              <w:t>5. Daily Wage</w:t>
+            </w:r>
+            <w:r>
+              <w:br/>
+              <w:t>6. Other</w:t>
+            </w:r>
+          </w:p>
+        </w:tc>
+      </w:tr>
+      <w:tr>
+        <w:tc>
+          <w:tcPr>
+            <w:tcW w:w="3120" w:type="dxa"/>
+          </w:tcPr>
+          <w:p>
+            <w:r>
+              <w:t>20</w:t>
+            </w:r>
+          </w:p>
+        </w:tc>
+        <w:tc>
+          <w:tcPr>
+            <w:tcW w:w="3120" w:type="dxa"/>
+          </w:tcPr>
+          <w:p>
+            <w:r>
+              <w:t>Who mainly decided migration?</w:t>
+            </w:r>
+          </w:p>
+        </w:tc>
+        <w:tc>
+          <w:tcPr>
+            <w:tcW w:w="3120" w:type="dxa"/>
+          </w:tcPr>
+          <w:p>
+            <w:r>
+              <w:t xml:space="preserve">1. </w:t>
+            </w:r>
+            <w:proofErr w:type="spellStart"/>
+            <w:r>
+              <w:t>Self</w:t>
+            </w:r>
+            <w:r>
+              <w:br/>
+              <w:t>2</w:t>
+            </w:r>
+            <w:proofErr w:type="spellEnd"/>
+            <w:r>
+              <w:t>. Parents</w:t>
+            </w:r>
+            <w:r>
+              <w:br/>
+              <w:t>3. Spouse</w:t>
+            </w:r>
+            <w:r>
+              <w:br/>
+              <w:t>4. Relatives</w:t>
+            </w:r>
+            <w:r>
+              <w:br/>
+              <w:t>5. Others</w:t>
+            </w:r>
+          </w:p>
+        </w:tc>
+      </w:tr>
+      <w:tr>
+        <w:tc>
+          <w:tcPr>
+            <w:tcW w:w="3120" w:type="dxa"/>
+          </w:tcPr>
+          <w:p>
+            <w:r>
+              <w:t>21</w:t>
+            </w:r>
+          </w:p>
+        </w:tc>
+        <w:tc>
+          <w:tcPr>
+            <w:tcW w:w="3120" w:type="dxa"/>
+          </w:tcPr>
+          <w:p>
+            <w:r>
+              <w:t>Did unemployment influence migration?</w:t>
+            </w:r>
+          </w:p>
+        </w:tc>
+        <w:tc>
+          <w:tcPr>
+            <w:tcW w:w="3120" w:type="dxa"/>
+          </w:tcPr>
+          <w:p>
+            <w:r>
+              <w:t>1. Yes</w:t>
+            </w:r>
+            <w:r>
+              <w:br/>
+              <w:t>2. No</w:t>
+            </w:r>
+          </w:p>
+        </w:tc>
+      </w:tr>
+      <w:tr>
+        <w:tc>
+          <w:tcPr>
+            <w:tcW w:w="3120" w:type="dxa"/>
+          </w:tcPr>
+          <w:p>
+            <w:r>
+              <w:t>22</w:t>
+            </w:r>
+          </w:p>
+        </w:tc>
+        <w:tc>
+          <w:tcPr>
+            <w:tcW w:w="3120" w:type="dxa"/>
+          </w:tcPr>
+          <w:p>
+            <w:r>
+              <w:t>Did lack of agricultural land influence migration?</w:t>
+            </w:r>
+          </w:p>
+        </w:tc>
+        <w:tc>
+          <w:tcPr>
+            <w:tcW w:w="3120" w:type="dxa"/>
+          </w:tcPr>
+          <w:p>
+            <w:r>
+              <w:t>1. Yes</w:t>
+            </w:r>
+            <w:r>
+              <w:br/>
+              <w:t>2. No</w:t>
+            </w:r>
+          </w:p>
+        </w:tc>
+      </w:tr>
+      <w:tr>
+        <w:tc>
+          <w:tcPr>
+            <w:tcW w:w="3120" w:type="dxa"/>
+          </w:tcPr>
+          <w:p>
+            <w:r>
+              <w:t>23</w:t>
+            </w:r>
+          </w:p>
+        </w:tc>
+        <w:tc>
+          <w:tcPr>
+            <w:tcW w:w="3120" w:type="dxa"/>
+          </w:tcPr>
+          <w:p>
+            <w:r>
+              <w:t>Did better education opportunities influence migration?</w:t>
+            </w:r>
+          </w:p>
+        </w:tc>
+        <w:tc>
+          <w:tcPr>
+            <w:tcW w:w="3120" w:type="dxa"/>
+          </w:tcPr>
+          <w:p>
+            <w:r>
+              <w:t>1. Yes</w:t>
+            </w:r>
+            <w:r>
+              <w:br/>
+              <w:t>2. No</w:t>
+            </w:r>
+          </w:p>
+        </w:tc>
+      </w:tr>
+      <w:tr>
+        <w:tc>
+          <w:tcPr>
+            <w:tcW w:w="3120" w:type="dxa"/>
+          </w:tcPr>
+          <w:p>
+            <w:r>
+              <w:t>24</w:t>
+            </w:r>
+          </w:p>
+        </w:tc>
+        <w:tc>
+          <w:tcPr>
+            <w:tcW w:w="3120" w:type="dxa"/>
+          </w:tcPr>
+          <w:p>
+            <w:r>
+              <w:t>Did better infrastructure influence migration?</w:t>
+            </w:r>
+          </w:p>
+        </w:tc>
+        <w:tc>
+          <w:tcPr>
+            <w:tcW w:w="3120" w:type="dxa"/>
+          </w:tcPr>
+          <w:p>
+            <w:r>
+              <w:t>1. Yes</w:t>
+            </w:r>
+            <w:r>
+              <w:br/>
+              <w:t>2. No</w:t>
+            </w:r>
+          </w:p>
+        </w:tc>
+      </w:tr>
+      <w:tr>
+        <w:tc>
+          <w:tcPr>
+            <w:tcW w:w="3120" w:type="dxa"/>
+          </w:tcPr>
+          <w:p>
+            <w:r>
+              <w:t>25</w:t>
+            </w:r>
+          </w:p>
+        </w:tc>
+        <w:tc>
+          <w:tcPr>
+            <w:tcW w:w="3120" w:type="dxa"/>
+          </w:tcPr>
+          <w:p>
+            <w:r>
+              <w:t>Did family networks influence migration?</w:t>
+            </w:r>
+          </w:p>
+        </w:tc>
+        <w:tc>
+          <w:tcPr>
+            <w:tcW w:w="3120" w:type="dxa"/>
+          </w:tcPr>
+          <w:p>
+            <w:r>
+              <w:t>1. Yes</w:t>
+            </w:r>
+            <w:r>
+              <w:br/>
+              <w:t>2. No</w:t>
+            </w:r>
+          </w:p>
+        </w:tc>
+      </w:tr>
+    </w:tbl>
+    <w:p>
+      <w:pPr>
+        <w:pStyle w:val="Heading2"/>
+      </w:pPr>
+      <w:r>
+        <w:lastRenderedPageBreak/>
+        <w:t>Part IV: Questionnaire for Consequences of In-Migration</w:t>
+      </w:r>
+    </w:p>
+    <w:tbl>
+      <w:tblPr>
+        <w:tblStyle w:val="TableGrid"/>
+        <w:tblW w:w="0" w:type="auto"/>
+        <w:tblLook w:val="04A0" w:firstRow="1" w:lastRow="0" w:firstColumn="1" w:lastColumn="0" w:noHBand="0" w:noVBand="1"/>
+      </w:tblPr>
+      <w:tblGrid>
+        <w:gridCol w:w="2782"/>
+        <w:gridCol w:w="2962"/>
+        <w:gridCol w:w="2886"/>
+      </w:tblGrid>
+      <w:tr>
+        <w:tc>
+          <w:tcPr>
+            <w:tcW w:w="3120" w:type="dxa"/>
+          </w:tcPr>
+          <w:p>
+            <w:r>
+              <w:t>26</w:t>
+            </w:r>
+          </w:p>
+        </w:tc>
+        <w:tc>
+          <w:tcPr>
+            <w:tcW w:w="3120" w:type="dxa"/>
+          </w:tcPr>
+          <w:p>
+            <w:r>
+              <w:t>Have you settled permanently in this area?</w:t>
+            </w:r>
+          </w:p>
+        </w:tc>
+        <w:tc>
+          <w:tcPr>
+            <w:tcW w:w="3120" w:type="dxa"/>
+          </w:tcPr>
+          <w:p>
+            <w:r>
+              <w:t>1. Yes</w:t>
+            </w:r>
+            <w:r>
+              <w:br/>
+              <w:t>2. No</w:t>
+            </w:r>
+          </w:p>
+        </w:tc>
+      </w:tr>
+      <w:tr>
+        <w:tc>
+          <w:tcPr>
+            <w:tcW w:w="3120" w:type="dxa"/>
+          </w:tcPr>
+          <w:p>
+            <w:r>
+              <w:t>27</w:t>
+            </w:r>
+          </w:p>
+        </w:tc>
+        <w:tc>
+          <w:tcPr>
+            <w:tcW w:w="3120" w:type="dxa"/>
+          </w:tcPr>
+          <w:p>
+            <w:r>
+              <w:t>Has migration improved household income?</w:t>
+            </w:r>
+          </w:p>
+        </w:tc>
+        <w:tc>
+          <w:tcPr>
+            <w:tcW w:w="3120" w:type="dxa"/>
+          </w:tcPr>
+          <w:p>
+            <w:r>
+              <w:t>1. Yes</w:t>
+            </w:r>
+            <w:r>
+              <w:br/>
+              <w:t>2. No</w:t>
+            </w:r>
+          </w:p>
+        </w:tc>
+      </w:tr>
+      <w:tr>
+        <w:tc>
+          <w:tcPr>
+            <w:tcW w:w="3120" w:type="dxa"/>
+          </w:tcPr>
+          <w:p>
+            <w:r>
+              <w:t>28</w:t>
+            </w:r>
+          </w:p>
+        </w:tc>
+        <w:tc>
+          <w:tcPr>
+            <w:tcW w:w="3120" w:type="dxa"/>
+          </w:tcPr>
+          <w:p>
+            <w:r>
+              <w:t>Are you satisfied with your current residence?</w:t>
+            </w:r>
+          </w:p>
+        </w:tc>
+        <w:tc>
+          <w:tcPr>
+            <w:tcW w:w="3120" w:type="dxa"/>
+          </w:tcPr>
+          <w:p>
+            <w:r>
+              <w:t>1. Yes</w:t>
+            </w:r>
+            <w:r>
+              <w:br/>
+              <w:t>2. No</w:t>
+            </w:r>
+          </w:p>
+        </w:tc>
+      </w:tr>
+      <w:tr>
+        <w:tc>
+          <w:tcPr>
+            <w:tcW w:w="3120" w:type="dxa"/>
+          </w:tcPr>
+          <w:p>
+            <w:r>
+              <w:t>29</w:t>
+            </w:r>
+          </w:p>
+        </w:tc>
+        <w:tc>
+          <w:tcPr>
+            <w:tcW w:w="3120" w:type="dxa"/>
+          </w:tcPr>
+          <w:p>
+            <w:r>
+              <w:t>Do you want to continue living here permanently?</w:t>
+            </w:r>
+          </w:p>
+        </w:tc>
+        <w:tc>
+          <w:tcPr>
+            <w:tcW w:w="3120" w:type="dxa"/>
+          </w:tcPr>
+          <w:p>
+            <w:r>
+              <w:t>1. Yes</w:t>
+            </w:r>
+            <w:r>
+              <w:br/>
+              <w:t>2. No</w:t>
+            </w:r>
+          </w:p>
+        </w:tc>
+      </w:tr>
+      <w:tr>
+        <w:tc>
+          <w:tcPr>
+            <w:tcW w:w="3120" w:type="dxa"/>
+          </w:tcPr>
+          <w:p>
+            <w:r>
+              <w:t>30</w:t>
+            </w:r>
+          </w:p>
+        </w:tc>
+        <w:tc>
+          <w:tcPr>
+            <w:tcW w:w="3120" w:type="dxa"/>
+          </w:tcPr>
+          <w:p>
+            <w:r>
+              <w:t>Main problems faced after migration?</w:t>
+            </w:r>
+          </w:p>
+        </w:tc>
+        <w:tc>
+          <w:tcPr>
+            <w:tcW w:w="3120" w:type="dxa"/>
+          </w:tcPr>
+          <w:p>
+            <w:r>
+              <w:t>1. Pollution</w:t>
+            </w:r>
+            <w:r>
+              <w:br/>
+              <w:t>2. Road Problems</w:t>
+            </w:r>
+            <w:r>
+              <w:br/>
+              <w:t>3. Housing</w:t>
+            </w:r>
+            <w:r>
+              <w:br/>
+              <w:t>4. Health Services</w:t>
+            </w:r>
+            <w:r>
+              <w:br/>
+              <w:t>5. Other</w:t>
+            </w:r>
+          </w:p>
+        </w:tc>
+      </w:tr>
+      <w:tr>
+        <w:tc>
+          <w:tcPr>
+            <w:tcW w:w="3120" w:type="dxa"/>
+          </w:tcPr>
+          <w:p>
+            <w:r>
+              <w:t>31</w:t>
+            </w:r>
+          </w:p>
+        </w:tc>
+        <w:tc>
+          <w:tcPr>
+            <w:tcW w:w="3120" w:type="dxa"/>
+          </w:tcPr>
+          <w:p>
+            <w:r>
+              <w:t>Has migration increased population density?</w:t>
+            </w:r>
+          </w:p>
+        </w:tc>
+        <w:tc>
+          <w:tcPr>
+            <w:tcW w:w="3120" w:type="dxa"/>
+          </w:tcPr>
+          <w:p>
+            <w:r>
+              <w:t>1. Yes</w:t>
+            </w:r>
+            <w:r>
+              <w:br/>
+              <w:t>2. No</w:t>
+            </w:r>
+          </w:p>
+        </w:tc>
+      </w:tr>
+      <w:tr>
+        <w:tc>
+          <w:tcPr>
+            <w:tcW w:w="3120" w:type="dxa"/>
+          </w:tcPr>
+          <w:p>
+            <w:r>
+              <w:t>32</w:t>
+            </w:r>
+          </w:p>
+        </w:tc>
+        <w:tc>
+          <w:tcPr>
+            <w:tcW w:w="3120" w:type="dxa"/>
+          </w:tcPr>
+          <w:p>
+            <w:r>
+              <w:t>Has migration increased pressure on infrastructure?</w:t>
+            </w:r>
+          </w:p>
+        </w:tc>
+        <w:tc>
+          <w:tcPr>
+            <w:tcW w:w="3120" w:type="dxa"/>
+          </w:tcPr>
+          <w:p>
+            <w:r>
+              <w:t>1. Yes</w:t>
+            </w:r>
+            <w:r>
+              <w:br/>
+              <w:t>2. No</w:t>
+            </w:r>
+          </w:p>
+        </w:tc>
+      </w:tr>
+      <w:tr>
+        <w:tc>
+          <w:tcPr>
+            <w:tcW w:w="3120" w:type="dxa"/>
+          </w:tcPr>
+          <w:p>
+            <w:r>
+              <w:t>33</w:t>
+            </w:r>
+          </w:p>
+        </w:tc>
+        <w:tc>
+          <w:tcPr>
+            <w:tcW w:w="3120" w:type="dxa"/>
+          </w:tcPr>
+          <w:p>
+            <w:r>
+              <w:t>Has migration increased job competition?</w:t>
+            </w:r>
+          </w:p>
+        </w:tc>
+        <w:tc>
+          <w:tcPr>
+            <w:tcW w:w="3120" w:type="dxa"/>
+          </w:tcPr>
+          <w:p>
+            <w:r>
+              <w:t>1. Yes</w:t>
+            </w:r>
+            <w:r>
+              <w:br/>
+              <w:t>2. No</w:t>
+            </w:r>
+          </w:p>
+        </w:tc>
+      </w:tr>
+      <w:tr>
+        <w:tc>
+          <w:tcPr>
+            <w:tcW w:w="3120" w:type="dxa"/>
+          </w:tcPr>
+          <w:p>
+            <w:r>
+              <w:t>34</w:t>
+            </w:r>
+          </w:p>
+        </w:tc>
+        <w:tc>
+          <w:tcPr>
+            <w:tcW w:w="3120" w:type="dxa"/>
+          </w:tcPr>
+          <w:p>
+            <w:r>
+              <w:t>Has migration improved educational access?</w:t>
+            </w:r>
+          </w:p>
+        </w:tc>
+        <w:tc>
+          <w:tcPr>
+            <w:tcW w:w="3120" w:type="dxa"/>
+          </w:tcPr>
+          <w:p>
+            <w:r>
+              <w:t>1. Yes</w:t>
+            </w:r>
+            <w:r>
+              <w:br/>
+              <w:t>2. No</w:t>
+            </w:r>
+          </w:p>
+        </w:tc>
+      </w:tr>
+      <w:tr>
+        <w:tc>
+          <w:tcPr>
+            <w:tcW w:w="3120" w:type="dxa"/>
+          </w:tcPr>
+          <w:p>
+            <w:r>
+              <w:t>35</w:t>
+            </w:r>
+          </w:p>
+        </w:tc>
+        <w:tc>
+          <w:tcPr>
+            <w:tcW w:w="3120" w:type="dxa"/>
+          </w:tcPr>
+          <w:p>
+            <w:r>
+              <w:t>Has migration improved healthcare access?</w:t>
+            </w:r>
+          </w:p>
+        </w:tc>
+        <w:tc>
+          <w:tcPr>
+            <w:tcW w:w="3120" w:type="dxa"/>
+          </w:tcPr>
+          <w:p>
+            <w:r>
+              <w:t>1. Yes</w:t>
+            </w:r>
+            <w:r>
+              <w:br/>
+              <w:t>2. No</w:t>
+            </w:r>
+          </w:p>
+        </w:tc>
+      </w:tr>
+      <w:tr>
+        <w:tc>
+          <w:tcPr>
+            <w:tcW w:w="3120" w:type="dxa"/>
+          </w:tcPr>
+          <w:p>
+            <w:r>
+              <w:t>36</w:t>
+            </w:r>
+          </w:p>
+        </w:tc>
+        <w:tc>
+          <w:tcPr>
+            <w:tcW w:w="3120" w:type="dxa"/>
+          </w:tcPr>
+          <w:p>
+            <w:r>
+              <w:t>Has migration changed cultural practices?</w:t>
+            </w:r>
+          </w:p>
+        </w:tc>
+        <w:tc>
+          <w:tcPr>
+            <w:tcW w:w="3120" w:type="dxa"/>
+          </w:tcPr>
+          <w:p>
+            <w:r>
+              <w:t>1. No Change</w:t>
+            </w:r>
+            <w:r>
+              <w:br/>
+              <w:t>2. Slight Change</w:t>
+            </w:r>
+            <w:r>
+              <w:br/>
+              <w:t>3. Major Change</w:t>
+            </w:r>
+          </w:p>
+        </w:tc>
+      </w:tr>
+      <w:tr>
+        <w:tc>
+          <w:tcPr>
+            <w:tcW w:w="3120" w:type="dxa"/>
+          </w:tcPr>
+          <w:p>
+            <w:r>
+              <w:t>37</w:t>
+            </w:r>
+          </w:p>
+        </w:tc>
+        <w:tc>
+          <w:tcPr>
+            <w:tcW w:w="3120" w:type="dxa"/>
+          </w:tcPr>
+          <w:p>
+            <w:r>
+              <w:t>Has your occupation changed after migration?</w:t>
+            </w:r>
+          </w:p>
+        </w:tc>
+        <w:tc>
+          <w:tcPr>
+            <w:tcW w:w="3120" w:type="dxa"/>
+          </w:tcPr>
+          <w:p>
+            <w:r>
+              <w:t>1. Yes</w:t>
+            </w:r>
+            <w:r>
+              <w:br/>
+              <w:t>2. No</w:t>
+            </w:r>
+          </w:p>
+        </w:tc>
+      </w:tr>
+      <w:tr>
+        <w:tc>
+          <w:tcPr>
+            <w:tcW w:w="3120" w:type="dxa"/>
+          </w:tcPr>
+          <w:p>
+            <w:r>
+              <w:t>38</w:t>
+            </w:r>
+          </w:p>
+        </w:tc>
+        <w:tc>
+          <w:tcPr>
+            <w:tcW w:w="3120" w:type="dxa"/>
+          </w:tcPr>
+          <w:p>
+            <w:r>
+              <w:t>Has agricultural production changed after migration?</w:t>
+            </w:r>
+          </w:p>
+        </w:tc>
+        <w:tc>
+          <w:tcPr>
+            <w:tcW w:w="3120" w:type="dxa"/>
+          </w:tcPr>
+          <w:p>
+            <w:r>
+              <w:t>1. Increased</w:t>
+            </w:r>
+            <w:r>
+              <w:br/>
+              <w:t>2. Decreased</w:t>
+            </w:r>
+            <w:r>
+              <w:br/>
+              <w:t>3. No Change</w:t>
+            </w:r>
+          </w:p>
+        </w:tc>
+      </w:tr>
+      <w:tr>
+        <w:tc>
+          <w:tcPr>
+            <w:tcW w:w="3120" w:type="dxa"/>
+          </w:tcPr>
+          <w:p>
+            <w:r>
+              <w:t>39</w:t>
+            </w:r>
+          </w:p>
+        </w:tc>
+        <w:tc>
+          <w:tcPr>
+            <w:tcW w:w="3120" w:type="dxa"/>
+          </w:tcPr>
+          <w:p>
+            <w:r>
+              <w:t>Do you have livestock currently?</w:t>
+            </w:r>
+          </w:p>
+        </w:tc>
+        <w:tc>
+          <w:tcPr>
+            <w:tcW w:w="3120" w:type="dxa"/>
+          </w:tcPr>
+          <w:p>
+            <w:r>
+              <w:t>1. Yes</w:t>
+            </w:r>
+            <w:r>
+              <w:br/>
+              <w:t>2. No</w:t>
+            </w:r>
+          </w:p>
+        </w:tc>
+      </w:tr>
+      <w:tr>
+        <w:tc>
+          <w:tcPr>
+            <w:tcW w:w="3120" w:type="dxa"/>
+          </w:tcPr>
+          <w:p>
+            <w:r>
+              <w:t>40</w:t>
+            </w:r>
+          </w:p>
+        </w:tc>
+        <w:tc>
+          <w:tcPr>
+            <w:tcW w:w="3120" w:type="dxa"/>
+          </w:tcPr>
+          <w:p>
+            <w:r>
+              <w:t>What would you suggest to relatives/friends?</w:t>
+            </w:r>
+          </w:p>
+        </w:tc>
+        <w:tc>
+          <w:tcPr>
+            <w:tcW w:w="3120" w:type="dxa"/>
+          </w:tcPr>
+          <w:p>
+            <w:r>
+              <w:t>1. Migrate Here</w:t>
+            </w:r>
+            <w:r>
+              <w:br/>
+              <w:t>2. Go Elsewhere</w:t>
+            </w:r>
+            <w:r>
+              <w:br/>
+              <w:t>3. Cannot Suggest</w:t>
+            </w:r>
+          </w:p>
+        </w:tc>
+      </w:tr>
+    </w:tbl>
+    <w:p/>
+    <w:p>
+      <w:pPr>
+        <w:spacing w:line="360" w:lineRule="auto"/>
+        <w:rPr>
+          <w:rFonts w:ascii="Times New Roman" w:hAnsi="Times New Roman" w:cs="Times New Roman"/>
+        </w:rPr>
+      </w:pPr>
+    </w:p>
+    <w:p>
+      <w:pPr>
+        <w:spacing w:line="360" w:lineRule="auto"/>
+        <w:rPr>
+          <w:rFonts w:ascii="Times New Roman" w:hAnsi="Times New Roman" w:cs="Times New Roman"/>
+        </w:rPr>
+      </w:pPr>
+    </w:p>
+    <w:p>
+      <w:pPr>
+        <w:spacing w:line="360" w:lineRule="auto"/>
+        <w:rPr>
+          <w:rFonts w:ascii="Times New Roman" w:hAnsi="Times New Roman" w:cs="Times New Roman"/>
+        </w:rPr>
+      </w:pPr>
+    </w:p>
+    <w:p>
+      <w:pPr>
+        <w:spacing w:line="360" w:lineRule="auto"/>
+        <w:rPr>
+          <w:rFonts w:ascii="Times New Roman" w:hAnsi="Times New Roman" w:cs="Times New Roman"/>
+        </w:rPr>
+      </w:pPr>
+    </w:p>
+    <w:p>
+      <w:pPr>
+        <w:spacing w:line="360" w:lineRule="auto"/>
+        <w:rPr>
+          <w:rFonts w:ascii="Times New Roman" w:hAnsi="Times New Roman" w:cs="Times New Roman"/>
+        </w:rPr>
+      </w:pPr>
+    </w:p>
+    <w:p>
+      <w:pPr>
+        <w:spacing w:line="360" w:lineRule="auto"/>
+        <w:rPr>
+          <w:rFonts w:ascii="Times New Roman" w:hAnsi="Times New Roman" w:cs="Times New Roman"/>
+        </w:rPr>
+      </w:pPr>
+    </w:p>
+    <w:p>
+      <w:pPr>
+        <w:spacing w:line="360" w:lineRule="auto"/>
+        <w:rPr>
+          <w:rFonts w:ascii="Times New Roman" w:hAnsi="Times New Roman" w:cs="Times New Roman"/>
+        </w:rPr>
+      </w:pPr>
+    </w:p>
+    <w:p>
+      <w:pPr>
+        <w:spacing w:line="360" w:lineRule="auto"/>
+        <w:rPr>
+          <w:rFonts w:ascii="Times New Roman" w:hAnsi="Times New Roman" w:cs="Times New Roman"/>
+        </w:rPr>
+      </w:pPr>
+    </w:p>
+    <w:p>
+      <w:pPr>
+        <w:spacing w:line="360" w:lineRule="auto"/>
+        <w:rPr>
+          <w:rFonts w:ascii="Times New Roman" w:hAnsi="Times New Roman" w:cs="Times New Roman"/>
+        </w:rPr>
+      </w:pPr>
+    </w:p>
+    <w:p>
+      <w:pPr>
+        <w:spacing w:line="360" w:lineRule="auto"/>
+        <w:rPr>
+          <w:rFonts w:ascii="Times New Roman" w:hAnsi="Times New Roman" w:cs="Times New Roman"/>
+        </w:rPr>
+      </w:pPr>
+    </w:p>
+    <w:p>
+      <w:pPr>
+        <w:spacing w:line="360" w:lineRule="auto"/>
+        <w:rPr>
+          <w:rFonts w:ascii="Times New Roman" w:hAnsi="Times New Roman" w:cs="Times New Roman"/>
+        </w:rPr>
+      </w:pPr>
+      <w:bookmarkStart w:id="28" w:name="_GoBack"/>
+      <w:bookmarkEnd w:id="28"/>
+    </w:p>
     <w:sectPr>
       <w:headerReference w:type="default" r:id="rId11"/>
       <w:footerReference w:type="default" r:id="rId12"/>
@@ -6430,7 +9700,7 @@
           <w:rPr>
             <w:noProof/>
           </w:rPr>
-          <w:t>20</w:t>
+          <w:t>26</w:t>
         </w:r>
         <w:r>
           <w:rPr>
@@ -10103,7 +13373,7 @@
 </file>
 
 <file path=customXml/itemProps1.xml><?xml version="1.0" encoding="utf-8"?>
-<ds:datastoreItem xmlns:ds="http://schemas.openxmlformats.org/officeDocument/2006/customXml" ds:itemID="{9D631C68-9583-44D5-AFA5-76DE449E453E}">
+<ds:datastoreItem xmlns:ds="http://schemas.openxmlformats.org/officeDocument/2006/customXml" ds:itemID="{B43910A7-6FD1-4A8E-A3DB-BB1A3A378319}">
   <ds:schemaRefs>
     <ds:schemaRef ds:uri="http://schemas.openxmlformats.org/officeDocument/2006/bibliography"/>
   </ds:schemaRefs>

</xml_diff>